<commit_message>
Implemented set threshold interfaces and logic
</commit_message>
<xml_diff>
--- a/Team-Tasks/TasksReport.docx
+++ b/Team-Tasks/TasksReport.docx
@@ -1,6 +1,6 @@
 
 <file path=word/document.xml><?xml version="1.0" encoding="utf-8"?>
-<w:document xmlns:o="urn:schemas-microsoft-com:office:office" xmlns:r="http://schemas.openxmlformats.org/officeDocument/2006/relationships" xmlns:v="urn:schemas-microsoft-com:vml" xmlns:w="http://schemas.openxmlformats.org/wordprocessingml/2006/main" xmlns:w10="urn:schemas-microsoft-com:office:word" xmlns:wp="http://schemas.openxmlformats.org/drawingml/2006/wordprocessingDrawing" xmlns:pic="http://schemas.openxmlformats.org/drawingml/2006/picture" xmlns:wps="http://schemas.microsoft.com/office/word/2010/wordprocessingShape" xmlns:wpg="http://schemas.microsoft.com/office/word/2010/wordprocessingGroup" xmlns:mc="http://schemas.openxmlformats.org/markup-compatibility/2006" xmlns:wp14="http://schemas.microsoft.com/office/word/2010/wordprocessingDrawing" xmlns:w14="http://schemas.microsoft.com/office/word/2010/wordml" xmlns:w15="http://schemas.microsoft.com/office/word/2012/wordml" mc:Ignorable="w14 wp14 w15">
+<w:document xmlns:wpc="http://schemas.microsoft.com/office/word/2010/wordprocessingCanvas" xmlns:cx="http://schemas.microsoft.com/office/drawing/2014/chartex" xmlns:cx1="http://schemas.microsoft.com/office/drawing/2015/9/8/chartex" xmlns:cx2="http://schemas.microsoft.com/office/drawing/2015/10/21/chartex" xmlns:cx3="http://schemas.microsoft.com/office/drawing/2016/5/9/chartex" xmlns:cx4="http://schemas.microsoft.com/office/drawing/2016/5/10/chartex" xmlns:cx5="http://schemas.microsoft.com/office/drawing/2016/5/11/chartex" xmlns:cx6="http://schemas.microsoft.com/office/drawing/2016/5/12/chartex" xmlns:cx7="http://schemas.microsoft.com/office/drawing/2016/5/13/chartex" xmlns:cx8="http://schemas.microsoft.com/office/drawing/2016/5/14/chartex" xmlns:mc="http://schemas.openxmlformats.org/markup-compatibility/2006" xmlns:aink="http://schemas.microsoft.com/office/drawing/2016/ink" xmlns:am3d="http://schemas.microsoft.com/office/drawing/2017/model3d" xmlns:o="urn:schemas-microsoft-com:office:office" xmlns:oel="http://schemas.microsoft.com/office/2019/extlst" xmlns:r="http://schemas.openxmlformats.org/officeDocument/2006/relationships" xmlns:m="http://schemas.openxmlformats.org/officeDocument/2006/math" xmlns:v="urn:schemas-microsoft-com:vml" xmlns:wp14="http://schemas.microsoft.com/office/word/2010/wordprocessingDrawing" xmlns:wp="http://schemas.openxmlformats.org/drawingml/2006/wordprocessingDrawing" xmlns:w10="urn:schemas-microsoft-com:office:word" xmlns:w="http://schemas.openxmlformats.org/wordprocessingml/2006/main" xmlns:w14="http://schemas.microsoft.com/office/word/2010/wordml" xmlns:w15="http://schemas.microsoft.com/office/word/2012/wordml" xmlns:w16cex="http://schemas.microsoft.com/office/word/2018/wordml/cex" xmlns:w16cid="http://schemas.microsoft.com/office/word/2016/wordml/cid" xmlns:w16="http://schemas.microsoft.com/office/word/2018/wordml" xmlns:w16du="http://schemas.microsoft.com/office/word/2023/wordml/word16du" xmlns:w16sdtdh="http://schemas.microsoft.com/office/word/2020/wordml/sdtdatahash" xmlns:w16sdtfl="http://schemas.microsoft.com/office/word/2024/wordml/sdtformatlock" xmlns:w16se="http://schemas.microsoft.com/office/word/2015/wordml/symex" xmlns:wpg="http://schemas.microsoft.com/office/word/2010/wordprocessingGroup" xmlns:wpi="http://schemas.microsoft.com/office/word/2010/wordprocessingInk" xmlns:wne="http://schemas.microsoft.com/office/word/2006/wordml" xmlns:wps="http://schemas.microsoft.com/office/word/2010/wordprocessingShape" mc:Ignorable="w14 w15 w16se w16cid w16 w16cex w16sdtdh w16sdtfl w16du wp14">
   <w:body>
     <w:p>
       <w:pPr>
@@ -33,14 +33,6 @@
           <w:szCs w:val="28"/>
         </w:rPr>
       </w:pPr>
-      <w:r>
-        <w:rPr>
-          <w:b/>
-          <w:bCs/>
-          <w:sz w:val="28"/>
-          <w:szCs w:val="28"/>
-        </w:rPr>
-      </w:r>
     </w:p>
     <w:p>
       <w:pPr>
@@ -72,14 +64,6 @@
           <w:szCs w:val="28"/>
         </w:rPr>
       </w:pPr>
-      <w:r>
-        <w:rPr>
-          <w:b/>
-          <w:bCs/>
-          <w:sz w:val="28"/>
-          <w:szCs w:val="28"/>
-        </w:rPr>
-      </w:r>
     </w:p>
     <w:p>
       <w:pPr>
@@ -99,8 +83,32 @@
           <w:szCs w:val="28"/>
         </w:rPr>
         <w:t>Group name: Group02</w:t>
+      </w:r>
+      <w:r>
+        <w:rPr>
+          <w:b/>
+          <w:bCs/>
+          <w:sz w:val="28"/>
+          <w:szCs w:val="28"/>
+        </w:rPr>
         <w:tab/>
+      </w:r>
+      <w:r>
+        <w:rPr>
+          <w:b/>
+          <w:bCs/>
+          <w:sz w:val="28"/>
+          <w:szCs w:val="28"/>
+        </w:rPr>
         <w:tab/>
+      </w:r>
+      <w:r>
+        <w:rPr>
+          <w:b/>
+          <w:bCs/>
+          <w:sz w:val="28"/>
+          <w:szCs w:val="28"/>
+        </w:rPr>
         <w:tab/>
         <w:t>Section name:   section 01          Phase: 1</w:t>
       </w:r>
@@ -108,17 +116,12 @@
     <w:p>
       <w:pPr>
         <w:pStyle w:val="normal1"/>
-        <w:rPr/>
       </w:pPr>
-      <w:r>
-        <w:rPr/>
-      </w:r>
     </w:p>
     <w:tbl>
       <w:tblPr>
         <w:tblStyle w:val="TableNormal0"/>
         <w:tblW w:w="9350" w:type="dxa"/>
-        <w:jc w:val="left"/>
         <w:tblInd w:w="0" w:type="dxa"/>
         <w:tblLayout w:type="fixed"/>
         <w:tblCellMar>
@@ -127,15 +130,15 @@
           <w:bottom w:w="0" w:type="dxa"/>
           <w:right w:w="108" w:type="dxa"/>
         </w:tblCellMar>
-        <w:tblLook w:val="0400" w:noHBand="0" w:noVBand="1" w:firstColumn="0" w:lastRow="0" w:lastColumn="0" w:firstRow="0"/>
+        <w:tblLook w:val="0400" w:firstRow="0" w:lastRow="0" w:firstColumn="0" w:lastColumn="0" w:noHBand="0" w:noVBand="1"/>
       </w:tblPr>
       <w:tblGrid>
         <w:gridCol w:w="3955"/>
-        <w:gridCol w:w="5394"/>
+        <w:gridCol w:w="5395"/>
       </w:tblGrid>
       <w:tr>
         <w:trPr>
-          <w:trHeight w:val="530" w:hRule="atLeast"/>
+          <w:trHeight w:val="530"/>
         </w:trPr>
         <w:tc>
           <w:tcPr>
@@ -151,9 +154,6 @@
           <w:p>
             <w:pPr>
               <w:pStyle w:val="normal1"/>
-              <w:widowControl/>
-              <w:suppressAutoHyphens w:val="true"/>
-              <w:spacing w:before="0" w:after="160"/>
               <w:jc w:val="center"/>
               <w:rPr>
                 <w:b/>
@@ -164,13 +164,10 @@
             </w:pPr>
             <w:r>
               <w:rPr>
-                <w:rFonts w:eastAsia="Calibri" w:cs="Calibri"/>
-                <w:b/>
-                <w:bCs/>
-                <w:kern w:val="0"/>
+                <w:b/>
+                <w:bCs/>
                 <w:sz w:val="32"/>
                 <w:szCs w:val="32"/>
-                <w:lang w:val="en-US" w:eastAsia="zh-CN" w:bidi="hi-IN"/>
               </w:rPr>
               <w:t>Student name</w:t>
             </w:r>
@@ -190,9 +187,6 @@
           <w:p>
             <w:pPr>
               <w:pStyle w:val="normal1"/>
-              <w:widowControl/>
-              <w:suppressAutoHyphens w:val="true"/>
-              <w:spacing w:before="0" w:after="160"/>
               <w:jc w:val="center"/>
               <w:rPr>
                 <w:b/>
@@ -203,13 +197,10 @@
             </w:pPr>
             <w:r>
               <w:rPr>
-                <w:rFonts w:eastAsia="Calibri" w:cs="Calibri"/>
-                <w:b/>
-                <w:bCs/>
-                <w:kern w:val="0"/>
+                <w:b/>
+                <w:bCs/>
                 <w:sz w:val="32"/>
                 <w:szCs w:val="32"/>
-                <w:lang w:val="en-US" w:eastAsia="zh-CN" w:bidi="hi-IN"/>
               </w:rPr>
               <w:t>Tasks and duties</w:t>
             </w:r>
@@ -218,7 +209,7 @@
       </w:tr>
       <w:tr>
         <w:trPr>
-          <w:trHeight w:val="1790" w:hRule="atLeast"/>
+          <w:trHeight w:val="1790"/>
         </w:trPr>
         <w:tc>
           <w:tcPr>
@@ -234,9 +225,6 @@
           <w:p>
             <w:pPr>
               <w:pStyle w:val="normal1"/>
-              <w:widowControl/>
-              <w:suppressAutoHyphens w:val="true"/>
-              <w:spacing w:before="0" w:after="160"/>
               <w:jc w:val="left"/>
               <w:rPr>
                 <w:b/>
@@ -247,13 +235,10 @@
             </w:pPr>
             <w:r>
               <w:rPr>
-                <w:rFonts w:eastAsia="Calibri" w:cs="Calibri"/>
-                <w:b/>
-                <w:bCs/>
-                <w:kern w:val="0"/>
+                <w:b/>
+                <w:bCs/>
                 <w:sz w:val="24"/>
                 <w:szCs w:val="24"/>
-                <w:lang w:val="en-US" w:eastAsia="zh-CN" w:bidi="hi-IN"/>
               </w:rPr>
               <w:t>#1 Jonathan Markovic</w:t>
             </w:r>
@@ -272,99 +257,53 @@
           <w:p>
             <w:pPr>
               <w:pStyle w:val="normal1"/>
-              <w:widowControl/>
-              <w:suppressAutoHyphens w:val="true"/>
-              <w:spacing w:before="0" w:after="160"/>
-              <w:rPr>
-                <w:rFonts w:ascii="Calibri" w:hAnsi="Calibri" w:eastAsia="Calibri" w:cs="Calibri"/>
-                <w:kern w:val="0"/>
-                <w:sz w:val="22"/>
-                <w:szCs w:val="22"/>
-                <w:lang w:val="en-US" w:eastAsia="zh-CN" w:bidi="hi-IN"/>
-              </w:rPr>
-            </w:pPr>
-            <w:r>
-              <w:rPr>
-                <w:rFonts w:eastAsia="Calibri" w:cs="Calibri"/>
-                <w:kern w:val="0"/>
-                <w:sz w:val="22"/>
-                <w:szCs w:val="22"/>
-                <w:lang w:val="en-US" w:eastAsia="zh-CN" w:bidi="hi-IN"/>
-              </w:rPr>
-            </w:r>
-          </w:p>
-          <w:p>
-            <w:pPr>
-              <w:pStyle w:val="normal1"/>
-              <w:widowControl/>
-              <w:suppressAutoHyphens w:val="true"/>
-              <w:spacing w:before="0" w:after="160"/>
-              <w:rPr>
-                <w:rFonts w:ascii="Calibri" w:hAnsi="Calibri" w:eastAsia="Calibri" w:cs="Calibri"/>
-                <w:kern w:val="0"/>
-                <w:sz w:val="22"/>
-                <w:szCs w:val="22"/>
-                <w:lang w:val="en-US" w:eastAsia="zh-CN" w:bidi="hi-IN"/>
-              </w:rPr>
-            </w:pPr>
-            <w:r>
-              <w:rPr>
-                <w:rFonts w:eastAsia="Calibri" w:cs="Calibri"/>
-                <w:kern w:val="0"/>
-                <w:sz w:val="22"/>
-                <w:szCs w:val="22"/>
-                <w:lang w:val="en-US" w:eastAsia="zh-CN" w:bidi="hi-IN"/>
-              </w:rPr>
-              <w:t>Helped with finding ways to implement the project(sql, python/php etc…)</w:t>
-            </w:r>
-          </w:p>
-          <w:p>
-            <w:pPr>
-              <w:pStyle w:val="normal1"/>
-              <w:widowControl/>
-              <w:suppressAutoHyphens w:val="true"/>
-              <w:spacing w:before="0" w:after="160"/>
-              <w:rPr>
-                <w:rFonts w:ascii="Calibri" w:hAnsi="Calibri" w:eastAsia="Calibri" w:cs="Calibri"/>
-                <w:kern w:val="0"/>
-                <w:sz w:val="22"/>
-                <w:szCs w:val="22"/>
-                <w:lang w:val="en-US" w:eastAsia="zh-CN" w:bidi="hi-IN"/>
-              </w:rPr>
-            </w:pPr>
-            <w:r>
-              <w:rPr>
-                <w:rFonts w:eastAsia="Calibri" w:cs="Calibri"/>
-                <w:kern w:val="0"/>
-                <w:sz w:val="22"/>
-                <w:szCs w:val="22"/>
-                <w:lang w:val="en-US" w:eastAsia="zh-CN" w:bidi="hi-IN"/>
-              </w:rPr>
+            </w:pPr>
+          </w:p>
+          <w:p>
+            <w:pPr>
+              <w:pStyle w:val="normal1"/>
+            </w:pPr>
+            <w:r>
+              <w:t>Helped with finding ways to implement the project(</w:t>
+            </w:r>
+            <w:proofErr w:type="spellStart"/>
+            <w:r>
+              <w:t>sql</w:t>
+            </w:r>
+            <w:proofErr w:type="spellEnd"/>
+            <w:r>
+              <w:t>, python/</w:t>
+            </w:r>
+            <w:proofErr w:type="spellStart"/>
+            <w:r>
+              <w:t>php</w:t>
+            </w:r>
+            <w:proofErr w:type="spellEnd"/>
+            <w:r>
+              <w:t xml:space="preserve"> </w:t>
+            </w:r>
+            <w:proofErr w:type="spellStart"/>
+            <w:r>
+              <w:t>etc</w:t>
+            </w:r>
+            <w:proofErr w:type="spellEnd"/>
+            <w:r>
+              <w:t>…)</w:t>
+            </w:r>
+          </w:p>
+          <w:p>
+            <w:pPr>
+              <w:pStyle w:val="normal1"/>
+            </w:pPr>
+            <w:r>
               <w:t>Implemented the GPIO interaction in the code</w:t>
             </w:r>
           </w:p>
           <w:p>
             <w:pPr>
               <w:pStyle w:val="normal1"/>
-              <w:widowControl/>
-              <w:suppressAutoHyphens w:val="true"/>
-              <w:spacing w:before="0" w:after="160"/>
-              <w:rPr>
-                <w:rFonts w:ascii="Calibri" w:hAnsi="Calibri" w:eastAsia="Calibri" w:cs="Calibri"/>
-                <w:kern w:val="0"/>
-                <w:sz w:val="22"/>
-                <w:szCs w:val="22"/>
-                <w:lang w:val="en-US" w:eastAsia="zh-CN" w:bidi="hi-IN"/>
-              </w:rPr>
-            </w:pPr>
-            <w:r>
-              <w:rPr>
-                <w:rFonts w:eastAsia="Calibri" w:cs="Calibri"/>
-                <w:kern w:val="0"/>
-                <w:sz w:val="22"/>
-                <w:szCs w:val="22"/>
-                <w:lang w:val="en-US" w:eastAsia="zh-CN" w:bidi="hi-IN"/>
-              </w:rPr>
+            </w:pPr>
+            <w:r>
               <w:t>Bug fixes</w:t>
             </w:r>
           </w:p>
@@ -372,7 +311,7 @@
       </w:tr>
       <w:tr>
         <w:trPr>
-          <w:trHeight w:val="1340" w:hRule="atLeast"/>
+          <w:trHeight w:val="1340"/>
         </w:trPr>
         <w:tc>
           <w:tcPr>
@@ -388,9 +327,6 @@
           <w:p>
             <w:pPr>
               <w:pStyle w:val="normal1"/>
-              <w:widowControl/>
-              <w:suppressAutoHyphens w:val="true"/>
-              <w:spacing w:before="0" w:after="160"/>
               <w:jc w:val="left"/>
               <w:rPr>
                 <w:b/>
@@ -401,13 +337,10 @@
             </w:pPr>
             <w:r>
               <w:rPr>
-                <w:rFonts w:eastAsia="Calibri" w:cs="Calibri"/>
-                <w:b/>
-                <w:bCs/>
-                <w:kern w:val="0"/>
+                <w:b/>
+                <w:bCs/>
                 <w:sz w:val="24"/>
                 <w:szCs w:val="24"/>
-                <w:lang w:val="en-US" w:eastAsia="zh-CN" w:bidi="hi-IN"/>
               </w:rPr>
               <w:t>#2 Meerab Khan</w:t>
             </w:r>
@@ -426,58 +359,56 @@
           <w:p>
             <w:pPr>
               <w:pStyle w:val="normal1"/>
-              <w:widowControl/>
-              <w:suppressAutoHyphens w:val="true"/>
-              <w:spacing w:before="0" w:after="160"/>
-              <w:rPr>
-                <w:rFonts w:ascii="Calibri" w:hAnsi="Calibri" w:eastAsia="Calibri" w:cs="Calibri"/>
-                <w:kern w:val="0"/>
-                <w:sz w:val="22"/>
-                <w:szCs w:val="22"/>
-                <w:lang w:val="en-US" w:eastAsia="zh-CN" w:bidi="hi-IN"/>
-              </w:rPr>
-            </w:pPr>
-            <w:r>
-              <w:rPr>
-                <w:rFonts w:eastAsia="Calibri" w:cs="Calibri"/>
-                <w:kern w:val="0"/>
-                <w:sz w:val="22"/>
-                <w:szCs w:val="22"/>
-                <w:lang w:val="en-US" w:eastAsia="zh-CN" w:bidi="hi-IN"/>
-              </w:rPr>
-              <w:t>Helped with finding ways to implement the project(sql, python/php etc…)</w:t>
-            </w:r>
-          </w:p>
-          <w:p>
-            <w:pPr>
-              <w:pStyle w:val="normal1"/>
-              <w:widowControl/>
-              <w:suppressAutoHyphens w:val="true"/>
-              <w:spacing w:before="0" w:after="160"/>
-              <w:rPr>
-                <w:rFonts w:ascii="Calibri" w:hAnsi="Calibri" w:eastAsia="Calibri" w:cs="Calibri"/>
-                <w:kern w:val="0"/>
-                <w:sz w:val="22"/>
-                <w:szCs w:val="22"/>
-                <w:lang w:val="en-US" w:eastAsia="zh-CN" w:bidi="hi-IN"/>
-              </w:rPr>
-            </w:pPr>
-            <w:r>
-              <w:rPr>
-                <w:rFonts w:eastAsia="Calibri" w:cs="Calibri"/>
-                <w:kern w:val="0"/>
-                <w:sz w:val="22"/>
-                <w:szCs w:val="22"/>
-                <w:lang w:val="en-US" w:eastAsia="zh-CN" w:bidi="hi-IN"/>
-              </w:rPr>
-              <w:t>Implemented the database connection in the code,regex expressions</w:t>
+            </w:pPr>
+            <w:r>
+              <w:t>Helped with finding ways to implement the project(</w:t>
+            </w:r>
+            <w:proofErr w:type="spellStart"/>
+            <w:r>
+              <w:t>sql</w:t>
+            </w:r>
+            <w:proofErr w:type="spellEnd"/>
+            <w:r>
+              <w:t>, python/</w:t>
+            </w:r>
+            <w:proofErr w:type="spellStart"/>
+            <w:r>
+              <w:t>php</w:t>
+            </w:r>
+            <w:proofErr w:type="spellEnd"/>
+            <w:r>
+              <w:t xml:space="preserve"> </w:t>
+            </w:r>
+            <w:proofErr w:type="spellStart"/>
+            <w:r>
+              <w:t>etc</w:t>
+            </w:r>
+            <w:proofErr w:type="spellEnd"/>
+            <w:r>
+              <w:t>…)</w:t>
+            </w:r>
+          </w:p>
+          <w:p>
+            <w:pPr>
+              <w:pStyle w:val="normal1"/>
+            </w:pPr>
+            <w:r>
+              <w:t xml:space="preserve">Implemented the database connection in the </w:t>
+            </w:r>
+            <w:proofErr w:type="spellStart"/>
+            <w:r>
+              <w:t>code,regex</w:t>
+            </w:r>
+            <w:proofErr w:type="spellEnd"/>
+            <w:r>
+              <w:t xml:space="preserve"> expressions</w:t>
             </w:r>
           </w:p>
         </w:tc>
       </w:tr>
       <w:tr>
         <w:trPr>
-          <w:trHeight w:val="1430" w:hRule="atLeast"/>
+          <w:trHeight w:val="1430"/>
         </w:trPr>
         <w:tc>
           <w:tcPr>
@@ -493,9 +424,6 @@
           <w:p>
             <w:pPr>
               <w:pStyle w:val="normal1"/>
-              <w:widowControl/>
-              <w:suppressAutoHyphens w:val="true"/>
-              <w:spacing w:before="0" w:after="160"/>
               <w:jc w:val="left"/>
               <w:rPr>
                 <w:b/>
@@ -506,13 +434,10 @@
             </w:pPr>
             <w:r>
               <w:rPr>
-                <w:rFonts w:eastAsia="Calibri" w:cs="Calibri"/>
-                <w:b/>
-                <w:bCs/>
-                <w:kern w:val="0"/>
+                <w:b/>
+                <w:bCs/>
                 <w:sz w:val="24"/>
                 <w:szCs w:val="24"/>
-                <w:lang w:val="en-US" w:eastAsia="zh-CN" w:bidi="hi-IN"/>
               </w:rPr>
               <w:t>#3 Abdulmajeed Kakar</w:t>
             </w:r>
@@ -531,50 +456,40 @@
           <w:p>
             <w:pPr>
               <w:pStyle w:val="normal1"/>
-              <w:widowControl/>
-              <w:suppressAutoHyphens w:val="true"/>
-              <w:spacing w:before="0" w:after="160"/>
-              <w:rPr>
-                <w:rFonts w:ascii="Calibri" w:hAnsi="Calibri" w:eastAsia="Calibri" w:cs="Calibri"/>
-                <w:kern w:val="0"/>
-                <w:sz w:val="22"/>
-                <w:szCs w:val="22"/>
-                <w:lang w:val="en-US" w:eastAsia="zh-CN" w:bidi="hi-IN"/>
-              </w:rPr>
-            </w:pPr>
-            <w:r>
-              <w:rPr>
-                <w:rFonts w:eastAsia="Calibri" w:cs="Calibri"/>
-                <w:kern w:val="0"/>
-                <w:sz w:val="22"/>
-                <w:szCs w:val="22"/>
-                <w:lang w:val="en-US" w:eastAsia="zh-CN" w:bidi="hi-IN"/>
-              </w:rPr>
-              <w:t>Helped with finding ways to implement the project(sql, python/php etc…)</w:t>
-            </w:r>
-          </w:p>
-          <w:p>
-            <w:pPr>
-              <w:pStyle w:val="normal1"/>
-              <w:widowControl/>
-              <w:suppressAutoHyphens w:val="true"/>
-              <w:spacing w:before="0" w:after="160"/>
-              <w:rPr>
-                <w:rFonts w:ascii="Calibri" w:hAnsi="Calibri" w:eastAsia="Calibri" w:cs="Calibri"/>
-                <w:kern w:val="0"/>
-                <w:sz w:val="22"/>
-                <w:szCs w:val="22"/>
-                <w:lang w:val="en-US" w:eastAsia="zh-CN" w:bidi="hi-IN"/>
-              </w:rPr>
-            </w:pPr>
-            <w:r>
-              <w:rPr>
-                <w:rFonts w:eastAsia="Calibri" w:cs="Calibri"/>
-                <w:kern w:val="0"/>
-                <w:sz w:val="22"/>
-                <w:szCs w:val="22"/>
-                <w:lang w:val="en-US" w:eastAsia="zh-CN" w:bidi="hi-IN"/>
-              </w:rPr>
+            </w:pPr>
+            <w:r>
+              <w:t>Helped with finding ways to implement the project(</w:t>
+            </w:r>
+            <w:proofErr w:type="spellStart"/>
+            <w:r>
+              <w:t>sql</w:t>
+            </w:r>
+            <w:proofErr w:type="spellEnd"/>
+            <w:r>
+              <w:t>, python/</w:t>
+            </w:r>
+            <w:proofErr w:type="spellStart"/>
+            <w:r>
+              <w:t>php</w:t>
+            </w:r>
+            <w:proofErr w:type="spellEnd"/>
+            <w:r>
+              <w:t xml:space="preserve"> </w:t>
+            </w:r>
+            <w:proofErr w:type="spellStart"/>
+            <w:r>
+              <w:t>etc</w:t>
+            </w:r>
+            <w:proofErr w:type="spellEnd"/>
+            <w:r>
+              <w:t>…)</w:t>
+            </w:r>
+          </w:p>
+          <w:p>
+            <w:pPr>
+              <w:pStyle w:val="normal1"/>
+            </w:pPr>
+            <w:r>
               <w:t>Implemented the GUI in the code</w:t>
             </w:r>
           </w:p>
@@ -582,7 +497,7 @@
       </w:tr>
       <w:tr>
         <w:trPr>
-          <w:trHeight w:val="1430" w:hRule="atLeast"/>
+          <w:trHeight w:val="1430"/>
         </w:trPr>
         <w:tc>
           <w:tcPr>
@@ -598,9 +513,6 @@
           <w:p>
             <w:pPr>
               <w:pStyle w:val="normal1"/>
-              <w:widowControl/>
-              <w:suppressAutoHyphens w:val="true"/>
-              <w:spacing w:before="0" w:after="160"/>
               <w:jc w:val="left"/>
               <w:rPr>
                 <w:b/>
@@ -611,13 +523,10 @@
             </w:pPr>
             <w:r>
               <w:rPr>
-                <w:rFonts w:eastAsia="Calibri" w:cs="Calibri"/>
-                <w:b/>
-                <w:bCs/>
-                <w:kern w:val="0"/>
+                <w:b/>
+                <w:bCs/>
                 <w:sz w:val="24"/>
                 <w:szCs w:val="24"/>
-                <w:lang w:val="en-US" w:eastAsia="zh-CN" w:bidi="hi-IN"/>
               </w:rPr>
               <w:t>#4 Cheng Yu Yang</w:t>
             </w:r>
@@ -636,75 +545,48 @@
           <w:p>
             <w:pPr>
               <w:pStyle w:val="normal1"/>
-              <w:widowControl/>
-              <w:suppressAutoHyphens w:val="true"/>
-              <w:spacing w:before="0" w:after="160"/>
-              <w:rPr>
-                <w:rFonts w:ascii="Calibri" w:hAnsi="Calibri" w:eastAsia="Calibri" w:cs="Calibri"/>
-                <w:kern w:val="0"/>
-                <w:sz w:val="22"/>
-                <w:szCs w:val="22"/>
-                <w:lang w:val="en-US" w:eastAsia="zh-CN" w:bidi="hi-IN"/>
-              </w:rPr>
-            </w:pPr>
-            <w:r>
-              <w:rPr>
-                <w:rFonts w:eastAsia="Calibri" w:cs="Calibri"/>
-                <w:kern w:val="0"/>
-                <w:sz w:val="22"/>
-                <w:szCs w:val="22"/>
-                <w:lang w:val="en-US" w:eastAsia="zh-CN" w:bidi="hi-IN"/>
-              </w:rPr>
-              <w:t>Helped with finding ways to implement the project(sql, python/php etc…)</w:t>
-            </w:r>
-          </w:p>
-          <w:p>
-            <w:pPr>
-              <w:pStyle w:val="normal1"/>
-              <w:widowControl/>
-              <w:suppressAutoHyphens w:val="true"/>
-              <w:spacing w:before="0" w:after="160"/>
-              <w:rPr>
-                <w:rFonts w:ascii="Calibri" w:hAnsi="Calibri" w:eastAsia="Calibri" w:cs="Calibri"/>
-                <w:kern w:val="0"/>
-                <w:sz w:val="22"/>
-                <w:szCs w:val="22"/>
-                <w:lang w:val="en-US" w:eastAsia="zh-CN" w:bidi="hi-IN"/>
-              </w:rPr>
-            </w:pPr>
-            <w:r>
-              <w:rPr>
-                <w:rFonts w:eastAsia="Calibri" w:cs="Calibri"/>
-                <w:kern w:val="0"/>
-                <w:sz w:val="22"/>
-                <w:szCs w:val="22"/>
-                <w:lang w:val="en-US" w:eastAsia="zh-CN" w:bidi="hi-IN"/>
-              </w:rPr>
+            </w:pPr>
+            <w:r>
+              <w:t>Helped with finding ways to implement the project(</w:t>
+            </w:r>
+            <w:proofErr w:type="spellStart"/>
+            <w:r>
+              <w:t>sql</w:t>
+            </w:r>
+            <w:proofErr w:type="spellEnd"/>
+            <w:r>
+              <w:t>, python/</w:t>
+            </w:r>
+            <w:proofErr w:type="spellStart"/>
+            <w:r>
+              <w:t>php</w:t>
+            </w:r>
+            <w:proofErr w:type="spellEnd"/>
+            <w:r>
+              <w:t xml:space="preserve"> </w:t>
+            </w:r>
+            <w:proofErr w:type="spellStart"/>
+            <w:r>
+              <w:t>etc</w:t>
+            </w:r>
+            <w:proofErr w:type="spellEnd"/>
+            <w:r>
+              <w:t>…)</w:t>
+            </w:r>
+          </w:p>
+          <w:p>
+            <w:pPr>
+              <w:pStyle w:val="normal1"/>
+            </w:pPr>
+            <w:r>
               <w:t>Found solution for replacing slim framework since we were having issues.</w:t>
             </w:r>
           </w:p>
           <w:p>
             <w:pPr>
               <w:pStyle w:val="normal1"/>
-              <w:widowControl/>
-              <w:suppressAutoHyphens w:val="true"/>
-              <w:spacing w:before="0" w:after="160"/>
-              <w:rPr>
-                <w:rFonts w:ascii="Calibri" w:hAnsi="Calibri" w:eastAsia="Calibri" w:cs="Calibri"/>
-                <w:kern w:val="0"/>
-                <w:sz w:val="22"/>
-                <w:szCs w:val="22"/>
-                <w:lang w:val="en-US" w:eastAsia="zh-CN" w:bidi="hi-IN"/>
-              </w:rPr>
-            </w:pPr>
-            <w:r>
-              <w:rPr>
-                <w:rFonts w:eastAsia="Calibri" w:cs="Calibri"/>
-                <w:kern w:val="0"/>
-                <w:sz w:val="22"/>
-                <w:szCs w:val="22"/>
-                <w:lang w:val="en-US" w:eastAsia="zh-CN" w:bidi="hi-IN"/>
-              </w:rPr>
+            </w:pPr>
+            <w:r>
               <w:t>Working on Converting the interface to HTML</w:t>
             </w:r>
           </w:p>
@@ -714,35 +596,22 @@
     <w:p>
       <w:pPr>
         <w:pStyle w:val="normal1"/>
-        <w:rPr/>
       </w:pPr>
-      <w:r>
-        <w:rPr/>
-      </w:r>
     </w:p>
     <w:p>
       <w:pPr>
         <w:pStyle w:val="normal1"/>
-        <w:rPr/>
       </w:pPr>
-      <w:r>
-        <w:rPr/>
-      </w:r>
     </w:p>
     <w:p>
       <w:pPr>
         <w:pStyle w:val="normal1"/>
-        <w:rPr/>
       </w:pPr>
-      <w:r>
-        <w:rPr/>
-      </w:r>
     </w:p>
     <w:p>
       <w:pPr>
         <w:pStyle w:val="normal1"/>
         <w:jc w:val="right"/>
-        <w:rPr/>
       </w:pPr>
       <w:r>
         <w:rPr>
@@ -751,6 +620,7 @@
           <w:sz w:val="28"/>
           <w:szCs w:val="28"/>
         </w:rPr>
+        <w:lastRenderedPageBreak/>
         <w:t>Phase: 2</w:t>
       </w:r>
     </w:p>
@@ -758,7 +628,6 @@
       <w:tblPr>
         <w:tblStyle w:val="TableNormal0"/>
         <w:tblW w:w="9350" w:type="dxa"/>
-        <w:jc w:val="left"/>
         <w:tblInd w:w="0" w:type="dxa"/>
         <w:tblLayout w:type="fixed"/>
         <w:tblCellMar>
@@ -767,15 +636,15 @@
           <w:bottom w:w="0" w:type="dxa"/>
           <w:right w:w="108" w:type="dxa"/>
         </w:tblCellMar>
-        <w:tblLook w:val="0400" w:noHBand="0" w:noVBand="1" w:firstColumn="0" w:lastRow="0" w:lastColumn="0" w:firstRow="0"/>
+        <w:tblLook w:val="0400" w:firstRow="0" w:lastRow="0" w:firstColumn="0" w:lastColumn="0" w:noHBand="0" w:noVBand="1"/>
       </w:tblPr>
       <w:tblGrid>
         <w:gridCol w:w="3955"/>
-        <w:gridCol w:w="5394"/>
+        <w:gridCol w:w="5395"/>
       </w:tblGrid>
       <w:tr>
         <w:trPr>
-          <w:trHeight w:val="530" w:hRule="atLeast"/>
+          <w:trHeight w:val="530"/>
         </w:trPr>
         <w:tc>
           <w:tcPr>
@@ -791,9 +660,6 @@
           <w:p>
             <w:pPr>
               <w:pStyle w:val="normal1"/>
-              <w:widowControl/>
-              <w:suppressAutoHyphens w:val="true"/>
-              <w:spacing w:before="0" w:after="160"/>
               <w:jc w:val="center"/>
               <w:rPr>
                 <w:b/>
@@ -804,13 +670,10 @@
             </w:pPr>
             <w:r>
               <w:rPr>
-                <w:rFonts w:eastAsia="Calibri" w:cs="Calibri"/>
-                <w:b/>
-                <w:bCs/>
-                <w:kern w:val="0"/>
+                <w:b/>
+                <w:bCs/>
                 <w:sz w:val="32"/>
                 <w:szCs w:val="32"/>
-                <w:lang w:val="en-US" w:eastAsia="zh-CN" w:bidi="hi-IN"/>
               </w:rPr>
               <w:t>Student name</w:t>
             </w:r>
@@ -830,9 +693,6 @@
           <w:p>
             <w:pPr>
               <w:pStyle w:val="normal1"/>
-              <w:widowControl/>
-              <w:suppressAutoHyphens w:val="true"/>
-              <w:spacing w:before="0" w:after="160"/>
               <w:jc w:val="center"/>
               <w:rPr>
                 <w:b/>
@@ -843,13 +703,10 @@
             </w:pPr>
             <w:r>
               <w:rPr>
-                <w:rFonts w:eastAsia="Calibri" w:cs="Calibri"/>
-                <w:b/>
-                <w:bCs/>
-                <w:kern w:val="0"/>
+                <w:b/>
+                <w:bCs/>
                 <w:sz w:val="32"/>
                 <w:szCs w:val="32"/>
-                <w:lang w:val="en-US" w:eastAsia="zh-CN" w:bidi="hi-IN"/>
               </w:rPr>
               <w:t>Tasks and duties</w:t>
             </w:r>
@@ -858,7 +715,7 @@
       </w:tr>
       <w:tr>
         <w:trPr>
-          <w:trHeight w:val="1790" w:hRule="atLeast"/>
+          <w:trHeight w:val="1790"/>
         </w:trPr>
         <w:tc>
           <w:tcPr>
@@ -874,9 +731,6 @@
           <w:p>
             <w:pPr>
               <w:pStyle w:val="normal1"/>
-              <w:widowControl/>
-              <w:suppressAutoHyphens w:val="true"/>
-              <w:spacing w:before="0" w:after="160"/>
               <w:jc w:val="left"/>
               <w:rPr>
                 <w:b/>
@@ -887,13 +741,10 @@
             </w:pPr>
             <w:r>
               <w:rPr>
-                <w:rFonts w:eastAsia="Calibri" w:cs="Calibri"/>
-                <w:b/>
-                <w:bCs/>
-                <w:kern w:val="0"/>
+                <w:b/>
+                <w:bCs/>
                 <w:sz w:val="24"/>
                 <w:szCs w:val="24"/>
-                <w:lang w:val="en-US" w:eastAsia="zh-CN" w:bidi="hi-IN"/>
               </w:rPr>
               <w:t>#1 Jonathan Markovic</w:t>
             </w:r>
@@ -912,132 +763,52 @@
           <w:p>
             <w:pPr>
               <w:pStyle w:val="normal1"/>
-              <w:widowControl/>
-              <w:suppressAutoHyphens w:val="true"/>
-              <w:spacing w:before="0" w:after="160"/>
-              <w:rPr>
-                <w:rFonts w:ascii="Calibri" w:hAnsi="Calibri" w:eastAsia="Calibri" w:cs="Calibri"/>
-                <w:kern w:val="0"/>
-                <w:sz w:val="22"/>
-                <w:szCs w:val="22"/>
-                <w:lang w:val="en-US" w:eastAsia="zh-CN" w:bidi="hi-IN"/>
-              </w:rPr>
-            </w:pPr>
-            <w:r>
-              <w:rPr>
-                <w:rFonts w:eastAsia="Calibri" w:cs="Calibri"/>
-                <w:kern w:val="0"/>
-                <w:sz w:val="22"/>
-                <w:szCs w:val="22"/>
-                <w:lang w:val="en-US" w:eastAsia="zh-CN" w:bidi="hi-IN"/>
-              </w:rPr>
+            </w:pPr>
+            <w:r>
               <w:t>Helped in ways to implement the project(ESP32, MQTT, sensors)</w:t>
             </w:r>
           </w:p>
           <w:p>
             <w:pPr>
               <w:pStyle w:val="normal1"/>
-              <w:widowControl/>
-              <w:suppressAutoHyphens w:val="true"/>
-              <w:spacing w:before="0" w:after="160"/>
-              <w:rPr>
-                <w:rFonts w:ascii="Calibri" w:hAnsi="Calibri" w:eastAsia="Calibri" w:cs="Calibri"/>
-                <w:kern w:val="0"/>
-                <w:sz w:val="22"/>
-                <w:szCs w:val="22"/>
-                <w:lang w:val="en-US" w:eastAsia="zh-CN" w:bidi="hi-IN"/>
-              </w:rPr>
-            </w:pPr>
-            <w:r>
-              <w:rPr>
-                <w:rFonts w:eastAsia="Calibri" w:cs="Calibri"/>
-                <w:kern w:val="0"/>
-                <w:sz w:val="22"/>
-                <w:szCs w:val="22"/>
-                <w:lang w:val="en-US" w:eastAsia="zh-CN" w:bidi="hi-IN"/>
-              </w:rPr>
+            </w:pPr>
+            <w:r>
               <w:t>Implemented  DHT11  sensor connection with ESP32(temperature &amp; humidity)</w:t>
             </w:r>
           </w:p>
           <w:p>
             <w:pPr>
               <w:pStyle w:val="BodyText"/>
-              <w:widowControl/>
-              <w:suppressAutoHyphens w:val="true"/>
-              <w:spacing w:before="0" w:after="160"/>
-              <w:rPr>
-                <w:rFonts w:ascii="Calibri" w:hAnsi="Calibri" w:eastAsia="Calibri" w:cs="Calibri"/>
-                <w:kern w:val="0"/>
-                <w:sz w:val="22"/>
-                <w:szCs w:val="22"/>
-                <w:lang w:val="en-US" w:eastAsia="zh-CN" w:bidi="hi-IN"/>
-              </w:rPr>
-            </w:pPr>
-            <w:r>
-              <w:rPr>
-                <w:rFonts w:eastAsia="Calibri" w:cs="Calibri"/>
-                <w:kern w:val="0"/>
-                <w:sz w:val="22"/>
-                <w:szCs w:val="22"/>
-                <w:lang w:val="en-US" w:eastAsia="zh-CN" w:bidi="hi-IN"/>
-              </w:rPr>
+              <w:spacing w:after="160"/>
+            </w:pPr>
+            <w:r>
               <w:t>Configured MQTT server connection with Python and data publishing (Frig1 / Frig2)</w:t>
             </w:r>
           </w:p>
           <w:p>
             <w:pPr>
               <w:pStyle w:val="BodyText"/>
-              <w:widowControl/>
-              <w:suppressAutoHyphens w:val="true"/>
-              <w:spacing w:before="0" w:after="160"/>
-              <w:rPr>
-                <w:rFonts w:ascii="Calibri" w:hAnsi="Calibri" w:eastAsia="Calibri" w:cs="Calibri"/>
-                <w:kern w:val="0"/>
-                <w:sz w:val="22"/>
-                <w:szCs w:val="22"/>
-                <w:lang w:val="en-US" w:eastAsia="zh-CN" w:bidi="hi-IN"/>
-              </w:rPr>
-            </w:pPr>
-            <w:r>
-              <w:rPr/>
+              <w:spacing w:after="160"/>
+            </w:pPr>
+            <w:r>
               <w:t>Implemented fan logic based on temperature threshold</w:t>
             </w:r>
           </w:p>
           <w:p>
             <w:pPr>
               <w:pStyle w:val="BodyText"/>
-              <w:widowControl/>
-              <w:suppressAutoHyphens w:val="true"/>
-              <w:spacing w:before="0" w:after="160"/>
-              <w:rPr>
-                <w:rFonts w:ascii="Calibri" w:hAnsi="Calibri" w:eastAsia="Calibri" w:cs="Calibri"/>
-                <w:kern w:val="0"/>
-                <w:sz w:val="22"/>
-                <w:szCs w:val="22"/>
-                <w:lang w:val="en-US" w:eastAsia="zh-CN" w:bidi="hi-IN"/>
-              </w:rPr>
-            </w:pPr>
-            <w:r>
-              <w:rPr/>
+              <w:spacing w:after="160"/>
+            </w:pPr>
+            <w:r>
               <w:t>Designed and assembled circuit</w:t>
             </w:r>
           </w:p>
           <w:p>
             <w:pPr>
               <w:pStyle w:val="BodyText"/>
-              <w:widowControl/>
-              <w:suppressAutoHyphens w:val="true"/>
-              <w:spacing w:before="0" w:after="160"/>
-              <w:rPr>
-                <w:rFonts w:ascii="Calibri" w:hAnsi="Calibri" w:eastAsia="Calibri" w:cs="Calibri"/>
-                <w:kern w:val="0"/>
-                <w:sz w:val="22"/>
-                <w:szCs w:val="22"/>
-                <w:lang w:val="en-US" w:eastAsia="zh-CN" w:bidi="hi-IN"/>
-              </w:rPr>
-            </w:pPr>
-            <w:r>
-              <w:rPr/>
+              <w:spacing w:after="160"/>
+            </w:pPr>
+            <w:r>
               <w:t>Bug Fixes</w:t>
             </w:r>
           </w:p>
@@ -1045,7 +816,7 @@
       </w:tr>
       <w:tr>
         <w:trPr>
-          <w:trHeight w:val="1340" w:hRule="atLeast"/>
+          <w:trHeight w:val="1340"/>
         </w:trPr>
         <w:tc>
           <w:tcPr>
@@ -1061,9 +832,6 @@
           <w:p>
             <w:pPr>
               <w:pStyle w:val="normal1"/>
-              <w:widowControl/>
-              <w:suppressAutoHyphens w:val="true"/>
-              <w:spacing w:before="0" w:after="160"/>
               <w:jc w:val="left"/>
               <w:rPr>
                 <w:b/>
@@ -1074,13 +842,10 @@
             </w:pPr>
             <w:r>
               <w:rPr>
-                <w:rFonts w:eastAsia="Calibri" w:cs="Calibri"/>
-                <w:b/>
-                <w:bCs/>
-                <w:kern w:val="0"/>
+                <w:b/>
+                <w:bCs/>
                 <w:sz w:val="24"/>
                 <w:szCs w:val="24"/>
-                <w:lang w:val="en-US" w:eastAsia="zh-CN" w:bidi="hi-IN"/>
               </w:rPr>
               <w:t>#2 Meerab Khan</w:t>
             </w:r>
@@ -1099,63 +864,27 @@
           <w:p>
             <w:pPr>
               <w:pStyle w:val="BodyText"/>
-              <w:widowControl/>
-              <w:suppressAutoHyphens w:val="true"/>
-              <w:spacing w:before="0" w:after="160"/>
-              <w:rPr>
-                <w:rFonts w:ascii="Calibri" w:hAnsi="Calibri" w:eastAsia="Calibri" w:cs="Calibri"/>
-                <w:kern w:val="0"/>
-                <w:sz w:val="22"/>
-                <w:szCs w:val="22"/>
-                <w:lang w:val="en-US" w:eastAsia="zh-CN" w:bidi="hi-IN"/>
-              </w:rPr>
-            </w:pPr>
-            <w:r>
-              <w:rPr>
-                <w:rFonts w:eastAsia="Calibri" w:cs="Calibri"/>
-                <w:kern w:val="0"/>
-                <w:sz w:val="22"/>
-                <w:szCs w:val="22"/>
-                <w:lang w:val="en-US" w:eastAsia="zh-CN" w:bidi="hi-IN"/>
-              </w:rPr>
+              <w:spacing w:after="160"/>
+            </w:pPr>
+            <w:r>
               <w:t>Helped with finding ways to implement the project (Python, email system, MQTT logic with 2 ESP32s)</w:t>
             </w:r>
           </w:p>
           <w:p>
             <w:pPr>
               <w:pStyle w:val="BodyText"/>
-              <w:widowControl/>
-              <w:suppressAutoHyphens w:val="true"/>
-              <w:spacing w:before="0" w:after="160"/>
-              <w:rPr>
-                <w:rFonts w:ascii="Calibri" w:hAnsi="Calibri" w:eastAsia="Calibri" w:cs="Calibri"/>
-                <w:kern w:val="0"/>
-                <w:sz w:val="22"/>
-                <w:szCs w:val="22"/>
-                <w:lang w:val="en-US" w:eastAsia="zh-CN" w:bidi="hi-IN"/>
-              </w:rPr>
-            </w:pPr>
-            <w:r>
-              <w:rPr/>
+              <w:spacing w:after="160"/>
+            </w:pPr>
+            <w:r>
               <w:t>Implemented email  system (sending alerts and receiving)</w:t>
             </w:r>
           </w:p>
           <w:p>
             <w:pPr>
               <w:pStyle w:val="BodyText"/>
-              <w:widowControl/>
-              <w:suppressAutoHyphens w:val="true"/>
-              <w:spacing w:before="0" w:after="160"/>
-              <w:rPr>
-                <w:rFonts w:ascii="Calibri" w:hAnsi="Calibri" w:eastAsia="Calibri" w:cs="Calibri"/>
-                <w:kern w:val="0"/>
-                <w:sz w:val="22"/>
-                <w:szCs w:val="22"/>
-                <w:lang w:val="en-US" w:eastAsia="zh-CN" w:bidi="hi-IN"/>
-              </w:rPr>
-            </w:pPr>
-            <w:r>
-              <w:rPr/>
+              <w:spacing w:after="160"/>
+            </w:pPr>
+            <w:r>
               <w:t>Assisted with testing hardware setup with the GUI.</w:t>
             </w:r>
           </w:p>
@@ -1163,7 +892,7 @@
       </w:tr>
       <w:tr>
         <w:trPr>
-          <w:trHeight w:val="1430" w:hRule="atLeast"/>
+          <w:trHeight w:val="1430"/>
         </w:trPr>
         <w:tc>
           <w:tcPr>
@@ -1179,9 +908,6 @@
           <w:p>
             <w:pPr>
               <w:pStyle w:val="normal1"/>
-              <w:widowControl/>
-              <w:suppressAutoHyphens w:val="true"/>
-              <w:spacing w:before="0" w:after="160"/>
               <w:jc w:val="left"/>
               <w:rPr>
                 <w:b/>
@@ -1192,13 +918,10 @@
             </w:pPr>
             <w:r>
               <w:rPr>
-                <w:rFonts w:eastAsia="Calibri" w:cs="Calibri"/>
-                <w:b/>
-                <w:bCs/>
-                <w:kern w:val="0"/>
+                <w:b/>
+                <w:bCs/>
                 <w:sz w:val="24"/>
                 <w:szCs w:val="24"/>
-                <w:lang w:val="en-US" w:eastAsia="zh-CN" w:bidi="hi-IN"/>
               </w:rPr>
               <w:t>#3 Cheng Yu Yang</w:t>
             </w:r>
@@ -1217,132 +940,67 @@
           <w:p>
             <w:pPr>
               <w:pStyle w:val="normal1"/>
-              <w:widowControl/>
-              <w:suppressAutoHyphens w:val="true"/>
-              <w:spacing w:before="0" w:after="160"/>
-              <w:rPr>
-                <w:rFonts w:ascii="Calibri" w:hAnsi="Calibri" w:eastAsia="Calibri" w:cs="Calibri"/>
-                <w:kern w:val="0"/>
-                <w:sz w:val="22"/>
-                <w:szCs w:val="22"/>
-                <w:lang w:val="en-US" w:eastAsia="zh-CN" w:bidi="hi-IN"/>
-              </w:rPr>
-            </w:pPr>
-            <w:r>
-              <w:rPr>
-                <w:rFonts w:eastAsia="Calibri" w:cs="Calibri"/>
-                <w:kern w:val="0"/>
-                <w:sz w:val="22"/>
-                <w:szCs w:val="22"/>
-                <w:lang w:val="en-US" w:eastAsia="zh-CN" w:bidi="hi-IN"/>
-              </w:rPr>
+            </w:pPr>
+            <w:r>
               <w:t>Helped in ways with finding to implement the project dashboard UI design</w:t>
             </w:r>
           </w:p>
           <w:p>
             <w:pPr>
               <w:pStyle w:val="normal1"/>
-              <w:widowControl/>
-              <w:suppressAutoHyphens w:val="true"/>
-              <w:spacing w:before="0" w:after="160"/>
-              <w:rPr>
-                <w:rFonts w:ascii="Calibri" w:hAnsi="Calibri" w:eastAsia="Calibri" w:cs="Calibri"/>
-                <w:kern w:val="0"/>
-                <w:sz w:val="22"/>
-                <w:szCs w:val="22"/>
-                <w:lang w:val="en-US" w:eastAsia="zh-CN" w:bidi="hi-IN"/>
-              </w:rPr>
-            </w:pPr>
-            <w:r>
-              <w:rPr>
-                <w:rFonts w:eastAsia="Calibri" w:cs="Calibri"/>
-                <w:kern w:val="0"/>
-                <w:sz w:val="22"/>
-                <w:szCs w:val="22"/>
-                <w:lang w:val="en-US" w:eastAsia="zh-CN" w:bidi="hi-IN"/>
-              </w:rPr>
+            </w:pPr>
+            <w:r>
+              <w:t>Implemented app routing and HTTP request logic</w:t>
+            </w:r>
+          </w:p>
+          <w:p>
+            <w:pPr>
+              <w:pStyle w:val="normal1"/>
+            </w:pPr>
+            <w:r>
               <w:t>Designed layout with gauges for temperature and humidity</w:t>
             </w:r>
           </w:p>
           <w:p>
             <w:pPr>
               <w:pStyle w:val="normal1"/>
-              <w:widowControl/>
-              <w:suppressAutoHyphens w:val="true"/>
-              <w:spacing w:before="0" w:after="160"/>
-              <w:rPr>
-                <w:rFonts w:ascii="Calibri" w:hAnsi="Calibri" w:eastAsia="Calibri" w:cs="Calibri"/>
-                <w:kern w:val="0"/>
-                <w:sz w:val="22"/>
-                <w:szCs w:val="22"/>
-                <w:lang w:val="en-US" w:eastAsia="zh-CN" w:bidi="hi-IN"/>
-              </w:rPr>
-            </w:pPr>
-            <w:r>
-              <w:rPr>
-                <w:rFonts w:eastAsia="Calibri" w:cs="Calibri"/>
-                <w:kern w:val="0"/>
-                <w:sz w:val="22"/>
-                <w:szCs w:val="22"/>
-                <w:lang w:val="en-US" w:eastAsia="zh-CN" w:bidi="hi-IN"/>
-              </w:rPr>
+            </w:pPr>
+            <w:r>
               <w:t>Displayed fan status(ON/OFF)</w:t>
             </w:r>
           </w:p>
         </w:tc>
       </w:tr>
     </w:tbl>
+    <w:p/>
     <w:p>
       <w:pPr>
-        <w:pStyle w:val="Normal"/>
-        <w:rPr/>
+        <w:pStyle w:val="normal1"/>
       </w:pPr>
-      <w:r>
-        <w:rPr/>
-      </w:r>
     </w:p>
     <w:p>
       <w:pPr>
         <w:pStyle w:val="normal1"/>
-        <w:rPr/>
       </w:pPr>
-      <w:r>
-        <w:rPr/>
-      </w:r>
-    </w:p>
-    <w:p>
-      <w:pPr>
-        <w:pStyle w:val="normal1"/>
-        <w:widowControl/>
-        <w:suppressAutoHyphens w:val="true"/>
-        <w:bidi w:val="0"/>
-        <w:spacing w:lineRule="auto" w:line="259" w:before="0" w:after="160"/>
-        <w:jc w:val="both"/>
-        <w:rPr/>
-      </w:pPr>
-      <w:r>
-        <w:rPr/>
-      </w:r>
     </w:p>
     <w:sectPr>
-      <w:type w:val="nextPage"/>
       <w:pgSz w:w="12240" w:h="15840"/>
-      <w:pgMar w:left="1440" w:right="1440" w:gutter="0" w:header="0" w:top="1440" w:footer="0" w:bottom="1440"/>
-      <w:pgNumType w:start="1" w:fmt="decimal"/>
-      <w:formProt w:val="false"/>
-      <w:textDirection w:val="lrTb"/>
-      <w:docGrid w:type="default" w:linePitch="100" w:charSpace="8192"/>
+      <w:pgMar w:top="1440" w:right="1440" w:bottom="1440" w:left="1440" w:header="0" w:footer="0" w:gutter="0"/>
+      <w:pgNumType w:start="1"/>
+      <w:cols w:space="720"/>
+      <w:formProt w:val="0"/>
+      <w:docGrid w:linePitch="100" w:charSpace="8192"/>
     </w:sectPr>
   </w:body>
 </w:document>
 </file>
 
 <file path=word/styles.xml><?xml version="1.0" encoding="utf-8"?>
-<w:styles xmlns:w="http://schemas.openxmlformats.org/wordprocessingml/2006/main" xmlns:w14="http://schemas.microsoft.com/office/word/2010/wordml" xmlns:mc="http://schemas.openxmlformats.org/markup-compatibility/2006" mc:Ignorable="w14">
+<w:styles xmlns:mc="http://schemas.openxmlformats.org/markup-compatibility/2006" xmlns:r="http://schemas.openxmlformats.org/officeDocument/2006/relationships" xmlns:w="http://schemas.openxmlformats.org/wordprocessingml/2006/main" xmlns:w14="http://schemas.microsoft.com/office/word/2010/wordml" xmlns:w15="http://schemas.microsoft.com/office/word/2012/wordml" xmlns:w16cex="http://schemas.microsoft.com/office/word/2018/wordml/cex" xmlns:w16cid="http://schemas.microsoft.com/office/word/2016/wordml/cid" xmlns:w16="http://schemas.microsoft.com/office/word/2018/wordml" xmlns:w16du="http://schemas.microsoft.com/office/word/2023/wordml/word16du" xmlns:w16sdtdh="http://schemas.microsoft.com/office/word/2020/wordml/sdtdatahash" xmlns:w16sdtfl="http://schemas.microsoft.com/office/word/2024/wordml/sdtformatlock" xmlns:w16se="http://schemas.microsoft.com/office/word/2015/wordml/symex" mc:Ignorable="w14 w15 w16se w16cid w16 w16cex w16sdtdh w16sdtfl w16du">
   <w:docDefaults>
     <w:rPrDefault>
       <w:rPr>
-        <w:rFonts w:ascii="Calibri" w:hAnsi="Calibri" w:eastAsia="Calibri" w:cs="Calibri"/>
+        <w:rFonts w:ascii="Calibri" w:eastAsia="Calibri" w:hAnsi="Calibri" w:cs="Calibri"/>
         <w:sz w:val="22"/>
         <w:szCs w:val="22"/>
         <w:lang w:val="en-US" w:eastAsia="zh-CN" w:bidi="hi-IN"/>
@@ -1350,21 +1008,21 @@
     </w:rPrDefault>
     <w:pPrDefault>
       <w:pPr>
-        <w:suppressAutoHyphens w:val="true"/>
+        <w:suppressAutoHyphens/>
       </w:pPr>
     </w:pPrDefault>
   </w:docDefaults>
   <w:latentStyles w:defLockedState="0" w:defUIPriority="99" w:defSemiHidden="0" w:defUnhideWhenUsed="0" w:defQFormat="0" w:count="376">
     <w:lsdException w:name="Normal" w:uiPriority="0" w:qFormat="1"/>
     <w:lsdException w:name="heading 1" w:uiPriority="9" w:qFormat="1"/>
-    <w:lsdException w:name="heading 2" w:uiPriority="9" w:semiHidden="1" w:unhideWhenUsed="1" w:qFormat="1"/>
-    <w:lsdException w:name="heading 3" w:uiPriority="9" w:semiHidden="1" w:unhideWhenUsed="1" w:qFormat="1"/>
-    <w:lsdException w:name="heading 4" w:uiPriority="9" w:semiHidden="1" w:unhideWhenUsed="1" w:qFormat="1"/>
-    <w:lsdException w:name="heading 5" w:uiPriority="9" w:semiHidden="1" w:unhideWhenUsed="1" w:qFormat="1"/>
-    <w:lsdException w:name="heading 6" w:uiPriority="9" w:semiHidden="1" w:unhideWhenUsed="1" w:qFormat="1"/>
-    <w:lsdException w:name="heading 7" w:uiPriority="9" w:semiHidden="1" w:unhideWhenUsed="1" w:qFormat="1"/>
-    <w:lsdException w:name="heading 8" w:uiPriority="9" w:semiHidden="1" w:unhideWhenUsed="1" w:qFormat="1"/>
-    <w:lsdException w:name="heading 9" w:uiPriority="9" w:semiHidden="1" w:unhideWhenUsed="1" w:qFormat="1"/>
+    <w:lsdException w:name="heading 2" w:semiHidden="1" w:uiPriority="9" w:unhideWhenUsed="1" w:qFormat="1"/>
+    <w:lsdException w:name="heading 3" w:semiHidden="1" w:uiPriority="9" w:unhideWhenUsed="1" w:qFormat="1"/>
+    <w:lsdException w:name="heading 4" w:semiHidden="1" w:uiPriority="9" w:unhideWhenUsed="1" w:qFormat="1"/>
+    <w:lsdException w:name="heading 5" w:semiHidden="1" w:uiPriority="9" w:unhideWhenUsed="1" w:qFormat="1"/>
+    <w:lsdException w:name="heading 6" w:semiHidden="1" w:uiPriority="9" w:unhideWhenUsed="1" w:qFormat="1"/>
+    <w:lsdException w:name="heading 7" w:semiHidden="1" w:uiPriority="9" w:unhideWhenUsed="1" w:qFormat="1"/>
+    <w:lsdException w:name="heading 8" w:semiHidden="1" w:uiPriority="9" w:unhideWhenUsed="1" w:qFormat="1"/>
+    <w:lsdException w:name="heading 9" w:semiHidden="1" w:uiPriority="9" w:unhideWhenUsed="1" w:qFormat="1"/>
     <w:lsdException w:name="index 1" w:semiHidden="1" w:unhideWhenUsed="1"/>
     <w:lsdException w:name="index 2" w:semiHidden="1" w:unhideWhenUsed="1"/>
     <w:lsdException w:name="index 3" w:semiHidden="1" w:unhideWhenUsed="1"/>
@@ -1374,22 +1032,22 @@
     <w:lsdException w:name="index 7" w:semiHidden="1" w:unhideWhenUsed="1"/>
     <w:lsdException w:name="index 8" w:semiHidden="1" w:unhideWhenUsed="1"/>
     <w:lsdException w:name="index 9" w:semiHidden="1" w:unhideWhenUsed="1"/>
-    <w:lsdException w:name="toc 1" w:uiPriority="39" w:semiHidden="1" w:unhideWhenUsed="1"/>
-    <w:lsdException w:name="toc 2" w:uiPriority="39" w:semiHidden="1" w:unhideWhenUsed="1"/>
-    <w:lsdException w:name="toc 3" w:uiPriority="39" w:semiHidden="1" w:unhideWhenUsed="1"/>
-    <w:lsdException w:name="toc 4" w:uiPriority="39" w:semiHidden="1" w:unhideWhenUsed="1"/>
-    <w:lsdException w:name="toc 5" w:uiPriority="39" w:semiHidden="1" w:unhideWhenUsed="1"/>
-    <w:lsdException w:name="toc 6" w:uiPriority="39" w:semiHidden="1" w:unhideWhenUsed="1"/>
-    <w:lsdException w:name="toc 7" w:uiPriority="39" w:semiHidden="1" w:unhideWhenUsed="1"/>
-    <w:lsdException w:name="toc 8" w:uiPriority="39" w:semiHidden="1" w:unhideWhenUsed="1"/>
-    <w:lsdException w:name="toc 9" w:uiPriority="39" w:semiHidden="1" w:unhideWhenUsed="1"/>
+    <w:lsdException w:name="toc 1" w:semiHidden="1" w:uiPriority="39" w:unhideWhenUsed="1"/>
+    <w:lsdException w:name="toc 2" w:semiHidden="1" w:uiPriority="39" w:unhideWhenUsed="1"/>
+    <w:lsdException w:name="toc 3" w:semiHidden="1" w:uiPriority="39" w:unhideWhenUsed="1"/>
+    <w:lsdException w:name="toc 4" w:semiHidden="1" w:uiPriority="39" w:unhideWhenUsed="1"/>
+    <w:lsdException w:name="toc 5" w:semiHidden="1" w:uiPriority="39" w:unhideWhenUsed="1"/>
+    <w:lsdException w:name="toc 6" w:semiHidden="1" w:uiPriority="39" w:unhideWhenUsed="1"/>
+    <w:lsdException w:name="toc 7" w:semiHidden="1" w:uiPriority="39" w:unhideWhenUsed="1"/>
+    <w:lsdException w:name="toc 8" w:semiHidden="1" w:uiPriority="39" w:unhideWhenUsed="1"/>
+    <w:lsdException w:name="toc 9" w:semiHidden="1" w:uiPriority="39" w:unhideWhenUsed="1"/>
     <w:lsdException w:name="Normal Indent" w:semiHidden="1" w:unhideWhenUsed="1"/>
     <w:lsdException w:name="footnote text" w:semiHidden="1" w:unhideWhenUsed="1"/>
     <w:lsdException w:name="annotation text" w:semiHidden="1" w:unhideWhenUsed="1"/>
     <w:lsdException w:name="header" w:semiHidden="1" w:unhideWhenUsed="1"/>
     <w:lsdException w:name="footer" w:semiHidden="1" w:unhideWhenUsed="1"/>
     <w:lsdException w:name="index heading" w:semiHidden="1" w:unhideWhenUsed="1"/>
-    <w:lsdException w:name="caption" w:uiPriority="35" w:semiHidden="1" w:unhideWhenUsed="1" w:qFormat="1"/>
+    <w:lsdException w:name="caption" w:semiHidden="1" w:uiPriority="35" w:unhideWhenUsed="1" w:qFormat="1"/>
     <w:lsdException w:name="table of figures" w:semiHidden="1" w:unhideWhenUsed="1"/>
     <w:lsdException w:name="envelope address" w:semiHidden="1" w:unhideWhenUsed="1"/>
     <w:lsdException w:name="envelope return" w:semiHidden="1" w:unhideWhenUsed="1"/>
@@ -1420,7 +1078,7 @@
     <w:lsdException w:name="Title" w:uiPriority="10" w:qFormat="1"/>
     <w:lsdException w:name="Closing" w:semiHidden="1" w:unhideWhenUsed="1"/>
     <w:lsdException w:name="Signature" w:semiHidden="1" w:unhideWhenUsed="1"/>
-    <w:lsdException w:name="Default Paragraph Font" w:uiPriority="1" w:semiHidden="1" w:unhideWhenUsed="1"/>
+    <w:lsdException w:name="Default Paragraph Font" w:semiHidden="1" w:uiPriority="1" w:unhideWhenUsed="1"/>
     <w:lsdException w:name="Body Text" w:semiHidden="1" w:unhideWhenUsed="1"/>
     <w:lsdException w:name="Body Text Indent" w:semiHidden="1" w:unhideWhenUsed="1"/>
     <w:lsdException w:name="List Continue" w:semiHidden="1" w:unhideWhenUsed="1"/>
@@ -1620,8 +1278,8 @@
     <w:lsdException w:name="Subtle Reference" w:uiPriority="31" w:qFormat="1"/>
     <w:lsdException w:name="Intense Reference" w:uiPriority="32" w:qFormat="1"/>
     <w:lsdException w:name="Book Title" w:uiPriority="33" w:qFormat="1"/>
-    <w:lsdException w:name="Bibliography" w:uiPriority="37" w:semiHidden="1" w:unhideWhenUsed="1"/>
-    <w:lsdException w:name="TOC Heading" w:uiPriority="39" w:semiHidden="1" w:unhideWhenUsed="1" w:qFormat="1"/>
+    <w:lsdException w:name="Bibliography" w:semiHidden="1" w:uiPriority="37" w:unhideWhenUsed="1"/>
+    <w:lsdException w:name="TOC Heading" w:semiHidden="1" w:uiPriority="39" w:unhideWhenUsed="1" w:qFormat="1"/>
     <w:lsdException w:name="Plain Table 1" w:uiPriority="41"/>
     <w:lsdException w:name="Plain Table 2" w:uiPriority="42"/>
     <w:lsdException w:name="Plain Table 3" w:uiPriority="43"/>
@@ -1732,24 +1390,13 @@
     <w:lsdException w:name="Unresolved Mention" w:semiHidden="1" w:unhideWhenUsed="1"/>
     <w:lsdException w:name="Smart Link" w:semiHidden="1" w:unhideWhenUsed="1"/>
   </w:latentStyles>
-  <w:style w:type="paragraph" w:styleId="Normal" w:default="1">
+  <w:style w:type="paragraph" w:default="1" w:styleId="Normal">
     <w:name w:val="Normal"/>
     <w:qFormat/>
     <w:pPr>
-      <w:widowControl/>
-      <w:suppressAutoHyphens w:val="true"/>
-      <w:bidi w:val="0"/>
-      <w:spacing w:lineRule="auto" w:line="259" w:before="0" w:after="160"/>
+      <w:spacing w:after="160" w:line="259" w:lineRule="auto"/>
       <w:jc w:val="both"/>
     </w:pPr>
-    <w:rPr>
-      <w:rFonts w:ascii="Calibri" w:hAnsi="Calibri" w:eastAsia="Calibri" w:cs="Calibri"/>
-      <w:color w:val="auto"/>
-      <w:kern w:val="0"/>
-      <w:sz w:val="22"/>
-      <w:szCs w:val="22"/>
-      <w:lang w:val="en-US" w:eastAsia="zh-CN" w:bidi="hi-IN"/>
-    </w:rPr>
   </w:style>
   <w:style w:type="paragraph" w:styleId="Heading1">
     <w:name w:val="heading 1"/>
@@ -1758,9 +1405,9 @@
     <w:uiPriority w:val="9"/>
     <w:qFormat/>
     <w:pPr>
-      <w:keepNext w:val="true"/>
+      <w:keepNext/>
       <w:keepLines/>
-      <w:spacing w:lineRule="auto" w:line="240" w:before="480" w:after="120"/>
+      <w:spacing w:before="480" w:after="120" w:line="240" w:lineRule="auto"/>
       <w:outlineLvl w:val="0"/>
     </w:pPr>
     <w:rPr>
@@ -1779,9 +1426,9 @@
     <w:unhideWhenUsed/>
     <w:qFormat/>
     <w:pPr>
-      <w:keepNext w:val="true"/>
+      <w:keepNext/>
       <w:keepLines/>
-      <w:spacing w:lineRule="auto" w:line="240" w:before="360" w:after="80"/>
+      <w:spacing w:before="360" w:after="80" w:line="240" w:lineRule="auto"/>
       <w:outlineLvl w:val="1"/>
     </w:pPr>
     <w:rPr>
@@ -1800,9 +1447,9 @@
     <w:unhideWhenUsed/>
     <w:qFormat/>
     <w:pPr>
-      <w:keepNext w:val="true"/>
+      <w:keepNext/>
       <w:keepLines/>
-      <w:spacing w:lineRule="auto" w:line="240" w:before="280" w:after="80"/>
+      <w:spacing w:before="280" w:after="80" w:line="240" w:lineRule="auto"/>
       <w:outlineLvl w:val="2"/>
     </w:pPr>
     <w:rPr>
@@ -1821,9 +1468,9 @@
     <w:unhideWhenUsed/>
     <w:qFormat/>
     <w:pPr>
-      <w:keepNext w:val="true"/>
+      <w:keepNext/>
       <w:keepLines/>
-      <w:spacing w:lineRule="auto" w:line="240" w:before="240" w:after="40"/>
+      <w:spacing w:before="240" w:after="40" w:line="240" w:lineRule="auto"/>
       <w:outlineLvl w:val="3"/>
     </w:pPr>
     <w:rPr>
@@ -1842,9 +1489,9 @@
     <w:unhideWhenUsed/>
     <w:qFormat/>
     <w:pPr>
-      <w:keepNext w:val="true"/>
+      <w:keepNext/>
       <w:keepLines/>
-      <w:spacing w:lineRule="auto" w:line="240" w:before="220" w:after="40"/>
+      <w:spacing w:before="220" w:after="40" w:line="240" w:lineRule="auto"/>
       <w:outlineLvl w:val="4"/>
     </w:pPr>
     <w:rPr>
@@ -1861,9 +1508,9 @@
     <w:unhideWhenUsed/>
     <w:qFormat/>
     <w:pPr>
-      <w:keepNext w:val="true"/>
+      <w:keepNext/>
       <w:keepLines/>
-      <w:spacing w:lineRule="auto" w:line="240" w:before="200" w:after="40"/>
+      <w:spacing w:before="200" w:after="40" w:line="240" w:lineRule="auto"/>
       <w:outlineLvl w:val="5"/>
     </w:pPr>
     <w:rPr>
@@ -1873,32 +1520,51 @@
       <w:szCs w:val="20"/>
     </w:rPr>
   </w:style>
-  <w:style w:type="character" w:styleId="DefaultParagraphFont" w:default="1">
+  <w:style w:type="character" w:default="1" w:styleId="DefaultParagraphFont">
     <w:name w:val="Default Paragraph Font"/>
     <w:uiPriority w:val="1"/>
     <w:semiHidden/>
     <w:unhideWhenUsed/>
-    <w:qFormat/>
-    <w:rPr/>
-  </w:style>
-  <w:style w:type="character" w:styleId="Bulletsuser">
+  </w:style>
+  <w:style w:type="table" w:default="1" w:styleId="TableNormal">
+    <w:name w:val="Normal Table"/>
+    <w:uiPriority w:val="99"/>
+    <w:semiHidden/>
+    <w:unhideWhenUsed/>
+    <w:tblPr>
+      <w:tblInd w:w="0" w:type="dxa"/>
+      <w:tblCellMar>
+        <w:top w:w="0" w:type="dxa"/>
+        <w:left w:w="108" w:type="dxa"/>
+        <w:bottom w:w="0" w:type="dxa"/>
+        <w:right w:w="108" w:type="dxa"/>
+      </w:tblCellMar>
+    </w:tblPr>
+  </w:style>
+  <w:style w:type="numbering" w:default="1" w:styleId="NoList">
+    <w:name w:val="No List"/>
+    <w:uiPriority w:val="99"/>
+    <w:semiHidden/>
+    <w:unhideWhenUsed/>
+  </w:style>
+  <w:style w:type="character" w:customStyle="1" w:styleId="Bulletsuser">
     <w:name w:val="Bullets (user)"/>
     <w:qFormat/>
     <w:rPr>
-      <w:rFonts w:ascii="OpenSymbol" w:hAnsi="OpenSymbol" w:eastAsia="OpenSymbol" w:cs="OpenSymbol"/>
+      <w:rFonts w:ascii="OpenSymbol" w:eastAsia="OpenSymbol" w:hAnsi="OpenSymbol" w:cs="OpenSymbol"/>
     </w:rPr>
   </w:style>
-  <w:style w:type="paragraph" w:styleId="Heading" w:customStyle="1">
+  <w:style w:type="paragraph" w:customStyle="1" w:styleId="Heading">
     <w:name w:val="Heading"/>
     <w:basedOn w:val="Normal"/>
     <w:next w:val="BodyText"/>
     <w:qFormat/>
     <w:pPr>
-      <w:keepNext w:val="true"/>
+      <w:keepNext/>
       <w:spacing w:before="240" w:after="120"/>
     </w:pPr>
     <w:rPr>
-      <w:rFonts w:ascii="Liberation Sans" w:hAnsi="Liberation Sans" w:eastAsia="Noto Sans" w:cs="FreeSans"/>
+      <w:rFonts w:ascii="Liberation Sans" w:eastAsia="Noto Sans" w:hAnsi="Liberation Sans" w:cs="FreeSans"/>
       <w:sz w:val="28"/>
       <w:szCs w:val="28"/>
     </w:rPr>
@@ -1907,14 +1573,12 @@
     <w:name w:val="Body Text"/>
     <w:basedOn w:val="Normal"/>
     <w:pPr>
-      <w:spacing w:lineRule="auto" w:line="276" w:before="0" w:after="140"/>
+      <w:spacing w:after="140" w:line="276" w:lineRule="auto"/>
     </w:pPr>
-    <w:rPr/>
   </w:style>
   <w:style w:type="paragraph" w:styleId="List">
     <w:name w:val="List"/>
     <w:basedOn w:val="BodyText"/>
-    <w:pPr/>
     <w:rPr>
       <w:rFonts w:cs="FreeSans"/>
     </w:rPr>
@@ -1935,7 +1599,7 @@
       <w:szCs w:val="24"/>
     </w:rPr>
   </w:style>
-  <w:style w:type="paragraph" w:styleId="Index" w:customStyle="1">
+  <w:style w:type="paragraph" w:customStyle="1" w:styleId="Index">
     <w:name w:val="Index"/>
     <w:basedOn w:val="Normal"/>
     <w:qFormat/>
@@ -1946,24 +1610,13 @@
       <w:rFonts w:cs="FreeSans"/>
     </w:rPr>
   </w:style>
-  <w:style w:type="paragraph" w:styleId="normal1" w:customStyle="1">
+  <w:style w:type="paragraph" w:customStyle="1" w:styleId="normal1">
     <w:name w:val="normal1"/>
     <w:qFormat/>
     <w:pPr>
-      <w:widowControl/>
-      <w:suppressAutoHyphens w:val="true"/>
-      <w:bidi w:val="0"/>
-      <w:spacing w:lineRule="auto" w:line="259" w:before="0" w:after="160"/>
+      <w:spacing w:after="160" w:line="259" w:lineRule="auto"/>
       <w:jc w:val="both"/>
     </w:pPr>
-    <w:rPr>
-      <w:rFonts w:ascii="Calibri" w:hAnsi="Calibri" w:eastAsia="Calibri" w:cs="Calibri"/>
-      <w:color w:val="auto"/>
-      <w:kern w:val="0"/>
-      <w:sz w:val="22"/>
-      <w:szCs w:val="22"/>
-      <w:lang w:val="en-US" w:eastAsia="zh-CN" w:bidi="hi-IN"/>
-    </w:rPr>
   </w:style>
   <w:style w:type="paragraph" w:styleId="Title">
     <w:name w:val="Title"/>
@@ -1972,9 +1625,9 @@
     <w:uiPriority w:val="10"/>
     <w:qFormat/>
     <w:pPr>
-      <w:keepNext w:val="true"/>
+      <w:keepNext/>
       <w:keepLines/>
-      <w:spacing w:lineRule="auto" w:line="240" w:before="480" w:after="120"/>
+      <w:spacing w:before="480" w:after="120" w:line="240" w:lineRule="auto"/>
     </w:pPr>
     <w:rPr>
       <w:b/>
@@ -1990,12 +1643,12 @@
     <w:uiPriority w:val="11"/>
     <w:qFormat/>
     <w:pPr>
-      <w:keepNext w:val="true"/>
+      <w:keepNext/>
       <w:keepLines/>
-      <w:spacing w:lineRule="auto" w:line="240" w:before="360" w:after="80"/>
+      <w:spacing w:before="360" w:after="80" w:line="240" w:lineRule="auto"/>
     </w:pPr>
     <w:rPr>
-      <w:rFonts w:ascii="Georgia" w:hAnsi="Georgia" w:eastAsia="Georgia" w:cs="Georgia"/>
+      <w:rFonts w:ascii="Georgia" w:eastAsia="Georgia" w:hAnsi="Georgia" w:cs="Georgia"/>
       <w:i/>
       <w:iCs/>
       <w:color w:val="666666"/>
@@ -2003,49 +1656,26 @@
       <w:szCs w:val="48"/>
     </w:rPr>
   </w:style>
-  <w:style w:type="paragraph" w:styleId="TableContents">
+  <w:style w:type="paragraph" w:customStyle="1" w:styleId="TableContents">
     <w:name w:val="Table Contents"/>
     <w:basedOn w:val="Normal"/>
     <w:qFormat/>
     <w:pPr>
-      <w:widowControl w:val="false"/>
+      <w:widowControl w:val="0"/>
       <w:suppressLineNumbers/>
     </w:pPr>
-    <w:rPr/>
-  </w:style>
-  <w:style w:type="paragraph" w:styleId="TableHeading">
+  </w:style>
+  <w:style w:type="paragraph" w:customStyle="1" w:styleId="TableHeading">
     <w:name w:val="Table Heading"/>
     <w:basedOn w:val="TableContents"/>
     <w:qFormat/>
     <w:pPr>
-      <w:suppressLineNumbers/>
       <w:jc w:val="center"/>
     </w:pPr>
     <w:rPr>
       <w:b/>
       <w:bCs/>
     </w:rPr>
-  </w:style>
-  <w:style w:type="numbering" w:styleId="NoList" w:default="1">
-    <w:name w:val="No List"/>
-    <w:uiPriority w:val="99"/>
-    <w:semiHidden/>
-    <w:unhideWhenUsed/>
-    <w:qFormat/>
-  </w:style>
-  <w:style w:type="table" w:default="1" w:styleId="TableNormal">
-    <w:name w:val="Normal Table"/>
-    <w:uiPriority w:val="99"/>
-    <w:semiHidden/>
-    <w:unhideWhenUsed/>
-    <w:tblPr>
-      <w:tblCellMar>
-        <w:top w:w="0" w:type="dxa"/>
-        <w:left w:w="108" w:type="dxa"/>
-        <w:bottom w:w="0" w:type="dxa"/>
-        <w:right w:w="108" w:type="dxa"/>
-      </w:tblCellMar>
-    </w:tblPr>
   </w:style>
   <w:style w:type="table" w:customStyle="1" w:styleId="TableNormal0">
     <w:name w:val="TableNormal"/>
@@ -2062,41 +1692,41 @@
 </file>
 
 <file path=word/theme/theme1.xml><?xml version="1.0" encoding="utf-8"?>
-<a:theme xmlns:a="http://schemas.openxmlformats.org/drawingml/2006/main" xmlns:r="http://schemas.openxmlformats.org/officeDocument/2006/relationships" name="Office Theme">
+<a:theme xmlns:a="http://schemas.openxmlformats.org/drawingml/2006/main" name="Office Theme">
   <a:themeElements>
     <a:clrScheme name="Office">
       <a:dk1>
         <a:srgbClr val="000000"/>
       </a:dk1>
       <a:lt1>
-        <a:srgbClr val="ffffff"/>
+        <a:srgbClr val="FFFFFF"/>
       </a:lt1>
       <a:dk2>
-        <a:srgbClr val="1f497d"/>
+        <a:srgbClr val="1F497D"/>
       </a:dk2>
       <a:lt2>
-        <a:srgbClr val="eeece1"/>
+        <a:srgbClr val="EEECE1"/>
       </a:lt2>
       <a:accent1>
-        <a:srgbClr val="4f81bd"/>
+        <a:srgbClr val="4F81BD"/>
       </a:accent1>
       <a:accent2>
-        <a:srgbClr val="c0504d"/>
+        <a:srgbClr val="C0504D"/>
       </a:accent2>
       <a:accent3>
-        <a:srgbClr val="9bbb59"/>
+        <a:srgbClr val="9BBB59"/>
       </a:accent3>
       <a:accent4>
-        <a:srgbClr val="8064a2"/>
+        <a:srgbClr val="8064A2"/>
       </a:accent4>
       <a:accent5>
-        <a:srgbClr val="4bacc6"/>
+        <a:srgbClr val="4BACC6"/>
       </a:accent5>
       <a:accent6>
-        <a:srgbClr val="f79646"/>
+        <a:srgbClr val="F79646"/>
       </a:accent6>
       <a:hlink>
-        <a:srgbClr val="0000ff"/>
+        <a:srgbClr val="0000FF"/>
       </a:hlink>
       <a:folHlink>
         <a:srgbClr val="800080"/>
@@ -2104,12 +1734,12 @@
     </a:clrScheme>
     <a:fontScheme name="Office">
       <a:majorFont>
-        <a:latin typeface="Calibri" pitchFamily="0" charset="1"/>
+        <a:latin typeface="Calibri"/>
         <a:ea typeface=""/>
         <a:cs typeface=""/>
       </a:majorFont>
       <a:minorFont>
-        <a:latin typeface="Cambria" pitchFamily="0" charset="1"/>
+        <a:latin typeface="Cambria"/>
         <a:ea typeface=""/>
         <a:cs typeface=""/>
       </a:minorFont>
@@ -2138,7 +1768,7 @@
             </a:gs>
           </a:gsLst>
           <a:lin ang="16200000" scaled="1"/>
-          <a:tileRect l="0" t="0" r="0" b="0"/>
+          <a:tileRect/>
         </a:gradFill>
         <a:gradFill>
           <a:gsLst>
@@ -2156,7 +1786,7 @@
             </a:gs>
           </a:gsLst>
           <a:lin ang="16200000" scaled="0"/>
-          <a:tileRect l="0" t="0" r="0" b="0"/>
+          <a:tileRect/>
         </a:gradFill>
       </a:fillStyleLst>
       <a:lnStyleLst>
@@ -2207,7 +1837,7 @@
           <a:path path="circle">
             <a:fillToRect l="50000" t="-80000" r="50000" b="180000"/>
           </a:path>
-          <a:tileRect l="0" t="0" r="0" b="0"/>
+          <a:tileRect/>
         </a:gradFill>
         <a:gradFill>
           <a:gsLst>
@@ -2225,10 +1855,12 @@
           <a:path path="circle">
             <a:fillToRect l="50000" t="50000" r="50000" b="50000"/>
           </a:path>
-          <a:tileRect l="0" t="0" r="0" b="0"/>
+          <a:tileRect/>
         </a:gradFill>
       </a:bgFillStyleLst>
     </a:fmtScheme>
   </a:themeElements>
+  <a:objectDefaults/>
+  <a:extraClrSchemeLst/>
 </a:theme>
 </file>
</xml_diff>

<commit_message>
Phase 3 Task Report Template
</commit_message>
<xml_diff>
--- a/Team-Tasks/TasksReport.docx
+++ b/Team-Tasks/TasksReport.docx
@@ -264,36 +264,7 @@
               <w:pStyle w:val="normal1"/>
             </w:pPr>
             <w:r>
-              <w:t xml:space="preserve">Helped with finding ways to implement the </w:t>
-            </w:r>
-            <w:proofErr w:type="gramStart"/>
-            <w:r>
-              <w:t>project(</w:t>
-            </w:r>
-            <w:proofErr w:type="spellStart"/>
-            <w:proofErr w:type="gramEnd"/>
-            <w:r>
-              <w:t>sql</w:t>
-            </w:r>
-            <w:proofErr w:type="spellEnd"/>
-            <w:r>
-              <w:t>, python/</w:t>
-            </w:r>
-            <w:proofErr w:type="spellStart"/>
-            <w:r>
-              <w:t>php</w:t>
-            </w:r>
-            <w:proofErr w:type="spellEnd"/>
-            <w:r>
-              <w:t xml:space="preserve"> </w:t>
-            </w:r>
-            <w:proofErr w:type="spellStart"/>
-            <w:r>
-              <w:t>etc</w:t>
-            </w:r>
-            <w:proofErr w:type="spellEnd"/>
-            <w:r>
-              <w:t>…)</w:t>
+              <w:t>Helped with finding ways to implement the project(sql, python/php etc…)</w:t>
             </w:r>
           </w:p>
           <w:p>
@@ -366,54 +337,15 @@
               <w:pStyle w:val="normal1"/>
             </w:pPr>
             <w:r>
-              <w:t xml:space="preserve">Helped with finding ways to implement the </w:t>
-            </w:r>
-            <w:proofErr w:type="gramStart"/>
-            <w:r>
-              <w:t>project(</w:t>
-            </w:r>
-            <w:proofErr w:type="spellStart"/>
-            <w:proofErr w:type="gramEnd"/>
-            <w:r>
-              <w:t>sql</w:t>
-            </w:r>
-            <w:proofErr w:type="spellEnd"/>
-            <w:r>
-              <w:t>, python/</w:t>
-            </w:r>
-            <w:proofErr w:type="spellStart"/>
-            <w:r>
-              <w:t>php</w:t>
-            </w:r>
-            <w:proofErr w:type="spellEnd"/>
-            <w:r>
-              <w:t xml:space="preserve"> </w:t>
-            </w:r>
-            <w:proofErr w:type="spellStart"/>
-            <w:r>
-              <w:t>etc</w:t>
-            </w:r>
-            <w:proofErr w:type="spellEnd"/>
-            <w:r>
-              <w:t>…)</w:t>
-            </w:r>
-          </w:p>
-          <w:p>
-            <w:pPr>
-              <w:pStyle w:val="normal1"/>
-            </w:pPr>
-            <w:r>
-              <w:t xml:space="preserve">Implemented the database connection in the </w:t>
-            </w:r>
-            <w:proofErr w:type="spellStart"/>
-            <w:proofErr w:type="gramStart"/>
-            <w:r>
-              <w:t>code,regex</w:t>
-            </w:r>
-            <w:proofErr w:type="spellEnd"/>
-            <w:proofErr w:type="gramEnd"/>
-            <w:r>
-              <w:t xml:space="preserve"> expressions</w:t>
+              <w:t>Helped with finding ways to implement the project(sql, python/php etc…)</w:t>
+            </w:r>
+          </w:p>
+          <w:p>
+            <w:pPr>
+              <w:pStyle w:val="normal1"/>
+            </w:pPr>
+            <w:r>
+              <w:t>Implemented the database connection in the code,regex expressions</w:t>
             </w:r>
           </w:p>
         </w:tc>
@@ -470,36 +402,7 @@
               <w:pStyle w:val="normal1"/>
             </w:pPr>
             <w:r>
-              <w:t xml:space="preserve">Helped with finding ways to implement the </w:t>
-            </w:r>
-            <w:proofErr w:type="gramStart"/>
-            <w:r>
-              <w:t>project(</w:t>
-            </w:r>
-            <w:proofErr w:type="spellStart"/>
-            <w:proofErr w:type="gramEnd"/>
-            <w:r>
-              <w:t>sql</w:t>
-            </w:r>
-            <w:proofErr w:type="spellEnd"/>
-            <w:r>
-              <w:t>, python/</w:t>
-            </w:r>
-            <w:proofErr w:type="spellStart"/>
-            <w:r>
-              <w:t>php</w:t>
-            </w:r>
-            <w:proofErr w:type="spellEnd"/>
-            <w:r>
-              <w:t xml:space="preserve"> </w:t>
-            </w:r>
-            <w:proofErr w:type="spellStart"/>
-            <w:r>
-              <w:t>etc</w:t>
-            </w:r>
-            <w:proofErr w:type="spellEnd"/>
-            <w:r>
-              <w:t>…)</w:t>
+              <w:t>Helped with finding ways to implement the project(sql, python/php etc…)</w:t>
             </w:r>
           </w:p>
           <w:p>
@@ -564,36 +467,7 @@
               <w:pStyle w:val="normal1"/>
             </w:pPr>
             <w:r>
-              <w:t xml:space="preserve">Helped with finding ways to implement the </w:t>
-            </w:r>
-            <w:proofErr w:type="gramStart"/>
-            <w:r>
-              <w:t>project(</w:t>
-            </w:r>
-            <w:proofErr w:type="spellStart"/>
-            <w:proofErr w:type="gramEnd"/>
-            <w:r>
-              <w:t>sql</w:t>
-            </w:r>
-            <w:proofErr w:type="spellEnd"/>
-            <w:r>
-              <w:t>, python/</w:t>
-            </w:r>
-            <w:proofErr w:type="spellStart"/>
-            <w:r>
-              <w:t>php</w:t>
-            </w:r>
-            <w:proofErr w:type="spellEnd"/>
-            <w:r>
-              <w:t xml:space="preserve"> </w:t>
-            </w:r>
-            <w:proofErr w:type="spellStart"/>
-            <w:r>
-              <w:t>etc</w:t>
-            </w:r>
-            <w:proofErr w:type="spellEnd"/>
-            <w:r>
-              <w:t>…)</w:t>
+              <w:t>Helped with finding ways to implement the project(sql, python/php etc…)</w:t>
             </w:r>
           </w:p>
           <w:p>
@@ -787,15 +661,7 @@
               <w:pStyle w:val="normal1"/>
             </w:pPr>
             <w:r>
-              <w:t xml:space="preserve">Helped in ways to implement the </w:t>
-            </w:r>
-            <w:proofErr w:type="gramStart"/>
-            <w:r>
-              <w:t>project(</w:t>
-            </w:r>
-            <w:proofErr w:type="gramEnd"/>
-            <w:r>
-              <w:t>ESP32, MQTT, sensors)</w:t>
+              <w:t>Helped in ways to implement the project(ESP32, MQTT, sensors)</w:t>
             </w:r>
           </w:p>
           <w:p>
@@ -1063,13 +929,7 @@
               <w:pStyle w:val="normal1"/>
             </w:pPr>
             <w:r>
-              <w:t>Implemented</w:t>
-            </w:r>
-            <w:r>
-              <w:t xml:space="preserve"> fan </w:t>
-            </w:r>
-            <w:r>
-              <w:t>toggle</w:t>
+              <w:t>Implemented fan toggle</w:t>
             </w:r>
             <w:r>
               <w:t xml:space="preserve"> (</w:t>
@@ -1087,6 +947,304 @@
         <w:pStyle w:val="normal1"/>
       </w:pPr>
     </w:p>
+    <w:p>
+      <w:pPr>
+        <w:spacing w:after="0" w:line="240" w:lineRule="auto"/>
+        <w:jc w:val="left"/>
+      </w:pPr>
+      <w:r>
+        <w:br w:type="page"/>
+      </w:r>
+    </w:p>
+    <w:p>
+      <w:pPr>
+        <w:pStyle w:val="normal1"/>
+        <w:jc w:val="right"/>
+      </w:pPr>
+      <w:r>
+        <w:rPr>
+          <w:b/>
+          <w:bCs/>
+          <w:sz w:val="28"/>
+          <w:szCs w:val="28"/>
+        </w:rPr>
+        <w:lastRenderedPageBreak/>
+        <w:t xml:space="preserve">Phase: </w:t>
+      </w:r>
+      <w:r>
+        <w:rPr>
+          <w:b/>
+          <w:bCs/>
+          <w:sz w:val="28"/>
+          <w:szCs w:val="28"/>
+        </w:rPr>
+        <w:t>3</w:t>
+      </w:r>
+    </w:p>
+    <w:tbl>
+      <w:tblPr>
+        <w:tblStyle w:val="TableNormal0"/>
+        <w:tblW w:w="9350" w:type="dxa"/>
+        <w:tblInd w:w="0" w:type="dxa"/>
+        <w:tblLayout w:type="fixed"/>
+        <w:tblCellMar>
+          <w:top w:w="0" w:type="dxa"/>
+          <w:left w:w="108" w:type="dxa"/>
+          <w:bottom w:w="0" w:type="dxa"/>
+          <w:right w:w="108" w:type="dxa"/>
+        </w:tblCellMar>
+        <w:tblLook w:val="0400" w:firstRow="0" w:lastRow="0" w:firstColumn="0" w:lastColumn="0" w:noHBand="0" w:noVBand="1"/>
+      </w:tblPr>
+      <w:tblGrid>
+        <w:gridCol w:w="3955"/>
+        <w:gridCol w:w="5395"/>
+      </w:tblGrid>
+      <w:tr>
+        <w:trPr>
+          <w:trHeight w:val="530"/>
+        </w:trPr>
+        <w:tc>
+          <w:tcPr>
+            <w:tcW w:w="3955" w:type="dxa"/>
+            <w:tcBorders>
+              <w:top w:val="single" w:sz="4" w:space="0" w:color="000000"/>
+              <w:left w:val="single" w:sz="4" w:space="0" w:color="000000"/>
+              <w:bottom w:val="single" w:sz="4" w:space="0" w:color="000000"/>
+              <w:right w:val="single" w:sz="4" w:space="0" w:color="000000"/>
+            </w:tcBorders>
+            <w:vAlign w:val="center"/>
+          </w:tcPr>
+          <w:p>
+            <w:pPr>
+              <w:pStyle w:val="normal1"/>
+              <w:jc w:val="center"/>
+              <w:rPr>
+                <w:b/>
+                <w:bCs/>
+                <w:sz w:val="32"/>
+                <w:szCs w:val="32"/>
+              </w:rPr>
+            </w:pPr>
+            <w:r>
+              <w:rPr>
+                <w:b/>
+                <w:bCs/>
+                <w:sz w:val="32"/>
+                <w:szCs w:val="32"/>
+              </w:rPr>
+              <w:t>Student name</w:t>
+            </w:r>
+          </w:p>
+        </w:tc>
+        <w:tc>
+          <w:tcPr>
+            <w:tcW w:w="5394" w:type="dxa"/>
+            <w:tcBorders>
+              <w:top w:val="single" w:sz="4" w:space="0" w:color="000000"/>
+              <w:left w:val="single" w:sz="4" w:space="0" w:color="000000"/>
+              <w:bottom w:val="single" w:sz="4" w:space="0" w:color="000000"/>
+              <w:right w:val="single" w:sz="4" w:space="0" w:color="000000"/>
+            </w:tcBorders>
+            <w:vAlign w:val="center"/>
+          </w:tcPr>
+          <w:p>
+            <w:pPr>
+              <w:pStyle w:val="normal1"/>
+              <w:jc w:val="center"/>
+              <w:rPr>
+                <w:b/>
+                <w:bCs/>
+                <w:sz w:val="32"/>
+                <w:szCs w:val="32"/>
+              </w:rPr>
+            </w:pPr>
+            <w:r>
+              <w:rPr>
+                <w:b/>
+                <w:bCs/>
+                <w:sz w:val="32"/>
+                <w:szCs w:val="32"/>
+              </w:rPr>
+              <w:t>Tasks and duties</w:t>
+            </w:r>
+          </w:p>
+        </w:tc>
+      </w:tr>
+      <w:tr>
+        <w:trPr>
+          <w:trHeight w:val="1790"/>
+        </w:trPr>
+        <w:tc>
+          <w:tcPr>
+            <w:tcW w:w="3955" w:type="dxa"/>
+            <w:tcBorders>
+              <w:top w:val="single" w:sz="4" w:space="0" w:color="000000"/>
+              <w:left w:val="single" w:sz="4" w:space="0" w:color="000000"/>
+              <w:bottom w:val="single" w:sz="4" w:space="0" w:color="000000"/>
+              <w:right w:val="single" w:sz="4" w:space="0" w:color="000000"/>
+            </w:tcBorders>
+            <w:vAlign w:val="center"/>
+          </w:tcPr>
+          <w:p>
+            <w:pPr>
+              <w:pStyle w:val="normal1"/>
+              <w:jc w:val="left"/>
+              <w:rPr>
+                <w:b/>
+                <w:bCs/>
+                <w:sz w:val="24"/>
+                <w:szCs w:val="24"/>
+              </w:rPr>
+            </w:pPr>
+            <w:r>
+              <w:rPr>
+                <w:b/>
+                <w:bCs/>
+                <w:sz w:val="24"/>
+                <w:szCs w:val="24"/>
+              </w:rPr>
+              <w:t>#1 Jonathan Markovic</w:t>
+            </w:r>
+          </w:p>
+        </w:tc>
+        <w:tc>
+          <w:tcPr>
+            <w:tcW w:w="5394" w:type="dxa"/>
+            <w:tcBorders>
+              <w:top w:val="single" w:sz="4" w:space="0" w:color="000000"/>
+              <w:left w:val="single" w:sz="4" w:space="0" w:color="000000"/>
+              <w:bottom w:val="single" w:sz="4" w:space="0" w:color="000000"/>
+              <w:right w:val="single" w:sz="4" w:space="0" w:color="000000"/>
+            </w:tcBorders>
+          </w:tcPr>
+          <w:p>
+            <w:pPr>
+              <w:pStyle w:val="BodyText"/>
+              <w:spacing w:after="160"/>
+            </w:pPr>
+            <w:r>
+              <w:t>Enter tasks</w:t>
+            </w:r>
+          </w:p>
+        </w:tc>
+      </w:tr>
+      <w:tr>
+        <w:trPr>
+          <w:trHeight w:val="1340"/>
+        </w:trPr>
+        <w:tc>
+          <w:tcPr>
+            <w:tcW w:w="3955" w:type="dxa"/>
+            <w:tcBorders>
+              <w:top w:val="single" w:sz="4" w:space="0" w:color="000000"/>
+              <w:left w:val="single" w:sz="4" w:space="0" w:color="000000"/>
+              <w:bottom w:val="single" w:sz="4" w:space="0" w:color="000000"/>
+              <w:right w:val="single" w:sz="4" w:space="0" w:color="000000"/>
+            </w:tcBorders>
+            <w:vAlign w:val="center"/>
+          </w:tcPr>
+          <w:p>
+            <w:pPr>
+              <w:pStyle w:val="normal1"/>
+              <w:jc w:val="left"/>
+              <w:rPr>
+                <w:b/>
+                <w:bCs/>
+                <w:sz w:val="24"/>
+                <w:szCs w:val="24"/>
+              </w:rPr>
+            </w:pPr>
+            <w:r>
+              <w:rPr>
+                <w:b/>
+                <w:bCs/>
+                <w:sz w:val="24"/>
+                <w:szCs w:val="24"/>
+              </w:rPr>
+              <w:t>#2 Meerab Khan</w:t>
+            </w:r>
+          </w:p>
+        </w:tc>
+        <w:tc>
+          <w:tcPr>
+            <w:tcW w:w="5394" w:type="dxa"/>
+            <w:tcBorders>
+              <w:top w:val="single" w:sz="4" w:space="0" w:color="000000"/>
+              <w:left w:val="single" w:sz="4" w:space="0" w:color="000000"/>
+              <w:bottom w:val="single" w:sz="4" w:space="0" w:color="000000"/>
+              <w:right w:val="single" w:sz="4" w:space="0" w:color="000000"/>
+            </w:tcBorders>
+          </w:tcPr>
+          <w:p>
+            <w:pPr>
+              <w:pStyle w:val="BodyText"/>
+              <w:spacing w:after="160"/>
+            </w:pPr>
+            <w:r>
+              <w:t>Enter tasks</w:t>
+            </w:r>
+          </w:p>
+        </w:tc>
+      </w:tr>
+      <w:tr>
+        <w:trPr>
+          <w:trHeight w:val="1430"/>
+        </w:trPr>
+        <w:tc>
+          <w:tcPr>
+            <w:tcW w:w="3955" w:type="dxa"/>
+            <w:tcBorders>
+              <w:top w:val="single" w:sz="4" w:space="0" w:color="000000"/>
+              <w:left w:val="single" w:sz="4" w:space="0" w:color="000000"/>
+              <w:bottom w:val="single" w:sz="4" w:space="0" w:color="000000"/>
+              <w:right w:val="single" w:sz="4" w:space="0" w:color="000000"/>
+            </w:tcBorders>
+            <w:vAlign w:val="center"/>
+          </w:tcPr>
+          <w:p>
+            <w:pPr>
+              <w:pStyle w:val="normal1"/>
+              <w:jc w:val="left"/>
+              <w:rPr>
+                <w:b/>
+                <w:bCs/>
+                <w:sz w:val="24"/>
+                <w:szCs w:val="24"/>
+              </w:rPr>
+            </w:pPr>
+            <w:r>
+              <w:rPr>
+                <w:b/>
+                <w:bCs/>
+                <w:sz w:val="24"/>
+                <w:szCs w:val="24"/>
+              </w:rPr>
+              <w:t>#3 Cheng Yu Yang</w:t>
+            </w:r>
+          </w:p>
+        </w:tc>
+        <w:tc>
+          <w:tcPr>
+            <w:tcW w:w="5394" w:type="dxa"/>
+            <w:tcBorders>
+              <w:top w:val="single" w:sz="4" w:space="0" w:color="000000"/>
+              <w:left w:val="single" w:sz="4" w:space="0" w:color="000000"/>
+              <w:bottom w:val="single" w:sz="4" w:space="0" w:color="000000"/>
+              <w:right w:val="single" w:sz="4" w:space="0" w:color="000000"/>
+            </w:tcBorders>
+          </w:tcPr>
+          <w:p>
+            <w:pPr>
+              <w:pStyle w:val="normal1"/>
+            </w:pPr>
+            <w:r>
+              <w:t>Enter tasks</w:t>
+            </w:r>
+          </w:p>
+        </w:tc>
+      </w:tr>
+    </w:tbl>
+    <w:p/>
     <w:p>
       <w:pPr>
         <w:pStyle w:val="normal1"/>
@@ -1502,6 +1660,7 @@
   <w:style w:type="paragraph" w:default="1" w:styleId="Normal">
     <w:name w:val="Normal"/>
     <w:qFormat/>
+    <w:rsid w:val="00600128"/>
     <w:pPr>
       <w:spacing w:after="160" w:line="259" w:lineRule="auto"/>
       <w:jc w:val="both"/>
@@ -1681,6 +1840,7 @@
   <w:style w:type="paragraph" w:styleId="BodyText">
     <w:name w:val="Body Text"/>
     <w:basedOn w:val="Normal"/>
+    <w:link w:val="BodyTextChar"/>
     <w:pPr>
       <w:spacing w:after="140" w:line="276" w:lineRule="auto"/>
     </w:pPr>
@@ -1796,6 +1956,12 @@
         <w:right w:w="100" w:type="dxa"/>
       </w:tblCellMar>
     </w:tblPr>
+  </w:style>
+  <w:style w:type="character" w:customStyle="1" w:styleId="BodyTextChar">
+    <w:name w:val="Body Text Char"/>
+    <w:basedOn w:val="DefaultParagraphFont"/>
+    <w:link w:val="BodyText"/>
+    <w:rsid w:val="00600128"/>
   </w:style>
 </w:styles>
 </file>

</xml_diff>

<commit_message>
feat:exported db and added my tasks
</commit_message>
<xml_diff>
--- a/Team-Tasks/TasksReport.docx
+++ b/Team-Tasks/TasksReport.docx
@@ -1,6 +1,6 @@
 
 <file path=word/document.xml><?xml version="1.0" encoding="utf-8"?>
-<w:document xmlns:wpc="http://schemas.microsoft.com/office/word/2010/wordprocessingCanvas" xmlns:cx="http://schemas.microsoft.com/office/drawing/2014/chartex" xmlns:cx1="http://schemas.microsoft.com/office/drawing/2015/9/8/chartex" xmlns:cx2="http://schemas.microsoft.com/office/drawing/2015/10/21/chartex" xmlns:cx3="http://schemas.microsoft.com/office/drawing/2016/5/9/chartex" xmlns:cx4="http://schemas.microsoft.com/office/drawing/2016/5/10/chartex" xmlns:cx5="http://schemas.microsoft.com/office/drawing/2016/5/11/chartex" xmlns:cx6="http://schemas.microsoft.com/office/drawing/2016/5/12/chartex" xmlns:cx7="http://schemas.microsoft.com/office/drawing/2016/5/13/chartex" xmlns:cx8="http://schemas.microsoft.com/office/drawing/2016/5/14/chartex" xmlns:mc="http://schemas.openxmlformats.org/markup-compatibility/2006" xmlns:aink="http://schemas.microsoft.com/office/drawing/2016/ink" xmlns:am3d="http://schemas.microsoft.com/office/drawing/2017/model3d" xmlns:o="urn:schemas-microsoft-com:office:office" xmlns:oel="http://schemas.microsoft.com/office/2019/extlst" xmlns:r="http://schemas.openxmlformats.org/officeDocument/2006/relationships" xmlns:m="http://schemas.openxmlformats.org/officeDocument/2006/math" xmlns:v="urn:schemas-microsoft-com:vml" xmlns:wp14="http://schemas.microsoft.com/office/word/2010/wordprocessingDrawing" xmlns:wp="http://schemas.openxmlformats.org/drawingml/2006/wordprocessingDrawing" xmlns:w10="urn:schemas-microsoft-com:office:word" xmlns:w="http://schemas.openxmlformats.org/wordprocessingml/2006/main" xmlns:w14="http://schemas.microsoft.com/office/word/2010/wordml" xmlns:w15="http://schemas.microsoft.com/office/word/2012/wordml" xmlns:w16cex="http://schemas.microsoft.com/office/word/2018/wordml/cex" xmlns:w16cid="http://schemas.microsoft.com/office/word/2016/wordml/cid" xmlns:w16="http://schemas.microsoft.com/office/word/2018/wordml" xmlns:w16du="http://schemas.microsoft.com/office/word/2023/wordml/word16du" xmlns:w16sdtdh="http://schemas.microsoft.com/office/word/2020/wordml/sdtdatahash" xmlns:w16sdtfl="http://schemas.microsoft.com/office/word/2024/wordml/sdtformatlock" xmlns:w16se="http://schemas.microsoft.com/office/word/2015/wordml/symex" xmlns:wpg="http://schemas.microsoft.com/office/word/2010/wordprocessingGroup" xmlns:wpi="http://schemas.microsoft.com/office/word/2010/wordprocessingInk" xmlns:wne="http://schemas.microsoft.com/office/word/2006/wordml" xmlns:wps="http://schemas.microsoft.com/office/word/2010/wordprocessingShape" mc:Ignorable="w14 w15 w16se w16cid w16 w16cex w16sdtdh w16sdtfl w16du wp14">
+<w:document xmlns:o="urn:schemas-microsoft-com:office:office" xmlns:r="http://schemas.openxmlformats.org/officeDocument/2006/relationships" xmlns:v="urn:schemas-microsoft-com:vml" xmlns:w="http://schemas.openxmlformats.org/wordprocessingml/2006/main" xmlns:w10="urn:schemas-microsoft-com:office:word" xmlns:wp="http://schemas.openxmlformats.org/drawingml/2006/wordprocessingDrawing" xmlns:pic="http://schemas.openxmlformats.org/drawingml/2006/picture" xmlns:wps="http://schemas.microsoft.com/office/word/2010/wordprocessingShape" xmlns:wpg="http://schemas.microsoft.com/office/word/2010/wordprocessingGroup" xmlns:mc="http://schemas.openxmlformats.org/markup-compatibility/2006" xmlns:wp14="http://schemas.microsoft.com/office/word/2010/wordprocessingDrawing" xmlns:w14="http://schemas.microsoft.com/office/word/2010/wordml" xmlns:w15="http://schemas.microsoft.com/office/word/2012/wordml" mc:Ignorable="w14 wp14 w15">
   <w:body>
     <w:p>
       <w:pPr>
@@ -33,6 +33,14 @@
           <w:szCs w:val="28"/>
         </w:rPr>
       </w:pPr>
+      <w:r>
+        <w:rPr>
+          <w:b/>
+          <w:bCs/>
+          <w:sz w:val="28"/>
+          <w:szCs w:val="28"/>
+        </w:rPr>
+      </w:r>
     </w:p>
     <w:p>
       <w:pPr>
@@ -64,6 +72,14 @@
           <w:szCs w:val="28"/>
         </w:rPr>
       </w:pPr>
+      <w:r>
+        <w:rPr>
+          <w:b/>
+          <w:bCs/>
+          <w:sz w:val="28"/>
+          <w:szCs w:val="28"/>
+        </w:rPr>
+      </w:r>
     </w:p>
     <w:p>
       <w:pPr>
@@ -83,32 +99,8 @@
           <w:szCs w:val="28"/>
         </w:rPr>
         <w:t>Group name: Group02</w:t>
-      </w:r>
-      <w:r>
-        <w:rPr>
-          <w:b/>
-          <w:bCs/>
-          <w:sz w:val="28"/>
-          <w:szCs w:val="28"/>
-        </w:rPr>
         <w:tab/>
-      </w:r>
-      <w:r>
-        <w:rPr>
-          <w:b/>
-          <w:bCs/>
-          <w:sz w:val="28"/>
-          <w:szCs w:val="28"/>
-        </w:rPr>
         <w:tab/>
-      </w:r>
-      <w:r>
-        <w:rPr>
-          <w:b/>
-          <w:bCs/>
-          <w:sz w:val="28"/>
-          <w:szCs w:val="28"/>
-        </w:rPr>
         <w:tab/>
         <w:t>Section name:   section 01          Phase: 1</w:t>
       </w:r>
@@ -116,12 +108,17 @@
     <w:p>
       <w:pPr>
         <w:pStyle w:val="normal1"/>
+        <w:rPr/>
       </w:pPr>
+      <w:r>
+        <w:rPr/>
+      </w:r>
     </w:p>
     <w:tbl>
       <w:tblPr>
         <w:tblStyle w:val="TableNormal0"/>
         <w:tblW w:w="9350" w:type="dxa"/>
+        <w:jc w:val="left"/>
         <w:tblInd w:w="0" w:type="dxa"/>
         <w:tblLayout w:type="fixed"/>
         <w:tblCellMar>
@@ -130,15 +127,15 @@
           <w:bottom w:w="0" w:type="dxa"/>
           <w:right w:w="108" w:type="dxa"/>
         </w:tblCellMar>
-        <w:tblLook w:val="0400" w:firstRow="0" w:lastRow="0" w:firstColumn="0" w:lastColumn="0" w:noHBand="0" w:noVBand="1"/>
+        <w:tblLook w:val="0400" w:noHBand="0" w:noVBand="1" w:firstColumn="0" w:lastRow="0" w:lastColumn="0" w:firstRow="0"/>
       </w:tblPr>
       <w:tblGrid>
         <w:gridCol w:w="3955"/>
-        <w:gridCol w:w="5395"/>
+        <w:gridCol w:w="5394"/>
       </w:tblGrid>
       <w:tr>
         <w:trPr>
-          <w:trHeight w:val="530"/>
+          <w:trHeight w:val="530" w:hRule="atLeast"/>
         </w:trPr>
         <w:tc>
           <w:tcPr>
@@ -154,6 +151,9 @@
           <w:p>
             <w:pPr>
               <w:pStyle w:val="normal1"/>
+              <w:widowControl/>
+              <w:suppressAutoHyphens w:val="true"/>
+              <w:spacing w:before="0" w:after="160"/>
               <w:jc w:val="center"/>
               <w:rPr>
                 <w:b/>
@@ -164,10 +164,13 @@
             </w:pPr>
             <w:r>
               <w:rPr>
-                <w:b/>
-                <w:bCs/>
+                <w:rFonts w:eastAsia="Calibri" w:cs="Calibri"/>
+                <w:b/>
+                <w:bCs/>
+                <w:kern w:val="0"/>
                 <w:sz w:val="32"/>
                 <w:szCs w:val="32"/>
+                <w:lang w:val="en-US" w:eastAsia="zh-CN" w:bidi="hi-IN"/>
               </w:rPr>
               <w:t>Student name</w:t>
             </w:r>
@@ -187,6 +190,9 @@
           <w:p>
             <w:pPr>
               <w:pStyle w:val="normal1"/>
+              <w:widowControl/>
+              <w:suppressAutoHyphens w:val="true"/>
+              <w:spacing w:before="0" w:after="160"/>
               <w:jc w:val="center"/>
               <w:rPr>
                 <w:b/>
@@ -197,10 +203,13 @@
             </w:pPr>
             <w:r>
               <w:rPr>
-                <w:b/>
-                <w:bCs/>
+                <w:rFonts w:eastAsia="Calibri" w:cs="Calibri"/>
+                <w:b/>
+                <w:bCs/>
+                <w:kern w:val="0"/>
                 <w:sz w:val="32"/>
                 <w:szCs w:val="32"/>
+                <w:lang w:val="en-US" w:eastAsia="zh-CN" w:bidi="hi-IN"/>
               </w:rPr>
               <w:t>Tasks and duties</w:t>
             </w:r>
@@ -209,7 +218,7 @@
       </w:tr>
       <w:tr>
         <w:trPr>
-          <w:trHeight w:val="1790"/>
+          <w:trHeight w:val="1790" w:hRule="atLeast"/>
         </w:trPr>
         <w:tc>
           <w:tcPr>
@@ -225,6 +234,9 @@
           <w:p>
             <w:pPr>
               <w:pStyle w:val="normal1"/>
+              <w:widowControl/>
+              <w:suppressAutoHyphens w:val="true"/>
+              <w:spacing w:before="0" w:after="160"/>
               <w:jc w:val="left"/>
               <w:rPr>
                 <w:b/>
@@ -235,10 +247,13 @@
             </w:pPr>
             <w:r>
               <w:rPr>
-                <w:b/>
-                <w:bCs/>
+                <w:rFonts w:eastAsia="Calibri" w:cs="Calibri"/>
+                <w:b/>
+                <w:bCs/>
+                <w:kern w:val="0"/>
                 <w:sz w:val="24"/>
                 <w:szCs w:val="24"/>
+                <w:lang w:val="en-US" w:eastAsia="zh-CN" w:bidi="hi-IN"/>
               </w:rPr>
               <w:t>#1 Jonathan Markovic</w:t>
             </w:r>
@@ -257,29 +272,99 @@
           <w:p>
             <w:pPr>
               <w:pStyle w:val="normal1"/>
-            </w:pPr>
-          </w:p>
-          <w:p>
-            <w:pPr>
-              <w:pStyle w:val="normal1"/>
-            </w:pPr>
-            <w:r>
+              <w:widowControl/>
+              <w:suppressAutoHyphens w:val="true"/>
+              <w:spacing w:before="0" w:after="160"/>
+              <w:rPr>
+                <w:rFonts w:ascii="Calibri" w:hAnsi="Calibri" w:eastAsia="Calibri" w:cs="Calibri"/>
+                <w:kern w:val="0"/>
+                <w:sz w:val="22"/>
+                <w:szCs w:val="22"/>
+                <w:lang w:val="en-US" w:eastAsia="zh-CN" w:bidi="hi-IN"/>
+              </w:rPr>
+            </w:pPr>
+            <w:r>
+              <w:rPr>
+                <w:rFonts w:eastAsia="Calibri" w:cs="Calibri"/>
+                <w:kern w:val="0"/>
+                <w:sz w:val="22"/>
+                <w:szCs w:val="22"/>
+                <w:lang w:val="en-US" w:eastAsia="zh-CN" w:bidi="hi-IN"/>
+              </w:rPr>
+            </w:r>
+          </w:p>
+          <w:p>
+            <w:pPr>
+              <w:pStyle w:val="normal1"/>
+              <w:widowControl/>
+              <w:suppressAutoHyphens w:val="true"/>
+              <w:spacing w:before="0" w:after="160"/>
+              <w:rPr>
+                <w:rFonts w:ascii="Calibri" w:hAnsi="Calibri" w:eastAsia="Calibri" w:cs="Calibri"/>
+                <w:kern w:val="0"/>
+                <w:sz w:val="22"/>
+                <w:szCs w:val="22"/>
+                <w:lang w:val="en-US" w:eastAsia="zh-CN" w:bidi="hi-IN"/>
+              </w:rPr>
+            </w:pPr>
+            <w:r>
+              <w:rPr>
+                <w:rFonts w:eastAsia="Calibri" w:cs="Calibri"/>
+                <w:kern w:val="0"/>
+                <w:sz w:val="22"/>
+                <w:szCs w:val="22"/>
+                <w:lang w:val="en-US" w:eastAsia="zh-CN" w:bidi="hi-IN"/>
+              </w:rPr>
               <w:t>Helped with finding ways to implement the project(sql, python/php etc…)</w:t>
             </w:r>
           </w:p>
           <w:p>
             <w:pPr>
               <w:pStyle w:val="normal1"/>
-            </w:pPr>
-            <w:r>
+              <w:widowControl/>
+              <w:suppressAutoHyphens w:val="true"/>
+              <w:spacing w:before="0" w:after="160"/>
+              <w:rPr>
+                <w:rFonts w:ascii="Calibri" w:hAnsi="Calibri" w:eastAsia="Calibri" w:cs="Calibri"/>
+                <w:kern w:val="0"/>
+                <w:sz w:val="22"/>
+                <w:szCs w:val="22"/>
+                <w:lang w:val="en-US" w:eastAsia="zh-CN" w:bidi="hi-IN"/>
+              </w:rPr>
+            </w:pPr>
+            <w:r>
+              <w:rPr>
+                <w:rFonts w:eastAsia="Calibri" w:cs="Calibri"/>
+                <w:kern w:val="0"/>
+                <w:sz w:val="22"/>
+                <w:szCs w:val="22"/>
+                <w:lang w:val="en-US" w:eastAsia="zh-CN" w:bidi="hi-IN"/>
+              </w:rPr>
               <w:t>Implemented the GPIO interaction in the code</w:t>
             </w:r>
           </w:p>
           <w:p>
             <w:pPr>
               <w:pStyle w:val="normal1"/>
-            </w:pPr>
-            <w:r>
+              <w:widowControl/>
+              <w:suppressAutoHyphens w:val="true"/>
+              <w:spacing w:before="0" w:after="160"/>
+              <w:rPr>
+                <w:rFonts w:ascii="Calibri" w:hAnsi="Calibri" w:eastAsia="Calibri" w:cs="Calibri"/>
+                <w:kern w:val="0"/>
+                <w:sz w:val="22"/>
+                <w:szCs w:val="22"/>
+                <w:lang w:val="en-US" w:eastAsia="zh-CN" w:bidi="hi-IN"/>
+              </w:rPr>
+            </w:pPr>
+            <w:r>
+              <w:rPr>
+                <w:rFonts w:eastAsia="Calibri" w:cs="Calibri"/>
+                <w:kern w:val="0"/>
+                <w:sz w:val="22"/>
+                <w:szCs w:val="22"/>
+                <w:lang w:val="en-US" w:eastAsia="zh-CN" w:bidi="hi-IN"/>
+              </w:rPr>
               <w:t>Bug fixes</w:t>
             </w:r>
           </w:p>
@@ -287,7 +372,7 @@
       </w:tr>
       <w:tr>
         <w:trPr>
-          <w:trHeight w:val="1340"/>
+          <w:trHeight w:val="1340" w:hRule="atLeast"/>
         </w:trPr>
         <w:tc>
           <w:tcPr>
@@ -303,6 +388,9 @@
           <w:p>
             <w:pPr>
               <w:pStyle w:val="normal1"/>
+              <w:widowControl/>
+              <w:suppressAutoHyphens w:val="true"/>
+              <w:spacing w:before="0" w:after="160"/>
               <w:jc w:val="left"/>
               <w:rPr>
                 <w:b/>
@@ -313,10 +401,13 @@
             </w:pPr>
             <w:r>
               <w:rPr>
-                <w:b/>
-                <w:bCs/>
+                <w:rFonts w:eastAsia="Calibri" w:cs="Calibri"/>
+                <w:b/>
+                <w:bCs/>
+                <w:kern w:val="0"/>
                 <w:sz w:val="24"/>
                 <w:szCs w:val="24"/>
+                <w:lang w:val="en-US" w:eastAsia="zh-CN" w:bidi="hi-IN"/>
               </w:rPr>
               <w:t>#2 Meerab Khan</w:t>
             </w:r>
@@ -335,16 +426,50 @@
           <w:p>
             <w:pPr>
               <w:pStyle w:val="normal1"/>
-            </w:pPr>
-            <w:r>
+              <w:widowControl/>
+              <w:suppressAutoHyphens w:val="true"/>
+              <w:spacing w:before="0" w:after="160"/>
+              <w:rPr>
+                <w:rFonts w:ascii="Calibri" w:hAnsi="Calibri" w:eastAsia="Calibri" w:cs="Calibri"/>
+                <w:kern w:val="0"/>
+                <w:sz w:val="22"/>
+                <w:szCs w:val="22"/>
+                <w:lang w:val="en-US" w:eastAsia="zh-CN" w:bidi="hi-IN"/>
+              </w:rPr>
+            </w:pPr>
+            <w:r>
+              <w:rPr>
+                <w:rFonts w:eastAsia="Calibri" w:cs="Calibri"/>
+                <w:kern w:val="0"/>
+                <w:sz w:val="22"/>
+                <w:szCs w:val="22"/>
+                <w:lang w:val="en-US" w:eastAsia="zh-CN" w:bidi="hi-IN"/>
+              </w:rPr>
               <w:t>Helped with finding ways to implement the project(sql, python/php etc…)</w:t>
             </w:r>
           </w:p>
           <w:p>
             <w:pPr>
               <w:pStyle w:val="normal1"/>
-            </w:pPr>
-            <w:r>
+              <w:widowControl/>
+              <w:suppressAutoHyphens w:val="true"/>
+              <w:spacing w:before="0" w:after="160"/>
+              <w:rPr>
+                <w:rFonts w:ascii="Calibri" w:hAnsi="Calibri" w:eastAsia="Calibri" w:cs="Calibri"/>
+                <w:kern w:val="0"/>
+                <w:sz w:val="22"/>
+                <w:szCs w:val="22"/>
+                <w:lang w:val="en-US" w:eastAsia="zh-CN" w:bidi="hi-IN"/>
+              </w:rPr>
+            </w:pPr>
+            <w:r>
+              <w:rPr>
+                <w:rFonts w:eastAsia="Calibri" w:cs="Calibri"/>
+                <w:kern w:val="0"/>
+                <w:sz w:val="22"/>
+                <w:szCs w:val="22"/>
+                <w:lang w:val="en-US" w:eastAsia="zh-CN" w:bidi="hi-IN"/>
+              </w:rPr>
               <w:t>Implemented the database connection in the code,regex expressions</w:t>
             </w:r>
           </w:p>
@@ -352,7 +477,7 @@
       </w:tr>
       <w:tr>
         <w:trPr>
-          <w:trHeight w:val="1430"/>
+          <w:trHeight w:val="1430" w:hRule="atLeast"/>
         </w:trPr>
         <w:tc>
           <w:tcPr>
@@ -368,6 +493,9 @@
           <w:p>
             <w:pPr>
               <w:pStyle w:val="normal1"/>
+              <w:widowControl/>
+              <w:suppressAutoHyphens w:val="true"/>
+              <w:spacing w:before="0" w:after="160"/>
               <w:jc w:val="left"/>
               <w:rPr>
                 <w:b/>
@@ -378,10 +506,13 @@
             </w:pPr>
             <w:r>
               <w:rPr>
-                <w:b/>
-                <w:bCs/>
+                <w:rFonts w:eastAsia="Calibri" w:cs="Calibri"/>
+                <w:b/>
+                <w:bCs/>
+                <w:kern w:val="0"/>
                 <w:sz w:val="24"/>
                 <w:szCs w:val="24"/>
+                <w:lang w:val="en-US" w:eastAsia="zh-CN" w:bidi="hi-IN"/>
               </w:rPr>
               <w:t>#3 Abdulmajeed Kakar</w:t>
             </w:r>
@@ -400,16 +531,50 @@
           <w:p>
             <w:pPr>
               <w:pStyle w:val="normal1"/>
-            </w:pPr>
-            <w:r>
+              <w:widowControl/>
+              <w:suppressAutoHyphens w:val="true"/>
+              <w:spacing w:before="0" w:after="160"/>
+              <w:rPr>
+                <w:rFonts w:ascii="Calibri" w:hAnsi="Calibri" w:eastAsia="Calibri" w:cs="Calibri"/>
+                <w:kern w:val="0"/>
+                <w:sz w:val="22"/>
+                <w:szCs w:val="22"/>
+                <w:lang w:val="en-US" w:eastAsia="zh-CN" w:bidi="hi-IN"/>
+              </w:rPr>
+            </w:pPr>
+            <w:r>
+              <w:rPr>
+                <w:rFonts w:eastAsia="Calibri" w:cs="Calibri"/>
+                <w:kern w:val="0"/>
+                <w:sz w:val="22"/>
+                <w:szCs w:val="22"/>
+                <w:lang w:val="en-US" w:eastAsia="zh-CN" w:bidi="hi-IN"/>
+              </w:rPr>
               <w:t>Helped with finding ways to implement the project(sql, python/php etc…)</w:t>
             </w:r>
           </w:p>
           <w:p>
             <w:pPr>
               <w:pStyle w:val="normal1"/>
-            </w:pPr>
-            <w:r>
+              <w:widowControl/>
+              <w:suppressAutoHyphens w:val="true"/>
+              <w:spacing w:before="0" w:after="160"/>
+              <w:rPr>
+                <w:rFonts w:ascii="Calibri" w:hAnsi="Calibri" w:eastAsia="Calibri" w:cs="Calibri"/>
+                <w:kern w:val="0"/>
+                <w:sz w:val="22"/>
+                <w:szCs w:val="22"/>
+                <w:lang w:val="en-US" w:eastAsia="zh-CN" w:bidi="hi-IN"/>
+              </w:rPr>
+            </w:pPr>
+            <w:r>
+              <w:rPr>
+                <w:rFonts w:eastAsia="Calibri" w:cs="Calibri"/>
+                <w:kern w:val="0"/>
+                <w:sz w:val="22"/>
+                <w:szCs w:val="22"/>
+                <w:lang w:val="en-US" w:eastAsia="zh-CN" w:bidi="hi-IN"/>
+              </w:rPr>
               <w:t>Implemented the GUI in the code</w:t>
             </w:r>
           </w:p>
@@ -417,7 +582,7 @@
       </w:tr>
       <w:tr>
         <w:trPr>
-          <w:trHeight w:val="1430"/>
+          <w:trHeight w:val="1430" w:hRule="atLeast"/>
         </w:trPr>
         <w:tc>
           <w:tcPr>
@@ -433,6 +598,9 @@
           <w:p>
             <w:pPr>
               <w:pStyle w:val="normal1"/>
+              <w:widowControl/>
+              <w:suppressAutoHyphens w:val="true"/>
+              <w:spacing w:before="0" w:after="160"/>
               <w:jc w:val="left"/>
               <w:rPr>
                 <w:b/>
@@ -443,10 +611,13 @@
             </w:pPr>
             <w:r>
               <w:rPr>
-                <w:b/>
-                <w:bCs/>
+                <w:rFonts w:eastAsia="Calibri" w:cs="Calibri"/>
+                <w:b/>
+                <w:bCs/>
+                <w:kern w:val="0"/>
                 <w:sz w:val="24"/>
                 <w:szCs w:val="24"/>
+                <w:lang w:val="en-US" w:eastAsia="zh-CN" w:bidi="hi-IN"/>
               </w:rPr>
               <w:t>#4 Cheng Yu Yang</w:t>
             </w:r>
@@ -465,24 +636,75 @@
           <w:p>
             <w:pPr>
               <w:pStyle w:val="normal1"/>
-            </w:pPr>
-            <w:r>
+              <w:widowControl/>
+              <w:suppressAutoHyphens w:val="true"/>
+              <w:spacing w:before="0" w:after="160"/>
+              <w:rPr>
+                <w:rFonts w:ascii="Calibri" w:hAnsi="Calibri" w:eastAsia="Calibri" w:cs="Calibri"/>
+                <w:kern w:val="0"/>
+                <w:sz w:val="22"/>
+                <w:szCs w:val="22"/>
+                <w:lang w:val="en-US" w:eastAsia="zh-CN" w:bidi="hi-IN"/>
+              </w:rPr>
+            </w:pPr>
+            <w:r>
+              <w:rPr>
+                <w:rFonts w:eastAsia="Calibri" w:cs="Calibri"/>
+                <w:kern w:val="0"/>
+                <w:sz w:val="22"/>
+                <w:szCs w:val="22"/>
+                <w:lang w:val="en-US" w:eastAsia="zh-CN" w:bidi="hi-IN"/>
+              </w:rPr>
               <w:t>Helped with finding ways to implement the project(sql, python/php etc…)</w:t>
             </w:r>
           </w:p>
           <w:p>
             <w:pPr>
               <w:pStyle w:val="normal1"/>
-            </w:pPr>
-            <w:r>
+              <w:widowControl/>
+              <w:suppressAutoHyphens w:val="true"/>
+              <w:spacing w:before="0" w:after="160"/>
+              <w:rPr>
+                <w:rFonts w:ascii="Calibri" w:hAnsi="Calibri" w:eastAsia="Calibri" w:cs="Calibri"/>
+                <w:kern w:val="0"/>
+                <w:sz w:val="22"/>
+                <w:szCs w:val="22"/>
+                <w:lang w:val="en-US" w:eastAsia="zh-CN" w:bidi="hi-IN"/>
+              </w:rPr>
+            </w:pPr>
+            <w:r>
+              <w:rPr>
+                <w:rFonts w:eastAsia="Calibri" w:cs="Calibri"/>
+                <w:kern w:val="0"/>
+                <w:sz w:val="22"/>
+                <w:szCs w:val="22"/>
+                <w:lang w:val="en-US" w:eastAsia="zh-CN" w:bidi="hi-IN"/>
+              </w:rPr>
               <w:t>Found solution for replacing slim framework since we were having issues.</w:t>
             </w:r>
           </w:p>
           <w:p>
             <w:pPr>
               <w:pStyle w:val="normal1"/>
-            </w:pPr>
-            <w:r>
+              <w:widowControl/>
+              <w:suppressAutoHyphens w:val="true"/>
+              <w:spacing w:before="0" w:after="160"/>
+              <w:rPr>
+                <w:rFonts w:ascii="Calibri" w:hAnsi="Calibri" w:eastAsia="Calibri" w:cs="Calibri"/>
+                <w:kern w:val="0"/>
+                <w:sz w:val="22"/>
+                <w:szCs w:val="22"/>
+                <w:lang w:val="en-US" w:eastAsia="zh-CN" w:bidi="hi-IN"/>
+              </w:rPr>
+            </w:pPr>
+            <w:r>
+              <w:rPr>
+                <w:rFonts w:eastAsia="Calibri" w:cs="Calibri"/>
+                <w:kern w:val="0"/>
+                <w:sz w:val="22"/>
+                <w:szCs w:val="22"/>
+                <w:lang w:val="en-US" w:eastAsia="zh-CN" w:bidi="hi-IN"/>
+              </w:rPr>
               <w:t>Working on Converting the interface to HTML</w:t>
             </w:r>
           </w:p>
@@ -492,22 +714,35 @@
     <w:p>
       <w:pPr>
         <w:pStyle w:val="normal1"/>
+        <w:rPr/>
       </w:pPr>
+      <w:r>
+        <w:rPr/>
+      </w:r>
     </w:p>
     <w:p>
       <w:pPr>
         <w:pStyle w:val="normal1"/>
+        <w:rPr/>
       </w:pPr>
+      <w:r>
+        <w:rPr/>
+      </w:r>
     </w:p>
     <w:p>
       <w:pPr>
         <w:pStyle w:val="normal1"/>
+        <w:rPr/>
       </w:pPr>
+      <w:r>
+        <w:rPr/>
+      </w:r>
     </w:p>
     <w:p>
       <w:pPr>
         <w:pStyle w:val="normal1"/>
         <w:jc w:val="right"/>
+        <w:rPr/>
       </w:pPr>
       <w:r>
         <w:rPr>
@@ -516,7 +751,6 @@
           <w:sz w:val="28"/>
           <w:szCs w:val="28"/>
         </w:rPr>
-        <w:lastRenderedPageBreak/>
         <w:t>Phase: 2</w:t>
       </w:r>
     </w:p>
@@ -524,6 +758,7 @@
       <w:tblPr>
         <w:tblStyle w:val="TableNormal0"/>
         <w:tblW w:w="9350" w:type="dxa"/>
+        <w:jc w:val="left"/>
         <w:tblInd w:w="0" w:type="dxa"/>
         <w:tblLayout w:type="fixed"/>
         <w:tblCellMar>
@@ -532,15 +767,15 @@
           <w:bottom w:w="0" w:type="dxa"/>
           <w:right w:w="108" w:type="dxa"/>
         </w:tblCellMar>
-        <w:tblLook w:val="0400" w:firstRow="0" w:lastRow="0" w:firstColumn="0" w:lastColumn="0" w:noHBand="0" w:noVBand="1"/>
+        <w:tblLook w:val="0400" w:noHBand="0" w:noVBand="1" w:firstColumn="0" w:lastRow="0" w:lastColumn="0" w:firstRow="0"/>
       </w:tblPr>
       <w:tblGrid>
         <w:gridCol w:w="3955"/>
-        <w:gridCol w:w="5395"/>
+        <w:gridCol w:w="5394"/>
       </w:tblGrid>
       <w:tr>
         <w:trPr>
-          <w:trHeight w:val="530"/>
+          <w:trHeight w:val="530" w:hRule="atLeast"/>
         </w:trPr>
         <w:tc>
           <w:tcPr>
@@ -556,6 +791,9 @@
           <w:p>
             <w:pPr>
               <w:pStyle w:val="normal1"/>
+              <w:widowControl/>
+              <w:suppressAutoHyphens w:val="true"/>
+              <w:spacing w:before="0" w:after="160"/>
               <w:jc w:val="center"/>
               <w:rPr>
                 <w:b/>
@@ -566,10 +804,13 @@
             </w:pPr>
             <w:r>
               <w:rPr>
-                <w:b/>
-                <w:bCs/>
+                <w:rFonts w:eastAsia="Calibri" w:cs="Calibri"/>
+                <w:b/>
+                <w:bCs/>
+                <w:kern w:val="0"/>
                 <w:sz w:val="32"/>
                 <w:szCs w:val="32"/>
+                <w:lang w:val="en-US" w:eastAsia="zh-CN" w:bidi="hi-IN"/>
               </w:rPr>
               <w:t>Student name</w:t>
             </w:r>
@@ -589,6 +830,9 @@
           <w:p>
             <w:pPr>
               <w:pStyle w:val="normal1"/>
+              <w:widowControl/>
+              <w:suppressAutoHyphens w:val="true"/>
+              <w:spacing w:before="0" w:after="160"/>
               <w:jc w:val="center"/>
               <w:rPr>
                 <w:b/>
@@ -599,10 +843,13 @@
             </w:pPr>
             <w:r>
               <w:rPr>
-                <w:b/>
-                <w:bCs/>
+                <w:rFonts w:eastAsia="Calibri" w:cs="Calibri"/>
+                <w:b/>
+                <w:bCs/>
+                <w:kern w:val="0"/>
                 <w:sz w:val="32"/>
                 <w:szCs w:val="32"/>
+                <w:lang w:val="en-US" w:eastAsia="zh-CN" w:bidi="hi-IN"/>
               </w:rPr>
               <w:t>Tasks and duties</w:t>
             </w:r>
@@ -611,7 +858,7 @@
       </w:tr>
       <w:tr>
         <w:trPr>
-          <w:trHeight w:val="1790"/>
+          <w:trHeight w:val="1790" w:hRule="atLeast"/>
         </w:trPr>
         <w:tc>
           <w:tcPr>
@@ -627,6 +874,9 @@
           <w:p>
             <w:pPr>
               <w:pStyle w:val="normal1"/>
+              <w:widowControl/>
+              <w:suppressAutoHyphens w:val="true"/>
+              <w:spacing w:before="0" w:after="160"/>
               <w:jc w:val="left"/>
               <w:rPr>
                 <w:b/>
@@ -637,10 +887,13 @@
             </w:pPr>
             <w:r>
               <w:rPr>
-                <w:b/>
-                <w:bCs/>
+                <w:rFonts w:eastAsia="Calibri" w:cs="Calibri"/>
+                <w:b/>
+                <w:bCs/>
+                <w:kern w:val="0"/>
                 <w:sz w:val="24"/>
                 <w:szCs w:val="24"/>
+                <w:lang w:val="en-US" w:eastAsia="zh-CN" w:bidi="hi-IN"/>
               </w:rPr>
               <w:t>#1 Jonathan Markovic</w:t>
             </w:r>
@@ -659,64 +912,150 @@
           <w:p>
             <w:pPr>
               <w:pStyle w:val="normal1"/>
-            </w:pPr>
-            <w:r>
+              <w:widowControl/>
+              <w:suppressAutoHyphens w:val="true"/>
+              <w:spacing w:before="0" w:after="160"/>
+              <w:rPr>
+                <w:rFonts w:ascii="Calibri" w:hAnsi="Calibri" w:eastAsia="Calibri" w:cs="Calibri"/>
+                <w:kern w:val="0"/>
+                <w:sz w:val="22"/>
+                <w:szCs w:val="22"/>
+                <w:lang w:val="en-US" w:eastAsia="zh-CN" w:bidi="hi-IN"/>
+              </w:rPr>
+            </w:pPr>
+            <w:r>
+              <w:rPr>
+                <w:rFonts w:eastAsia="Calibri" w:cs="Calibri"/>
+                <w:kern w:val="0"/>
+                <w:sz w:val="22"/>
+                <w:szCs w:val="22"/>
+                <w:lang w:val="en-US" w:eastAsia="zh-CN" w:bidi="hi-IN"/>
+              </w:rPr>
               <w:t>Helped in ways to implement the project(ESP32, MQTT, sensors)</w:t>
             </w:r>
           </w:p>
           <w:p>
             <w:pPr>
               <w:pStyle w:val="normal1"/>
-            </w:pPr>
-            <w:r>
-              <w:t>Implemented</w:t>
-            </w:r>
-            <w:r>
-              <w:t xml:space="preserve"> D</w:t>
-            </w:r>
-            <w:r>
-              <w:t>HT11</w:t>
-            </w:r>
-            <w:r>
-              <w:t xml:space="preserve"> </w:t>
-            </w:r>
-            <w:r>
-              <w:t>sensor connection with ESP32(temperature &amp; humidity)</w:t>
+              <w:widowControl/>
+              <w:suppressAutoHyphens w:val="true"/>
+              <w:spacing w:before="0" w:after="160"/>
+              <w:rPr>
+                <w:rFonts w:ascii="Calibri" w:hAnsi="Calibri" w:eastAsia="Calibri" w:cs="Calibri"/>
+                <w:kern w:val="0"/>
+                <w:sz w:val="22"/>
+                <w:szCs w:val="22"/>
+                <w:lang w:val="en-US" w:eastAsia="zh-CN" w:bidi="hi-IN"/>
+              </w:rPr>
+            </w:pPr>
+            <w:r>
+              <w:rPr>
+                <w:rFonts w:eastAsia="Calibri" w:cs="Calibri"/>
+                <w:kern w:val="0"/>
+                <w:sz w:val="22"/>
+                <w:szCs w:val="22"/>
+                <w:lang w:val="en-US" w:eastAsia="zh-CN" w:bidi="hi-IN"/>
+              </w:rPr>
+              <w:t>Implemented DHT11 sensor connection with ESP32(temperature &amp; humidity)</w:t>
             </w:r>
           </w:p>
           <w:p>
             <w:pPr>
               <w:pStyle w:val="BodyText"/>
-              <w:spacing w:after="160"/>
-            </w:pPr>
-            <w:r>
+              <w:widowControl/>
+              <w:suppressAutoHyphens w:val="true"/>
+              <w:spacing w:before="0" w:after="160"/>
+              <w:rPr>
+                <w:rFonts w:ascii="Calibri" w:hAnsi="Calibri" w:eastAsia="Calibri" w:cs="Calibri"/>
+                <w:kern w:val="0"/>
+                <w:sz w:val="22"/>
+                <w:szCs w:val="22"/>
+                <w:lang w:val="en-US" w:eastAsia="zh-CN" w:bidi="hi-IN"/>
+              </w:rPr>
+            </w:pPr>
+            <w:r>
+              <w:rPr>
+                <w:rFonts w:eastAsia="Calibri" w:cs="Calibri"/>
+                <w:kern w:val="0"/>
+                <w:sz w:val="22"/>
+                <w:szCs w:val="22"/>
+                <w:lang w:val="en-US" w:eastAsia="zh-CN" w:bidi="hi-IN"/>
+              </w:rPr>
               <w:t>Configured MQTT server connection with Python and data publishing (Frig1 / Frig2)</w:t>
             </w:r>
           </w:p>
           <w:p>
             <w:pPr>
               <w:pStyle w:val="BodyText"/>
-              <w:spacing w:after="160"/>
-            </w:pPr>
-            <w:r>
+              <w:widowControl/>
+              <w:suppressAutoHyphens w:val="true"/>
+              <w:spacing w:before="0" w:after="160"/>
+              <w:rPr>
+                <w:rFonts w:ascii="Calibri" w:hAnsi="Calibri" w:eastAsia="Calibri" w:cs="Calibri"/>
+                <w:kern w:val="0"/>
+                <w:sz w:val="22"/>
+                <w:szCs w:val="22"/>
+                <w:lang w:val="en-US" w:eastAsia="zh-CN" w:bidi="hi-IN"/>
+              </w:rPr>
+            </w:pPr>
+            <w:r>
+              <w:rPr>
+                <w:rFonts w:eastAsia="Calibri" w:cs="Calibri"/>
+                <w:kern w:val="0"/>
+                <w:sz w:val="22"/>
+                <w:szCs w:val="22"/>
+                <w:lang w:val="en-US" w:eastAsia="zh-CN" w:bidi="hi-IN"/>
+              </w:rPr>
               <w:t>Implemented fan logic based on temperature threshold</w:t>
             </w:r>
           </w:p>
           <w:p>
             <w:pPr>
               <w:pStyle w:val="BodyText"/>
-              <w:spacing w:after="160"/>
-            </w:pPr>
-            <w:r>
+              <w:widowControl/>
+              <w:suppressAutoHyphens w:val="true"/>
+              <w:spacing w:before="0" w:after="160"/>
+              <w:rPr>
+                <w:rFonts w:ascii="Calibri" w:hAnsi="Calibri" w:eastAsia="Calibri" w:cs="Calibri"/>
+                <w:kern w:val="0"/>
+                <w:sz w:val="22"/>
+                <w:szCs w:val="22"/>
+                <w:lang w:val="en-US" w:eastAsia="zh-CN" w:bidi="hi-IN"/>
+              </w:rPr>
+            </w:pPr>
+            <w:r>
+              <w:rPr>
+                <w:rFonts w:eastAsia="Calibri" w:cs="Calibri"/>
+                <w:kern w:val="0"/>
+                <w:sz w:val="22"/>
+                <w:szCs w:val="22"/>
+                <w:lang w:val="en-US" w:eastAsia="zh-CN" w:bidi="hi-IN"/>
+              </w:rPr>
               <w:t>Designed and assembled circuit</w:t>
             </w:r>
           </w:p>
           <w:p>
             <w:pPr>
               <w:pStyle w:val="BodyText"/>
-              <w:spacing w:after="160"/>
-            </w:pPr>
-            <w:r>
+              <w:widowControl/>
+              <w:suppressAutoHyphens w:val="true"/>
+              <w:spacing w:before="0" w:after="160"/>
+              <w:rPr>
+                <w:rFonts w:ascii="Calibri" w:hAnsi="Calibri" w:eastAsia="Calibri" w:cs="Calibri"/>
+                <w:kern w:val="0"/>
+                <w:sz w:val="22"/>
+                <w:szCs w:val="22"/>
+                <w:lang w:val="en-US" w:eastAsia="zh-CN" w:bidi="hi-IN"/>
+              </w:rPr>
+            </w:pPr>
+            <w:r>
+              <w:rPr>
+                <w:rFonts w:eastAsia="Calibri" w:cs="Calibri"/>
+                <w:kern w:val="0"/>
+                <w:sz w:val="22"/>
+                <w:szCs w:val="22"/>
+                <w:lang w:val="en-US" w:eastAsia="zh-CN" w:bidi="hi-IN"/>
+              </w:rPr>
               <w:t>Bug Fixes</w:t>
             </w:r>
           </w:p>
@@ -724,7 +1063,7 @@
       </w:tr>
       <w:tr>
         <w:trPr>
-          <w:trHeight w:val="1340"/>
+          <w:trHeight w:val="1340" w:hRule="atLeast"/>
         </w:trPr>
         <w:tc>
           <w:tcPr>
@@ -740,6 +1079,9 @@
           <w:p>
             <w:pPr>
               <w:pStyle w:val="normal1"/>
+              <w:widowControl/>
+              <w:suppressAutoHyphens w:val="true"/>
+              <w:spacing w:before="0" w:after="160"/>
               <w:jc w:val="left"/>
               <w:rPr>
                 <w:b/>
@@ -750,10 +1092,13 @@
             </w:pPr>
             <w:r>
               <w:rPr>
-                <w:b/>
-                <w:bCs/>
+                <w:rFonts w:eastAsia="Calibri" w:cs="Calibri"/>
+                <w:b/>
+                <w:bCs/>
+                <w:kern w:val="0"/>
                 <w:sz w:val="24"/>
                 <w:szCs w:val="24"/>
+                <w:lang w:val="en-US" w:eastAsia="zh-CN" w:bidi="hi-IN"/>
               </w:rPr>
               <w:t>#2 Meerab Khan</w:t>
             </w:r>
@@ -772,51 +1117,100 @@
           <w:p>
             <w:pPr>
               <w:pStyle w:val="BodyText"/>
-              <w:spacing w:after="160"/>
-            </w:pPr>
-            <w:r>
+              <w:widowControl/>
+              <w:suppressAutoHyphens w:val="true"/>
+              <w:spacing w:before="0" w:after="160"/>
+              <w:rPr>
+                <w:rFonts w:ascii="Calibri" w:hAnsi="Calibri" w:eastAsia="Calibri" w:cs="Calibri"/>
+                <w:kern w:val="0"/>
+                <w:sz w:val="22"/>
+                <w:szCs w:val="22"/>
+                <w:lang w:val="en-US" w:eastAsia="zh-CN" w:bidi="hi-IN"/>
+              </w:rPr>
+            </w:pPr>
+            <w:r>
+              <w:rPr>
+                <w:rFonts w:eastAsia="Calibri" w:cs="Calibri"/>
+                <w:kern w:val="0"/>
+                <w:sz w:val="22"/>
+                <w:szCs w:val="22"/>
+                <w:lang w:val="en-US" w:eastAsia="zh-CN" w:bidi="hi-IN"/>
+              </w:rPr>
               <w:t>Helped with finding ways to implement the project (Python, email system, MQTT logic with 2 ESP32s)</w:t>
             </w:r>
           </w:p>
           <w:p>
             <w:pPr>
               <w:pStyle w:val="BodyText"/>
-              <w:spacing w:after="160"/>
-            </w:pPr>
-            <w:r>
-              <w:t xml:space="preserve">Implemented </w:t>
-            </w:r>
-            <w:r>
-              <w:t>email system</w:t>
-            </w:r>
-            <w:r>
-              <w:t xml:space="preserve"> (sending alerts and receiving</w:t>
-            </w:r>
-            <w:r>
-              <w:t xml:space="preserve"> with fan activation</w:t>
-            </w:r>
-            <w:r>
-              <w:t>)</w:t>
-            </w:r>
-            <w:r>
-              <w:t xml:space="preserve"> </w:t>
+              <w:widowControl/>
+              <w:suppressAutoHyphens w:val="true"/>
+              <w:spacing w:before="0" w:after="160"/>
+              <w:rPr>
+                <w:rFonts w:ascii="Calibri" w:hAnsi="Calibri" w:eastAsia="Calibri" w:cs="Calibri"/>
+                <w:kern w:val="0"/>
+                <w:sz w:val="22"/>
+                <w:szCs w:val="22"/>
+                <w:lang w:val="en-US" w:eastAsia="zh-CN" w:bidi="hi-IN"/>
+              </w:rPr>
+            </w:pPr>
+            <w:r>
+              <w:rPr>
+                <w:rFonts w:eastAsia="Calibri" w:cs="Calibri"/>
+                <w:kern w:val="0"/>
+                <w:sz w:val="22"/>
+                <w:szCs w:val="22"/>
+                <w:lang w:val="en-US" w:eastAsia="zh-CN" w:bidi="hi-IN"/>
+              </w:rPr>
+              <w:t>Implemented email system (sending alerts and receiving with fan activation)</w:t>
             </w:r>
           </w:p>
           <w:p>
             <w:pPr>
               <w:pStyle w:val="BodyText"/>
-              <w:spacing w:after="160"/>
-            </w:pPr>
-            <w:r>
+              <w:widowControl/>
+              <w:suppressAutoHyphens w:val="true"/>
+              <w:spacing w:before="0" w:after="160"/>
+              <w:rPr>
+                <w:rFonts w:ascii="Calibri" w:hAnsi="Calibri" w:eastAsia="Calibri" w:cs="Calibri"/>
+                <w:kern w:val="0"/>
+                <w:sz w:val="22"/>
+                <w:szCs w:val="22"/>
+                <w:lang w:val="en-US" w:eastAsia="zh-CN" w:bidi="hi-IN"/>
+              </w:rPr>
+            </w:pPr>
+            <w:r>
+              <w:rPr>
+                <w:rFonts w:eastAsia="Calibri" w:cs="Calibri"/>
+                <w:kern w:val="0"/>
+                <w:sz w:val="22"/>
+                <w:szCs w:val="22"/>
+                <w:lang w:val="en-US" w:eastAsia="zh-CN" w:bidi="hi-IN"/>
+              </w:rPr>
               <w:t>Implemented threshold values stored in database</w:t>
             </w:r>
           </w:p>
           <w:p>
             <w:pPr>
               <w:pStyle w:val="BodyText"/>
-              <w:spacing w:after="160"/>
-            </w:pPr>
-            <w:r>
+              <w:widowControl/>
+              <w:suppressAutoHyphens w:val="true"/>
+              <w:spacing w:before="0" w:after="160"/>
+              <w:rPr>
+                <w:rFonts w:ascii="Calibri" w:hAnsi="Calibri" w:eastAsia="Calibri" w:cs="Calibri"/>
+                <w:kern w:val="0"/>
+                <w:sz w:val="22"/>
+                <w:szCs w:val="22"/>
+                <w:lang w:val="en-US" w:eastAsia="zh-CN" w:bidi="hi-IN"/>
+              </w:rPr>
+            </w:pPr>
+            <w:r>
+              <w:rPr>
+                <w:rFonts w:eastAsia="Calibri" w:cs="Calibri"/>
+                <w:kern w:val="0"/>
+                <w:sz w:val="22"/>
+                <w:szCs w:val="22"/>
+                <w:lang w:val="en-US" w:eastAsia="zh-CN" w:bidi="hi-IN"/>
+              </w:rPr>
               <w:t>Assisted with testing hardware setup with the GUI.</w:t>
             </w:r>
           </w:p>
@@ -824,7 +1218,7 @@
       </w:tr>
       <w:tr>
         <w:trPr>
-          <w:trHeight w:val="1430"/>
+          <w:trHeight w:val="1430" w:hRule="atLeast"/>
         </w:trPr>
         <w:tc>
           <w:tcPr>
@@ -840,6 +1234,9 @@
           <w:p>
             <w:pPr>
               <w:pStyle w:val="normal1"/>
+              <w:widowControl/>
+              <w:suppressAutoHyphens w:val="true"/>
+              <w:spacing w:before="0" w:after="160"/>
               <w:jc w:val="left"/>
               <w:rPr>
                 <w:b/>
@@ -850,10 +1247,13 @@
             </w:pPr>
             <w:r>
               <w:rPr>
-                <w:b/>
-                <w:bCs/>
+                <w:rFonts w:eastAsia="Calibri" w:cs="Calibri"/>
+                <w:b/>
+                <w:bCs/>
+                <w:kern w:val="0"/>
                 <w:sz w:val="24"/>
                 <w:szCs w:val="24"/>
+                <w:lang w:val="en-US" w:eastAsia="zh-CN" w:bidi="hi-IN"/>
               </w:rPr>
               <w:t>#3 Cheng Yu Yang</w:t>
             </w:r>
@@ -872,86 +1272,184 @@
           <w:p>
             <w:pPr>
               <w:pStyle w:val="normal1"/>
-            </w:pPr>
-            <w:r>
+              <w:widowControl/>
+              <w:suppressAutoHyphens w:val="true"/>
+              <w:spacing w:before="0" w:after="160"/>
+              <w:rPr>
+                <w:rFonts w:ascii="Calibri" w:hAnsi="Calibri" w:eastAsia="Calibri" w:cs="Calibri"/>
+                <w:kern w:val="0"/>
+                <w:sz w:val="22"/>
+                <w:szCs w:val="22"/>
+                <w:lang w:val="en-US" w:eastAsia="zh-CN" w:bidi="hi-IN"/>
+              </w:rPr>
+            </w:pPr>
+            <w:r>
+              <w:rPr>
+                <w:rFonts w:eastAsia="Calibri" w:cs="Calibri"/>
+                <w:kern w:val="0"/>
+                <w:sz w:val="22"/>
+                <w:szCs w:val="22"/>
+                <w:lang w:val="en-US" w:eastAsia="zh-CN" w:bidi="hi-IN"/>
+              </w:rPr>
               <w:t>Created flask server application and HTML templates</w:t>
             </w:r>
           </w:p>
           <w:p>
             <w:pPr>
               <w:pStyle w:val="normal1"/>
-            </w:pPr>
-            <w:r>
-              <w:t xml:space="preserve">Styled pages using </w:t>
-            </w:r>
-            <w:r>
-              <w:t xml:space="preserve">custom </w:t>
-            </w:r>
-            <w:r>
-              <w:t>CSS</w:t>
-            </w:r>
-          </w:p>
-          <w:p>
-            <w:pPr>
-              <w:pStyle w:val="normal1"/>
-            </w:pPr>
-            <w:r>
+              <w:widowControl/>
+              <w:suppressAutoHyphens w:val="true"/>
+              <w:spacing w:before="0" w:after="160"/>
+              <w:rPr>
+                <w:rFonts w:ascii="Calibri" w:hAnsi="Calibri" w:eastAsia="Calibri" w:cs="Calibri"/>
+                <w:kern w:val="0"/>
+                <w:sz w:val="22"/>
+                <w:szCs w:val="22"/>
+                <w:lang w:val="en-US" w:eastAsia="zh-CN" w:bidi="hi-IN"/>
+              </w:rPr>
+            </w:pPr>
+            <w:r>
+              <w:rPr>
+                <w:rFonts w:eastAsia="Calibri" w:cs="Calibri"/>
+                <w:kern w:val="0"/>
+                <w:sz w:val="22"/>
+                <w:szCs w:val="22"/>
+                <w:lang w:val="en-US" w:eastAsia="zh-CN" w:bidi="hi-IN"/>
+              </w:rPr>
+              <w:t>Styled pages using custom CSS</w:t>
+            </w:r>
+          </w:p>
+          <w:p>
+            <w:pPr>
+              <w:pStyle w:val="normal1"/>
+              <w:widowControl/>
+              <w:suppressAutoHyphens w:val="true"/>
+              <w:spacing w:before="0" w:after="160"/>
+              <w:rPr>
+                <w:rFonts w:ascii="Calibri" w:hAnsi="Calibri" w:eastAsia="Calibri" w:cs="Calibri"/>
+                <w:kern w:val="0"/>
+                <w:sz w:val="22"/>
+                <w:szCs w:val="22"/>
+                <w:lang w:val="en-US" w:eastAsia="zh-CN" w:bidi="hi-IN"/>
+              </w:rPr>
+            </w:pPr>
+            <w:r>
+              <w:rPr>
+                <w:rFonts w:eastAsia="Calibri" w:cs="Calibri"/>
+                <w:kern w:val="0"/>
+                <w:sz w:val="22"/>
+                <w:szCs w:val="22"/>
+                <w:lang w:val="en-US" w:eastAsia="zh-CN" w:bidi="hi-IN"/>
+              </w:rPr>
               <w:t>Implemented app routes and HTTP request logic</w:t>
             </w:r>
           </w:p>
           <w:p>
             <w:pPr>
               <w:pStyle w:val="normal1"/>
-            </w:pPr>
-            <w:r>
-              <w:t>Helped implement database methods</w:t>
-            </w:r>
-            <w:r>
-              <w:t xml:space="preserve"> (insert)</w:t>
-            </w:r>
-          </w:p>
-          <w:p>
-            <w:pPr>
-              <w:pStyle w:val="normal1"/>
-            </w:pPr>
-            <w:r>
-              <w:t xml:space="preserve">Designed </w:t>
-            </w:r>
-            <w:r>
-              <w:t>value display</w:t>
-            </w:r>
-            <w:r>
-              <w:t xml:space="preserve"> for temperature and humidity</w:t>
-            </w:r>
-          </w:p>
-          <w:p>
-            <w:pPr>
-              <w:pStyle w:val="normal1"/>
-            </w:pPr>
-            <w:r>
-              <w:t>Implemented fan toggle</w:t>
-            </w:r>
-            <w:r>
-              <w:t xml:space="preserve"> (</w:t>
-            </w:r>
-            <w:r>
-              <w:t>ON/OFF)</w:t>
+              <w:widowControl/>
+              <w:suppressAutoHyphens w:val="true"/>
+              <w:spacing w:before="0" w:after="160"/>
+              <w:rPr>
+                <w:rFonts w:ascii="Calibri" w:hAnsi="Calibri" w:eastAsia="Calibri" w:cs="Calibri"/>
+                <w:kern w:val="0"/>
+                <w:sz w:val="22"/>
+                <w:szCs w:val="22"/>
+                <w:lang w:val="en-US" w:eastAsia="zh-CN" w:bidi="hi-IN"/>
+              </w:rPr>
+            </w:pPr>
+            <w:r>
+              <w:rPr>
+                <w:rFonts w:eastAsia="Calibri" w:cs="Calibri"/>
+                <w:kern w:val="0"/>
+                <w:sz w:val="22"/>
+                <w:szCs w:val="22"/>
+                <w:lang w:val="en-US" w:eastAsia="zh-CN" w:bidi="hi-IN"/>
+              </w:rPr>
+              <w:t>Helped implement database methods (insert)</w:t>
+            </w:r>
+          </w:p>
+          <w:p>
+            <w:pPr>
+              <w:pStyle w:val="normal1"/>
+              <w:widowControl/>
+              <w:suppressAutoHyphens w:val="true"/>
+              <w:spacing w:before="0" w:after="160"/>
+              <w:rPr>
+                <w:rFonts w:ascii="Calibri" w:hAnsi="Calibri" w:eastAsia="Calibri" w:cs="Calibri"/>
+                <w:kern w:val="0"/>
+                <w:sz w:val="22"/>
+                <w:szCs w:val="22"/>
+                <w:lang w:val="en-US" w:eastAsia="zh-CN" w:bidi="hi-IN"/>
+              </w:rPr>
+            </w:pPr>
+            <w:r>
+              <w:rPr>
+                <w:rFonts w:eastAsia="Calibri" w:cs="Calibri"/>
+                <w:kern w:val="0"/>
+                <w:sz w:val="22"/>
+                <w:szCs w:val="22"/>
+                <w:lang w:val="en-US" w:eastAsia="zh-CN" w:bidi="hi-IN"/>
+              </w:rPr>
+              <w:t>Designed value display for temperature and humidity</w:t>
+            </w:r>
+          </w:p>
+          <w:p>
+            <w:pPr>
+              <w:pStyle w:val="normal1"/>
+              <w:widowControl/>
+              <w:suppressAutoHyphens w:val="true"/>
+              <w:spacing w:before="0" w:after="160"/>
+              <w:rPr>
+                <w:rFonts w:ascii="Calibri" w:hAnsi="Calibri" w:eastAsia="Calibri" w:cs="Calibri"/>
+                <w:kern w:val="0"/>
+                <w:sz w:val="22"/>
+                <w:szCs w:val="22"/>
+                <w:lang w:val="en-US" w:eastAsia="zh-CN" w:bidi="hi-IN"/>
+              </w:rPr>
+            </w:pPr>
+            <w:r>
+              <w:rPr>
+                <w:rFonts w:eastAsia="Calibri" w:cs="Calibri"/>
+                <w:kern w:val="0"/>
+                <w:sz w:val="22"/>
+                <w:szCs w:val="22"/>
+                <w:lang w:val="en-US" w:eastAsia="zh-CN" w:bidi="hi-IN"/>
+              </w:rPr>
+              <w:t>Implemented fan toggle (ON/OFF)</w:t>
             </w:r>
           </w:p>
         </w:tc>
       </w:tr>
     </w:tbl>
-    <w:p/>
+    <w:p>
+      <w:pPr>
+        <w:pStyle w:val="Normal"/>
+        <w:rPr/>
+      </w:pPr>
+      <w:r>
+        <w:rPr/>
+      </w:r>
+    </w:p>
     <w:p>
       <w:pPr>
         <w:pStyle w:val="normal1"/>
+        <w:rPr/>
       </w:pPr>
+      <w:r>
+        <w:rPr/>
+      </w:r>
     </w:p>
     <w:p>
       <w:pPr>
-        <w:spacing w:after="0" w:line="240" w:lineRule="auto"/>
+        <w:pStyle w:val="Normal"/>
+        <w:spacing w:lineRule="auto" w:line="240" w:before="0" w:after="0"/>
         <w:jc w:val="left"/>
+        <w:rPr/>
       </w:pPr>
+      <w:r>
+        <w:rPr/>
+      </w:r>
       <w:r>
         <w:br w:type="page"/>
       </w:r>
@@ -959,7 +1457,9 @@
     <w:p>
       <w:pPr>
         <w:pStyle w:val="normal1"/>
+        <w:spacing w:before="0" w:after="160"/>
         <w:jc w:val="right"/>
+        <w:rPr/>
       </w:pPr>
       <w:r>
         <w:rPr>
@@ -968,7 +1468,6 @@
           <w:sz w:val="28"/>
           <w:szCs w:val="28"/>
         </w:rPr>
-        <w:lastRenderedPageBreak/>
         <w:t>Phase: 3</w:t>
       </w:r>
     </w:p>
@@ -976,6 +1475,7 @@
       <w:tblPr>
         <w:tblStyle w:val="TableNormal0"/>
         <w:tblW w:w="9350" w:type="dxa"/>
+        <w:jc w:val="left"/>
         <w:tblInd w:w="0" w:type="dxa"/>
         <w:tblLayout w:type="fixed"/>
         <w:tblCellMar>
@@ -984,15 +1484,15 @@
           <w:bottom w:w="0" w:type="dxa"/>
           <w:right w:w="108" w:type="dxa"/>
         </w:tblCellMar>
-        <w:tblLook w:val="0400" w:firstRow="0" w:lastRow="0" w:firstColumn="0" w:lastColumn="0" w:noHBand="0" w:noVBand="1"/>
+        <w:tblLook w:val="0400" w:noHBand="0" w:noVBand="1" w:firstColumn="0" w:lastRow="0" w:lastColumn="0" w:firstRow="0"/>
       </w:tblPr>
       <w:tblGrid>
         <w:gridCol w:w="3955"/>
-        <w:gridCol w:w="5395"/>
+        <w:gridCol w:w="5394"/>
       </w:tblGrid>
       <w:tr>
         <w:trPr>
-          <w:trHeight w:val="530"/>
+          <w:trHeight w:val="530" w:hRule="atLeast"/>
         </w:trPr>
         <w:tc>
           <w:tcPr>
@@ -1008,6 +1508,9 @@
           <w:p>
             <w:pPr>
               <w:pStyle w:val="normal1"/>
+              <w:widowControl/>
+              <w:suppressAutoHyphens w:val="true"/>
+              <w:spacing w:before="0" w:after="160"/>
               <w:jc w:val="center"/>
               <w:rPr>
                 <w:b/>
@@ -1018,10 +1521,13 @@
             </w:pPr>
             <w:r>
               <w:rPr>
-                <w:b/>
-                <w:bCs/>
+                <w:rFonts w:eastAsia="Calibri" w:cs="Calibri"/>
+                <w:b/>
+                <w:bCs/>
+                <w:kern w:val="0"/>
                 <w:sz w:val="32"/>
                 <w:szCs w:val="32"/>
+                <w:lang w:val="en-US" w:eastAsia="zh-CN" w:bidi="hi-IN"/>
               </w:rPr>
               <w:t>Student name</w:t>
             </w:r>
@@ -1041,6 +1547,9 @@
           <w:p>
             <w:pPr>
               <w:pStyle w:val="normal1"/>
+              <w:widowControl/>
+              <w:suppressAutoHyphens w:val="true"/>
+              <w:spacing w:before="0" w:after="160"/>
               <w:jc w:val="center"/>
               <w:rPr>
                 <w:b/>
@@ -1051,10 +1560,13 @@
             </w:pPr>
             <w:r>
               <w:rPr>
-                <w:b/>
-                <w:bCs/>
+                <w:rFonts w:eastAsia="Calibri" w:cs="Calibri"/>
+                <w:b/>
+                <w:bCs/>
+                <w:kern w:val="0"/>
                 <w:sz w:val="32"/>
                 <w:szCs w:val="32"/>
+                <w:lang w:val="en-US" w:eastAsia="zh-CN" w:bidi="hi-IN"/>
               </w:rPr>
               <w:t>Tasks and duties</w:t>
             </w:r>
@@ -1063,7 +1575,7 @@
       </w:tr>
       <w:tr>
         <w:trPr>
-          <w:trHeight w:val="1790"/>
+          <w:trHeight w:val="1790" w:hRule="atLeast"/>
         </w:trPr>
         <w:tc>
           <w:tcPr>
@@ -1079,6 +1591,9 @@
           <w:p>
             <w:pPr>
               <w:pStyle w:val="normal1"/>
+              <w:widowControl/>
+              <w:suppressAutoHyphens w:val="true"/>
+              <w:spacing w:before="0" w:after="160"/>
               <w:jc w:val="left"/>
               <w:rPr>
                 <w:b/>
@@ -1089,10 +1604,13 @@
             </w:pPr>
             <w:r>
               <w:rPr>
-                <w:b/>
-                <w:bCs/>
+                <w:rFonts w:eastAsia="Calibri" w:cs="Calibri"/>
+                <w:b/>
+                <w:bCs/>
+                <w:kern w:val="0"/>
                 <w:sz w:val="24"/>
                 <w:szCs w:val="24"/>
+                <w:lang w:val="en-US" w:eastAsia="zh-CN" w:bidi="hi-IN"/>
               </w:rPr>
               <w:t>#1 Jonathan Markovic</w:t>
             </w:r>
@@ -1111,9 +1629,25 @@
           <w:p>
             <w:pPr>
               <w:pStyle w:val="BodyText"/>
-              <w:spacing w:after="160"/>
-            </w:pPr>
-            <w:r>
+              <w:widowControl/>
+              <w:suppressAutoHyphens w:val="true"/>
+              <w:spacing w:before="0" w:after="160"/>
+              <w:rPr>
+                <w:rFonts w:ascii="Calibri" w:hAnsi="Calibri" w:eastAsia="Calibri" w:cs="Calibri"/>
+                <w:kern w:val="0"/>
+                <w:sz w:val="22"/>
+                <w:szCs w:val="22"/>
+                <w:lang w:val="en-US" w:eastAsia="zh-CN" w:bidi="hi-IN"/>
+              </w:rPr>
+            </w:pPr>
+            <w:r>
+              <w:rPr>
+                <w:rFonts w:eastAsia="Calibri" w:cs="Calibri"/>
+                <w:kern w:val="0"/>
+                <w:sz w:val="22"/>
+                <w:szCs w:val="22"/>
+                <w:lang w:val="en-US" w:eastAsia="zh-CN" w:bidi="hi-IN"/>
+              </w:rPr>
               <w:t>Enter tasks</w:t>
             </w:r>
           </w:p>
@@ -1121,7 +1655,7 @@
       </w:tr>
       <w:tr>
         <w:trPr>
-          <w:trHeight w:val="1340"/>
+          <w:trHeight w:val="1340" w:hRule="atLeast"/>
         </w:trPr>
         <w:tc>
           <w:tcPr>
@@ -1137,6 +1671,9 @@
           <w:p>
             <w:pPr>
               <w:pStyle w:val="normal1"/>
+              <w:widowControl/>
+              <w:suppressAutoHyphens w:val="true"/>
+              <w:spacing w:before="0" w:after="160"/>
               <w:jc w:val="left"/>
               <w:rPr>
                 <w:b/>
@@ -1147,10 +1684,13 @@
             </w:pPr>
             <w:r>
               <w:rPr>
-                <w:b/>
-                <w:bCs/>
+                <w:rFonts w:eastAsia="Calibri" w:cs="Calibri"/>
+                <w:b/>
+                <w:bCs/>
+                <w:kern w:val="0"/>
                 <w:sz w:val="24"/>
                 <w:szCs w:val="24"/>
+                <w:lang w:val="en-US" w:eastAsia="zh-CN" w:bidi="hi-IN"/>
               </w:rPr>
               <w:t>#2 Meerab Khan</w:t>
             </w:r>
@@ -1169,17 +1709,128 @@
           <w:p>
             <w:pPr>
               <w:pStyle w:val="BodyText"/>
-              <w:spacing w:after="160"/>
-            </w:pPr>
-            <w:r>
-              <w:t>Enter tasks</w:t>
+              <w:widowControl/>
+              <w:suppressAutoHyphens w:val="true"/>
+              <w:spacing w:before="0" w:after="160"/>
+              <w:rPr>
+                <w:rFonts w:ascii="Calibri" w:hAnsi="Calibri" w:eastAsia="Calibri" w:cs="Calibri"/>
+                <w:kern w:val="0"/>
+                <w:sz w:val="22"/>
+                <w:szCs w:val="22"/>
+                <w:lang w:val="en-US" w:eastAsia="zh-CN" w:bidi="hi-IN"/>
+              </w:rPr>
+            </w:pPr>
+            <w:r>
+              <w:rPr>
+                <w:rFonts w:eastAsia="Calibri" w:cs="Calibri"/>
+                <w:kern w:val="0"/>
+                <w:sz w:val="22"/>
+                <w:szCs w:val="22"/>
+                <w:lang w:val="en-US" w:eastAsia="zh-CN" w:bidi="hi-IN"/>
+              </w:rPr>
+              <w:t>Designed the database.</w:t>
+            </w:r>
+          </w:p>
+          <w:p>
+            <w:pPr>
+              <w:pStyle w:val="BodyText"/>
+              <w:widowControl/>
+              <w:suppressAutoHyphens w:val="true"/>
+              <w:spacing w:before="0" w:after="160"/>
+              <w:rPr>
+                <w:rFonts w:ascii="Calibri" w:hAnsi="Calibri" w:eastAsia="Calibri" w:cs="Calibri"/>
+                <w:kern w:val="0"/>
+                <w:sz w:val="22"/>
+                <w:szCs w:val="22"/>
+                <w:lang w:val="en-US" w:eastAsia="zh-CN" w:bidi="hi-IN"/>
+              </w:rPr>
+            </w:pPr>
+            <w:r>
+              <w:rPr>
+                <w:rFonts w:eastAsia="Calibri" w:cs="Calibri"/>
+                <w:kern w:val="0"/>
+                <w:sz w:val="22"/>
+                <w:szCs w:val="22"/>
+                <w:lang w:val="en-US" w:eastAsia="zh-CN" w:bidi="hi-IN"/>
+              </w:rPr>
+              <w:t>Implemented Admin side UI with back-end CRUD operations on products</w:t>
+            </w:r>
+          </w:p>
+          <w:p>
+            <w:pPr>
+              <w:pStyle w:val="BodyText"/>
+              <w:widowControl/>
+              <w:suppressAutoHyphens w:val="true"/>
+              <w:spacing w:before="0" w:after="160"/>
+              <w:rPr>
+                <w:rFonts w:ascii="Calibri" w:hAnsi="Calibri" w:eastAsia="Calibri" w:cs="Calibri"/>
+                <w:kern w:val="0"/>
+                <w:sz w:val="22"/>
+                <w:szCs w:val="22"/>
+                <w:lang w:val="en-US" w:eastAsia="zh-CN" w:bidi="hi-IN"/>
+              </w:rPr>
+            </w:pPr>
+            <w:r>
+              <w:rPr>
+                <w:rFonts w:eastAsia="Calibri" w:cs="Calibri"/>
+                <w:kern w:val="0"/>
+                <w:sz w:val="22"/>
+                <w:szCs w:val="22"/>
+                <w:lang w:val="en-US" w:eastAsia="zh-CN" w:bidi="hi-IN"/>
+              </w:rPr>
+              <w:t xml:space="preserve">Fixed client registration back-end </w:t>
+            </w:r>
+            <w:r>
+              <w:rPr>
+                <w:rFonts w:eastAsia="Calibri" w:cs="Calibri"/>
+                <w:kern w:val="0"/>
+                <w:sz w:val="22"/>
+                <w:szCs w:val="22"/>
+                <w:lang w:val="en-US" w:eastAsia="zh-CN" w:bidi="hi-IN"/>
+              </w:rPr>
+              <w:t>and helped in bug fixes</w:t>
+            </w:r>
+            <w:r>
+              <w:rPr>
+                <w:rFonts w:eastAsia="Calibri" w:cs="Calibri"/>
+                <w:kern w:val="0"/>
+                <w:sz w:val="22"/>
+                <w:szCs w:val="22"/>
+                <w:lang w:val="en-US" w:eastAsia="zh-CN" w:bidi="hi-IN"/>
+              </w:rPr>
+              <w:t xml:space="preserve"> </w:t>
+            </w:r>
+          </w:p>
+          <w:p>
+            <w:pPr>
+              <w:pStyle w:val="BodyText"/>
+              <w:widowControl/>
+              <w:suppressAutoHyphens w:val="true"/>
+              <w:spacing w:before="0" w:after="160"/>
+              <w:rPr>
+                <w:rFonts w:ascii="Calibri" w:hAnsi="Calibri" w:eastAsia="Calibri" w:cs="Calibri"/>
+                <w:kern w:val="0"/>
+                <w:sz w:val="22"/>
+                <w:szCs w:val="22"/>
+                <w:lang w:val="en-US" w:eastAsia="zh-CN" w:bidi="hi-IN"/>
+              </w:rPr>
+            </w:pPr>
+            <w:r>
+              <w:rPr>
+                <w:rFonts w:eastAsia="Calibri" w:cs="Calibri"/>
+                <w:kern w:val="0"/>
+                <w:sz w:val="22"/>
+                <w:szCs w:val="22"/>
+                <w:lang w:val="en-US" w:eastAsia="zh-CN" w:bidi="hi-IN"/>
+              </w:rPr>
+              <w:t>Assisted in testing hardware, UI and database all together</w:t>
             </w:r>
           </w:p>
         </w:tc>
       </w:tr>
       <w:tr>
         <w:trPr>
-          <w:trHeight w:val="1430"/>
+          <w:trHeight w:val="1430" w:hRule="atLeast"/>
         </w:trPr>
         <w:tc>
           <w:tcPr>
@@ -1195,6 +1846,9 @@
           <w:p>
             <w:pPr>
               <w:pStyle w:val="normal1"/>
+              <w:widowControl/>
+              <w:suppressAutoHyphens w:val="true"/>
+              <w:spacing w:before="0" w:after="160"/>
               <w:jc w:val="left"/>
               <w:rPr>
                 <w:b/>
@@ -1205,10 +1859,13 @@
             </w:pPr>
             <w:r>
               <w:rPr>
-                <w:b/>
-                <w:bCs/>
+                <w:rFonts w:eastAsia="Calibri" w:cs="Calibri"/>
+                <w:b/>
+                <w:bCs/>
+                <w:kern w:val="0"/>
                 <w:sz w:val="24"/>
                 <w:szCs w:val="24"/>
+                <w:lang w:val="en-US" w:eastAsia="zh-CN" w:bidi="hi-IN"/>
               </w:rPr>
               <w:t>#3 Cheng Yu Yang</w:t>
             </w:r>
@@ -1227,54 +1884,123 @@
           <w:p>
             <w:pPr>
               <w:pStyle w:val="normal1"/>
-            </w:pPr>
-            <w:r>
+              <w:widowControl/>
+              <w:suppressAutoHyphens w:val="true"/>
+              <w:spacing w:before="0" w:after="160"/>
+              <w:rPr>
+                <w:rFonts w:ascii="Calibri" w:hAnsi="Calibri" w:eastAsia="Calibri" w:cs="Calibri"/>
+                <w:kern w:val="0"/>
+                <w:sz w:val="22"/>
+                <w:szCs w:val="22"/>
+                <w:lang w:val="en-US" w:eastAsia="zh-CN" w:bidi="hi-IN"/>
+              </w:rPr>
+            </w:pPr>
+            <w:r>
+              <w:rPr>
+                <w:rFonts w:eastAsia="Calibri" w:cs="Calibri"/>
+                <w:kern w:val="0"/>
+                <w:sz w:val="22"/>
+                <w:szCs w:val="22"/>
+                <w:lang w:val="en-US" w:eastAsia="zh-CN" w:bidi="hi-IN"/>
+              </w:rPr>
               <w:t>Make the code compatible with Windows to make future iterations easier to implement</w:t>
             </w:r>
           </w:p>
           <w:p>
             <w:pPr>
               <w:pStyle w:val="normal1"/>
-            </w:pPr>
-            <w:r>
+              <w:widowControl/>
+              <w:suppressAutoHyphens w:val="true"/>
+              <w:spacing w:before="0" w:after="160"/>
+              <w:rPr>
+                <w:rFonts w:ascii="Calibri" w:hAnsi="Calibri" w:eastAsia="Calibri" w:cs="Calibri"/>
+                <w:kern w:val="0"/>
+                <w:sz w:val="22"/>
+                <w:szCs w:val="22"/>
+                <w:lang w:val="en-US" w:eastAsia="zh-CN" w:bidi="hi-IN"/>
+              </w:rPr>
+            </w:pPr>
+            <w:r>
+              <w:rPr>
+                <w:rFonts w:eastAsia="Calibri" w:cs="Calibri"/>
+                <w:kern w:val="0"/>
+                <w:sz w:val="22"/>
+                <w:szCs w:val="22"/>
+                <w:lang w:val="en-US" w:eastAsia="zh-CN" w:bidi="hi-IN"/>
+              </w:rPr>
               <w:t>Create Client Login and Register UI</w:t>
             </w:r>
           </w:p>
           <w:p>
             <w:pPr>
               <w:pStyle w:val="normal1"/>
-            </w:pPr>
-            <w:r>
+              <w:widowControl/>
+              <w:suppressAutoHyphens w:val="true"/>
+              <w:spacing w:before="0" w:after="160"/>
+              <w:rPr>
+                <w:rFonts w:ascii="Calibri" w:hAnsi="Calibri" w:eastAsia="Calibri" w:cs="Calibri"/>
+                <w:kern w:val="0"/>
+                <w:sz w:val="22"/>
+                <w:szCs w:val="22"/>
+                <w:lang w:val="en-US" w:eastAsia="zh-CN" w:bidi="hi-IN"/>
+              </w:rPr>
+            </w:pPr>
+            <w:r>
+              <w:rPr>
+                <w:rFonts w:eastAsia="Calibri" w:cs="Calibri"/>
+                <w:kern w:val="0"/>
+                <w:sz w:val="22"/>
+                <w:szCs w:val="22"/>
+                <w:lang w:val="en-US" w:eastAsia="zh-CN" w:bidi="hi-IN"/>
+              </w:rPr>
               <w:t>Optimize Flask HTML template structure using extends and Jinja2 blocks</w:t>
             </w:r>
           </w:p>
         </w:tc>
       </w:tr>
     </w:tbl>
-    <w:p/>
+    <w:p>
+      <w:pPr>
+        <w:pStyle w:val="Normal"/>
+        <w:rPr/>
+      </w:pPr>
+      <w:r>
+        <w:rPr/>
+      </w:r>
+    </w:p>
     <w:p>
       <w:pPr>
         <w:pStyle w:val="normal1"/>
+        <w:widowControl/>
+        <w:suppressAutoHyphens w:val="true"/>
+        <w:bidi w:val="0"/>
+        <w:spacing w:lineRule="auto" w:line="259" w:before="0" w:after="160"/>
+        <w:jc w:val="both"/>
+        <w:rPr/>
       </w:pPr>
+      <w:r>
+        <w:rPr/>
+      </w:r>
     </w:p>
     <w:sectPr>
+      <w:type w:val="nextPage"/>
       <w:pgSz w:w="12240" w:h="15840"/>
-      <w:pgMar w:top="1440" w:right="1440" w:bottom="1440" w:left="1440" w:header="0" w:footer="0" w:gutter="0"/>
-      <w:pgNumType w:start="1"/>
-      <w:cols w:space="720"/>
-      <w:formProt w:val="0"/>
-      <w:docGrid w:linePitch="100" w:charSpace="8192"/>
+      <w:pgMar w:left="1440" w:right="1440" w:gutter="0" w:header="0" w:top="1440" w:footer="0" w:bottom="1440"/>
+      <w:pgNumType w:start="1" w:fmt="decimal"/>
+      <w:formProt w:val="false"/>
+      <w:textDirection w:val="lrTb"/>
+      <w:docGrid w:type="default" w:linePitch="100" w:charSpace="12288"/>
     </w:sectPr>
   </w:body>
 </w:document>
 </file>
 
 <file path=word/styles.xml><?xml version="1.0" encoding="utf-8"?>
-<w:styles xmlns:mc="http://schemas.openxmlformats.org/markup-compatibility/2006" xmlns:r="http://schemas.openxmlformats.org/officeDocument/2006/relationships" xmlns:w="http://schemas.openxmlformats.org/wordprocessingml/2006/main" xmlns:w14="http://schemas.microsoft.com/office/word/2010/wordml" xmlns:w15="http://schemas.microsoft.com/office/word/2012/wordml" xmlns:w16cex="http://schemas.microsoft.com/office/word/2018/wordml/cex" xmlns:w16cid="http://schemas.microsoft.com/office/word/2016/wordml/cid" xmlns:w16="http://schemas.microsoft.com/office/word/2018/wordml" xmlns:w16du="http://schemas.microsoft.com/office/word/2023/wordml/word16du" xmlns:w16sdtdh="http://schemas.microsoft.com/office/word/2020/wordml/sdtdatahash" xmlns:w16sdtfl="http://schemas.microsoft.com/office/word/2024/wordml/sdtformatlock" xmlns:w16se="http://schemas.microsoft.com/office/word/2015/wordml/symex" mc:Ignorable="w14 w15 w16se w16cid w16 w16cex w16sdtdh w16sdtfl w16du">
+<w:styles xmlns:w="http://schemas.openxmlformats.org/wordprocessingml/2006/main" xmlns:w14="http://schemas.microsoft.com/office/word/2010/wordml" xmlns:mc="http://schemas.openxmlformats.org/markup-compatibility/2006" mc:Ignorable="w14">
   <w:docDefaults>
     <w:rPrDefault>
       <w:rPr>
-        <w:rFonts w:ascii="Calibri" w:eastAsia="Calibri" w:hAnsi="Calibri" w:cs="Calibri"/>
+        <w:rFonts w:ascii="Calibri" w:hAnsi="Calibri" w:eastAsia="Calibri" w:cs="Calibri"/>
         <w:sz w:val="22"/>
         <w:szCs w:val="22"/>
         <w:lang w:val="en-US" w:eastAsia="zh-CN" w:bidi="hi-IN"/>
@@ -1282,21 +2008,21 @@
     </w:rPrDefault>
     <w:pPrDefault>
       <w:pPr>
-        <w:suppressAutoHyphens/>
+        <w:suppressAutoHyphens w:val="true"/>
       </w:pPr>
     </w:pPrDefault>
   </w:docDefaults>
   <w:latentStyles w:defLockedState="0" w:defUIPriority="99" w:defSemiHidden="0" w:defUnhideWhenUsed="0" w:defQFormat="0" w:count="376">
     <w:lsdException w:name="Normal" w:uiPriority="0" w:qFormat="1"/>
     <w:lsdException w:name="heading 1" w:uiPriority="9" w:qFormat="1"/>
-    <w:lsdException w:name="heading 2" w:semiHidden="1" w:uiPriority="9" w:unhideWhenUsed="1" w:qFormat="1"/>
-    <w:lsdException w:name="heading 3" w:semiHidden="1" w:uiPriority="9" w:unhideWhenUsed="1" w:qFormat="1"/>
-    <w:lsdException w:name="heading 4" w:semiHidden="1" w:uiPriority="9" w:unhideWhenUsed="1" w:qFormat="1"/>
-    <w:lsdException w:name="heading 5" w:semiHidden="1" w:uiPriority="9" w:unhideWhenUsed="1" w:qFormat="1"/>
-    <w:lsdException w:name="heading 6" w:semiHidden="1" w:uiPriority="9" w:unhideWhenUsed="1" w:qFormat="1"/>
-    <w:lsdException w:name="heading 7" w:semiHidden="1" w:uiPriority="9" w:unhideWhenUsed="1" w:qFormat="1"/>
-    <w:lsdException w:name="heading 8" w:semiHidden="1" w:uiPriority="9" w:unhideWhenUsed="1" w:qFormat="1"/>
-    <w:lsdException w:name="heading 9" w:semiHidden="1" w:uiPriority="9" w:unhideWhenUsed="1" w:qFormat="1"/>
+    <w:lsdException w:name="heading 2" w:uiPriority="9" w:semiHidden="1" w:unhideWhenUsed="1" w:qFormat="1"/>
+    <w:lsdException w:name="heading 3" w:uiPriority="9" w:semiHidden="1" w:unhideWhenUsed="1" w:qFormat="1"/>
+    <w:lsdException w:name="heading 4" w:uiPriority="9" w:semiHidden="1" w:unhideWhenUsed="1" w:qFormat="1"/>
+    <w:lsdException w:name="heading 5" w:uiPriority="9" w:semiHidden="1" w:unhideWhenUsed="1" w:qFormat="1"/>
+    <w:lsdException w:name="heading 6" w:uiPriority="9" w:semiHidden="1" w:unhideWhenUsed="1" w:qFormat="1"/>
+    <w:lsdException w:name="heading 7" w:uiPriority="9" w:semiHidden="1" w:unhideWhenUsed="1" w:qFormat="1"/>
+    <w:lsdException w:name="heading 8" w:uiPriority="9" w:semiHidden="1" w:unhideWhenUsed="1" w:qFormat="1"/>
+    <w:lsdException w:name="heading 9" w:uiPriority="9" w:semiHidden="1" w:unhideWhenUsed="1" w:qFormat="1"/>
     <w:lsdException w:name="index 1" w:semiHidden="1" w:unhideWhenUsed="1"/>
     <w:lsdException w:name="index 2" w:semiHidden="1" w:unhideWhenUsed="1"/>
     <w:lsdException w:name="index 3" w:semiHidden="1" w:unhideWhenUsed="1"/>
@@ -1306,22 +2032,22 @@
     <w:lsdException w:name="index 7" w:semiHidden="1" w:unhideWhenUsed="1"/>
     <w:lsdException w:name="index 8" w:semiHidden="1" w:unhideWhenUsed="1"/>
     <w:lsdException w:name="index 9" w:semiHidden="1" w:unhideWhenUsed="1"/>
-    <w:lsdException w:name="toc 1" w:semiHidden="1" w:uiPriority="39" w:unhideWhenUsed="1"/>
-    <w:lsdException w:name="toc 2" w:semiHidden="1" w:uiPriority="39" w:unhideWhenUsed="1"/>
-    <w:lsdException w:name="toc 3" w:semiHidden="1" w:uiPriority="39" w:unhideWhenUsed="1"/>
-    <w:lsdException w:name="toc 4" w:semiHidden="1" w:uiPriority="39" w:unhideWhenUsed="1"/>
-    <w:lsdException w:name="toc 5" w:semiHidden="1" w:uiPriority="39" w:unhideWhenUsed="1"/>
-    <w:lsdException w:name="toc 6" w:semiHidden="1" w:uiPriority="39" w:unhideWhenUsed="1"/>
-    <w:lsdException w:name="toc 7" w:semiHidden="1" w:uiPriority="39" w:unhideWhenUsed="1"/>
-    <w:lsdException w:name="toc 8" w:semiHidden="1" w:uiPriority="39" w:unhideWhenUsed="1"/>
-    <w:lsdException w:name="toc 9" w:semiHidden="1" w:uiPriority="39" w:unhideWhenUsed="1"/>
+    <w:lsdException w:name="toc 1" w:uiPriority="39" w:semiHidden="1" w:unhideWhenUsed="1"/>
+    <w:lsdException w:name="toc 2" w:uiPriority="39" w:semiHidden="1" w:unhideWhenUsed="1"/>
+    <w:lsdException w:name="toc 3" w:uiPriority="39" w:semiHidden="1" w:unhideWhenUsed="1"/>
+    <w:lsdException w:name="toc 4" w:uiPriority="39" w:semiHidden="1" w:unhideWhenUsed="1"/>
+    <w:lsdException w:name="toc 5" w:uiPriority="39" w:semiHidden="1" w:unhideWhenUsed="1"/>
+    <w:lsdException w:name="toc 6" w:uiPriority="39" w:semiHidden="1" w:unhideWhenUsed="1"/>
+    <w:lsdException w:name="toc 7" w:uiPriority="39" w:semiHidden="1" w:unhideWhenUsed="1"/>
+    <w:lsdException w:name="toc 8" w:uiPriority="39" w:semiHidden="1" w:unhideWhenUsed="1"/>
+    <w:lsdException w:name="toc 9" w:uiPriority="39" w:semiHidden="1" w:unhideWhenUsed="1"/>
     <w:lsdException w:name="Normal Indent" w:semiHidden="1" w:unhideWhenUsed="1"/>
     <w:lsdException w:name="footnote text" w:semiHidden="1" w:unhideWhenUsed="1"/>
     <w:lsdException w:name="annotation text" w:semiHidden="1" w:unhideWhenUsed="1"/>
     <w:lsdException w:name="header" w:semiHidden="1" w:unhideWhenUsed="1"/>
     <w:lsdException w:name="footer" w:semiHidden="1" w:unhideWhenUsed="1"/>
     <w:lsdException w:name="index heading" w:semiHidden="1" w:unhideWhenUsed="1"/>
-    <w:lsdException w:name="caption" w:semiHidden="1" w:uiPriority="35" w:unhideWhenUsed="1" w:qFormat="1"/>
+    <w:lsdException w:name="caption" w:uiPriority="35" w:semiHidden="1" w:unhideWhenUsed="1" w:qFormat="1"/>
     <w:lsdException w:name="table of figures" w:semiHidden="1" w:unhideWhenUsed="1"/>
     <w:lsdException w:name="envelope address" w:semiHidden="1" w:unhideWhenUsed="1"/>
     <w:lsdException w:name="envelope return" w:semiHidden="1" w:unhideWhenUsed="1"/>
@@ -1352,7 +2078,7 @@
     <w:lsdException w:name="Title" w:uiPriority="10" w:qFormat="1"/>
     <w:lsdException w:name="Closing" w:semiHidden="1" w:unhideWhenUsed="1"/>
     <w:lsdException w:name="Signature" w:semiHidden="1" w:unhideWhenUsed="1"/>
-    <w:lsdException w:name="Default Paragraph Font" w:semiHidden="1" w:uiPriority="1" w:unhideWhenUsed="1"/>
+    <w:lsdException w:name="Default Paragraph Font" w:uiPriority="1" w:semiHidden="1" w:unhideWhenUsed="1"/>
     <w:lsdException w:name="Body Text" w:semiHidden="1" w:unhideWhenUsed="1"/>
     <w:lsdException w:name="Body Text Indent" w:semiHidden="1" w:unhideWhenUsed="1"/>
     <w:lsdException w:name="List Continue" w:semiHidden="1" w:unhideWhenUsed="1"/>
@@ -1552,8 +2278,8 @@
     <w:lsdException w:name="Subtle Reference" w:uiPriority="31" w:qFormat="1"/>
     <w:lsdException w:name="Intense Reference" w:uiPriority="32" w:qFormat="1"/>
     <w:lsdException w:name="Book Title" w:uiPriority="33" w:qFormat="1"/>
-    <w:lsdException w:name="Bibliography" w:semiHidden="1" w:uiPriority="37" w:unhideWhenUsed="1"/>
-    <w:lsdException w:name="TOC Heading" w:semiHidden="1" w:uiPriority="39" w:unhideWhenUsed="1" w:qFormat="1"/>
+    <w:lsdException w:name="Bibliography" w:uiPriority="37" w:semiHidden="1" w:unhideWhenUsed="1"/>
+    <w:lsdException w:name="TOC Heading" w:uiPriority="39" w:semiHidden="1" w:unhideWhenUsed="1" w:qFormat="1"/>
     <w:lsdException w:name="Plain Table 1" w:uiPriority="41"/>
     <w:lsdException w:name="Plain Table 2" w:uiPriority="42"/>
     <w:lsdException w:name="Plain Table 3" w:uiPriority="43"/>
@@ -1664,14 +2390,25 @@
     <w:lsdException w:name="Unresolved Mention" w:semiHidden="1" w:unhideWhenUsed="1"/>
     <w:lsdException w:name="Smart Link" w:semiHidden="1" w:unhideWhenUsed="1"/>
   </w:latentStyles>
-  <w:style w:type="paragraph" w:default="1" w:styleId="Normal">
+  <w:style w:type="paragraph" w:styleId="Normal" w:default="1">
     <w:name w:val="Normal"/>
     <w:qFormat/>
     <w:rsid w:val="00600128"/>
     <w:pPr>
-      <w:spacing w:after="160" w:line="259" w:lineRule="auto"/>
+      <w:widowControl/>
+      <w:suppressAutoHyphens w:val="true"/>
+      <w:bidi w:val="0"/>
+      <w:spacing w:lineRule="auto" w:line="259" w:before="0" w:after="160"/>
       <w:jc w:val="both"/>
     </w:pPr>
+    <w:rPr>
+      <w:rFonts w:ascii="Calibri" w:hAnsi="Calibri" w:eastAsia="Calibri" w:cs="Calibri"/>
+      <w:color w:val="auto"/>
+      <w:kern w:val="0"/>
+      <w:sz w:val="22"/>
+      <w:szCs w:val="22"/>
+      <w:lang w:val="en-US" w:eastAsia="zh-CN" w:bidi="hi-IN"/>
+    </w:rPr>
   </w:style>
   <w:style w:type="paragraph" w:styleId="Heading1">
     <w:name w:val="heading 1"/>
@@ -1680,9 +2417,9 @@
     <w:uiPriority w:val="9"/>
     <w:qFormat/>
     <w:pPr>
-      <w:keepNext/>
+      <w:keepNext w:val="true"/>
       <w:keepLines/>
-      <w:spacing w:before="480" w:after="120" w:line="240" w:lineRule="auto"/>
+      <w:spacing w:lineRule="auto" w:line="240" w:before="480" w:after="120"/>
       <w:outlineLvl w:val="0"/>
     </w:pPr>
     <w:rPr>
@@ -1701,9 +2438,9 @@
     <w:unhideWhenUsed/>
     <w:qFormat/>
     <w:pPr>
-      <w:keepNext/>
+      <w:keepNext w:val="true"/>
       <w:keepLines/>
-      <w:spacing w:before="360" w:after="80" w:line="240" w:lineRule="auto"/>
+      <w:spacing w:lineRule="auto" w:line="240" w:before="360" w:after="80"/>
       <w:outlineLvl w:val="1"/>
     </w:pPr>
     <w:rPr>
@@ -1722,9 +2459,9 @@
     <w:unhideWhenUsed/>
     <w:qFormat/>
     <w:pPr>
-      <w:keepNext/>
+      <w:keepNext w:val="true"/>
       <w:keepLines/>
-      <w:spacing w:before="280" w:after="80" w:line="240" w:lineRule="auto"/>
+      <w:spacing w:lineRule="auto" w:line="240" w:before="280" w:after="80"/>
       <w:outlineLvl w:val="2"/>
     </w:pPr>
     <w:rPr>
@@ -1743,9 +2480,9 @@
     <w:unhideWhenUsed/>
     <w:qFormat/>
     <w:pPr>
-      <w:keepNext/>
+      <w:keepNext w:val="true"/>
       <w:keepLines/>
-      <w:spacing w:before="240" w:after="40" w:line="240" w:lineRule="auto"/>
+      <w:spacing w:lineRule="auto" w:line="240" w:before="240" w:after="40"/>
       <w:outlineLvl w:val="3"/>
     </w:pPr>
     <w:rPr>
@@ -1764,9 +2501,9 @@
     <w:unhideWhenUsed/>
     <w:qFormat/>
     <w:pPr>
-      <w:keepNext/>
+      <w:keepNext w:val="true"/>
       <w:keepLines/>
-      <w:spacing w:before="220" w:after="40" w:line="240" w:lineRule="auto"/>
+      <w:spacing w:lineRule="auto" w:line="240" w:before="220" w:after="40"/>
       <w:outlineLvl w:val="4"/>
     </w:pPr>
     <w:rPr>
@@ -1783,9 +2520,9 @@
     <w:unhideWhenUsed/>
     <w:qFormat/>
     <w:pPr>
-      <w:keepNext/>
+      <w:keepNext w:val="true"/>
       <w:keepLines/>
-      <w:spacing w:before="200" w:after="40" w:line="240" w:lineRule="auto"/>
+      <w:spacing w:lineRule="auto" w:line="240" w:before="200" w:after="40"/>
       <w:outlineLvl w:val="5"/>
     </w:pPr>
     <w:rPr>
@@ -1795,51 +2532,39 @@
       <w:szCs w:val="20"/>
     </w:rPr>
   </w:style>
-  <w:style w:type="character" w:default="1" w:styleId="DefaultParagraphFont">
+  <w:style w:type="character" w:styleId="DefaultParagraphFont" w:default="1">
     <w:name w:val="Default Paragraph Font"/>
     <w:uiPriority w:val="1"/>
     <w:semiHidden/>
     <w:unhideWhenUsed/>
+    <w:qFormat/>
+    <w:rPr/>
   </w:style>
-  <w:style w:type="table" w:default="1" w:styleId="TableNormal">
-    <w:name w:val="Normal Table"/>
-    <w:uiPriority w:val="99"/>
-    <w:semiHidden/>
-    <w:unhideWhenUsed/>
-    <w:tblPr>
-      <w:tblInd w:w="0" w:type="dxa"/>
-      <w:tblCellMar>
-        <w:top w:w="0" w:type="dxa"/>
-        <w:left w:w="108" w:type="dxa"/>
-        <w:bottom w:w="0" w:type="dxa"/>
-        <w:right w:w="108" w:type="dxa"/>
-      </w:tblCellMar>
-    </w:tblPr>
-  </w:style>
-  <w:style w:type="numbering" w:default="1" w:styleId="NoList">
-    <w:name w:val="No List"/>
-    <w:uiPriority w:val="99"/>
-    <w:semiHidden/>
-    <w:unhideWhenUsed/>
-  </w:style>
-  <w:style w:type="character" w:customStyle="1" w:styleId="Bulletsuser">
-    <w:name w:val="Bullets (user)"/>
+  <w:style w:type="character" w:styleId="Bullets" w:customStyle="1">
+    <w:name w:val="Bullets"/>
     <w:qFormat/>
     <w:rPr>
-      <w:rFonts w:ascii="OpenSymbol" w:eastAsia="OpenSymbol" w:hAnsi="OpenSymbol" w:cs="OpenSymbol"/>
+      <w:rFonts w:ascii="OpenSymbol" w:hAnsi="OpenSymbol" w:eastAsia="OpenSymbol" w:cs="OpenSymbol"/>
     </w:rPr>
   </w:style>
-  <w:style w:type="paragraph" w:customStyle="1" w:styleId="Heading">
+  <w:style w:type="character" w:styleId="BodyTextChar" w:customStyle="1">
+    <w:name w:val="Body Text Char"/>
+    <w:basedOn w:val="DefaultParagraphFont"/>
+    <w:qFormat/>
+    <w:rsid w:val="00600128"/>
+    <w:rPr/>
+  </w:style>
+  <w:style w:type="paragraph" w:styleId="Heading" w:customStyle="1">
     <w:name w:val="Heading"/>
     <w:basedOn w:val="Normal"/>
     <w:next w:val="BodyText"/>
     <w:qFormat/>
     <w:pPr>
-      <w:keepNext/>
+      <w:keepNext w:val="true"/>
       <w:spacing w:before="240" w:after="120"/>
     </w:pPr>
     <w:rPr>
-      <w:rFonts w:ascii="Liberation Sans" w:eastAsia="Noto Sans" w:hAnsi="Liberation Sans" w:cs="FreeSans"/>
+      <w:rFonts w:ascii="Liberation Sans" w:hAnsi="Liberation Sans" w:eastAsia="Noto Sans" w:cs="FreeSans"/>
       <w:sz w:val="28"/>
       <w:szCs w:val="28"/>
     </w:rPr>
@@ -1849,12 +2574,14 @@
     <w:basedOn w:val="Normal"/>
     <w:link w:val="BodyTextChar"/>
     <w:pPr>
-      <w:spacing w:after="140" w:line="276" w:lineRule="auto"/>
+      <w:spacing w:lineRule="auto" w:line="276" w:before="0" w:after="140"/>
     </w:pPr>
+    <w:rPr/>
   </w:style>
   <w:style w:type="paragraph" w:styleId="List">
     <w:name w:val="List"/>
     <w:basedOn w:val="BodyText"/>
+    <w:pPr/>
     <w:rPr>
       <w:rFonts w:cs="FreeSans"/>
     </w:rPr>
@@ -1875,7 +2602,7 @@
       <w:szCs w:val="24"/>
     </w:rPr>
   </w:style>
-  <w:style w:type="paragraph" w:customStyle="1" w:styleId="Index">
+  <w:style w:type="paragraph" w:styleId="Index" w:customStyle="1">
     <w:name w:val="Index"/>
     <w:basedOn w:val="Normal"/>
     <w:qFormat/>
@@ -1886,13 +2613,24 @@
       <w:rFonts w:cs="FreeSans"/>
     </w:rPr>
   </w:style>
-  <w:style w:type="paragraph" w:customStyle="1" w:styleId="normal1">
+  <w:style w:type="paragraph" w:styleId="normal1" w:customStyle="1">
     <w:name w:val="normal1"/>
     <w:qFormat/>
     <w:pPr>
-      <w:spacing w:after="160" w:line="259" w:lineRule="auto"/>
+      <w:widowControl/>
+      <w:suppressAutoHyphens w:val="true"/>
+      <w:bidi w:val="0"/>
+      <w:spacing w:lineRule="auto" w:line="259" w:before="0" w:after="160"/>
       <w:jc w:val="both"/>
     </w:pPr>
+    <w:rPr>
+      <w:rFonts w:ascii="Calibri" w:hAnsi="Calibri" w:eastAsia="Calibri" w:cs="Calibri"/>
+      <w:color w:val="auto"/>
+      <w:kern w:val="0"/>
+      <w:sz w:val="22"/>
+      <w:szCs w:val="22"/>
+      <w:lang w:val="en-US" w:eastAsia="zh-CN" w:bidi="hi-IN"/>
+    </w:rPr>
   </w:style>
   <w:style w:type="paragraph" w:styleId="Title">
     <w:name w:val="Title"/>
@@ -1901,9 +2639,9 @@
     <w:uiPriority w:val="10"/>
     <w:qFormat/>
     <w:pPr>
-      <w:keepNext/>
+      <w:keepNext w:val="true"/>
       <w:keepLines/>
-      <w:spacing w:before="480" w:after="120" w:line="240" w:lineRule="auto"/>
+      <w:spacing w:lineRule="auto" w:line="240" w:before="480" w:after="120"/>
     </w:pPr>
     <w:rPr>
       <w:b/>
@@ -1919,12 +2657,12 @@
     <w:uiPriority w:val="11"/>
     <w:qFormat/>
     <w:pPr>
-      <w:keepNext/>
+      <w:keepNext w:val="true"/>
       <w:keepLines/>
-      <w:spacing w:before="360" w:after="80" w:line="240" w:lineRule="auto"/>
+      <w:spacing w:lineRule="auto" w:line="240" w:before="360" w:after="80"/>
     </w:pPr>
     <w:rPr>
-      <w:rFonts w:ascii="Georgia" w:eastAsia="Georgia" w:hAnsi="Georgia" w:cs="Georgia"/>
+      <w:rFonts w:ascii="Georgia" w:hAnsi="Georgia" w:eastAsia="Georgia" w:cs="Georgia"/>
       <w:i/>
       <w:iCs/>
       <w:color w:val="666666"/>
@@ -1932,16 +2670,17 @@
       <w:szCs w:val="48"/>
     </w:rPr>
   </w:style>
-  <w:style w:type="paragraph" w:customStyle="1" w:styleId="TableContents">
+  <w:style w:type="paragraph" w:styleId="TableContents" w:customStyle="1">
     <w:name w:val="Table Contents"/>
     <w:basedOn w:val="Normal"/>
     <w:qFormat/>
     <w:pPr>
-      <w:widowControl w:val="0"/>
+      <w:widowControl w:val="false"/>
       <w:suppressLineNumbers/>
     </w:pPr>
+    <w:rPr/>
   </w:style>
-  <w:style w:type="paragraph" w:customStyle="1" w:styleId="TableHeading">
+  <w:style w:type="paragraph" w:styleId="TableHeading" w:customStyle="1">
     <w:name w:val="Table Heading"/>
     <w:basedOn w:val="TableContents"/>
     <w:qFormat/>
@@ -1952,6 +2691,27 @@
       <w:b/>
       <w:bCs/>
     </w:rPr>
+  </w:style>
+  <w:style w:type="numbering" w:styleId="NoList" w:default="1">
+    <w:name w:val="No List"/>
+    <w:uiPriority w:val="99"/>
+    <w:semiHidden/>
+    <w:unhideWhenUsed/>
+    <w:qFormat/>
+  </w:style>
+  <w:style w:type="table" w:default="1" w:styleId="TableNormal">
+    <w:name w:val="Normal Table"/>
+    <w:uiPriority w:val="99"/>
+    <w:semiHidden/>
+    <w:unhideWhenUsed/>
+    <w:tblPr>
+      <w:tblCellMar>
+        <w:top w:w="0" w:type="dxa"/>
+        <w:left w:w="108" w:type="dxa"/>
+        <w:bottom w:w="0" w:type="dxa"/>
+        <w:right w:w="108" w:type="dxa"/>
+      </w:tblCellMar>
+    </w:tblPr>
   </w:style>
   <w:style w:type="table" w:customStyle="1" w:styleId="TableNormal0">
     <w:name w:val="TableNormal"/>
@@ -1964,51 +2724,45 @@
       </w:tblCellMar>
     </w:tblPr>
   </w:style>
-  <w:style w:type="character" w:customStyle="1" w:styleId="BodyTextChar">
-    <w:name w:val="Body Text Char"/>
-    <w:basedOn w:val="DefaultParagraphFont"/>
-    <w:link w:val="BodyText"/>
-    <w:rsid w:val="00600128"/>
-  </w:style>
 </w:styles>
 </file>
 
 <file path=word/theme/theme1.xml><?xml version="1.0" encoding="utf-8"?>
-<a:theme xmlns:a="http://schemas.openxmlformats.org/drawingml/2006/main" name="Office Theme">
+<a:theme xmlns:a="http://schemas.openxmlformats.org/drawingml/2006/main" xmlns:r="http://schemas.openxmlformats.org/officeDocument/2006/relationships" name="Office Theme">
   <a:themeElements>
     <a:clrScheme name="Office">
       <a:dk1>
         <a:srgbClr val="000000"/>
       </a:dk1>
       <a:lt1>
-        <a:srgbClr val="FFFFFF"/>
+        <a:srgbClr val="ffffff"/>
       </a:lt1>
       <a:dk2>
-        <a:srgbClr val="1F497D"/>
+        <a:srgbClr val="1f497d"/>
       </a:dk2>
       <a:lt2>
-        <a:srgbClr val="EEECE1"/>
+        <a:srgbClr val="eeece1"/>
       </a:lt2>
       <a:accent1>
-        <a:srgbClr val="4F81BD"/>
+        <a:srgbClr val="4f81bd"/>
       </a:accent1>
       <a:accent2>
-        <a:srgbClr val="C0504D"/>
+        <a:srgbClr val="c0504d"/>
       </a:accent2>
       <a:accent3>
-        <a:srgbClr val="9BBB59"/>
+        <a:srgbClr val="9bbb59"/>
       </a:accent3>
       <a:accent4>
-        <a:srgbClr val="8064A2"/>
+        <a:srgbClr val="8064a2"/>
       </a:accent4>
       <a:accent5>
-        <a:srgbClr val="4BACC6"/>
+        <a:srgbClr val="4bacc6"/>
       </a:accent5>
       <a:accent6>
-        <a:srgbClr val="F79646"/>
+        <a:srgbClr val="f79646"/>
       </a:accent6>
       <a:hlink>
-        <a:srgbClr val="0000FF"/>
+        <a:srgbClr val="0000ff"/>
       </a:hlink>
       <a:folHlink>
         <a:srgbClr val="800080"/>
@@ -2016,12 +2770,12 @@
     </a:clrScheme>
     <a:fontScheme name="Office">
       <a:majorFont>
-        <a:latin typeface="Calibri"/>
+        <a:latin typeface="Calibri" pitchFamily="0" charset="1"/>
         <a:ea typeface=""/>
         <a:cs typeface=""/>
       </a:majorFont>
       <a:minorFont>
-        <a:latin typeface="Cambria"/>
+        <a:latin typeface="Cambria" pitchFamily="0" charset="1"/>
         <a:ea typeface=""/>
         <a:cs typeface=""/>
       </a:minorFont>
@@ -2050,7 +2804,7 @@
             </a:gs>
           </a:gsLst>
           <a:lin ang="16200000" scaled="1"/>
-          <a:tileRect/>
+          <a:tileRect l="0" t="0" r="0" b="0"/>
         </a:gradFill>
         <a:gradFill>
           <a:gsLst>
@@ -2068,7 +2822,7 @@
             </a:gs>
           </a:gsLst>
           <a:lin ang="16200000" scaled="0"/>
-          <a:tileRect/>
+          <a:tileRect l="0" t="0" r="0" b="0"/>
         </a:gradFill>
       </a:fillStyleLst>
       <a:lnStyleLst>
@@ -2119,7 +2873,7 @@
           <a:path path="circle">
             <a:fillToRect l="50000" t="-80000" r="50000" b="180000"/>
           </a:path>
-          <a:tileRect/>
+          <a:tileRect l="0" t="0" r="0" b="0"/>
         </a:gradFill>
         <a:gradFill>
           <a:gsLst>
@@ -2137,12 +2891,10 @@
           <a:path path="circle">
             <a:fillToRect l="50000" t="50000" r="50000" b="50000"/>
           </a:path>
-          <a:tileRect/>
+          <a:tileRect l="0" t="0" r="0" b="0"/>
         </a:gradFill>
       </a:bgFillStyleLst>
     </a:fmtScheme>
   </a:themeElements>
-  <a:objectDefaults/>
-  <a:extraClrSchemeLst/>
 </a:theme>
 </file>
</xml_diff>

<commit_message>
Wrote tasks in the report
</commit_message>
<xml_diff>
--- a/Team-Tasks/TasksReport.docx
+++ b/Team-Tasks/TasksReport.docx
@@ -1,6 +1,6 @@
 
 <file path=word/document.xml><?xml version="1.0" encoding="utf-8"?>
-<w:document xmlns:wpc="http://schemas.microsoft.com/office/word/2010/wordprocessingCanvas" xmlns:cx="http://schemas.microsoft.com/office/drawing/2014/chartex" xmlns:cx1="http://schemas.microsoft.com/office/drawing/2015/9/8/chartex" xmlns:cx2="http://schemas.microsoft.com/office/drawing/2015/10/21/chartex" xmlns:cx3="http://schemas.microsoft.com/office/drawing/2016/5/9/chartex" xmlns:cx4="http://schemas.microsoft.com/office/drawing/2016/5/10/chartex" xmlns:cx5="http://schemas.microsoft.com/office/drawing/2016/5/11/chartex" xmlns:cx6="http://schemas.microsoft.com/office/drawing/2016/5/12/chartex" xmlns:cx7="http://schemas.microsoft.com/office/drawing/2016/5/13/chartex" xmlns:cx8="http://schemas.microsoft.com/office/drawing/2016/5/14/chartex" xmlns:mc="http://schemas.openxmlformats.org/markup-compatibility/2006" xmlns:aink="http://schemas.microsoft.com/office/drawing/2016/ink" xmlns:am3d="http://schemas.microsoft.com/office/drawing/2017/model3d" xmlns:o="urn:schemas-microsoft-com:office:office" xmlns:oel="http://schemas.microsoft.com/office/2019/extlst" xmlns:r="http://schemas.openxmlformats.org/officeDocument/2006/relationships" xmlns:m="http://schemas.openxmlformats.org/officeDocument/2006/math" xmlns:v="urn:schemas-microsoft-com:vml" xmlns:wp14="http://schemas.microsoft.com/office/word/2010/wordprocessingDrawing" xmlns:wp="http://schemas.openxmlformats.org/drawingml/2006/wordprocessingDrawing" xmlns:w10="urn:schemas-microsoft-com:office:word" xmlns:w="http://schemas.openxmlformats.org/wordprocessingml/2006/main" xmlns:w14="http://schemas.microsoft.com/office/word/2010/wordml" xmlns:w15="http://schemas.microsoft.com/office/word/2012/wordml" xmlns:w16cex="http://schemas.microsoft.com/office/word/2018/wordml/cex" xmlns:w16cid="http://schemas.microsoft.com/office/word/2016/wordml/cid" xmlns:w16="http://schemas.microsoft.com/office/word/2018/wordml" xmlns:w16du="http://schemas.microsoft.com/office/word/2023/wordml/word16du" xmlns:w16sdtdh="http://schemas.microsoft.com/office/word/2020/wordml/sdtdatahash" xmlns:w16sdtfl="http://schemas.microsoft.com/office/word/2024/wordml/sdtformatlock" xmlns:w16se="http://schemas.microsoft.com/office/word/2015/wordml/symex" xmlns:wpg="http://schemas.microsoft.com/office/word/2010/wordprocessingGroup" xmlns:wpi="http://schemas.microsoft.com/office/word/2010/wordprocessingInk" xmlns:wne="http://schemas.microsoft.com/office/word/2006/wordml" xmlns:wps="http://schemas.microsoft.com/office/word/2010/wordprocessingShape" mc:Ignorable="w14 w15 w16se w16cid w16 w16cex w16sdtdh w16sdtfl w16du wp14">
+<w:document xmlns:o="urn:schemas-microsoft-com:office:office" xmlns:r="http://schemas.openxmlformats.org/officeDocument/2006/relationships" xmlns:v="urn:schemas-microsoft-com:vml" xmlns:w="http://schemas.openxmlformats.org/wordprocessingml/2006/main" xmlns:w10="urn:schemas-microsoft-com:office:word" xmlns:wp="http://schemas.openxmlformats.org/drawingml/2006/wordprocessingDrawing" xmlns:pic="http://schemas.openxmlformats.org/drawingml/2006/picture" xmlns:wps="http://schemas.microsoft.com/office/word/2010/wordprocessingShape" xmlns:wpg="http://schemas.microsoft.com/office/word/2010/wordprocessingGroup" xmlns:mc="http://schemas.openxmlformats.org/markup-compatibility/2006" xmlns:wp14="http://schemas.microsoft.com/office/word/2010/wordprocessingDrawing" xmlns:w14="http://schemas.microsoft.com/office/word/2010/wordml" xmlns:w15="http://schemas.microsoft.com/office/word/2012/wordml" mc:Ignorable="w14 wp14 w15">
   <w:body>
     <w:p>
       <w:pPr>
@@ -33,6 +33,14 @@
           <w:szCs w:val="28"/>
         </w:rPr>
       </w:pPr>
+      <w:r>
+        <w:rPr>
+          <w:b/>
+          <w:bCs/>
+          <w:sz w:val="28"/>
+          <w:szCs w:val="28"/>
+        </w:rPr>
+      </w:r>
     </w:p>
     <w:p>
       <w:pPr>
@@ -64,6 +72,14 @@
           <w:szCs w:val="28"/>
         </w:rPr>
       </w:pPr>
+      <w:r>
+        <w:rPr>
+          <w:b/>
+          <w:bCs/>
+          <w:sz w:val="28"/>
+          <w:szCs w:val="28"/>
+        </w:rPr>
+      </w:r>
     </w:p>
     <w:p>
       <w:pPr>
@@ -83,32 +99,8 @@
           <w:szCs w:val="28"/>
         </w:rPr>
         <w:t>Group name: Group02</w:t>
-      </w:r>
-      <w:r>
-        <w:rPr>
-          <w:b/>
-          <w:bCs/>
-          <w:sz w:val="28"/>
-          <w:szCs w:val="28"/>
-        </w:rPr>
         <w:tab/>
-      </w:r>
-      <w:r>
-        <w:rPr>
-          <w:b/>
-          <w:bCs/>
-          <w:sz w:val="28"/>
-          <w:szCs w:val="28"/>
-        </w:rPr>
         <w:tab/>
-      </w:r>
-      <w:r>
-        <w:rPr>
-          <w:b/>
-          <w:bCs/>
-          <w:sz w:val="28"/>
-          <w:szCs w:val="28"/>
-        </w:rPr>
         <w:tab/>
         <w:t>Section name:   section 01          Phase: 1</w:t>
       </w:r>
@@ -116,12 +108,17 @@
     <w:p>
       <w:pPr>
         <w:pStyle w:val="normal1"/>
+        <w:rPr/>
       </w:pPr>
+      <w:r>
+        <w:rPr/>
+      </w:r>
     </w:p>
     <w:tbl>
       <w:tblPr>
         <w:tblStyle w:val="TableNormal0"/>
         <w:tblW w:w="9350" w:type="dxa"/>
+        <w:jc w:val="left"/>
         <w:tblInd w:w="0" w:type="dxa"/>
         <w:tblLayout w:type="fixed"/>
         <w:tblCellMar>
@@ -130,15 +127,15 @@
           <w:bottom w:w="0" w:type="dxa"/>
           <w:right w:w="108" w:type="dxa"/>
         </w:tblCellMar>
-        <w:tblLook w:val="0400" w:firstRow="0" w:lastRow="0" w:firstColumn="0" w:lastColumn="0" w:noHBand="0" w:noVBand="1"/>
+        <w:tblLook w:val="0400" w:noHBand="0" w:noVBand="1" w:firstColumn="0" w:lastRow="0" w:lastColumn="0" w:firstRow="0"/>
       </w:tblPr>
       <w:tblGrid>
         <w:gridCol w:w="3955"/>
-        <w:gridCol w:w="5395"/>
+        <w:gridCol w:w="5394"/>
       </w:tblGrid>
       <w:tr>
         <w:trPr>
-          <w:trHeight w:val="530"/>
+          <w:trHeight w:val="530" w:hRule="atLeast"/>
         </w:trPr>
         <w:tc>
           <w:tcPr>
@@ -154,6 +151,9 @@
           <w:p>
             <w:pPr>
               <w:pStyle w:val="normal1"/>
+              <w:widowControl/>
+              <w:suppressAutoHyphens w:val="true"/>
+              <w:spacing w:before="0" w:after="160"/>
               <w:jc w:val="center"/>
               <w:rPr>
                 <w:b/>
@@ -164,10 +164,13 @@
             </w:pPr>
             <w:r>
               <w:rPr>
-                <w:b/>
-                <w:bCs/>
+                <w:rFonts w:eastAsia="Calibri" w:cs="Calibri"/>
+                <w:b/>
+                <w:bCs/>
+                <w:kern w:val="0"/>
                 <w:sz w:val="32"/>
                 <w:szCs w:val="32"/>
+                <w:lang w:val="en-US" w:eastAsia="zh-CN" w:bidi="hi-IN"/>
               </w:rPr>
               <w:t>Student name</w:t>
             </w:r>
@@ -187,6 +190,9 @@
           <w:p>
             <w:pPr>
               <w:pStyle w:val="normal1"/>
+              <w:widowControl/>
+              <w:suppressAutoHyphens w:val="true"/>
+              <w:spacing w:before="0" w:after="160"/>
               <w:jc w:val="center"/>
               <w:rPr>
                 <w:b/>
@@ -197,10 +203,13 @@
             </w:pPr>
             <w:r>
               <w:rPr>
-                <w:b/>
-                <w:bCs/>
+                <w:rFonts w:eastAsia="Calibri" w:cs="Calibri"/>
+                <w:b/>
+                <w:bCs/>
+                <w:kern w:val="0"/>
                 <w:sz w:val="32"/>
                 <w:szCs w:val="32"/>
+                <w:lang w:val="en-US" w:eastAsia="zh-CN" w:bidi="hi-IN"/>
               </w:rPr>
               <w:t>Tasks and duties</w:t>
             </w:r>
@@ -209,7 +218,7 @@
       </w:tr>
       <w:tr>
         <w:trPr>
-          <w:trHeight w:val="1790"/>
+          <w:trHeight w:val="1790" w:hRule="atLeast"/>
         </w:trPr>
         <w:tc>
           <w:tcPr>
@@ -225,6 +234,9 @@
           <w:p>
             <w:pPr>
               <w:pStyle w:val="normal1"/>
+              <w:widowControl/>
+              <w:suppressAutoHyphens w:val="true"/>
+              <w:spacing w:before="0" w:after="160"/>
               <w:jc w:val="left"/>
               <w:rPr>
                 <w:b/>
@@ -235,10 +247,13 @@
             </w:pPr>
             <w:r>
               <w:rPr>
-                <w:b/>
-                <w:bCs/>
+                <w:rFonts w:eastAsia="Calibri" w:cs="Calibri"/>
+                <w:b/>
+                <w:bCs/>
+                <w:kern w:val="0"/>
                 <w:sz w:val="24"/>
                 <w:szCs w:val="24"/>
+                <w:lang w:val="en-US" w:eastAsia="zh-CN" w:bidi="hi-IN"/>
               </w:rPr>
               <w:t>#1 Jonathan Markovic</w:t>
             </w:r>
@@ -257,29 +272,99 @@
           <w:p>
             <w:pPr>
               <w:pStyle w:val="normal1"/>
-            </w:pPr>
-          </w:p>
-          <w:p>
-            <w:pPr>
-              <w:pStyle w:val="normal1"/>
-            </w:pPr>
-            <w:r>
+              <w:widowControl/>
+              <w:suppressAutoHyphens w:val="true"/>
+              <w:spacing w:before="0" w:after="160"/>
+              <w:rPr>
+                <w:rFonts w:ascii="Calibri" w:hAnsi="Calibri" w:eastAsia="Calibri" w:cs="Calibri"/>
+                <w:kern w:val="0"/>
+                <w:sz w:val="22"/>
+                <w:szCs w:val="22"/>
+                <w:lang w:val="en-US" w:eastAsia="zh-CN" w:bidi="hi-IN"/>
+              </w:rPr>
+            </w:pPr>
+            <w:r>
+              <w:rPr>
+                <w:rFonts w:eastAsia="Calibri" w:cs="Calibri"/>
+                <w:kern w:val="0"/>
+                <w:sz w:val="22"/>
+                <w:szCs w:val="22"/>
+                <w:lang w:val="en-US" w:eastAsia="zh-CN" w:bidi="hi-IN"/>
+              </w:rPr>
+            </w:r>
+          </w:p>
+          <w:p>
+            <w:pPr>
+              <w:pStyle w:val="normal1"/>
+              <w:widowControl/>
+              <w:suppressAutoHyphens w:val="true"/>
+              <w:spacing w:before="0" w:after="160"/>
+              <w:rPr>
+                <w:rFonts w:ascii="Calibri" w:hAnsi="Calibri" w:eastAsia="Calibri" w:cs="Calibri"/>
+                <w:kern w:val="0"/>
+                <w:sz w:val="22"/>
+                <w:szCs w:val="22"/>
+                <w:lang w:val="en-US" w:eastAsia="zh-CN" w:bidi="hi-IN"/>
+              </w:rPr>
+            </w:pPr>
+            <w:r>
+              <w:rPr>
+                <w:rFonts w:eastAsia="Calibri" w:cs="Calibri"/>
+                <w:kern w:val="0"/>
+                <w:sz w:val="22"/>
+                <w:szCs w:val="22"/>
+                <w:lang w:val="en-US" w:eastAsia="zh-CN" w:bidi="hi-IN"/>
+              </w:rPr>
               <w:t>Helped with finding ways to implement the project(sql, python/php etc…)</w:t>
             </w:r>
           </w:p>
           <w:p>
             <w:pPr>
               <w:pStyle w:val="normal1"/>
-            </w:pPr>
-            <w:r>
+              <w:widowControl/>
+              <w:suppressAutoHyphens w:val="true"/>
+              <w:spacing w:before="0" w:after="160"/>
+              <w:rPr>
+                <w:rFonts w:ascii="Calibri" w:hAnsi="Calibri" w:eastAsia="Calibri" w:cs="Calibri"/>
+                <w:kern w:val="0"/>
+                <w:sz w:val="22"/>
+                <w:szCs w:val="22"/>
+                <w:lang w:val="en-US" w:eastAsia="zh-CN" w:bidi="hi-IN"/>
+              </w:rPr>
+            </w:pPr>
+            <w:r>
+              <w:rPr>
+                <w:rFonts w:eastAsia="Calibri" w:cs="Calibri"/>
+                <w:kern w:val="0"/>
+                <w:sz w:val="22"/>
+                <w:szCs w:val="22"/>
+                <w:lang w:val="en-US" w:eastAsia="zh-CN" w:bidi="hi-IN"/>
+              </w:rPr>
               <w:t>Implemented the GPIO interaction in the code</w:t>
             </w:r>
           </w:p>
           <w:p>
             <w:pPr>
               <w:pStyle w:val="normal1"/>
-            </w:pPr>
-            <w:r>
+              <w:widowControl/>
+              <w:suppressAutoHyphens w:val="true"/>
+              <w:spacing w:before="0" w:after="160"/>
+              <w:rPr>
+                <w:rFonts w:ascii="Calibri" w:hAnsi="Calibri" w:eastAsia="Calibri" w:cs="Calibri"/>
+                <w:kern w:val="0"/>
+                <w:sz w:val="22"/>
+                <w:szCs w:val="22"/>
+                <w:lang w:val="en-US" w:eastAsia="zh-CN" w:bidi="hi-IN"/>
+              </w:rPr>
+            </w:pPr>
+            <w:r>
+              <w:rPr>
+                <w:rFonts w:eastAsia="Calibri" w:cs="Calibri"/>
+                <w:kern w:val="0"/>
+                <w:sz w:val="22"/>
+                <w:szCs w:val="22"/>
+                <w:lang w:val="en-US" w:eastAsia="zh-CN" w:bidi="hi-IN"/>
+              </w:rPr>
               <w:t>Bug fixes</w:t>
             </w:r>
           </w:p>
@@ -287,7 +372,7 @@
       </w:tr>
       <w:tr>
         <w:trPr>
-          <w:trHeight w:val="1340"/>
+          <w:trHeight w:val="1340" w:hRule="atLeast"/>
         </w:trPr>
         <w:tc>
           <w:tcPr>
@@ -303,6 +388,9 @@
           <w:p>
             <w:pPr>
               <w:pStyle w:val="normal1"/>
+              <w:widowControl/>
+              <w:suppressAutoHyphens w:val="true"/>
+              <w:spacing w:before="0" w:after="160"/>
               <w:jc w:val="left"/>
               <w:rPr>
                 <w:b/>
@@ -313,10 +401,13 @@
             </w:pPr>
             <w:r>
               <w:rPr>
-                <w:b/>
-                <w:bCs/>
+                <w:rFonts w:eastAsia="Calibri" w:cs="Calibri"/>
+                <w:b/>
+                <w:bCs/>
+                <w:kern w:val="0"/>
                 <w:sz w:val="24"/>
                 <w:szCs w:val="24"/>
+                <w:lang w:val="en-US" w:eastAsia="zh-CN" w:bidi="hi-IN"/>
               </w:rPr>
               <w:t>#2 Meerab Khan</w:t>
             </w:r>
@@ -335,16 +426,50 @@
           <w:p>
             <w:pPr>
               <w:pStyle w:val="normal1"/>
-            </w:pPr>
-            <w:r>
+              <w:widowControl/>
+              <w:suppressAutoHyphens w:val="true"/>
+              <w:spacing w:before="0" w:after="160"/>
+              <w:rPr>
+                <w:rFonts w:ascii="Calibri" w:hAnsi="Calibri" w:eastAsia="Calibri" w:cs="Calibri"/>
+                <w:kern w:val="0"/>
+                <w:sz w:val="22"/>
+                <w:szCs w:val="22"/>
+                <w:lang w:val="en-US" w:eastAsia="zh-CN" w:bidi="hi-IN"/>
+              </w:rPr>
+            </w:pPr>
+            <w:r>
+              <w:rPr>
+                <w:rFonts w:eastAsia="Calibri" w:cs="Calibri"/>
+                <w:kern w:val="0"/>
+                <w:sz w:val="22"/>
+                <w:szCs w:val="22"/>
+                <w:lang w:val="en-US" w:eastAsia="zh-CN" w:bidi="hi-IN"/>
+              </w:rPr>
               <w:t>Helped with finding ways to implement the project(sql, python/php etc…)</w:t>
             </w:r>
           </w:p>
           <w:p>
             <w:pPr>
               <w:pStyle w:val="normal1"/>
-            </w:pPr>
-            <w:r>
+              <w:widowControl/>
+              <w:suppressAutoHyphens w:val="true"/>
+              <w:spacing w:before="0" w:after="160"/>
+              <w:rPr>
+                <w:rFonts w:ascii="Calibri" w:hAnsi="Calibri" w:eastAsia="Calibri" w:cs="Calibri"/>
+                <w:kern w:val="0"/>
+                <w:sz w:val="22"/>
+                <w:szCs w:val="22"/>
+                <w:lang w:val="en-US" w:eastAsia="zh-CN" w:bidi="hi-IN"/>
+              </w:rPr>
+            </w:pPr>
+            <w:r>
+              <w:rPr>
+                <w:rFonts w:eastAsia="Calibri" w:cs="Calibri"/>
+                <w:kern w:val="0"/>
+                <w:sz w:val="22"/>
+                <w:szCs w:val="22"/>
+                <w:lang w:val="en-US" w:eastAsia="zh-CN" w:bidi="hi-IN"/>
+              </w:rPr>
               <w:t>Implemented the database connection in the code,regex expressions</w:t>
             </w:r>
           </w:p>
@@ -352,7 +477,7 @@
       </w:tr>
       <w:tr>
         <w:trPr>
-          <w:trHeight w:val="1430"/>
+          <w:trHeight w:val="1430" w:hRule="atLeast"/>
         </w:trPr>
         <w:tc>
           <w:tcPr>
@@ -368,6 +493,9 @@
           <w:p>
             <w:pPr>
               <w:pStyle w:val="normal1"/>
+              <w:widowControl/>
+              <w:suppressAutoHyphens w:val="true"/>
+              <w:spacing w:before="0" w:after="160"/>
               <w:jc w:val="left"/>
               <w:rPr>
                 <w:b/>
@@ -378,10 +506,13 @@
             </w:pPr>
             <w:r>
               <w:rPr>
-                <w:b/>
-                <w:bCs/>
+                <w:rFonts w:eastAsia="Calibri" w:cs="Calibri"/>
+                <w:b/>
+                <w:bCs/>
+                <w:kern w:val="0"/>
                 <w:sz w:val="24"/>
                 <w:szCs w:val="24"/>
+                <w:lang w:val="en-US" w:eastAsia="zh-CN" w:bidi="hi-IN"/>
               </w:rPr>
               <w:t>#3 Abdulmajeed Kakar</w:t>
             </w:r>
@@ -400,16 +531,50 @@
           <w:p>
             <w:pPr>
               <w:pStyle w:val="normal1"/>
-            </w:pPr>
-            <w:r>
+              <w:widowControl/>
+              <w:suppressAutoHyphens w:val="true"/>
+              <w:spacing w:before="0" w:after="160"/>
+              <w:rPr>
+                <w:rFonts w:ascii="Calibri" w:hAnsi="Calibri" w:eastAsia="Calibri" w:cs="Calibri"/>
+                <w:kern w:val="0"/>
+                <w:sz w:val="22"/>
+                <w:szCs w:val="22"/>
+                <w:lang w:val="en-US" w:eastAsia="zh-CN" w:bidi="hi-IN"/>
+              </w:rPr>
+            </w:pPr>
+            <w:r>
+              <w:rPr>
+                <w:rFonts w:eastAsia="Calibri" w:cs="Calibri"/>
+                <w:kern w:val="0"/>
+                <w:sz w:val="22"/>
+                <w:szCs w:val="22"/>
+                <w:lang w:val="en-US" w:eastAsia="zh-CN" w:bidi="hi-IN"/>
+              </w:rPr>
               <w:t>Helped with finding ways to implement the project(sql, python/php etc…)</w:t>
             </w:r>
           </w:p>
           <w:p>
             <w:pPr>
               <w:pStyle w:val="normal1"/>
-            </w:pPr>
-            <w:r>
+              <w:widowControl/>
+              <w:suppressAutoHyphens w:val="true"/>
+              <w:spacing w:before="0" w:after="160"/>
+              <w:rPr>
+                <w:rFonts w:ascii="Calibri" w:hAnsi="Calibri" w:eastAsia="Calibri" w:cs="Calibri"/>
+                <w:kern w:val="0"/>
+                <w:sz w:val="22"/>
+                <w:szCs w:val="22"/>
+                <w:lang w:val="en-US" w:eastAsia="zh-CN" w:bidi="hi-IN"/>
+              </w:rPr>
+            </w:pPr>
+            <w:r>
+              <w:rPr>
+                <w:rFonts w:eastAsia="Calibri" w:cs="Calibri"/>
+                <w:kern w:val="0"/>
+                <w:sz w:val="22"/>
+                <w:szCs w:val="22"/>
+                <w:lang w:val="en-US" w:eastAsia="zh-CN" w:bidi="hi-IN"/>
+              </w:rPr>
               <w:t>Implemented the GUI in the code</w:t>
             </w:r>
           </w:p>
@@ -417,7 +582,7 @@
       </w:tr>
       <w:tr>
         <w:trPr>
-          <w:trHeight w:val="1430"/>
+          <w:trHeight w:val="1430" w:hRule="atLeast"/>
         </w:trPr>
         <w:tc>
           <w:tcPr>
@@ -433,6 +598,9 @@
           <w:p>
             <w:pPr>
               <w:pStyle w:val="normal1"/>
+              <w:widowControl/>
+              <w:suppressAutoHyphens w:val="true"/>
+              <w:spacing w:before="0" w:after="160"/>
               <w:jc w:val="left"/>
               <w:rPr>
                 <w:b/>
@@ -443,10 +611,13 @@
             </w:pPr>
             <w:r>
               <w:rPr>
-                <w:b/>
-                <w:bCs/>
+                <w:rFonts w:eastAsia="Calibri" w:cs="Calibri"/>
+                <w:b/>
+                <w:bCs/>
+                <w:kern w:val="0"/>
                 <w:sz w:val="24"/>
                 <w:szCs w:val="24"/>
+                <w:lang w:val="en-US" w:eastAsia="zh-CN" w:bidi="hi-IN"/>
               </w:rPr>
               <w:t>#4 Cheng Yu Yang</w:t>
             </w:r>
@@ -465,24 +636,75 @@
           <w:p>
             <w:pPr>
               <w:pStyle w:val="normal1"/>
-            </w:pPr>
-            <w:r>
+              <w:widowControl/>
+              <w:suppressAutoHyphens w:val="true"/>
+              <w:spacing w:before="0" w:after="160"/>
+              <w:rPr>
+                <w:rFonts w:ascii="Calibri" w:hAnsi="Calibri" w:eastAsia="Calibri" w:cs="Calibri"/>
+                <w:kern w:val="0"/>
+                <w:sz w:val="22"/>
+                <w:szCs w:val="22"/>
+                <w:lang w:val="en-US" w:eastAsia="zh-CN" w:bidi="hi-IN"/>
+              </w:rPr>
+            </w:pPr>
+            <w:r>
+              <w:rPr>
+                <w:rFonts w:eastAsia="Calibri" w:cs="Calibri"/>
+                <w:kern w:val="0"/>
+                <w:sz w:val="22"/>
+                <w:szCs w:val="22"/>
+                <w:lang w:val="en-US" w:eastAsia="zh-CN" w:bidi="hi-IN"/>
+              </w:rPr>
               <w:t>Helped with finding ways to implement the project(sql, python/php etc…)</w:t>
             </w:r>
           </w:p>
           <w:p>
             <w:pPr>
               <w:pStyle w:val="normal1"/>
-            </w:pPr>
-            <w:r>
+              <w:widowControl/>
+              <w:suppressAutoHyphens w:val="true"/>
+              <w:spacing w:before="0" w:after="160"/>
+              <w:rPr>
+                <w:rFonts w:ascii="Calibri" w:hAnsi="Calibri" w:eastAsia="Calibri" w:cs="Calibri"/>
+                <w:kern w:val="0"/>
+                <w:sz w:val="22"/>
+                <w:szCs w:val="22"/>
+                <w:lang w:val="en-US" w:eastAsia="zh-CN" w:bidi="hi-IN"/>
+              </w:rPr>
+            </w:pPr>
+            <w:r>
+              <w:rPr>
+                <w:rFonts w:eastAsia="Calibri" w:cs="Calibri"/>
+                <w:kern w:val="0"/>
+                <w:sz w:val="22"/>
+                <w:szCs w:val="22"/>
+                <w:lang w:val="en-US" w:eastAsia="zh-CN" w:bidi="hi-IN"/>
+              </w:rPr>
               <w:t>Found solution for replacing slim framework since we were having issues.</w:t>
             </w:r>
           </w:p>
           <w:p>
             <w:pPr>
               <w:pStyle w:val="normal1"/>
-            </w:pPr>
-            <w:r>
+              <w:widowControl/>
+              <w:suppressAutoHyphens w:val="true"/>
+              <w:spacing w:before="0" w:after="160"/>
+              <w:rPr>
+                <w:rFonts w:ascii="Calibri" w:hAnsi="Calibri" w:eastAsia="Calibri" w:cs="Calibri"/>
+                <w:kern w:val="0"/>
+                <w:sz w:val="22"/>
+                <w:szCs w:val="22"/>
+                <w:lang w:val="en-US" w:eastAsia="zh-CN" w:bidi="hi-IN"/>
+              </w:rPr>
+            </w:pPr>
+            <w:r>
+              <w:rPr>
+                <w:rFonts w:eastAsia="Calibri" w:cs="Calibri"/>
+                <w:kern w:val="0"/>
+                <w:sz w:val="22"/>
+                <w:szCs w:val="22"/>
+                <w:lang w:val="en-US" w:eastAsia="zh-CN" w:bidi="hi-IN"/>
+              </w:rPr>
               <w:t>Working on Converting the interface to HTML</w:t>
             </w:r>
           </w:p>
@@ -492,22 +714,35 @@
     <w:p>
       <w:pPr>
         <w:pStyle w:val="normal1"/>
+        <w:rPr/>
       </w:pPr>
+      <w:r>
+        <w:rPr/>
+      </w:r>
     </w:p>
     <w:p>
       <w:pPr>
         <w:pStyle w:val="normal1"/>
+        <w:rPr/>
       </w:pPr>
+      <w:r>
+        <w:rPr/>
+      </w:r>
     </w:p>
     <w:p>
       <w:pPr>
         <w:pStyle w:val="normal1"/>
+        <w:rPr/>
       </w:pPr>
+      <w:r>
+        <w:rPr/>
+      </w:r>
     </w:p>
     <w:p>
       <w:pPr>
         <w:pStyle w:val="normal1"/>
         <w:jc w:val="right"/>
+        <w:rPr/>
       </w:pPr>
       <w:r>
         <w:rPr>
@@ -516,7 +751,6 @@
           <w:sz w:val="28"/>
           <w:szCs w:val="28"/>
         </w:rPr>
-        <w:lastRenderedPageBreak/>
         <w:t>Phase: 2</w:t>
       </w:r>
     </w:p>
@@ -524,6 +758,7 @@
       <w:tblPr>
         <w:tblStyle w:val="TableNormal0"/>
         <w:tblW w:w="9350" w:type="dxa"/>
+        <w:jc w:val="left"/>
         <w:tblInd w:w="0" w:type="dxa"/>
         <w:tblLayout w:type="fixed"/>
         <w:tblCellMar>
@@ -532,15 +767,15 @@
           <w:bottom w:w="0" w:type="dxa"/>
           <w:right w:w="108" w:type="dxa"/>
         </w:tblCellMar>
-        <w:tblLook w:val="0400" w:firstRow="0" w:lastRow="0" w:firstColumn="0" w:lastColumn="0" w:noHBand="0" w:noVBand="1"/>
+        <w:tblLook w:val="0400" w:noHBand="0" w:noVBand="1" w:firstColumn="0" w:lastRow="0" w:lastColumn="0" w:firstRow="0"/>
       </w:tblPr>
       <w:tblGrid>
         <w:gridCol w:w="3955"/>
-        <w:gridCol w:w="5395"/>
+        <w:gridCol w:w="5394"/>
       </w:tblGrid>
       <w:tr>
         <w:trPr>
-          <w:trHeight w:val="530"/>
+          <w:trHeight w:val="530" w:hRule="atLeast"/>
         </w:trPr>
         <w:tc>
           <w:tcPr>
@@ -556,6 +791,9 @@
           <w:p>
             <w:pPr>
               <w:pStyle w:val="normal1"/>
+              <w:widowControl/>
+              <w:suppressAutoHyphens w:val="true"/>
+              <w:spacing w:before="0" w:after="160"/>
               <w:jc w:val="center"/>
               <w:rPr>
                 <w:b/>
@@ -566,10 +804,13 @@
             </w:pPr>
             <w:r>
               <w:rPr>
-                <w:b/>
-                <w:bCs/>
+                <w:rFonts w:eastAsia="Calibri" w:cs="Calibri"/>
+                <w:b/>
+                <w:bCs/>
+                <w:kern w:val="0"/>
                 <w:sz w:val="32"/>
                 <w:szCs w:val="32"/>
+                <w:lang w:val="en-US" w:eastAsia="zh-CN" w:bidi="hi-IN"/>
               </w:rPr>
               <w:t>Student name</w:t>
             </w:r>
@@ -589,6 +830,9 @@
           <w:p>
             <w:pPr>
               <w:pStyle w:val="normal1"/>
+              <w:widowControl/>
+              <w:suppressAutoHyphens w:val="true"/>
+              <w:spacing w:before="0" w:after="160"/>
               <w:jc w:val="center"/>
               <w:rPr>
                 <w:b/>
@@ -599,10 +843,13 @@
             </w:pPr>
             <w:r>
               <w:rPr>
-                <w:b/>
-                <w:bCs/>
+                <w:rFonts w:eastAsia="Calibri" w:cs="Calibri"/>
+                <w:b/>
+                <w:bCs/>
+                <w:kern w:val="0"/>
                 <w:sz w:val="32"/>
                 <w:szCs w:val="32"/>
+                <w:lang w:val="en-US" w:eastAsia="zh-CN" w:bidi="hi-IN"/>
               </w:rPr>
               <w:t>Tasks and duties</w:t>
             </w:r>
@@ -611,7 +858,7 @@
       </w:tr>
       <w:tr>
         <w:trPr>
-          <w:trHeight w:val="1790"/>
+          <w:trHeight w:val="1790" w:hRule="atLeast"/>
         </w:trPr>
         <w:tc>
           <w:tcPr>
@@ -627,6 +874,9 @@
           <w:p>
             <w:pPr>
               <w:pStyle w:val="normal1"/>
+              <w:widowControl/>
+              <w:suppressAutoHyphens w:val="true"/>
+              <w:spacing w:before="0" w:after="160"/>
               <w:jc w:val="left"/>
               <w:rPr>
                 <w:b/>
@@ -637,10 +887,13 @@
             </w:pPr>
             <w:r>
               <w:rPr>
-                <w:b/>
-                <w:bCs/>
+                <w:rFonts w:eastAsia="Calibri" w:cs="Calibri"/>
+                <w:b/>
+                <w:bCs/>
+                <w:kern w:val="0"/>
                 <w:sz w:val="24"/>
                 <w:szCs w:val="24"/>
+                <w:lang w:val="en-US" w:eastAsia="zh-CN" w:bidi="hi-IN"/>
               </w:rPr>
               <w:t>#1 Jonathan Markovic</w:t>
             </w:r>
@@ -659,64 +912,150 @@
           <w:p>
             <w:pPr>
               <w:pStyle w:val="normal1"/>
-            </w:pPr>
-            <w:r>
+              <w:widowControl/>
+              <w:suppressAutoHyphens w:val="true"/>
+              <w:spacing w:before="0" w:after="160"/>
+              <w:rPr>
+                <w:rFonts w:ascii="Calibri" w:hAnsi="Calibri" w:eastAsia="Calibri" w:cs="Calibri"/>
+                <w:kern w:val="0"/>
+                <w:sz w:val="22"/>
+                <w:szCs w:val="22"/>
+                <w:lang w:val="en-US" w:eastAsia="zh-CN" w:bidi="hi-IN"/>
+              </w:rPr>
+            </w:pPr>
+            <w:r>
+              <w:rPr>
+                <w:rFonts w:eastAsia="Calibri" w:cs="Calibri"/>
+                <w:kern w:val="0"/>
+                <w:sz w:val="22"/>
+                <w:szCs w:val="22"/>
+                <w:lang w:val="en-US" w:eastAsia="zh-CN" w:bidi="hi-IN"/>
+              </w:rPr>
               <w:t>Helped in ways to implement the project(ESP32, MQTT, sensors)</w:t>
             </w:r>
           </w:p>
           <w:p>
             <w:pPr>
               <w:pStyle w:val="normal1"/>
-            </w:pPr>
-            <w:r>
-              <w:t>Implemented</w:t>
-            </w:r>
-            <w:r>
-              <w:t xml:space="preserve"> D</w:t>
-            </w:r>
-            <w:r>
-              <w:t>HT11</w:t>
-            </w:r>
-            <w:r>
-              <w:t xml:space="preserve"> </w:t>
-            </w:r>
-            <w:r>
-              <w:t>sensor connection with ESP32(temperature &amp; humidity)</w:t>
+              <w:widowControl/>
+              <w:suppressAutoHyphens w:val="true"/>
+              <w:spacing w:before="0" w:after="160"/>
+              <w:rPr>
+                <w:rFonts w:ascii="Calibri" w:hAnsi="Calibri" w:eastAsia="Calibri" w:cs="Calibri"/>
+                <w:kern w:val="0"/>
+                <w:sz w:val="22"/>
+                <w:szCs w:val="22"/>
+                <w:lang w:val="en-US" w:eastAsia="zh-CN" w:bidi="hi-IN"/>
+              </w:rPr>
+            </w:pPr>
+            <w:r>
+              <w:rPr>
+                <w:rFonts w:eastAsia="Calibri" w:cs="Calibri"/>
+                <w:kern w:val="0"/>
+                <w:sz w:val="22"/>
+                <w:szCs w:val="22"/>
+                <w:lang w:val="en-US" w:eastAsia="zh-CN" w:bidi="hi-IN"/>
+              </w:rPr>
+              <w:t>Implemented DHT11 sensor connection with ESP32(temperature &amp; humidity)</w:t>
             </w:r>
           </w:p>
           <w:p>
             <w:pPr>
               <w:pStyle w:val="BodyText"/>
-              <w:spacing w:after="160"/>
-            </w:pPr>
-            <w:r>
+              <w:widowControl/>
+              <w:suppressAutoHyphens w:val="true"/>
+              <w:spacing w:before="0" w:after="160"/>
+              <w:rPr>
+                <w:rFonts w:ascii="Calibri" w:hAnsi="Calibri" w:eastAsia="Calibri" w:cs="Calibri"/>
+                <w:kern w:val="0"/>
+                <w:sz w:val="22"/>
+                <w:szCs w:val="22"/>
+                <w:lang w:val="en-US" w:eastAsia="zh-CN" w:bidi="hi-IN"/>
+              </w:rPr>
+            </w:pPr>
+            <w:r>
+              <w:rPr>
+                <w:rFonts w:eastAsia="Calibri" w:cs="Calibri"/>
+                <w:kern w:val="0"/>
+                <w:sz w:val="22"/>
+                <w:szCs w:val="22"/>
+                <w:lang w:val="en-US" w:eastAsia="zh-CN" w:bidi="hi-IN"/>
+              </w:rPr>
               <w:t>Configured MQTT server connection with Python and data publishing (Frig1 / Frig2)</w:t>
             </w:r>
           </w:p>
           <w:p>
             <w:pPr>
               <w:pStyle w:val="BodyText"/>
-              <w:spacing w:after="160"/>
-            </w:pPr>
-            <w:r>
+              <w:widowControl/>
+              <w:suppressAutoHyphens w:val="true"/>
+              <w:spacing w:before="0" w:after="160"/>
+              <w:rPr>
+                <w:rFonts w:ascii="Calibri" w:hAnsi="Calibri" w:eastAsia="Calibri" w:cs="Calibri"/>
+                <w:kern w:val="0"/>
+                <w:sz w:val="22"/>
+                <w:szCs w:val="22"/>
+                <w:lang w:val="en-US" w:eastAsia="zh-CN" w:bidi="hi-IN"/>
+              </w:rPr>
+            </w:pPr>
+            <w:r>
+              <w:rPr>
+                <w:rFonts w:eastAsia="Calibri" w:cs="Calibri"/>
+                <w:kern w:val="0"/>
+                <w:sz w:val="22"/>
+                <w:szCs w:val="22"/>
+                <w:lang w:val="en-US" w:eastAsia="zh-CN" w:bidi="hi-IN"/>
+              </w:rPr>
               <w:t>Implemented fan logic based on temperature threshold</w:t>
             </w:r>
           </w:p>
           <w:p>
             <w:pPr>
               <w:pStyle w:val="BodyText"/>
-              <w:spacing w:after="160"/>
-            </w:pPr>
-            <w:r>
+              <w:widowControl/>
+              <w:suppressAutoHyphens w:val="true"/>
+              <w:spacing w:before="0" w:after="160"/>
+              <w:rPr>
+                <w:rFonts w:ascii="Calibri" w:hAnsi="Calibri" w:eastAsia="Calibri" w:cs="Calibri"/>
+                <w:kern w:val="0"/>
+                <w:sz w:val="22"/>
+                <w:szCs w:val="22"/>
+                <w:lang w:val="en-US" w:eastAsia="zh-CN" w:bidi="hi-IN"/>
+              </w:rPr>
+            </w:pPr>
+            <w:r>
+              <w:rPr>
+                <w:rFonts w:eastAsia="Calibri" w:cs="Calibri"/>
+                <w:kern w:val="0"/>
+                <w:sz w:val="22"/>
+                <w:szCs w:val="22"/>
+                <w:lang w:val="en-US" w:eastAsia="zh-CN" w:bidi="hi-IN"/>
+              </w:rPr>
               <w:t>Designed and assembled circuit</w:t>
             </w:r>
           </w:p>
           <w:p>
             <w:pPr>
               <w:pStyle w:val="BodyText"/>
-              <w:spacing w:after="160"/>
-            </w:pPr>
-            <w:r>
+              <w:widowControl/>
+              <w:suppressAutoHyphens w:val="true"/>
+              <w:spacing w:before="0" w:after="160"/>
+              <w:rPr>
+                <w:rFonts w:ascii="Calibri" w:hAnsi="Calibri" w:eastAsia="Calibri" w:cs="Calibri"/>
+                <w:kern w:val="0"/>
+                <w:sz w:val="22"/>
+                <w:szCs w:val="22"/>
+                <w:lang w:val="en-US" w:eastAsia="zh-CN" w:bidi="hi-IN"/>
+              </w:rPr>
+            </w:pPr>
+            <w:r>
+              <w:rPr>
+                <w:rFonts w:eastAsia="Calibri" w:cs="Calibri"/>
+                <w:kern w:val="0"/>
+                <w:sz w:val="22"/>
+                <w:szCs w:val="22"/>
+                <w:lang w:val="en-US" w:eastAsia="zh-CN" w:bidi="hi-IN"/>
+              </w:rPr>
               <w:t>Bug Fixes</w:t>
             </w:r>
           </w:p>
@@ -724,7 +1063,7 @@
       </w:tr>
       <w:tr>
         <w:trPr>
-          <w:trHeight w:val="1340"/>
+          <w:trHeight w:val="1340" w:hRule="atLeast"/>
         </w:trPr>
         <w:tc>
           <w:tcPr>
@@ -740,6 +1079,9 @@
           <w:p>
             <w:pPr>
               <w:pStyle w:val="normal1"/>
+              <w:widowControl/>
+              <w:suppressAutoHyphens w:val="true"/>
+              <w:spacing w:before="0" w:after="160"/>
               <w:jc w:val="left"/>
               <w:rPr>
                 <w:b/>
@@ -750,10 +1092,13 @@
             </w:pPr>
             <w:r>
               <w:rPr>
-                <w:b/>
-                <w:bCs/>
+                <w:rFonts w:eastAsia="Calibri" w:cs="Calibri"/>
+                <w:b/>
+                <w:bCs/>
+                <w:kern w:val="0"/>
                 <w:sz w:val="24"/>
                 <w:szCs w:val="24"/>
+                <w:lang w:val="en-US" w:eastAsia="zh-CN" w:bidi="hi-IN"/>
               </w:rPr>
               <w:t>#2 Meerab Khan</w:t>
             </w:r>
@@ -772,51 +1117,100 @@
           <w:p>
             <w:pPr>
               <w:pStyle w:val="BodyText"/>
-              <w:spacing w:after="160"/>
-            </w:pPr>
-            <w:r>
+              <w:widowControl/>
+              <w:suppressAutoHyphens w:val="true"/>
+              <w:spacing w:before="0" w:after="160"/>
+              <w:rPr>
+                <w:rFonts w:ascii="Calibri" w:hAnsi="Calibri" w:eastAsia="Calibri" w:cs="Calibri"/>
+                <w:kern w:val="0"/>
+                <w:sz w:val="22"/>
+                <w:szCs w:val="22"/>
+                <w:lang w:val="en-US" w:eastAsia="zh-CN" w:bidi="hi-IN"/>
+              </w:rPr>
+            </w:pPr>
+            <w:r>
+              <w:rPr>
+                <w:rFonts w:eastAsia="Calibri" w:cs="Calibri"/>
+                <w:kern w:val="0"/>
+                <w:sz w:val="22"/>
+                <w:szCs w:val="22"/>
+                <w:lang w:val="en-US" w:eastAsia="zh-CN" w:bidi="hi-IN"/>
+              </w:rPr>
               <w:t>Helped with finding ways to implement the project (Python, email system, MQTT logic with 2 ESP32s)</w:t>
             </w:r>
           </w:p>
           <w:p>
             <w:pPr>
               <w:pStyle w:val="BodyText"/>
-              <w:spacing w:after="160"/>
-            </w:pPr>
-            <w:r>
-              <w:t xml:space="preserve">Implemented </w:t>
-            </w:r>
-            <w:r>
-              <w:t>email system</w:t>
-            </w:r>
-            <w:r>
-              <w:t xml:space="preserve"> (sending alerts and receiving</w:t>
-            </w:r>
-            <w:r>
-              <w:t xml:space="preserve"> with fan activation</w:t>
-            </w:r>
-            <w:r>
-              <w:t>)</w:t>
-            </w:r>
-            <w:r>
-              <w:t xml:space="preserve"> </w:t>
+              <w:widowControl/>
+              <w:suppressAutoHyphens w:val="true"/>
+              <w:spacing w:before="0" w:after="160"/>
+              <w:rPr>
+                <w:rFonts w:ascii="Calibri" w:hAnsi="Calibri" w:eastAsia="Calibri" w:cs="Calibri"/>
+                <w:kern w:val="0"/>
+                <w:sz w:val="22"/>
+                <w:szCs w:val="22"/>
+                <w:lang w:val="en-US" w:eastAsia="zh-CN" w:bidi="hi-IN"/>
+              </w:rPr>
+            </w:pPr>
+            <w:r>
+              <w:rPr>
+                <w:rFonts w:eastAsia="Calibri" w:cs="Calibri"/>
+                <w:kern w:val="0"/>
+                <w:sz w:val="22"/>
+                <w:szCs w:val="22"/>
+                <w:lang w:val="en-US" w:eastAsia="zh-CN" w:bidi="hi-IN"/>
+              </w:rPr>
+              <w:t>Implemented email system (sending alerts and receiving with fan activation)</w:t>
             </w:r>
           </w:p>
           <w:p>
             <w:pPr>
               <w:pStyle w:val="BodyText"/>
-              <w:spacing w:after="160"/>
-            </w:pPr>
-            <w:r>
+              <w:widowControl/>
+              <w:suppressAutoHyphens w:val="true"/>
+              <w:spacing w:before="0" w:after="160"/>
+              <w:rPr>
+                <w:rFonts w:ascii="Calibri" w:hAnsi="Calibri" w:eastAsia="Calibri" w:cs="Calibri"/>
+                <w:kern w:val="0"/>
+                <w:sz w:val="22"/>
+                <w:szCs w:val="22"/>
+                <w:lang w:val="en-US" w:eastAsia="zh-CN" w:bidi="hi-IN"/>
+              </w:rPr>
+            </w:pPr>
+            <w:r>
+              <w:rPr>
+                <w:rFonts w:eastAsia="Calibri" w:cs="Calibri"/>
+                <w:kern w:val="0"/>
+                <w:sz w:val="22"/>
+                <w:szCs w:val="22"/>
+                <w:lang w:val="en-US" w:eastAsia="zh-CN" w:bidi="hi-IN"/>
+              </w:rPr>
               <w:t>Implemented threshold values stored in database</w:t>
             </w:r>
           </w:p>
           <w:p>
             <w:pPr>
               <w:pStyle w:val="BodyText"/>
-              <w:spacing w:after="160"/>
-            </w:pPr>
-            <w:r>
+              <w:widowControl/>
+              <w:suppressAutoHyphens w:val="true"/>
+              <w:spacing w:before="0" w:after="160"/>
+              <w:rPr>
+                <w:rFonts w:ascii="Calibri" w:hAnsi="Calibri" w:eastAsia="Calibri" w:cs="Calibri"/>
+                <w:kern w:val="0"/>
+                <w:sz w:val="22"/>
+                <w:szCs w:val="22"/>
+                <w:lang w:val="en-US" w:eastAsia="zh-CN" w:bidi="hi-IN"/>
+              </w:rPr>
+            </w:pPr>
+            <w:r>
+              <w:rPr>
+                <w:rFonts w:eastAsia="Calibri" w:cs="Calibri"/>
+                <w:kern w:val="0"/>
+                <w:sz w:val="22"/>
+                <w:szCs w:val="22"/>
+                <w:lang w:val="en-US" w:eastAsia="zh-CN" w:bidi="hi-IN"/>
+              </w:rPr>
               <w:t>Assisted with testing hardware setup with the GUI.</w:t>
             </w:r>
           </w:p>
@@ -824,7 +1218,7 @@
       </w:tr>
       <w:tr>
         <w:trPr>
-          <w:trHeight w:val="1430"/>
+          <w:trHeight w:val="1430" w:hRule="atLeast"/>
         </w:trPr>
         <w:tc>
           <w:tcPr>
@@ -840,6 +1234,9 @@
           <w:p>
             <w:pPr>
               <w:pStyle w:val="normal1"/>
+              <w:widowControl/>
+              <w:suppressAutoHyphens w:val="true"/>
+              <w:spacing w:before="0" w:after="160"/>
               <w:jc w:val="left"/>
               <w:rPr>
                 <w:b/>
@@ -850,10 +1247,13 @@
             </w:pPr>
             <w:r>
               <w:rPr>
-                <w:b/>
-                <w:bCs/>
+                <w:rFonts w:eastAsia="Calibri" w:cs="Calibri"/>
+                <w:b/>
+                <w:bCs/>
+                <w:kern w:val="0"/>
                 <w:sz w:val="24"/>
                 <w:szCs w:val="24"/>
+                <w:lang w:val="en-US" w:eastAsia="zh-CN" w:bidi="hi-IN"/>
               </w:rPr>
               <w:t>#3 Cheng Yu Yang</w:t>
             </w:r>
@@ -872,86 +1272,184 @@
           <w:p>
             <w:pPr>
               <w:pStyle w:val="normal1"/>
-            </w:pPr>
-            <w:r>
+              <w:widowControl/>
+              <w:suppressAutoHyphens w:val="true"/>
+              <w:spacing w:before="0" w:after="160"/>
+              <w:rPr>
+                <w:rFonts w:ascii="Calibri" w:hAnsi="Calibri" w:eastAsia="Calibri" w:cs="Calibri"/>
+                <w:kern w:val="0"/>
+                <w:sz w:val="22"/>
+                <w:szCs w:val="22"/>
+                <w:lang w:val="en-US" w:eastAsia="zh-CN" w:bidi="hi-IN"/>
+              </w:rPr>
+            </w:pPr>
+            <w:r>
+              <w:rPr>
+                <w:rFonts w:eastAsia="Calibri" w:cs="Calibri"/>
+                <w:kern w:val="0"/>
+                <w:sz w:val="22"/>
+                <w:szCs w:val="22"/>
+                <w:lang w:val="en-US" w:eastAsia="zh-CN" w:bidi="hi-IN"/>
+              </w:rPr>
               <w:t>Created flask server application and HTML templates</w:t>
             </w:r>
           </w:p>
           <w:p>
             <w:pPr>
               <w:pStyle w:val="normal1"/>
-            </w:pPr>
-            <w:r>
-              <w:t xml:space="preserve">Styled pages using </w:t>
-            </w:r>
-            <w:r>
-              <w:t xml:space="preserve">custom </w:t>
-            </w:r>
-            <w:r>
-              <w:t>CSS</w:t>
-            </w:r>
-          </w:p>
-          <w:p>
-            <w:pPr>
-              <w:pStyle w:val="normal1"/>
-            </w:pPr>
-            <w:r>
+              <w:widowControl/>
+              <w:suppressAutoHyphens w:val="true"/>
+              <w:spacing w:before="0" w:after="160"/>
+              <w:rPr>
+                <w:rFonts w:ascii="Calibri" w:hAnsi="Calibri" w:eastAsia="Calibri" w:cs="Calibri"/>
+                <w:kern w:val="0"/>
+                <w:sz w:val="22"/>
+                <w:szCs w:val="22"/>
+                <w:lang w:val="en-US" w:eastAsia="zh-CN" w:bidi="hi-IN"/>
+              </w:rPr>
+            </w:pPr>
+            <w:r>
+              <w:rPr>
+                <w:rFonts w:eastAsia="Calibri" w:cs="Calibri"/>
+                <w:kern w:val="0"/>
+                <w:sz w:val="22"/>
+                <w:szCs w:val="22"/>
+                <w:lang w:val="en-US" w:eastAsia="zh-CN" w:bidi="hi-IN"/>
+              </w:rPr>
+              <w:t>Styled pages using custom CSS</w:t>
+            </w:r>
+          </w:p>
+          <w:p>
+            <w:pPr>
+              <w:pStyle w:val="normal1"/>
+              <w:widowControl/>
+              <w:suppressAutoHyphens w:val="true"/>
+              <w:spacing w:before="0" w:after="160"/>
+              <w:rPr>
+                <w:rFonts w:ascii="Calibri" w:hAnsi="Calibri" w:eastAsia="Calibri" w:cs="Calibri"/>
+                <w:kern w:val="0"/>
+                <w:sz w:val="22"/>
+                <w:szCs w:val="22"/>
+                <w:lang w:val="en-US" w:eastAsia="zh-CN" w:bidi="hi-IN"/>
+              </w:rPr>
+            </w:pPr>
+            <w:r>
+              <w:rPr>
+                <w:rFonts w:eastAsia="Calibri" w:cs="Calibri"/>
+                <w:kern w:val="0"/>
+                <w:sz w:val="22"/>
+                <w:szCs w:val="22"/>
+                <w:lang w:val="en-US" w:eastAsia="zh-CN" w:bidi="hi-IN"/>
+              </w:rPr>
               <w:t>Implemented app routes and HTTP request logic</w:t>
             </w:r>
           </w:p>
           <w:p>
             <w:pPr>
               <w:pStyle w:val="normal1"/>
-            </w:pPr>
-            <w:r>
-              <w:t>Helped implement database methods</w:t>
-            </w:r>
-            <w:r>
-              <w:t xml:space="preserve"> (insert)</w:t>
-            </w:r>
-          </w:p>
-          <w:p>
-            <w:pPr>
-              <w:pStyle w:val="normal1"/>
-            </w:pPr>
-            <w:r>
-              <w:t xml:space="preserve">Designed </w:t>
-            </w:r>
-            <w:r>
-              <w:t>value display</w:t>
-            </w:r>
-            <w:r>
-              <w:t xml:space="preserve"> for temperature and humidity</w:t>
-            </w:r>
-          </w:p>
-          <w:p>
-            <w:pPr>
-              <w:pStyle w:val="normal1"/>
-            </w:pPr>
-            <w:r>
-              <w:t>Implemented fan toggle</w:t>
-            </w:r>
-            <w:r>
-              <w:t xml:space="preserve"> (</w:t>
-            </w:r>
-            <w:r>
-              <w:t>ON/OFF)</w:t>
+              <w:widowControl/>
+              <w:suppressAutoHyphens w:val="true"/>
+              <w:spacing w:before="0" w:after="160"/>
+              <w:rPr>
+                <w:rFonts w:ascii="Calibri" w:hAnsi="Calibri" w:eastAsia="Calibri" w:cs="Calibri"/>
+                <w:kern w:val="0"/>
+                <w:sz w:val="22"/>
+                <w:szCs w:val="22"/>
+                <w:lang w:val="en-US" w:eastAsia="zh-CN" w:bidi="hi-IN"/>
+              </w:rPr>
+            </w:pPr>
+            <w:r>
+              <w:rPr>
+                <w:rFonts w:eastAsia="Calibri" w:cs="Calibri"/>
+                <w:kern w:val="0"/>
+                <w:sz w:val="22"/>
+                <w:szCs w:val="22"/>
+                <w:lang w:val="en-US" w:eastAsia="zh-CN" w:bidi="hi-IN"/>
+              </w:rPr>
+              <w:t>Helped implement database methods (insert)</w:t>
+            </w:r>
+          </w:p>
+          <w:p>
+            <w:pPr>
+              <w:pStyle w:val="normal1"/>
+              <w:widowControl/>
+              <w:suppressAutoHyphens w:val="true"/>
+              <w:spacing w:before="0" w:after="160"/>
+              <w:rPr>
+                <w:rFonts w:ascii="Calibri" w:hAnsi="Calibri" w:eastAsia="Calibri" w:cs="Calibri"/>
+                <w:kern w:val="0"/>
+                <w:sz w:val="22"/>
+                <w:szCs w:val="22"/>
+                <w:lang w:val="en-US" w:eastAsia="zh-CN" w:bidi="hi-IN"/>
+              </w:rPr>
+            </w:pPr>
+            <w:r>
+              <w:rPr>
+                <w:rFonts w:eastAsia="Calibri" w:cs="Calibri"/>
+                <w:kern w:val="0"/>
+                <w:sz w:val="22"/>
+                <w:szCs w:val="22"/>
+                <w:lang w:val="en-US" w:eastAsia="zh-CN" w:bidi="hi-IN"/>
+              </w:rPr>
+              <w:t>Designed value display for temperature and humidity</w:t>
+            </w:r>
+          </w:p>
+          <w:p>
+            <w:pPr>
+              <w:pStyle w:val="normal1"/>
+              <w:widowControl/>
+              <w:suppressAutoHyphens w:val="true"/>
+              <w:spacing w:before="0" w:after="160"/>
+              <w:rPr>
+                <w:rFonts w:ascii="Calibri" w:hAnsi="Calibri" w:eastAsia="Calibri" w:cs="Calibri"/>
+                <w:kern w:val="0"/>
+                <w:sz w:val="22"/>
+                <w:szCs w:val="22"/>
+                <w:lang w:val="en-US" w:eastAsia="zh-CN" w:bidi="hi-IN"/>
+              </w:rPr>
+            </w:pPr>
+            <w:r>
+              <w:rPr>
+                <w:rFonts w:eastAsia="Calibri" w:cs="Calibri"/>
+                <w:kern w:val="0"/>
+                <w:sz w:val="22"/>
+                <w:szCs w:val="22"/>
+                <w:lang w:val="en-US" w:eastAsia="zh-CN" w:bidi="hi-IN"/>
+              </w:rPr>
+              <w:t>Implemented fan toggle (ON/OFF)</w:t>
             </w:r>
           </w:p>
         </w:tc>
       </w:tr>
     </w:tbl>
-    <w:p/>
+    <w:p>
+      <w:pPr>
+        <w:pStyle w:val="Normal"/>
+        <w:rPr/>
+      </w:pPr>
+      <w:r>
+        <w:rPr/>
+      </w:r>
+    </w:p>
     <w:p>
       <w:pPr>
         <w:pStyle w:val="normal1"/>
+        <w:rPr/>
       </w:pPr>
+      <w:r>
+        <w:rPr/>
+      </w:r>
     </w:p>
     <w:p>
       <w:pPr>
-        <w:spacing w:after="0" w:line="240" w:lineRule="auto"/>
+        <w:pStyle w:val="Normal"/>
+        <w:spacing w:lineRule="auto" w:line="240" w:before="0" w:after="0"/>
         <w:jc w:val="left"/>
+        <w:rPr/>
       </w:pPr>
+      <w:r>
+        <w:rPr/>
+      </w:r>
       <w:r>
         <w:br w:type="page"/>
       </w:r>
@@ -959,7 +1457,9 @@
     <w:p>
       <w:pPr>
         <w:pStyle w:val="normal1"/>
+        <w:spacing w:before="0" w:after="160"/>
         <w:jc w:val="right"/>
+        <w:rPr/>
       </w:pPr>
       <w:r>
         <w:rPr>
@@ -968,7 +1468,6 @@
           <w:sz w:val="28"/>
           <w:szCs w:val="28"/>
         </w:rPr>
-        <w:lastRenderedPageBreak/>
         <w:t>Phase: 3</w:t>
       </w:r>
     </w:p>
@@ -976,6 +1475,7 @@
       <w:tblPr>
         <w:tblStyle w:val="TableNormal0"/>
         <w:tblW w:w="9350" w:type="dxa"/>
+        <w:jc w:val="left"/>
         <w:tblInd w:w="0" w:type="dxa"/>
         <w:tblLayout w:type="fixed"/>
         <w:tblCellMar>
@@ -984,15 +1484,15 @@
           <w:bottom w:w="0" w:type="dxa"/>
           <w:right w:w="108" w:type="dxa"/>
         </w:tblCellMar>
-        <w:tblLook w:val="0400" w:firstRow="0" w:lastRow="0" w:firstColumn="0" w:lastColumn="0" w:noHBand="0" w:noVBand="1"/>
+        <w:tblLook w:val="0400" w:noHBand="0" w:noVBand="1" w:firstColumn="0" w:lastRow="0" w:lastColumn="0" w:firstRow="0"/>
       </w:tblPr>
       <w:tblGrid>
         <w:gridCol w:w="3955"/>
-        <w:gridCol w:w="5395"/>
+        <w:gridCol w:w="5394"/>
       </w:tblGrid>
       <w:tr>
         <w:trPr>
-          <w:trHeight w:val="530"/>
+          <w:trHeight w:val="530" w:hRule="atLeast"/>
         </w:trPr>
         <w:tc>
           <w:tcPr>
@@ -1008,6 +1508,9 @@
           <w:p>
             <w:pPr>
               <w:pStyle w:val="normal1"/>
+              <w:widowControl/>
+              <w:suppressAutoHyphens w:val="true"/>
+              <w:spacing w:before="0" w:after="160"/>
               <w:jc w:val="center"/>
               <w:rPr>
                 <w:b/>
@@ -1018,10 +1521,13 @@
             </w:pPr>
             <w:r>
               <w:rPr>
-                <w:b/>
-                <w:bCs/>
+                <w:rFonts w:eastAsia="Calibri" w:cs="Calibri"/>
+                <w:b/>
+                <w:bCs/>
+                <w:kern w:val="0"/>
                 <w:sz w:val="32"/>
                 <w:szCs w:val="32"/>
+                <w:lang w:val="en-US" w:eastAsia="zh-CN" w:bidi="hi-IN"/>
               </w:rPr>
               <w:t>Student name</w:t>
             </w:r>
@@ -1041,6 +1547,9 @@
           <w:p>
             <w:pPr>
               <w:pStyle w:val="normal1"/>
+              <w:widowControl/>
+              <w:suppressAutoHyphens w:val="true"/>
+              <w:spacing w:before="0" w:after="160"/>
               <w:jc w:val="center"/>
               <w:rPr>
                 <w:b/>
@@ -1051,10 +1560,13 @@
             </w:pPr>
             <w:r>
               <w:rPr>
-                <w:b/>
-                <w:bCs/>
+                <w:rFonts w:eastAsia="Calibri" w:cs="Calibri"/>
+                <w:b/>
+                <w:bCs/>
+                <w:kern w:val="0"/>
                 <w:sz w:val="32"/>
                 <w:szCs w:val="32"/>
+                <w:lang w:val="en-US" w:eastAsia="zh-CN" w:bidi="hi-IN"/>
               </w:rPr>
               <w:t>Tasks and duties</w:t>
             </w:r>
@@ -1063,7 +1575,7 @@
       </w:tr>
       <w:tr>
         <w:trPr>
-          <w:trHeight w:val="1790"/>
+          <w:trHeight w:val="1790" w:hRule="atLeast"/>
         </w:trPr>
         <w:tc>
           <w:tcPr>
@@ -1079,6 +1591,9 @@
           <w:p>
             <w:pPr>
               <w:pStyle w:val="normal1"/>
+              <w:widowControl/>
+              <w:suppressAutoHyphens w:val="true"/>
+              <w:spacing w:before="0" w:after="160"/>
               <w:jc w:val="left"/>
               <w:rPr>
                 <w:b/>
@@ -1089,10 +1604,13 @@
             </w:pPr>
             <w:r>
               <w:rPr>
-                <w:b/>
-                <w:bCs/>
+                <w:rFonts w:eastAsia="Calibri" w:cs="Calibri"/>
+                <w:b/>
+                <w:bCs/>
+                <w:kern w:val="0"/>
                 <w:sz w:val="24"/>
                 <w:szCs w:val="24"/>
+                <w:lang w:val="en-US" w:eastAsia="zh-CN" w:bidi="hi-IN"/>
               </w:rPr>
               <w:t>#1 Jonathan Markovic</w:t>
             </w:r>
@@ -1111,17 +1629,158 @@
           <w:p>
             <w:pPr>
               <w:pStyle w:val="BodyText"/>
-              <w:spacing w:after="160"/>
-            </w:pPr>
-            <w:r>
-              <w:t>Enter tasks</w:t>
+              <w:widowControl/>
+              <w:suppressAutoHyphens w:val="true"/>
+              <w:spacing w:before="0" w:after="160"/>
+              <w:rPr>
+                <w:rFonts w:ascii="Calibri" w:hAnsi="Calibri" w:eastAsia="Calibri" w:cs="Calibri"/>
+                <w:kern w:val="0"/>
+                <w:sz w:val="22"/>
+                <w:szCs w:val="22"/>
+                <w:lang w:val="en-US" w:eastAsia="zh-CN" w:bidi="hi-IN"/>
+              </w:rPr>
+            </w:pPr>
+            <w:r>
+              <w:rPr>
+                <w:rFonts w:eastAsia="Calibri" w:cs="Calibri"/>
+                <w:kern w:val="0"/>
+                <w:sz w:val="22"/>
+                <w:szCs w:val="22"/>
+                <w:lang w:val="en-US" w:eastAsia="zh-CN" w:bidi="hi-IN"/>
+              </w:rPr>
+              <w:t>Worked on the RFID system implementation</w:t>
+            </w:r>
+          </w:p>
+          <w:p>
+            <w:pPr>
+              <w:pStyle w:val="BodyText"/>
+              <w:widowControl/>
+              <w:suppressAutoHyphens w:val="true"/>
+              <w:spacing w:before="0" w:after="160"/>
+              <w:rPr>
+                <w:rFonts w:ascii="Calibri" w:hAnsi="Calibri" w:eastAsia="Calibri" w:cs="Calibri"/>
+                <w:kern w:val="0"/>
+                <w:sz w:val="22"/>
+                <w:szCs w:val="22"/>
+                <w:lang w:val="en-US" w:eastAsia="zh-CN" w:bidi="hi-IN"/>
+              </w:rPr>
+            </w:pPr>
+            <w:r>
+              <w:rPr>
+                <w:rFonts w:eastAsia="Calibri" w:cs="Calibri"/>
+                <w:kern w:val="0"/>
+                <w:sz w:val="22"/>
+                <w:szCs w:val="22"/>
+                <w:lang w:val="en-US" w:eastAsia="zh-CN" w:bidi="hi-IN"/>
+              </w:rPr>
+              <w:t>Worked on the Barcode scanner implementation</w:t>
+            </w:r>
+          </w:p>
+          <w:p>
+            <w:pPr>
+              <w:pStyle w:val="BodyText"/>
+              <w:widowControl/>
+              <w:suppressAutoHyphens w:val="true"/>
+              <w:spacing w:before="0" w:after="160"/>
+              <w:rPr>
+                <w:rFonts w:ascii="Calibri" w:hAnsi="Calibri" w:eastAsia="Calibri" w:cs="Calibri"/>
+                <w:kern w:val="0"/>
+                <w:sz w:val="22"/>
+                <w:szCs w:val="22"/>
+                <w:lang w:val="en-US" w:eastAsia="zh-CN" w:bidi="hi-IN"/>
+              </w:rPr>
+            </w:pPr>
+            <w:r>
+              <w:rPr>
+                <w:rFonts w:eastAsia="Calibri" w:cs="Calibri"/>
+                <w:kern w:val="0"/>
+                <w:sz w:val="22"/>
+                <w:szCs w:val="22"/>
+                <w:lang w:val="en-US" w:eastAsia="zh-CN" w:bidi="hi-IN"/>
+              </w:rPr>
+              <w:t>Worked on the cart and receipt implementation</w:t>
+            </w:r>
+          </w:p>
+          <w:p>
+            <w:pPr>
+              <w:pStyle w:val="BodyText"/>
+              <w:widowControl/>
+              <w:suppressAutoHyphens w:val="true"/>
+              <w:spacing w:before="0" w:after="160"/>
+              <w:rPr>
+                <w:rFonts w:ascii="Calibri" w:hAnsi="Calibri" w:eastAsia="Calibri" w:cs="Calibri"/>
+                <w:kern w:val="0"/>
+                <w:sz w:val="22"/>
+                <w:szCs w:val="22"/>
+                <w:lang w:val="en-US" w:eastAsia="zh-CN" w:bidi="hi-IN"/>
+              </w:rPr>
+            </w:pPr>
+            <w:r>
+              <w:rPr>
+                <w:rFonts w:eastAsia="Calibri" w:cs="Calibri"/>
+                <w:kern w:val="0"/>
+                <w:sz w:val="22"/>
+                <w:szCs w:val="22"/>
+                <w:lang w:val="en-US" w:eastAsia="zh-CN" w:bidi="hi-IN"/>
+              </w:rPr>
+              <w:t>Worked on sending email receipt implementation</w:t>
+            </w:r>
+          </w:p>
+          <w:p>
+            <w:pPr>
+              <w:pStyle w:val="BodyText"/>
+              <w:widowControl/>
+              <w:suppressAutoHyphens w:val="true"/>
+              <w:spacing w:before="0" w:after="160"/>
+              <w:rPr>
+                <w:rFonts w:ascii="Calibri" w:hAnsi="Calibri" w:eastAsia="Calibri" w:cs="Calibri"/>
+                <w:kern w:val="0"/>
+                <w:sz w:val="22"/>
+                <w:szCs w:val="22"/>
+                <w:lang w:val="en-US" w:eastAsia="zh-CN" w:bidi="hi-IN"/>
+              </w:rPr>
+            </w:pPr>
+            <w:r>
+              <w:rPr>
+                <w:rFonts w:eastAsia="Calibri" w:cs="Calibri"/>
+                <w:kern w:val="0"/>
+                <w:sz w:val="22"/>
+                <w:szCs w:val="22"/>
+                <w:lang w:val="en-US" w:eastAsia="zh-CN" w:bidi="hi-IN"/>
+              </w:rPr>
+              <w:t>Made the checkout page</w:t>
+            </w:r>
+          </w:p>
+          <w:p>
+            <w:pPr>
+              <w:pStyle w:val="BodyText"/>
+              <w:widowControl/>
+              <w:suppressAutoHyphens w:val="true"/>
+              <w:spacing w:before="0" w:after="160"/>
+              <w:rPr>
+                <w:rFonts w:ascii="Calibri" w:hAnsi="Calibri" w:eastAsia="Calibri" w:cs="Calibri"/>
+                <w:kern w:val="0"/>
+                <w:sz w:val="22"/>
+                <w:szCs w:val="22"/>
+                <w:lang w:val="en-US" w:eastAsia="zh-CN" w:bidi="hi-IN"/>
+              </w:rPr>
+            </w:pPr>
+            <w:r>
+              <w:rPr>
+                <w:rFonts w:eastAsia="Calibri" w:cs="Calibri"/>
+                <w:kern w:val="0"/>
+                <w:sz w:val="22"/>
+                <w:szCs w:val="22"/>
+                <w:lang w:val="en-US" w:eastAsia="zh-CN" w:bidi="hi-IN"/>
+              </w:rPr>
+              <w:t>Worked on bug fixes</w:t>
             </w:r>
           </w:p>
         </w:tc>
       </w:tr>
       <w:tr>
         <w:trPr>
-          <w:trHeight w:val="1340"/>
+          <w:trHeight w:val="1340" w:hRule="atLeast"/>
         </w:trPr>
         <w:tc>
           <w:tcPr>
@@ -1137,6 +1796,9 @@
           <w:p>
             <w:pPr>
               <w:pStyle w:val="normal1"/>
+              <w:widowControl/>
+              <w:suppressAutoHyphens w:val="true"/>
+              <w:spacing w:before="0" w:after="160"/>
               <w:jc w:val="left"/>
               <w:rPr>
                 <w:b/>
@@ -1147,10 +1809,13 @@
             </w:pPr>
             <w:r>
               <w:rPr>
-                <w:b/>
-                <w:bCs/>
+                <w:rFonts w:eastAsia="Calibri" w:cs="Calibri"/>
+                <w:b/>
+                <w:bCs/>
+                <w:kern w:val="0"/>
                 <w:sz w:val="24"/>
                 <w:szCs w:val="24"/>
+                <w:lang w:val="en-US" w:eastAsia="zh-CN" w:bidi="hi-IN"/>
               </w:rPr>
               <w:t>#2 Meerab Khan</w:t>
             </w:r>
@@ -1169,9 +1834,25 @@
           <w:p>
             <w:pPr>
               <w:pStyle w:val="BodyText"/>
-              <w:spacing w:after="160"/>
-            </w:pPr>
-            <w:r>
+              <w:widowControl/>
+              <w:suppressAutoHyphens w:val="true"/>
+              <w:spacing w:before="0" w:after="160"/>
+              <w:rPr>
+                <w:rFonts w:ascii="Calibri" w:hAnsi="Calibri" w:eastAsia="Calibri" w:cs="Calibri"/>
+                <w:kern w:val="0"/>
+                <w:sz w:val="22"/>
+                <w:szCs w:val="22"/>
+                <w:lang w:val="en-US" w:eastAsia="zh-CN" w:bidi="hi-IN"/>
+              </w:rPr>
+            </w:pPr>
+            <w:r>
+              <w:rPr>
+                <w:rFonts w:eastAsia="Calibri" w:cs="Calibri"/>
+                <w:kern w:val="0"/>
+                <w:sz w:val="22"/>
+                <w:szCs w:val="22"/>
+                <w:lang w:val="en-US" w:eastAsia="zh-CN" w:bidi="hi-IN"/>
+              </w:rPr>
               <w:t>Enter tasks</w:t>
             </w:r>
           </w:p>
@@ -1179,7 +1860,7 @@
       </w:tr>
       <w:tr>
         <w:trPr>
-          <w:trHeight w:val="1430"/>
+          <w:trHeight w:val="1430" w:hRule="atLeast"/>
         </w:trPr>
         <w:tc>
           <w:tcPr>
@@ -1195,6 +1876,9 @@
           <w:p>
             <w:pPr>
               <w:pStyle w:val="normal1"/>
+              <w:widowControl/>
+              <w:suppressAutoHyphens w:val="true"/>
+              <w:spacing w:before="0" w:after="160"/>
               <w:jc w:val="left"/>
               <w:rPr>
                 <w:b/>
@@ -1205,10 +1889,13 @@
             </w:pPr>
             <w:r>
               <w:rPr>
-                <w:b/>
-                <w:bCs/>
+                <w:rFonts w:eastAsia="Calibri" w:cs="Calibri"/>
+                <w:b/>
+                <w:bCs/>
+                <w:kern w:val="0"/>
                 <w:sz w:val="24"/>
                 <w:szCs w:val="24"/>
+                <w:lang w:val="en-US" w:eastAsia="zh-CN" w:bidi="hi-IN"/>
               </w:rPr>
               <w:t>#3 Cheng Yu Yang</w:t>
             </w:r>
@@ -1227,54 +1914,123 @@
           <w:p>
             <w:pPr>
               <w:pStyle w:val="normal1"/>
-            </w:pPr>
-            <w:r>
+              <w:widowControl/>
+              <w:suppressAutoHyphens w:val="true"/>
+              <w:spacing w:before="0" w:after="160"/>
+              <w:rPr>
+                <w:rFonts w:ascii="Calibri" w:hAnsi="Calibri" w:eastAsia="Calibri" w:cs="Calibri"/>
+                <w:kern w:val="0"/>
+                <w:sz w:val="22"/>
+                <w:szCs w:val="22"/>
+                <w:lang w:val="en-US" w:eastAsia="zh-CN" w:bidi="hi-IN"/>
+              </w:rPr>
+            </w:pPr>
+            <w:r>
+              <w:rPr>
+                <w:rFonts w:eastAsia="Calibri" w:cs="Calibri"/>
+                <w:kern w:val="0"/>
+                <w:sz w:val="22"/>
+                <w:szCs w:val="22"/>
+                <w:lang w:val="en-US" w:eastAsia="zh-CN" w:bidi="hi-IN"/>
+              </w:rPr>
               <w:t>Make the code compatible with Windows to make future iterations easier to implement</w:t>
             </w:r>
           </w:p>
           <w:p>
             <w:pPr>
               <w:pStyle w:val="normal1"/>
-            </w:pPr>
-            <w:r>
+              <w:widowControl/>
+              <w:suppressAutoHyphens w:val="true"/>
+              <w:spacing w:before="0" w:after="160"/>
+              <w:rPr>
+                <w:rFonts w:ascii="Calibri" w:hAnsi="Calibri" w:eastAsia="Calibri" w:cs="Calibri"/>
+                <w:kern w:val="0"/>
+                <w:sz w:val="22"/>
+                <w:szCs w:val="22"/>
+                <w:lang w:val="en-US" w:eastAsia="zh-CN" w:bidi="hi-IN"/>
+              </w:rPr>
+            </w:pPr>
+            <w:r>
+              <w:rPr>
+                <w:rFonts w:eastAsia="Calibri" w:cs="Calibri"/>
+                <w:kern w:val="0"/>
+                <w:sz w:val="22"/>
+                <w:szCs w:val="22"/>
+                <w:lang w:val="en-US" w:eastAsia="zh-CN" w:bidi="hi-IN"/>
+              </w:rPr>
               <w:t>Create Client Login and Register UI</w:t>
             </w:r>
           </w:p>
           <w:p>
             <w:pPr>
               <w:pStyle w:val="normal1"/>
-            </w:pPr>
-            <w:r>
+              <w:widowControl/>
+              <w:suppressAutoHyphens w:val="true"/>
+              <w:spacing w:before="0" w:after="160"/>
+              <w:rPr>
+                <w:rFonts w:ascii="Calibri" w:hAnsi="Calibri" w:eastAsia="Calibri" w:cs="Calibri"/>
+                <w:kern w:val="0"/>
+                <w:sz w:val="22"/>
+                <w:szCs w:val="22"/>
+                <w:lang w:val="en-US" w:eastAsia="zh-CN" w:bidi="hi-IN"/>
+              </w:rPr>
+            </w:pPr>
+            <w:r>
+              <w:rPr>
+                <w:rFonts w:eastAsia="Calibri" w:cs="Calibri"/>
+                <w:kern w:val="0"/>
+                <w:sz w:val="22"/>
+                <w:szCs w:val="22"/>
+                <w:lang w:val="en-US" w:eastAsia="zh-CN" w:bidi="hi-IN"/>
+              </w:rPr>
               <w:t>Optimize Flask HTML template structure using extends and Jinja2 blocks</w:t>
             </w:r>
           </w:p>
         </w:tc>
       </w:tr>
     </w:tbl>
-    <w:p/>
+    <w:p>
+      <w:pPr>
+        <w:pStyle w:val="Normal"/>
+        <w:rPr/>
+      </w:pPr>
+      <w:r>
+        <w:rPr/>
+      </w:r>
+    </w:p>
     <w:p>
       <w:pPr>
         <w:pStyle w:val="normal1"/>
+        <w:widowControl/>
+        <w:suppressAutoHyphens w:val="true"/>
+        <w:bidi w:val="0"/>
+        <w:spacing w:lineRule="auto" w:line="259" w:before="0" w:after="160"/>
+        <w:jc w:val="both"/>
+        <w:rPr/>
       </w:pPr>
+      <w:r>
+        <w:rPr/>
+      </w:r>
     </w:p>
     <w:sectPr>
+      <w:type w:val="nextPage"/>
       <w:pgSz w:w="12240" w:h="15840"/>
-      <w:pgMar w:top="1440" w:right="1440" w:bottom="1440" w:left="1440" w:header="0" w:footer="0" w:gutter="0"/>
-      <w:pgNumType w:start="1"/>
-      <w:cols w:space="720"/>
-      <w:formProt w:val="0"/>
-      <w:docGrid w:linePitch="100" w:charSpace="8192"/>
+      <w:pgMar w:left="1440" w:right="1440" w:gutter="0" w:header="0" w:top="1440" w:footer="0" w:bottom="1440"/>
+      <w:pgNumType w:start="1" w:fmt="decimal"/>
+      <w:formProt w:val="false"/>
+      <w:textDirection w:val="lrTb"/>
+      <w:docGrid w:type="default" w:linePitch="100" w:charSpace="12288"/>
     </w:sectPr>
   </w:body>
 </w:document>
 </file>
 
 <file path=word/styles.xml><?xml version="1.0" encoding="utf-8"?>
-<w:styles xmlns:mc="http://schemas.openxmlformats.org/markup-compatibility/2006" xmlns:r="http://schemas.openxmlformats.org/officeDocument/2006/relationships" xmlns:w="http://schemas.openxmlformats.org/wordprocessingml/2006/main" xmlns:w14="http://schemas.microsoft.com/office/word/2010/wordml" xmlns:w15="http://schemas.microsoft.com/office/word/2012/wordml" xmlns:w16cex="http://schemas.microsoft.com/office/word/2018/wordml/cex" xmlns:w16cid="http://schemas.microsoft.com/office/word/2016/wordml/cid" xmlns:w16="http://schemas.microsoft.com/office/word/2018/wordml" xmlns:w16du="http://schemas.microsoft.com/office/word/2023/wordml/word16du" xmlns:w16sdtdh="http://schemas.microsoft.com/office/word/2020/wordml/sdtdatahash" xmlns:w16sdtfl="http://schemas.microsoft.com/office/word/2024/wordml/sdtformatlock" xmlns:w16se="http://schemas.microsoft.com/office/word/2015/wordml/symex" mc:Ignorable="w14 w15 w16se w16cid w16 w16cex w16sdtdh w16sdtfl w16du">
+<w:styles xmlns:w="http://schemas.openxmlformats.org/wordprocessingml/2006/main" xmlns:w14="http://schemas.microsoft.com/office/word/2010/wordml" xmlns:mc="http://schemas.openxmlformats.org/markup-compatibility/2006" mc:Ignorable="w14">
   <w:docDefaults>
     <w:rPrDefault>
       <w:rPr>
-        <w:rFonts w:ascii="Calibri" w:eastAsia="Calibri" w:hAnsi="Calibri" w:cs="Calibri"/>
+        <w:rFonts w:ascii="Calibri" w:hAnsi="Calibri" w:eastAsia="Calibri" w:cs="Calibri"/>
         <w:sz w:val="22"/>
         <w:szCs w:val="22"/>
         <w:lang w:val="en-US" w:eastAsia="zh-CN" w:bidi="hi-IN"/>
@@ -1282,21 +2038,21 @@
     </w:rPrDefault>
     <w:pPrDefault>
       <w:pPr>
-        <w:suppressAutoHyphens/>
+        <w:suppressAutoHyphens w:val="true"/>
       </w:pPr>
     </w:pPrDefault>
   </w:docDefaults>
   <w:latentStyles w:defLockedState="0" w:defUIPriority="99" w:defSemiHidden="0" w:defUnhideWhenUsed="0" w:defQFormat="0" w:count="376">
     <w:lsdException w:name="Normal" w:uiPriority="0" w:qFormat="1"/>
     <w:lsdException w:name="heading 1" w:uiPriority="9" w:qFormat="1"/>
-    <w:lsdException w:name="heading 2" w:semiHidden="1" w:uiPriority="9" w:unhideWhenUsed="1" w:qFormat="1"/>
-    <w:lsdException w:name="heading 3" w:semiHidden="1" w:uiPriority="9" w:unhideWhenUsed="1" w:qFormat="1"/>
-    <w:lsdException w:name="heading 4" w:semiHidden="1" w:uiPriority="9" w:unhideWhenUsed="1" w:qFormat="1"/>
-    <w:lsdException w:name="heading 5" w:semiHidden="1" w:uiPriority="9" w:unhideWhenUsed="1" w:qFormat="1"/>
-    <w:lsdException w:name="heading 6" w:semiHidden="1" w:uiPriority="9" w:unhideWhenUsed="1" w:qFormat="1"/>
-    <w:lsdException w:name="heading 7" w:semiHidden="1" w:uiPriority="9" w:unhideWhenUsed="1" w:qFormat="1"/>
-    <w:lsdException w:name="heading 8" w:semiHidden="1" w:uiPriority="9" w:unhideWhenUsed="1" w:qFormat="1"/>
-    <w:lsdException w:name="heading 9" w:semiHidden="1" w:uiPriority="9" w:unhideWhenUsed="1" w:qFormat="1"/>
+    <w:lsdException w:name="heading 2" w:uiPriority="9" w:semiHidden="1" w:unhideWhenUsed="1" w:qFormat="1"/>
+    <w:lsdException w:name="heading 3" w:uiPriority="9" w:semiHidden="1" w:unhideWhenUsed="1" w:qFormat="1"/>
+    <w:lsdException w:name="heading 4" w:uiPriority="9" w:semiHidden="1" w:unhideWhenUsed="1" w:qFormat="1"/>
+    <w:lsdException w:name="heading 5" w:uiPriority="9" w:semiHidden="1" w:unhideWhenUsed="1" w:qFormat="1"/>
+    <w:lsdException w:name="heading 6" w:uiPriority="9" w:semiHidden="1" w:unhideWhenUsed="1" w:qFormat="1"/>
+    <w:lsdException w:name="heading 7" w:uiPriority="9" w:semiHidden="1" w:unhideWhenUsed="1" w:qFormat="1"/>
+    <w:lsdException w:name="heading 8" w:uiPriority="9" w:semiHidden="1" w:unhideWhenUsed="1" w:qFormat="1"/>
+    <w:lsdException w:name="heading 9" w:uiPriority="9" w:semiHidden="1" w:unhideWhenUsed="1" w:qFormat="1"/>
     <w:lsdException w:name="index 1" w:semiHidden="1" w:unhideWhenUsed="1"/>
     <w:lsdException w:name="index 2" w:semiHidden="1" w:unhideWhenUsed="1"/>
     <w:lsdException w:name="index 3" w:semiHidden="1" w:unhideWhenUsed="1"/>
@@ -1306,22 +2062,22 @@
     <w:lsdException w:name="index 7" w:semiHidden="1" w:unhideWhenUsed="1"/>
     <w:lsdException w:name="index 8" w:semiHidden="1" w:unhideWhenUsed="1"/>
     <w:lsdException w:name="index 9" w:semiHidden="1" w:unhideWhenUsed="1"/>
-    <w:lsdException w:name="toc 1" w:semiHidden="1" w:uiPriority="39" w:unhideWhenUsed="1"/>
-    <w:lsdException w:name="toc 2" w:semiHidden="1" w:uiPriority="39" w:unhideWhenUsed="1"/>
-    <w:lsdException w:name="toc 3" w:semiHidden="1" w:uiPriority="39" w:unhideWhenUsed="1"/>
-    <w:lsdException w:name="toc 4" w:semiHidden="1" w:uiPriority="39" w:unhideWhenUsed="1"/>
-    <w:lsdException w:name="toc 5" w:semiHidden="1" w:uiPriority="39" w:unhideWhenUsed="1"/>
-    <w:lsdException w:name="toc 6" w:semiHidden="1" w:uiPriority="39" w:unhideWhenUsed="1"/>
-    <w:lsdException w:name="toc 7" w:semiHidden="1" w:uiPriority="39" w:unhideWhenUsed="1"/>
-    <w:lsdException w:name="toc 8" w:semiHidden="1" w:uiPriority="39" w:unhideWhenUsed="1"/>
-    <w:lsdException w:name="toc 9" w:semiHidden="1" w:uiPriority="39" w:unhideWhenUsed="1"/>
+    <w:lsdException w:name="toc 1" w:uiPriority="39" w:semiHidden="1" w:unhideWhenUsed="1"/>
+    <w:lsdException w:name="toc 2" w:uiPriority="39" w:semiHidden="1" w:unhideWhenUsed="1"/>
+    <w:lsdException w:name="toc 3" w:uiPriority="39" w:semiHidden="1" w:unhideWhenUsed="1"/>
+    <w:lsdException w:name="toc 4" w:uiPriority="39" w:semiHidden="1" w:unhideWhenUsed="1"/>
+    <w:lsdException w:name="toc 5" w:uiPriority="39" w:semiHidden="1" w:unhideWhenUsed="1"/>
+    <w:lsdException w:name="toc 6" w:uiPriority="39" w:semiHidden="1" w:unhideWhenUsed="1"/>
+    <w:lsdException w:name="toc 7" w:uiPriority="39" w:semiHidden="1" w:unhideWhenUsed="1"/>
+    <w:lsdException w:name="toc 8" w:uiPriority="39" w:semiHidden="1" w:unhideWhenUsed="1"/>
+    <w:lsdException w:name="toc 9" w:uiPriority="39" w:semiHidden="1" w:unhideWhenUsed="1"/>
     <w:lsdException w:name="Normal Indent" w:semiHidden="1" w:unhideWhenUsed="1"/>
     <w:lsdException w:name="footnote text" w:semiHidden="1" w:unhideWhenUsed="1"/>
     <w:lsdException w:name="annotation text" w:semiHidden="1" w:unhideWhenUsed="1"/>
     <w:lsdException w:name="header" w:semiHidden="1" w:unhideWhenUsed="1"/>
     <w:lsdException w:name="footer" w:semiHidden="1" w:unhideWhenUsed="1"/>
     <w:lsdException w:name="index heading" w:semiHidden="1" w:unhideWhenUsed="1"/>
-    <w:lsdException w:name="caption" w:semiHidden="1" w:uiPriority="35" w:unhideWhenUsed="1" w:qFormat="1"/>
+    <w:lsdException w:name="caption" w:uiPriority="35" w:semiHidden="1" w:unhideWhenUsed="1" w:qFormat="1"/>
     <w:lsdException w:name="table of figures" w:semiHidden="1" w:unhideWhenUsed="1"/>
     <w:lsdException w:name="envelope address" w:semiHidden="1" w:unhideWhenUsed="1"/>
     <w:lsdException w:name="envelope return" w:semiHidden="1" w:unhideWhenUsed="1"/>
@@ -1352,7 +2108,7 @@
     <w:lsdException w:name="Title" w:uiPriority="10" w:qFormat="1"/>
     <w:lsdException w:name="Closing" w:semiHidden="1" w:unhideWhenUsed="1"/>
     <w:lsdException w:name="Signature" w:semiHidden="1" w:unhideWhenUsed="1"/>
-    <w:lsdException w:name="Default Paragraph Font" w:semiHidden="1" w:uiPriority="1" w:unhideWhenUsed="1"/>
+    <w:lsdException w:name="Default Paragraph Font" w:uiPriority="1" w:semiHidden="1" w:unhideWhenUsed="1"/>
     <w:lsdException w:name="Body Text" w:semiHidden="1" w:unhideWhenUsed="1"/>
     <w:lsdException w:name="Body Text Indent" w:semiHidden="1" w:unhideWhenUsed="1"/>
     <w:lsdException w:name="List Continue" w:semiHidden="1" w:unhideWhenUsed="1"/>
@@ -1552,8 +2308,8 @@
     <w:lsdException w:name="Subtle Reference" w:uiPriority="31" w:qFormat="1"/>
     <w:lsdException w:name="Intense Reference" w:uiPriority="32" w:qFormat="1"/>
     <w:lsdException w:name="Book Title" w:uiPriority="33" w:qFormat="1"/>
-    <w:lsdException w:name="Bibliography" w:semiHidden="1" w:uiPriority="37" w:unhideWhenUsed="1"/>
-    <w:lsdException w:name="TOC Heading" w:semiHidden="1" w:uiPriority="39" w:unhideWhenUsed="1" w:qFormat="1"/>
+    <w:lsdException w:name="Bibliography" w:uiPriority="37" w:semiHidden="1" w:unhideWhenUsed="1"/>
+    <w:lsdException w:name="TOC Heading" w:uiPriority="39" w:semiHidden="1" w:unhideWhenUsed="1" w:qFormat="1"/>
     <w:lsdException w:name="Plain Table 1" w:uiPriority="41"/>
     <w:lsdException w:name="Plain Table 2" w:uiPriority="42"/>
     <w:lsdException w:name="Plain Table 3" w:uiPriority="43"/>
@@ -1664,14 +2420,25 @@
     <w:lsdException w:name="Unresolved Mention" w:semiHidden="1" w:unhideWhenUsed="1"/>
     <w:lsdException w:name="Smart Link" w:semiHidden="1" w:unhideWhenUsed="1"/>
   </w:latentStyles>
-  <w:style w:type="paragraph" w:default="1" w:styleId="Normal">
+  <w:style w:type="paragraph" w:styleId="Normal" w:default="1">
     <w:name w:val="Normal"/>
     <w:qFormat/>
     <w:rsid w:val="00600128"/>
     <w:pPr>
-      <w:spacing w:after="160" w:line="259" w:lineRule="auto"/>
+      <w:widowControl/>
+      <w:suppressAutoHyphens w:val="true"/>
+      <w:bidi w:val="0"/>
+      <w:spacing w:lineRule="auto" w:line="259" w:before="0" w:after="160"/>
       <w:jc w:val="both"/>
     </w:pPr>
+    <w:rPr>
+      <w:rFonts w:ascii="Calibri" w:hAnsi="Calibri" w:eastAsia="Calibri" w:cs="Calibri"/>
+      <w:color w:val="auto"/>
+      <w:kern w:val="0"/>
+      <w:sz w:val="22"/>
+      <w:szCs w:val="22"/>
+      <w:lang w:val="en-US" w:eastAsia="zh-CN" w:bidi="hi-IN"/>
+    </w:rPr>
   </w:style>
   <w:style w:type="paragraph" w:styleId="Heading1">
     <w:name w:val="heading 1"/>
@@ -1680,9 +2447,9 @@
     <w:uiPriority w:val="9"/>
     <w:qFormat/>
     <w:pPr>
-      <w:keepNext/>
+      <w:keepNext w:val="true"/>
       <w:keepLines/>
-      <w:spacing w:before="480" w:after="120" w:line="240" w:lineRule="auto"/>
+      <w:spacing w:lineRule="auto" w:line="240" w:before="480" w:after="120"/>
       <w:outlineLvl w:val="0"/>
     </w:pPr>
     <w:rPr>
@@ -1701,9 +2468,9 @@
     <w:unhideWhenUsed/>
     <w:qFormat/>
     <w:pPr>
-      <w:keepNext/>
+      <w:keepNext w:val="true"/>
       <w:keepLines/>
-      <w:spacing w:before="360" w:after="80" w:line="240" w:lineRule="auto"/>
+      <w:spacing w:lineRule="auto" w:line="240" w:before="360" w:after="80"/>
       <w:outlineLvl w:val="1"/>
     </w:pPr>
     <w:rPr>
@@ -1722,9 +2489,9 @@
     <w:unhideWhenUsed/>
     <w:qFormat/>
     <w:pPr>
-      <w:keepNext/>
+      <w:keepNext w:val="true"/>
       <w:keepLines/>
-      <w:spacing w:before="280" w:after="80" w:line="240" w:lineRule="auto"/>
+      <w:spacing w:lineRule="auto" w:line="240" w:before="280" w:after="80"/>
       <w:outlineLvl w:val="2"/>
     </w:pPr>
     <w:rPr>
@@ -1743,9 +2510,9 @@
     <w:unhideWhenUsed/>
     <w:qFormat/>
     <w:pPr>
-      <w:keepNext/>
+      <w:keepNext w:val="true"/>
       <w:keepLines/>
-      <w:spacing w:before="240" w:after="40" w:line="240" w:lineRule="auto"/>
+      <w:spacing w:lineRule="auto" w:line="240" w:before="240" w:after="40"/>
       <w:outlineLvl w:val="3"/>
     </w:pPr>
     <w:rPr>
@@ -1764,9 +2531,9 @@
     <w:unhideWhenUsed/>
     <w:qFormat/>
     <w:pPr>
-      <w:keepNext/>
+      <w:keepNext w:val="true"/>
       <w:keepLines/>
-      <w:spacing w:before="220" w:after="40" w:line="240" w:lineRule="auto"/>
+      <w:spacing w:lineRule="auto" w:line="240" w:before="220" w:after="40"/>
       <w:outlineLvl w:val="4"/>
     </w:pPr>
     <w:rPr>
@@ -1783,9 +2550,9 @@
     <w:unhideWhenUsed/>
     <w:qFormat/>
     <w:pPr>
-      <w:keepNext/>
+      <w:keepNext w:val="true"/>
       <w:keepLines/>
-      <w:spacing w:before="200" w:after="40" w:line="240" w:lineRule="auto"/>
+      <w:spacing w:lineRule="auto" w:line="240" w:before="200" w:after="40"/>
       <w:outlineLvl w:val="5"/>
     </w:pPr>
     <w:rPr>
@@ -1795,51 +2562,39 @@
       <w:szCs w:val="20"/>
     </w:rPr>
   </w:style>
-  <w:style w:type="character" w:default="1" w:styleId="DefaultParagraphFont">
+  <w:style w:type="character" w:styleId="DefaultParagraphFont" w:default="1">
     <w:name w:val="Default Paragraph Font"/>
     <w:uiPriority w:val="1"/>
     <w:semiHidden/>
     <w:unhideWhenUsed/>
+    <w:qFormat/>
+    <w:rPr/>
   </w:style>
-  <w:style w:type="table" w:default="1" w:styleId="TableNormal">
-    <w:name w:val="Normal Table"/>
-    <w:uiPriority w:val="99"/>
-    <w:semiHidden/>
-    <w:unhideWhenUsed/>
-    <w:tblPr>
-      <w:tblInd w:w="0" w:type="dxa"/>
-      <w:tblCellMar>
-        <w:top w:w="0" w:type="dxa"/>
-        <w:left w:w="108" w:type="dxa"/>
-        <w:bottom w:w="0" w:type="dxa"/>
-        <w:right w:w="108" w:type="dxa"/>
-      </w:tblCellMar>
-    </w:tblPr>
-  </w:style>
-  <w:style w:type="numbering" w:default="1" w:styleId="NoList">
-    <w:name w:val="No List"/>
-    <w:uiPriority w:val="99"/>
-    <w:semiHidden/>
-    <w:unhideWhenUsed/>
-  </w:style>
-  <w:style w:type="character" w:customStyle="1" w:styleId="Bulletsuser">
-    <w:name w:val="Bullets (user)"/>
+  <w:style w:type="character" w:styleId="Bullets" w:customStyle="1">
+    <w:name w:val="Bullets"/>
     <w:qFormat/>
     <w:rPr>
-      <w:rFonts w:ascii="OpenSymbol" w:eastAsia="OpenSymbol" w:hAnsi="OpenSymbol" w:cs="OpenSymbol"/>
+      <w:rFonts w:ascii="OpenSymbol" w:hAnsi="OpenSymbol" w:eastAsia="OpenSymbol" w:cs="OpenSymbol"/>
     </w:rPr>
   </w:style>
-  <w:style w:type="paragraph" w:customStyle="1" w:styleId="Heading">
+  <w:style w:type="character" w:styleId="BodyTextChar" w:customStyle="1">
+    <w:name w:val="Body Text Char"/>
+    <w:basedOn w:val="DefaultParagraphFont"/>
+    <w:qFormat/>
+    <w:rsid w:val="00600128"/>
+    <w:rPr/>
+  </w:style>
+  <w:style w:type="paragraph" w:styleId="Heading" w:customStyle="1">
     <w:name w:val="Heading"/>
     <w:basedOn w:val="Normal"/>
     <w:next w:val="BodyText"/>
     <w:qFormat/>
     <w:pPr>
-      <w:keepNext/>
+      <w:keepNext w:val="true"/>
       <w:spacing w:before="240" w:after="120"/>
     </w:pPr>
     <w:rPr>
-      <w:rFonts w:ascii="Liberation Sans" w:eastAsia="Noto Sans" w:hAnsi="Liberation Sans" w:cs="FreeSans"/>
+      <w:rFonts w:ascii="Liberation Sans" w:hAnsi="Liberation Sans" w:eastAsia="Noto Sans" w:cs="FreeSans"/>
       <w:sz w:val="28"/>
       <w:szCs w:val="28"/>
     </w:rPr>
@@ -1849,12 +2604,14 @@
     <w:basedOn w:val="Normal"/>
     <w:link w:val="BodyTextChar"/>
     <w:pPr>
-      <w:spacing w:after="140" w:line="276" w:lineRule="auto"/>
+      <w:spacing w:lineRule="auto" w:line="276" w:before="0" w:after="140"/>
     </w:pPr>
+    <w:rPr/>
   </w:style>
   <w:style w:type="paragraph" w:styleId="List">
     <w:name w:val="List"/>
     <w:basedOn w:val="BodyText"/>
+    <w:pPr/>
     <w:rPr>
       <w:rFonts w:cs="FreeSans"/>
     </w:rPr>
@@ -1875,7 +2632,7 @@
       <w:szCs w:val="24"/>
     </w:rPr>
   </w:style>
-  <w:style w:type="paragraph" w:customStyle="1" w:styleId="Index">
+  <w:style w:type="paragraph" w:styleId="Index" w:customStyle="1">
     <w:name w:val="Index"/>
     <w:basedOn w:val="Normal"/>
     <w:qFormat/>
@@ -1886,13 +2643,24 @@
       <w:rFonts w:cs="FreeSans"/>
     </w:rPr>
   </w:style>
-  <w:style w:type="paragraph" w:customStyle="1" w:styleId="normal1">
+  <w:style w:type="paragraph" w:styleId="normal1" w:customStyle="1">
     <w:name w:val="normal1"/>
     <w:qFormat/>
     <w:pPr>
-      <w:spacing w:after="160" w:line="259" w:lineRule="auto"/>
+      <w:widowControl/>
+      <w:suppressAutoHyphens w:val="true"/>
+      <w:bidi w:val="0"/>
+      <w:spacing w:lineRule="auto" w:line="259" w:before="0" w:after="160"/>
       <w:jc w:val="both"/>
     </w:pPr>
+    <w:rPr>
+      <w:rFonts w:ascii="Calibri" w:hAnsi="Calibri" w:eastAsia="Calibri" w:cs="Calibri"/>
+      <w:color w:val="auto"/>
+      <w:kern w:val="0"/>
+      <w:sz w:val="22"/>
+      <w:szCs w:val="22"/>
+      <w:lang w:val="en-US" w:eastAsia="zh-CN" w:bidi="hi-IN"/>
+    </w:rPr>
   </w:style>
   <w:style w:type="paragraph" w:styleId="Title">
     <w:name w:val="Title"/>
@@ -1901,9 +2669,9 @@
     <w:uiPriority w:val="10"/>
     <w:qFormat/>
     <w:pPr>
-      <w:keepNext/>
+      <w:keepNext w:val="true"/>
       <w:keepLines/>
-      <w:spacing w:before="480" w:after="120" w:line="240" w:lineRule="auto"/>
+      <w:spacing w:lineRule="auto" w:line="240" w:before="480" w:after="120"/>
     </w:pPr>
     <w:rPr>
       <w:b/>
@@ -1919,12 +2687,12 @@
     <w:uiPriority w:val="11"/>
     <w:qFormat/>
     <w:pPr>
-      <w:keepNext/>
+      <w:keepNext w:val="true"/>
       <w:keepLines/>
-      <w:spacing w:before="360" w:after="80" w:line="240" w:lineRule="auto"/>
+      <w:spacing w:lineRule="auto" w:line="240" w:before="360" w:after="80"/>
     </w:pPr>
     <w:rPr>
-      <w:rFonts w:ascii="Georgia" w:eastAsia="Georgia" w:hAnsi="Georgia" w:cs="Georgia"/>
+      <w:rFonts w:ascii="Georgia" w:hAnsi="Georgia" w:eastAsia="Georgia" w:cs="Georgia"/>
       <w:i/>
       <w:iCs/>
       <w:color w:val="666666"/>
@@ -1932,16 +2700,17 @@
       <w:szCs w:val="48"/>
     </w:rPr>
   </w:style>
-  <w:style w:type="paragraph" w:customStyle="1" w:styleId="TableContents">
+  <w:style w:type="paragraph" w:styleId="TableContents" w:customStyle="1">
     <w:name w:val="Table Contents"/>
     <w:basedOn w:val="Normal"/>
     <w:qFormat/>
     <w:pPr>
-      <w:widowControl w:val="0"/>
+      <w:widowControl w:val="false"/>
       <w:suppressLineNumbers/>
     </w:pPr>
+    <w:rPr/>
   </w:style>
-  <w:style w:type="paragraph" w:customStyle="1" w:styleId="TableHeading">
+  <w:style w:type="paragraph" w:styleId="TableHeading" w:customStyle="1">
     <w:name w:val="Table Heading"/>
     <w:basedOn w:val="TableContents"/>
     <w:qFormat/>
@@ -1952,6 +2721,27 @@
       <w:b/>
       <w:bCs/>
     </w:rPr>
+  </w:style>
+  <w:style w:type="numbering" w:styleId="NoList" w:default="1">
+    <w:name w:val="No List"/>
+    <w:uiPriority w:val="99"/>
+    <w:semiHidden/>
+    <w:unhideWhenUsed/>
+    <w:qFormat/>
+  </w:style>
+  <w:style w:type="table" w:default="1" w:styleId="TableNormal">
+    <w:name w:val="Normal Table"/>
+    <w:uiPriority w:val="99"/>
+    <w:semiHidden/>
+    <w:unhideWhenUsed/>
+    <w:tblPr>
+      <w:tblCellMar>
+        <w:top w:w="0" w:type="dxa"/>
+        <w:left w:w="108" w:type="dxa"/>
+        <w:bottom w:w="0" w:type="dxa"/>
+        <w:right w:w="108" w:type="dxa"/>
+      </w:tblCellMar>
+    </w:tblPr>
   </w:style>
   <w:style w:type="table" w:customStyle="1" w:styleId="TableNormal0">
     <w:name w:val="TableNormal"/>
@@ -1964,51 +2754,45 @@
       </w:tblCellMar>
     </w:tblPr>
   </w:style>
-  <w:style w:type="character" w:customStyle="1" w:styleId="BodyTextChar">
-    <w:name w:val="Body Text Char"/>
-    <w:basedOn w:val="DefaultParagraphFont"/>
-    <w:link w:val="BodyText"/>
-    <w:rsid w:val="00600128"/>
-  </w:style>
 </w:styles>
 </file>
 
 <file path=word/theme/theme1.xml><?xml version="1.0" encoding="utf-8"?>
-<a:theme xmlns:a="http://schemas.openxmlformats.org/drawingml/2006/main" name="Office Theme">
+<a:theme xmlns:a="http://schemas.openxmlformats.org/drawingml/2006/main" xmlns:r="http://schemas.openxmlformats.org/officeDocument/2006/relationships" name="Office Theme">
   <a:themeElements>
     <a:clrScheme name="Office">
       <a:dk1>
         <a:srgbClr val="000000"/>
       </a:dk1>
       <a:lt1>
-        <a:srgbClr val="FFFFFF"/>
+        <a:srgbClr val="ffffff"/>
       </a:lt1>
       <a:dk2>
-        <a:srgbClr val="1F497D"/>
+        <a:srgbClr val="1f497d"/>
       </a:dk2>
       <a:lt2>
-        <a:srgbClr val="EEECE1"/>
+        <a:srgbClr val="eeece1"/>
       </a:lt2>
       <a:accent1>
-        <a:srgbClr val="4F81BD"/>
+        <a:srgbClr val="4f81bd"/>
       </a:accent1>
       <a:accent2>
-        <a:srgbClr val="C0504D"/>
+        <a:srgbClr val="c0504d"/>
       </a:accent2>
       <a:accent3>
-        <a:srgbClr val="9BBB59"/>
+        <a:srgbClr val="9bbb59"/>
       </a:accent3>
       <a:accent4>
-        <a:srgbClr val="8064A2"/>
+        <a:srgbClr val="8064a2"/>
       </a:accent4>
       <a:accent5>
-        <a:srgbClr val="4BACC6"/>
+        <a:srgbClr val="4bacc6"/>
       </a:accent5>
       <a:accent6>
-        <a:srgbClr val="F79646"/>
+        <a:srgbClr val="f79646"/>
       </a:accent6>
       <a:hlink>
-        <a:srgbClr val="0000FF"/>
+        <a:srgbClr val="0000ff"/>
       </a:hlink>
       <a:folHlink>
         <a:srgbClr val="800080"/>
@@ -2016,12 +2800,12 @@
     </a:clrScheme>
     <a:fontScheme name="Office">
       <a:majorFont>
-        <a:latin typeface="Calibri"/>
+        <a:latin typeface="Calibri" pitchFamily="0" charset="1"/>
         <a:ea typeface=""/>
         <a:cs typeface=""/>
       </a:majorFont>
       <a:minorFont>
-        <a:latin typeface="Cambria"/>
+        <a:latin typeface="Cambria" pitchFamily="0" charset="1"/>
         <a:ea typeface=""/>
         <a:cs typeface=""/>
       </a:minorFont>
@@ -2050,7 +2834,7 @@
             </a:gs>
           </a:gsLst>
           <a:lin ang="16200000" scaled="1"/>
-          <a:tileRect/>
+          <a:tileRect l="0" t="0" r="0" b="0"/>
         </a:gradFill>
         <a:gradFill>
           <a:gsLst>
@@ -2068,7 +2852,7 @@
             </a:gs>
           </a:gsLst>
           <a:lin ang="16200000" scaled="0"/>
-          <a:tileRect/>
+          <a:tileRect l="0" t="0" r="0" b="0"/>
         </a:gradFill>
       </a:fillStyleLst>
       <a:lnStyleLst>
@@ -2119,7 +2903,7 @@
           <a:path path="circle">
             <a:fillToRect l="50000" t="-80000" r="50000" b="180000"/>
           </a:path>
-          <a:tileRect/>
+          <a:tileRect l="0" t="0" r="0" b="0"/>
         </a:gradFill>
         <a:gradFill>
           <a:gsLst>
@@ -2137,12 +2921,10 @@
           <a:path path="circle">
             <a:fillToRect l="50000" t="50000" r="50000" b="50000"/>
           </a:path>
-          <a:tileRect/>
+          <a:tileRect l="0" t="0" r="0" b="0"/>
         </a:gradFill>
       </a:bgFillStyleLst>
     </a:fmtScheme>
   </a:themeElements>
-  <a:objectDefaults/>
-  <a:extraClrSchemeLst/>
 </a:theme>
 </file>
</xml_diff>

<commit_message>
changes on my tasks
</commit_message>
<xml_diff>
--- a/Team-Tasks/TasksReport.docx
+++ b/Team-Tasks/TasksReport.docx
@@ -1778,27 +1778,7 @@
                 <w:szCs w:val="22"/>
                 <w:lang w:val="en-US" w:eastAsia="zh-CN" w:bidi="hi-IN"/>
               </w:rPr>
-              <w:t xml:space="preserve">Fixed client registration back-end </w:t>
-            </w:r>
-            <w:r>
-              <w:rPr>
-                <w:rFonts w:eastAsia="Calibri" w:cs="Calibri"/>
-                <w:kern w:val="0"/>
-                <w:sz w:val="22"/>
-                <w:szCs w:val="22"/>
-                <w:lang w:val="en-US" w:eastAsia="zh-CN" w:bidi="hi-IN"/>
-              </w:rPr>
-              <w:t>and helped in bug fixes</w:t>
-            </w:r>
-            <w:r>
-              <w:rPr>
-                <w:rFonts w:eastAsia="Calibri" w:cs="Calibri"/>
-                <w:kern w:val="0"/>
-                <w:sz w:val="22"/>
-                <w:szCs w:val="22"/>
-                <w:lang w:val="en-US" w:eastAsia="zh-CN" w:bidi="hi-IN"/>
-              </w:rPr>
-              <w:t xml:space="preserve"> </w:t>
+              <w:t>Fixed client registration back-end and helped in bug fixes</w:t>
             </w:r>
           </w:p>
           <w:p>
@@ -2540,8 +2520,8 @@
     <w:qFormat/>
     <w:rPr/>
   </w:style>
-  <w:style w:type="character" w:styleId="Bullets" w:customStyle="1">
-    <w:name w:val="Bullets"/>
+  <w:style w:type="character" w:styleId="Bulletsuser" w:customStyle="1">
+    <w:name w:val="Bullets (user)"/>
     <w:qFormat/>
     <w:rPr>
       <w:rFonts w:ascii="OpenSymbol" w:hAnsi="OpenSymbol" w:eastAsia="OpenSymbol" w:cs="OpenSymbol"/>

</xml_diff>

<commit_message>
fixing my tasks annoying push
</commit_message>
<xml_diff>
--- a/Team-Tasks/TasksReport.docx
+++ b/Team-Tasks/TasksReport.docx
@@ -1,6 +1,6 @@
 
 <file path=word/document.xml><?xml version="1.0" encoding="utf-8"?>
-<w:document xmlns:wpc="http://schemas.microsoft.com/office/word/2010/wordprocessingCanvas" xmlns:cx="http://schemas.microsoft.com/office/drawing/2014/chartex" xmlns:cx1="http://schemas.microsoft.com/office/drawing/2015/9/8/chartex" xmlns:cx2="http://schemas.microsoft.com/office/drawing/2015/10/21/chartex" xmlns:cx3="http://schemas.microsoft.com/office/drawing/2016/5/9/chartex" xmlns:cx4="http://schemas.microsoft.com/office/drawing/2016/5/10/chartex" xmlns:cx5="http://schemas.microsoft.com/office/drawing/2016/5/11/chartex" xmlns:cx6="http://schemas.microsoft.com/office/drawing/2016/5/12/chartex" xmlns:cx7="http://schemas.microsoft.com/office/drawing/2016/5/13/chartex" xmlns:cx8="http://schemas.microsoft.com/office/drawing/2016/5/14/chartex" xmlns:mc="http://schemas.openxmlformats.org/markup-compatibility/2006" xmlns:aink="http://schemas.microsoft.com/office/drawing/2016/ink" xmlns:am3d="http://schemas.microsoft.com/office/drawing/2017/model3d" xmlns:o="urn:schemas-microsoft-com:office:office" xmlns:oel="http://schemas.microsoft.com/office/2019/extlst" xmlns:r="http://schemas.openxmlformats.org/officeDocument/2006/relationships" xmlns:m="http://schemas.openxmlformats.org/officeDocument/2006/math" xmlns:v="urn:schemas-microsoft-com:vml" xmlns:wp14="http://schemas.microsoft.com/office/word/2010/wordprocessingDrawing" xmlns:wp="http://schemas.openxmlformats.org/drawingml/2006/wordprocessingDrawing" xmlns:w10="urn:schemas-microsoft-com:office:word" xmlns:w="http://schemas.openxmlformats.org/wordprocessingml/2006/main" xmlns:w14="http://schemas.microsoft.com/office/word/2010/wordml" xmlns:w15="http://schemas.microsoft.com/office/word/2012/wordml" xmlns:w16cex="http://schemas.microsoft.com/office/word/2018/wordml/cex" xmlns:w16cid="http://schemas.microsoft.com/office/word/2016/wordml/cid" xmlns:w16="http://schemas.microsoft.com/office/word/2018/wordml" xmlns:w16du="http://schemas.microsoft.com/office/word/2023/wordml/word16du" xmlns:w16sdtdh="http://schemas.microsoft.com/office/word/2020/wordml/sdtdatahash" xmlns:w16sdtfl="http://schemas.microsoft.com/office/word/2024/wordml/sdtformatlock" xmlns:w16se="http://schemas.microsoft.com/office/word/2015/wordml/symex" xmlns:wpg="http://schemas.microsoft.com/office/word/2010/wordprocessingGroup" xmlns:wpi="http://schemas.microsoft.com/office/word/2010/wordprocessingInk" xmlns:wne="http://schemas.microsoft.com/office/word/2006/wordml" xmlns:wps="http://schemas.microsoft.com/office/word/2010/wordprocessingShape" mc:Ignorable="w14 w15 w16se w16cid w16 w16cex w16sdtdh w16sdtfl w16du wp14">
+<w:document xmlns:o="urn:schemas-microsoft-com:office:office" xmlns:r="http://schemas.openxmlformats.org/officeDocument/2006/relationships" xmlns:v="urn:schemas-microsoft-com:vml" xmlns:w="http://schemas.openxmlformats.org/wordprocessingml/2006/main" xmlns:w10="urn:schemas-microsoft-com:office:word" xmlns:wp="http://schemas.openxmlformats.org/drawingml/2006/wordprocessingDrawing" xmlns:pic="http://schemas.openxmlformats.org/drawingml/2006/picture" xmlns:wps="http://schemas.microsoft.com/office/word/2010/wordprocessingShape" xmlns:wpg="http://schemas.microsoft.com/office/word/2010/wordprocessingGroup" xmlns:mc="http://schemas.openxmlformats.org/markup-compatibility/2006" xmlns:wp14="http://schemas.microsoft.com/office/word/2010/wordprocessingDrawing" xmlns:w14="http://schemas.microsoft.com/office/word/2010/wordml" xmlns:w15="http://schemas.microsoft.com/office/word/2012/wordml" mc:Ignorable="w14 wp14 w15">
   <w:body>
     <w:p>
       <w:pPr>
@@ -33,6 +33,14 @@
           <w:szCs w:val="28"/>
         </w:rPr>
       </w:pPr>
+      <w:r>
+        <w:rPr>
+          <w:b/>
+          <w:bCs/>
+          <w:sz w:val="28"/>
+          <w:szCs w:val="28"/>
+        </w:rPr>
+      </w:r>
     </w:p>
     <w:p>
       <w:pPr>
@@ -64,6 +72,14 @@
           <w:szCs w:val="28"/>
         </w:rPr>
       </w:pPr>
+      <w:r>
+        <w:rPr>
+          <w:b/>
+          <w:bCs/>
+          <w:sz w:val="28"/>
+          <w:szCs w:val="28"/>
+        </w:rPr>
+      </w:r>
     </w:p>
     <w:p>
       <w:pPr>
@@ -83,32 +99,8 @@
           <w:szCs w:val="28"/>
         </w:rPr>
         <w:t>Group name: Group02</w:t>
-      </w:r>
-      <w:r>
-        <w:rPr>
-          <w:b/>
-          <w:bCs/>
-          <w:sz w:val="28"/>
-          <w:szCs w:val="28"/>
-        </w:rPr>
         <w:tab/>
-      </w:r>
-      <w:r>
-        <w:rPr>
-          <w:b/>
-          <w:bCs/>
-          <w:sz w:val="28"/>
-          <w:szCs w:val="28"/>
-        </w:rPr>
         <w:tab/>
-      </w:r>
-      <w:r>
-        <w:rPr>
-          <w:b/>
-          <w:bCs/>
-          <w:sz w:val="28"/>
-          <w:szCs w:val="28"/>
-        </w:rPr>
         <w:tab/>
         <w:t>Section name:   section 01          Phase: 1</w:t>
       </w:r>
@@ -116,12 +108,17 @@
     <w:p>
       <w:pPr>
         <w:pStyle w:val="normal1"/>
+        <w:rPr/>
       </w:pPr>
+      <w:r>
+        <w:rPr/>
+      </w:r>
     </w:p>
     <w:tbl>
       <w:tblPr>
         <w:tblStyle w:val="TableNormal0"/>
         <w:tblW w:w="9350" w:type="dxa"/>
+        <w:jc w:val="left"/>
         <w:tblInd w:w="0" w:type="dxa"/>
         <w:tblLayout w:type="fixed"/>
         <w:tblCellMar>
@@ -130,15 +127,15 @@
           <w:bottom w:w="0" w:type="dxa"/>
           <w:right w:w="108" w:type="dxa"/>
         </w:tblCellMar>
-        <w:tblLook w:val="0400" w:firstRow="0" w:lastRow="0" w:firstColumn="0" w:lastColumn="0" w:noHBand="0" w:noVBand="1"/>
+        <w:tblLook w:val="0400" w:noHBand="0" w:noVBand="1" w:firstColumn="0" w:lastRow="0" w:lastColumn="0" w:firstRow="0"/>
       </w:tblPr>
       <w:tblGrid>
         <w:gridCol w:w="3955"/>
-        <w:gridCol w:w="5395"/>
+        <w:gridCol w:w="5394"/>
       </w:tblGrid>
       <w:tr>
         <w:trPr>
-          <w:trHeight w:val="530"/>
+          <w:trHeight w:val="530" w:hRule="atLeast"/>
         </w:trPr>
         <w:tc>
           <w:tcPr>
@@ -154,6 +151,9 @@
           <w:p>
             <w:pPr>
               <w:pStyle w:val="normal1"/>
+              <w:widowControl/>
+              <w:suppressAutoHyphens w:val="true"/>
+              <w:spacing w:before="0" w:after="160"/>
               <w:jc w:val="center"/>
               <w:rPr>
                 <w:b/>
@@ -164,10 +164,13 @@
             </w:pPr>
             <w:r>
               <w:rPr>
-                <w:b/>
-                <w:bCs/>
+                <w:rFonts w:eastAsia="Calibri" w:cs="Calibri"/>
+                <w:b/>
+                <w:bCs/>
+                <w:kern w:val="0"/>
                 <w:sz w:val="32"/>
                 <w:szCs w:val="32"/>
+                <w:lang w:val="en-US" w:eastAsia="zh-CN" w:bidi="hi-IN"/>
               </w:rPr>
               <w:t>Student name</w:t>
             </w:r>
@@ -187,6 +190,9 @@
           <w:p>
             <w:pPr>
               <w:pStyle w:val="normal1"/>
+              <w:widowControl/>
+              <w:suppressAutoHyphens w:val="true"/>
+              <w:spacing w:before="0" w:after="160"/>
               <w:jc w:val="center"/>
               <w:rPr>
                 <w:b/>
@@ -197,10 +203,13 @@
             </w:pPr>
             <w:r>
               <w:rPr>
-                <w:b/>
-                <w:bCs/>
+                <w:rFonts w:eastAsia="Calibri" w:cs="Calibri"/>
+                <w:b/>
+                <w:bCs/>
+                <w:kern w:val="0"/>
                 <w:sz w:val="32"/>
                 <w:szCs w:val="32"/>
+                <w:lang w:val="en-US" w:eastAsia="zh-CN" w:bidi="hi-IN"/>
               </w:rPr>
               <w:t>Tasks and duties</w:t>
             </w:r>
@@ -209,7 +218,7 @@
       </w:tr>
       <w:tr>
         <w:trPr>
-          <w:trHeight w:val="1790"/>
+          <w:trHeight w:val="1790" w:hRule="atLeast"/>
         </w:trPr>
         <w:tc>
           <w:tcPr>
@@ -225,6 +234,9 @@
           <w:p>
             <w:pPr>
               <w:pStyle w:val="normal1"/>
+              <w:widowControl/>
+              <w:suppressAutoHyphens w:val="true"/>
+              <w:spacing w:before="0" w:after="160"/>
               <w:jc w:val="left"/>
               <w:rPr>
                 <w:b/>
@@ -235,10 +247,13 @@
             </w:pPr>
             <w:r>
               <w:rPr>
-                <w:b/>
-                <w:bCs/>
+                <w:rFonts w:eastAsia="Calibri" w:cs="Calibri"/>
+                <w:b/>
+                <w:bCs/>
+                <w:kern w:val="0"/>
                 <w:sz w:val="24"/>
                 <w:szCs w:val="24"/>
+                <w:lang w:val="en-US" w:eastAsia="zh-CN" w:bidi="hi-IN"/>
               </w:rPr>
               <w:t>#1 Jonathan Markovic</w:t>
             </w:r>
@@ -257,58 +272,99 @@
           <w:p>
             <w:pPr>
               <w:pStyle w:val="normal1"/>
-            </w:pPr>
-          </w:p>
-          <w:p>
-            <w:pPr>
-              <w:pStyle w:val="normal1"/>
-            </w:pPr>
-            <w:r>
-              <w:t xml:space="preserve">Helped with finding ways to implement the </w:t>
-            </w:r>
-            <w:proofErr w:type="gramStart"/>
-            <w:r>
-              <w:t>project(</w:t>
-            </w:r>
-            <w:proofErr w:type="spellStart"/>
-            <w:proofErr w:type="gramEnd"/>
-            <w:r>
-              <w:t>sql</w:t>
-            </w:r>
-            <w:proofErr w:type="spellEnd"/>
-            <w:r>
-              <w:t>, python/</w:t>
-            </w:r>
-            <w:proofErr w:type="spellStart"/>
-            <w:r>
-              <w:t>php</w:t>
-            </w:r>
-            <w:proofErr w:type="spellEnd"/>
-            <w:r>
-              <w:t xml:space="preserve"> </w:t>
-            </w:r>
-            <w:proofErr w:type="spellStart"/>
-            <w:r>
-              <w:t>etc</w:t>
-            </w:r>
-            <w:proofErr w:type="spellEnd"/>
-            <w:r>
-              <w:t>…)</w:t>
-            </w:r>
-          </w:p>
-          <w:p>
-            <w:pPr>
-              <w:pStyle w:val="normal1"/>
-            </w:pPr>
-            <w:r>
+              <w:widowControl/>
+              <w:suppressAutoHyphens w:val="true"/>
+              <w:spacing w:before="0" w:after="160"/>
+              <w:rPr>
+                <w:rFonts w:ascii="Calibri" w:hAnsi="Calibri" w:eastAsia="Calibri" w:cs="Calibri"/>
+                <w:kern w:val="0"/>
+                <w:sz w:val="22"/>
+                <w:szCs w:val="22"/>
+                <w:lang w:val="en-US" w:eastAsia="zh-CN" w:bidi="hi-IN"/>
+              </w:rPr>
+            </w:pPr>
+            <w:r>
+              <w:rPr>
+                <w:rFonts w:eastAsia="Calibri" w:cs="Calibri"/>
+                <w:kern w:val="0"/>
+                <w:sz w:val="22"/>
+                <w:szCs w:val="22"/>
+                <w:lang w:val="en-US" w:eastAsia="zh-CN" w:bidi="hi-IN"/>
+              </w:rPr>
+            </w:r>
+          </w:p>
+          <w:p>
+            <w:pPr>
+              <w:pStyle w:val="normal1"/>
+              <w:widowControl/>
+              <w:suppressAutoHyphens w:val="true"/>
+              <w:spacing w:before="0" w:after="160"/>
+              <w:rPr>
+                <w:rFonts w:ascii="Calibri" w:hAnsi="Calibri" w:eastAsia="Calibri" w:cs="Calibri"/>
+                <w:kern w:val="0"/>
+                <w:sz w:val="22"/>
+                <w:szCs w:val="22"/>
+                <w:lang w:val="en-US" w:eastAsia="zh-CN" w:bidi="hi-IN"/>
+              </w:rPr>
+            </w:pPr>
+            <w:r>
+              <w:rPr>
+                <w:rFonts w:eastAsia="Calibri" w:cs="Calibri"/>
+                <w:kern w:val="0"/>
+                <w:sz w:val="22"/>
+                <w:szCs w:val="22"/>
+                <w:lang w:val="en-US" w:eastAsia="zh-CN" w:bidi="hi-IN"/>
+              </w:rPr>
+              <w:t>Helped with finding ways to implement the project(sql, python/php etc…)</w:t>
+            </w:r>
+          </w:p>
+          <w:p>
+            <w:pPr>
+              <w:pStyle w:val="normal1"/>
+              <w:widowControl/>
+              <w:suppressAutoHyphens w:val="true"/>
+              <w:spacing w:before="0" w:after="160"/>
+              <w:rPr>
+                <w:rFonts w:ascii="Calibri" w:hAnsi="Calibri" w:eastAsia="Calibri" w:cs="Calibri"/>
+                <w:kern w:val="0"/>
+                <w:sz w:val="22"/>
+                <w:szCs w:val="22"/>
+                <w:lang w:val="en-US" w:eastAsia="zh-CN" w:bidi="hi-IN"/>
+              </w:rPr>
+            </w:pPr>
+            <w:r>
+              <w:rPr>
+                <w:rFonts w:eastAsia="Calibri" w:cs="Calibri"/>
+                <w:kern w:val="0"/>
+                <w:sz w:val="22"/>
+                <w:szCs w:val="22"/>
+                <w:lang w:val="en-US" w:eastAsia="zh-CN" w:bidi="hi-IN"/>
+              </w:rPr>
               <w:t>Implemented the GPIO interaction in the code</w:t>
             </w:r>
           </w:p>
           <w:p>
             <w:pPr>
               <w:pStyle w:val="normal1"/>
-            </w:pPr>
-            <w:r>
+              <w:widowControl/>
+              <w:suppressAutoHyphens w:val="true"/>
+              <w:spacing w:before="0" w:after="160"/>
+              <w:rPr>
+                <w:rFonts w:ascii="Calibri" w:hAnsi="Calibri" w:eastAsia="Calibri" w:cs="Calibri"/>
+                <w:kern w:val="0"/>
+                <w:sz w:val="22"/>
+                <w:szCs w:val="22"/>
+                <w:lang w:val="en-US" w:eastAsia="zh-CN" w:bidi="hi-IN"/>
+              </w:rPr>
+            </w:pPr>
+            <w:r>
+              <w:rPr>
+                <w:rFonts w:eastAsia="Calibri" w:cs="Calibri"/>
+                <w:kern w:val="0"/>
+                <w:sz w:val="22"/>
+                <w:szCs w:val="22"/>
+                <w:lang w:val="en-US" w:eastAsia="zh-CN" w:bidi="hi-IN"/>
+              </w:rPr>
               <w:t>Bug fixes</w:t>
             </w:r>
           </w:p>
@@ -316,7 +372,7 @@
       </w:tr>
       <w:tr>
         <w:trPr>
-          <w:trHeight w:val="1340"/>
+          <w:trHeight w:val="1340" w:hRule="atLeast"/>
         </w:trPr>
         <w:tc>
           <w:tcPr>
@@ -332,6 +388,9 @@
           <w:p>
             <w:pPr>
               <w:pStyle w:val="normal1"/>
+              <w:widowControl/>
+              <w:suppressAutoHyphens w:val="true"/>
+              <w:spacing w:before="0" w:after="160"/>
               <w:jc w:val="left"/>
               <w:rPr>
                 <w:b/>
@@ -342,10 +401,13 @@
             </w:pPr>
             <w:r>
               <w:rPr>
-                <w:b/>
-                <w:bCs/>
+                <w:rFonts w:eastAsia="Calibri" w:cs="Calibri"/>
+                <w:b/>
+                <w:bCs/>
+                <w:kern w:val="0"/>
                 <w:sz w:val="24"/>
                 <w:szCs w:val="24"/>
+                <w:lang w:val="en-US" w:eastAsia="zh-CN" w:bidi="hi-IN"/>
               </w:rPr>
               <w:t>#2 Meerab Khan</w:t>
             </w:r>
@@ -364,63 +426,58 @@
           <w:p>
             <w:pPr>
               <w:pStyle w:val="normal1"/>
-            </w:pPr>
-            <w:r>
-              <w:t xml:space="preserve">Helped with finding ways to implement the </w:t>
-            </w:r>
-            <w:proofErr w:type="gramStart"/>
-            <w:r>
-              <w:t>project(</w:t>
-            </w:r>
-            <w:proofErr w:type="spellStart"/>
-            <w:proofErr w:type="gramEnd"/>
-            <w:r>
-              <w:t>sql</w:t>
-            </w:r>
-            <w:proofErr w:type="spellEnd"/>
-            <w:r>
-              <w:t>, python/</w:t>
-            </w:r>
-            <w:proofErr w:type="spellStart"/>
-            <w:r>
-              <w:t>php</w:t>
-            </w:r>
-            <w:proofErr w:type="spellEnd"/>
-            <w:r>
-              <w:t xml:space="preserve"> </w:t>
-            </w:r>
-            <w:proofErr w:type="spellStart"/>
-            <w:r>
-              <w:t>etc</w:t>
-            </w:r>
-            <w:proofErr w:type="spellEnd"/>
-            <w:r>
-              <w:t>…)</w:t>
-            </w:r>
-          </w:p>
-          <w:p>
-            <w:pPr>
-              <w:pStyle w:val="normal1"/>
-            </w:pPr>
-            <w:r>
-              <w:t xml:space="preserve">Implemented the database connection in the </w:t>
-            </w:r>
-            <w:proofErr w:type="spellStart"/>
-            <w:proofErr w:type="gramStart"/>
-            <w:r>
-              <w:t>code,regex</w:t>
-            </w:r>
-            <w:proofErr w:type="spellEnd"/>
-            <w:proofErr w:type="gramEnd"/>
-            <w:r>
-              <w:t xml:space="preserve"> expressions</w:t>
+              <w:widowControl/>
+              <w:suppressAutoHyphens w:val="true"/>
+              <w:spacing w:before="0" w:after="160"/>
+              <w:rPr>
+                <w:rFonts w:ascii="Calibri" w:hAnsi="Calibri" w:eastAsia="Calibri" w:cs="Calibri"/>
+                <w:kern w:val="0"/>
+                <w:sz w:val="22"/>
+                <w:szCs w:val="22"/>
+                <w:lang w:val="en-US" w:eastAsia="zh-CN" w:bidi="hi-IN"/>
+              </w:rPr>
+            </w:pPr>
+            <w:r>
+              <w:rPr>
+                <w:rFonts w:eastAsia="Calibri" w:cs="Calibri"/>
+                <w:kern w:val="0"/>
+                <w:sz w:val="22"/>
+                <w:szCs w:val="22"/>
+                <w:lang w:val="en-US" w:eastAsia="zh-CN" w:bidi="hi-IN"/>
+              </w:rPr>
+              <w:t>Helped with finding ways to implement the project(sql, python/php etc…)</w:t>
+            </w:r>
+          </w:p>
+          <w:p>
+            <w:pPr>
+              <w:pStyle w:val="normal1"/>
+              <w:widowControl/>
+              <w:suppressAutoHyphens w:val="true"/>
+              <w:spacing w:before="0" w:after="160"/>
+              <w:rPr>
+                <w:rFonts w:ascii="Calibri" w:hAnsi="Calibri" w:eastAsia="Calibri" w:cs="Calibri"/>
+                <w:kern w:val="0"/>
+                <w:sz w:val="22"/>
+                <w:szCs w:val="22"/>
+                <w:lang w:val="en-US" w:eastAsia="zh-CN" w:bidi="hi-IN"/>
+              </w:rPr>
+            </w:pPr>
+            <w:r>
+              <w:rPr>
+                <w:rFonts w:eastAsia="Calibri" w:cs="Calibri"/>
+                <w:kern w:val="0"/>
+                <w:sz w:val="22"/>
+                <w:szCs w:val="22"/>
+                <w:lang w:val="en-US" w:eastAsia="zh-CN" w:bidi="hi-IN"/>
+              </w:rPr>
+              <w:t>Implemented the database connection in the code,regex expressions</w:t>
             </w:r>
           </w:p>
         </w:tc>
       </w:tr>
       <w:tr>
         <w:trPr>
-          <w:trHeight w:val="1430"/>
+          <w:trHeight w:val="1430" w:hRule="atLeast"/>
         </w:trPr>
         <w:tc>
           <w:tcPr>
@@ -436,6 +493,9 @@
           <w:p>
             <w:pPr>
               <w:pStyle w:val="normal1"/>
+              <w:widowControl/>
+              <w:suppressAutoHyphens w:val="true"/>
+              <w:spacing w:before="0" w:after="160"/>
               <w:jc w:val="left"/>
               <w:rPr>
                 <w:b/>
@@ -446,10 +506,13 @@
             </w:pPr>
             <w:r>
               <w:rPr>
-                <w:b/>
-                <w:bCs/>
+                <w:rFonts w:eastAsia="Calibri" w:cs="Calibri"/>
+                <w:b/>
+                <w:bCs/>
+                <w:kern w:val="0"/>
                 <w:sz w:val="24"/>
                 <w:szCs w:val="24"/>
+                <w:lang w:val="en-US" w:eastAsia="zh-CN" w:bidi="hi-IN"/>
               </w:rPr>
               <w:t>#3 Abdulmajeed Kakar</w:t>
             </w:r>
@@ -468,45 +531,50 @@
           <w:p>
             <w:pPr>
               <w:pStyle w:val="normal1"/>
-            </w:pPr>
-            <w:r>
-              <w:t xml:space="preserve">Helped with finding ways to implement the </w:t>
-            </w:r>
-            <w:proofErr w:type="gramStart"/>
-            <w:r>
-              <w:t>project(</w:t>
-            </w:r>
-            <w:proofErr w:type="spellStart"/>
-            <w:proofErr w:type="gramEnd"/>
-            <w:r>
-              <w:t>sql</w:t>
-            </w:r>
-            <w:proofErr w:type="spellEnd"/>
-            <w:r>
-              <w:t>, python/</w:t>
-            </w:r>
-            <w:proofErr w:type="spellStart"/>
-            <w:r>
-              <w:t>php</w:t>
-            </w:r>
-            <w:proofErr w:type="spellEnd"/>
-            <w:r>
-              <w:t xml:space="preserve"> </w:t>
-            </w:r>
-            <w:proofErr w:type="spellStart"/>
-            <w:r>
-              <w:t>etc</w:t>
-            </w:r>
-            <w:proofErr w:type="spellEnd"/>
-            <w:r>
-              <w:t>…)</w:t>
-            </w:r>
-          </w:p>
-          <w:p>
-            <w:pPr>
-              <w:pStyle w:val="normal1"/>
-            </w:pPr>
-            <w:r>
+              <w:widowControl/>
+              <w:suppressAutoHyphens w:val="true"/>
+              <w:spacing w:before="0" w:after="160"/>
+              <w:rPr>
+                <w:rFonts w:ascii="Calibri" w:hAnsi="Calibri" w:eastAsia="Calibri" w:cs="Calibri"/>
+                <w:kern w:val="0"/>
+                <w:sz w:val="22"/>
+                <w:szCs w:val="22"/>
+                <w:lang w:val="en-US" w:eastAsia="zh-CN" w:bidi="hi-IN"/>
+              </w:rPr>
+            </w:pPr>
+            <w:r>
+              <w:rPr>
+                <w:rFonts w:eastAsia="Calibri" w:cs="Calibri"/>
+                <w:kern w:val="0"/>
+                <w:sz w:val="22"/>
+                <w:szCs w:val="22"/>
+                <w:lang w:val="en-US" w:eastAsia="zh-CN" w:bidi="hi-IN"/>
+              </w:rPr>
+              <w:t>Helped with finding ways to implement the project(sql, python/php etc…)</w:t>
+            </w:r>
+          </w:p>
+          <w:p>
+            <w:pPr>
+              <w:pStyle w:val="normal1"/>
+              <w:widowControl/>
+              <w:suppressAutoHyphens w:val="true"/>
+              <w:spacing w:before="0" w:after="160"/>
+              <w:rPr>
+                <w:rFonts w:ascii="Calibri" w:hAnsi="Calibri" w:eastAsia="Calibri" w:cs="Calibri"/>
+                <w:kern w:val="0"/>
+                <w:sz w:val="22"/>
+                <w:szCs w:val="22"/>
+                <w:lang w:val="en-US" w:eastAsia="zh-CN" w:bidi="hi-IN"/>
+              </w:rPr>
+            </w:pPr>
+            <w:r>
+              <w:rPr>
+                <w:rFonts w:eastAsia="Calibri" w:cs="Calibri"/>
+                <w:kern w:val="0"/>
+                <w:sz w:val="22"/>
+                <w:szCs w:val="22"/>
+                <w:lang w:val="en-US" w:eastAsia="zh-CN" w:bidi="hi-IN"/>
+              </w:rPr>
               <w:t>Implemented the GUI in the code</w:t>
             </w:r>
           </w:p>
@@ -514,7 +582,7 @@
       </w:tr>
       <w:tr>
         <w:trPr>
-          <w:trHeight w:val="1430"/>
+          <w:trHeight w:val="1430" w:hRule="atLeast"/>
         </w:trPr>
         <w:tc>
           <w:tcPr>
@@ -530,6 +598,9 @@
           <w:p>
             <w:pPr>
               <w:pStyle w:val="normal1"/>
+              <w:widowControl/>
+              <w:suppressAutoHyphens w:val="true"/>
+              <w:spacing w:before="0" w:after="160"/>
               <w:jc w:val="left"/>
               <w:rPr>
                 <w:b/>
@@ -540,10 +611,13 @@
             </w:pPr>
             <w:r>
               <w:rPr>
-                <w:b/>
-                <w:bCs/>
+                <w:rFonts w:eastAsia="Calibri" w:cs="Calibri"/>
+                <w:b/>
+                <w:bCs/>
+                <w:kern w:val="0"/>
                 <w:sz w:val="24"/>
                 <w:szCs w:val="24"/>
+                <w:lang w:val="en-US" w:eastAsia="zh-CN" w:bidi="hi-IN"/>
               </w:rPr>
               <w:t>#4 Cheng Yu Yang</w:t>
             </w:r>
@@ -562,53 +636,75 @@
           <w:p>
             <w:pPr>
               <w:pStyle w:val="normal1"/>
-            </w:pPr>
-            <w:r>
-              <w:t xml:space="preserve">Helped with finding ways to implement the </w:t>
-            </w:r>
-            <w:proofErr w:type="gramStart"/>
-            <w:r>
-              <w:t>project(</w:t>
-            </w:r>
-            <w:proofErr w:type="spellStart"/>
-            <w:proofErr w:type="gramEnd"/>
-            <w:r>
-              <w:t>sql</w:t>
-            </w:r>
-            <w:proofErr w:type="spellEnd"/>
-            <w:r>
-              <w:t>, python/</w:t>
-            </w:r>
-            <w:proofErr w:type="spellStart"/>
-            <w:r>
-              <w:t>php</w:t>
-            </w:r>
-            <w:proofErr w:type="spellEnd"/>
-            <w:r>
-              <w:t xml:space="preserve"> </w:t>
-            </w:r>
-            <w:proofErr w:type="spellStart"/>
-            <w:r>
-              <w:t>etc</w:t>
-            </w:r>
-            <w:proofErr w:type="spellEnd"/>
-            <w:r>
-              <w:t>…)</w:t>
-            </w:r>
-          </w:p>
-          <w:p>
-            <w:pPr>
-              <w:pStyle w:val="normal1"/>
-            </w:pPr>
-            <w:r>
+              <w:widowControl/>
+              <w:suppressAutoHyphens w:val="true"/>
+              <w:spacing w:before="0" w:after="160"/>
+              <w:rPr>
+                <w:rFonts w:ascii="Calibri" w:hAnsi="Calibri" w:eastAsia="Calibri" w:cs="Calibri"/>
+                <w:kern w:val="0"/>
+                <w:sz w:val="22"/>
+                <w:szCs w:val="22"/>
+                <w:lang w:val="en-US" w:eastAsia="zh-CN" w:bidi="hi-IN"/>
+              </w:rPr>
+            </w:pPr>
+            <w:r>
+              <w:rPr>
+                <w:rFonts w:eastAsia="Calibri" w:cs="Calibri"/>
+                <w:kern w:val="0"/>
+                <w:sz w:val="22"/>
+                <w:szCs w:val="22"/>
+                <w:lang w:val="en-US" w:eastAsia="zh-CN" w:bidi="hi-IN"/>
+              </w:rPr>
+              <w:t>Helped with finding ways to implement the project(sql, python/php etc…)</w:t>
+            </w:r>
+          </w:p>
+          <w:p>
+            <w:pPr>
+              <w:pStyle w:val="normal1"/>
+              <w:widowControl/>
+              <w:suppressAutoHyphens w:val="true"/>
+              <w:spacing w:before="0" w:after="160"/>
+              <w:rPr>
+                <w:rFonts w:ascii="Calibri" w:hAnsi="Calibri" w:eastAsia="Calibri" w:cs="Calibri"/>
+                <w:kern w:val="0"/>
+                <w:sz w:val="22"/>
+                <w:szCs w:val="22"/>
+                <w:lang w:val="en-US" w:eastAsia="zh-CN" w:bidi="hi-IN"/>
+              </w:rPr>
+            </w:pPr>
+            <w:r>
+              <w:rPr>
+                <w:rFonts w:eastAsia="Calibri" w:cs="Calibri"/>
+                <w:kern w:val="0"/>
+                <w:sz w:val="22"/>
+                <w:szCs w:val="22"/>
+                <w:lang w:val="en-US" w:eastAsia="zh-CN" w:bidi="hi-IN"/>
+              </w:rPr>
               <w:t>Found solution for replacing slim framework since we were having issues.</w:t>
             </w:r>
           </w:p>
           <w:p>
             <w:pPr>
               <w:pStyle w:val="normal1"/>
-            </w:pPr>
-            <w:r>
+              <w:widowControl/>
+              <w:suppressAutoHyphens w:val="true"/>
+              <w:spacing w:before="0" w:after="160"/>
+              <w:rPr>
+                <w:rFonts w:ascii="Calibri" w:hAnsi="Calibri" w:eastAsia="Calibri" w:cs="Calibri"/>
+                <w:kern w:val="0"/>
+                <w:sz w:val="22"/>
+                <w:szCs w:val="22"/>
+                <w:lang w:val="en-US" w:eastAsia="zh-CN" w:bidi="hi-IN"/>
+              </w:rPr>
+            </w:pPr>
+            <w:r>
+              <w:rPr>
+                <w:rFonts w:eastAsia="Calibri" w:cs="Calibri"/>
+                <w:kern w:val="0"/>
+                <w:sz w:val="22"/>
+                <w:szCs w:val="22"/>
+                <w:lang w:val="en-US" w:eastAsia="zh-CN" w:bidi="hi-IN"/>
+              </w:rPr>
               <w:t>Working on Converting the interface to HTML</w:t>
             </w:r>
           </w:p>
@@ -618,22 +714,35 @@
     <w:p>
       <w:pPr>
         <w:pStyle w:val="normal1"/>
+        <w:rPr/>
       </w:pPr>
+      <w:r>
+        <w:rPr/>
+      </w:r>
     </w:p>
     <w:p>
       <w:pPr>
         <w:pStyle w:val="normal1"/>
+        <w:rPr/>
       </w:pPr>
+      <w:r>
+        <w:rPr/>
+      </w:r>
     </w:p>
     <w:p>
       <w:pPr>
         <w:pStyle w:val="normal1"/>
+        <w:rPr/>
       </w:pPr>
+      <w:r>
+        <w:rPr/>
+      </w:r>
     </w:p>
     <w:p>
       <w:pPr>
         <w:pStyle w:val="normal1"/>
         <w:jc w:val="right"/>
+        <w:rPr/>
       </w:pPr>
       <w:r>
         <w:rPr>
@@ -642,7 +751,6 @@
           <w:sz w:val="28"/>
           <w:szCs w:val="28"/>
         </w:rPr>
-        <w:lastRenderedPageBreak/>
         <w:t>Phase: 2</w:t>
       </w:r>
     </w:p>
@@ -650,6 +758,7 @@
       <w:tblPr>
         <w:tblStyle w:val="TableNormal0"/>
         <w:tblW w:w="9350" w:type="dxa"/>
+        <w:jc w:val="left"/>
         <w:tblInd w:w="0" w:type="dxa"/>
         <w:tblLayout w:type="fixed"/>
         <w:tblCellMar>
@@ -658,15 +767,15 @@
           <w:bottom w:w="0" w:type="dxa"/>
           <w:right w:w="108" w:type="dxa"/>
         </w:tblCellMar>
-        <w:tblLook w:val="0400" w:firstRow="0" w:lastRow="0" w:firstColumn="0" w:lastColumn="0" w:noHBand="0" w:noVBand="1"/>
+        <w:tblLook w:val="0400" w:noHBand="0" w:noVBand="1" w:firstColumn="0" w:lastRow="0" w:lastColumn="0" w:firstRow="0"/>
       </w:tblPr>
       <w:tblGrid>
         <w:gridCol w:w="3955"/>
-        <w:gridCol w:w="5395"/>
+        <w:gridCol w:w="5394"/>
       </w:tblGrid>
       <w:tr>
         <w:trPr>
-          <w:trHeight w:val="530"/>
+          <w:trHeight w:val="530" w:hRule="atLeast"/>
         </w:trPr>
         <w:tc>
           <w:tcPr>
@@ -682,6 +791,9 @@
           <w:p>
             <w:pPr>
               <w:pStyle w:val="normal1"/>
+              <w:widowControl/>
+              <w:suppressAutoHyphens w:val="true"/>
+              <w:spacing w:before="0" w:after="160"/>
               <w:jc w:val="center"/>
               <w:rPr>
                 <w:b/>
@@ -692,10 +804,13 @@
             </w:pPr>
             <w:r>
               <w:rPr>
-                <w:b/>
-                <w:bCs/>
+                <w:rFonts w:eastAsia="Calibri" w:cs="Calibri"/>
+                <w:b/>
+                <w:bCs/>
+                <w:kern w:val="0"/>
                 <w:sz w:val="32"/>
                 <w:szCs w:val="32"/>
+                <w:lang w:val="en-US" w:eastAsia="zh-CN" w:bidi="hi-IN"/>
               </w:rPr>
               <w:t>Student name</w:t>
             </w:r>
@@ -715,6 +830,9 @@
           <w:p>
             <w:pPr>
               <w:pStyle w:val="normal1"/>
+              <w:widowControl/>
+              <w:suppressAutoHyphens w:val="true"/>
+              <w:spacing w:before="0" w:after="160"/>
               <w:jc w:val="center"/>
               <w:rPr>
                 <w:b/>
@@ -725,10 +843,13 @@
             </w:pPr>
             <w:r>
               <w:rPr>
-                <w:b/>
-                <w:bCs/>
+                <w:rFonts w:eastAsia="Calibri" w:cs="Calibri"/>
+                <w:b/>
+                <w:bCs/>
+                <w:kern w:val="0"/>
                 <w:sz w:val="32"/>
                 <w:szCs w:val="32"/>
+                <w:lang w:val="en-US" w:eastAsia="zh-CN" w:bidi="hi-IN"/>
               </w:rPr>
               <w:t>Tasks and duties</w:t>
             </w:r>
@@ -737,7 +858,7 @@
       </w:tr>
       <w:tr>
         <w:trPr>
-          <w:trHeight w:val="1790"/>
+          <w:trHeight w:val="1790" w:hRule="atLeast"/>
         </w:trPr>
         <w:tc>
           <w:tcPr>
@@ -753,6 +874,9 @@
           <w:p>
             <w:pPr>
               <w:pStyle w:val="normal1"/>
+              <w:widowControl/>
+              <w:suppressAutoHyphens w:val="true"/>
+              <w:spacing w:before="0" w:after="160"/>
               <w:jc w:val="left"/>
               <w:rPr>
                 <w:b/>
@@ -763,10 +887,13 @@
             </w:pPr>
             <w:r>
               <w:rPr>
-                <w:b/>
-                <w:bCs/>
+                <w:rFonts w:eastAsia="Calibri" w:cs="Calibri"/>
+                <w:b/>
+                <w:bCs/>
+                <w:kern w:val="0"/>
                 <w:sz w:val="24"/>
                 <w:szCs w:val="24"/>
+                <w:lang w:val="en-US" w:eastAsia="zh-CN" w:bidi="hi-IN"/>
               </w:rPr>
               <w:t>#1 Jonathan Markovic</w:t>
             </w:r>
@@ -785,60 +912,150 @@
           <w:p>
             <w:pPr>
               <w:pStyle w:val="normal1"/>
-            </w:pPr>
-            <w:r>
-              <w:t xml:space="preserve">Helped in ways to implement the </w:t>
-            </w:r>
-            <w:proofErr w:type="gramStart"/>
-            <w:r>
-              <w:t>project(</w:t>
-            </w:r>
-            <w:proofErr w:type="gramEnd"/>
-            <w:r>
-              <w:t>ESP32, MQTT, sensors)</w:t>
-            </w:r>
-          </w:p>
-          <w:p>
-            <w:pPr>
-              <w:pStyle w:val="normal1"/>
-            </w:pPr>
-            <w:r>
+              <w:widowControl/>
+              <w:suppressAutoHyphens w:val="true"/>
+              <w:spacing w:before="0" w:after="160"/>
+              <w:rPr>
+                <w:rFonts w:ascii="Calibri" w:hAnsi="Calibri" w:eastAsia="Calibri" w:cs="Calibri"/>
+                <w:kern w:val="0"/>
+                <w:sz w:val="22"/>
+                <w:szCs w:val="22"/>
+                <w:lang w:val="en-US" w:eastAsia="zh-CN" w:bidi="hi-IN"/>
+              </w:rPr>
+            </w:pPr>
+            <w:r>
+              <w:rPr>
+                <w:rFonts w:eastAsia="Calibri" w:cs="Calibri"/>
+                <w:kern w:val="0"/>
+                <w:sz w:val="22"/>
+                <w:szCs w:val="22"/>
+                <w:lang w:val="en-US" w:eastAsia="zh-CN" w:bidi="hi-IN"/>
+              </w:rPr>
+              <w:t>Helped in ways to implement the project(ESP32, MQTT, sensors)</w:t>
+            </w:r>
+          </w:p>
+          <w:p>
+            <w:pPr>
+              <w:pStyle w:val="normal1"/>
+              <w:widowControl/>
+              <w:suppressAutoHyphens w:val="true"/>
+              <w:spacing w:before="0" w:after="160"/>
+              <w:rPr>
+                <w:rFonts w:ascii="Calibri" w:hAnsi="Calibri" w:eastAsia="Calibri" w:cs="Calibri"/>
+                <w:kern w:val="0"/>
+                <w:sz w:val="22"/>
+                <w:szCs w:val="22"/>
+                <w:lang w:val="en-US" w:eastAsia="zh-CN" w:bidi="hi-IN"/>
+              </w:rPr>
+            </w:pPr>
+            <w:r>
+              <w:rPr>
+                <w:rFonts w:eastAsia="Calibri" w:cs="Calibri"/>
+                <w:kern w:val="0"/>
+                <w:sz w:val="22"/>
+                <w:szCs w:val="22"/>
+                <w:lang w:val="en-US" w:eastAsia="zh-CN" w:bidi="hi-IN"/>
+              </w:rPr>
               <w:t>Implemented DHT11 sensor connection with ESP32(temperature &amp; humidity)</w:t>
             </w:r>
           </w:p>
           <w:p>
             <w:pPr>
               <w:pStyle w:val="BodyText"/>
-              <w:spacing w:after="160"/>
-            </w:pPr>
-            <w:r>
+              <w:widowControl/>
+              <w:suppressAutoHyphens w:val="true"/>
+              <w:spacing w:before="0" w:after="160"/>
+              <w:rPr>
+                <w:rFonts w:ascii="Calibri" w:hAnsi="Calibri" w:eastAsia="Calibri" w:cs="Calibri"/>
+                <w:kern w:val="0"/>
+                <w:sz w:val="22"/>
+                <w:szCs w:val="22"/>
+                <w:lang w:val="en-US" w:eastAsia="zh-CN" w:bidi="hi-IN"/>
+              </w:rPr>
+            </w:pPr>
+            <w:r>
+              <w:rPr>
+                <w:rFonts w:eastAsia="Calibri" w:cs="Calibri"/>
+                <w:kern w:val="0"/>
+                <w:sz w:val="22"/>
+                <w:szCs w:val="22"/>
+                <w:lang w:val="en-US" w:eastAsia="zh-CN" w:bidi="hi-IN"/>
+              </w:rPr>
               <w:t>Configured MQTT server connection with Python and data publishing (Frig1 / Frig2)</w:t>
             </w:r>
           </w:p>
           <w:p>
             <w:pPr>
               <w:pStyle w:val="BodyText"/>
-              <w:spacing w:after="160"/>
-            </w:pPr>
-            <w:r>
+              <w:widowControl/>
+              <w:suppressAutoHyphens w:val="true"/>
+              <w:spacing w:before="0" w:after="160"/>
+              <w:rPr>
+                <w:rFonts w:ascii="Calibri" w:hAnsi="Calibri" w:eastAsia="Calibri" w:cs="Calibri"/>
+                <w:kern w:val="0"/>
+                <w:sz w:val="22"/>
+                <w:szCs w:val="22"/>
+                <w:lang w:val="en-US" w:eastAsia="zh-CN" w:bidi="hi-IN"/>
+              </w:rPr>
+            </w:pPr>
+            <w:r>
+              <w:rPr>
+                <w:rFonts w:eastAsia="Calibri" w:cs="Calibri"/>
+                <w:kern w:val="0"/>
+                <w:sz w:val="22"/>
+                <w:szCs w:val="22"/>
+                <w:lang w:val="en-US" w:eastAsia="zh-CN" w:bidi="hi-IN"/>
+              </w:rPr>
               <w:t>Implemented fan logic based on temperature threshold</w:t>
             </w:r>
           </w:p>
           <w:p>
             <w:pPr>
               <w:pStyle w:val="BodyText"/>
-              <w:spacing w:after="160"/>
-            </w:pPr>
-            <w:r>
+              <w:widowControl/>
+              <w:suppressAutoHyphens w:val="true"/>
+              <w:spacing w:before="0" w:after="160"/>
+              <w:rPr>
+                <w:rFonts w:ascii="Calibri" w:hAnsi="Calibri" w:eastAsia="Calibri" w:cs="Calibri"/>
+                <w:kern w:val="0"/>
+                <w:sz w:val="22"/>
+                <w:szCs w:val="22"/>
+                <w:lang w:val="en-US" w:eastAsia="zh-CN" w:bidi="hi-IN"/>
+              </w:rPr>
+            </w:pPr>
+            <w:r>
+              <w:rPr>
+                <w:rFonts w:eastAsia="Calibri" w:cs="Calibri"/>
+                <w:kern w:val="0"/>
+                <w:sz w:val="22"/>
+                <w:szCs w:val="22"/>
+                <w:lang w:val="en-US" w:eastAsia="zh-CN" w:bidi="hi-IN"/>
+              </w:rPr>
               <w:t>Designed and assembled circuit</w:t>
             </w:r>
           </w:p>
           <w:p>
             <w:pPr>
               <w:pStyle w:val="BodyText"/>
-              <w:spacing w:after="160"/>
-            </w:pPr>
-            <w:r>
+              <w:widowControl/>
+              <w:suppressAutoHyphens w:val="true"/>
+              <w:spacing w:before="0" w:after="160"/>
+              <w:rPr>
+                <w:rFonts w:ascii="Calibri" w:hAnsi="Calibri" w:eastAsia="Calibri" w:cs="Calibri"/>
+                <w:kern w:val="0"/>
+                <w:sz w:val="22"/>
+                <w:szCs w:val="22"/>
+                <w:lang w:val="en-US" w:eastAsia="zh-CN" w:bidi="hi-IN"/>
+              </w:rPr>
+            </w:pPr>
+            <w:r>
+              <w:rPr>
+                <w:rFonts w:eastAsia="Calibri" w:cs="Calibri"/>
+                <w:kern w:val="0"/>
+                <w:sz w:val="22"/>
+                <w:szCs w:val="22"/>
+                <w:lang w:val="en-US" w:eastAsia="zh-CN" w:bidi="hi-IN"/>
+              </w:rPr>
               <w:t>Bug Fixes</w:t>
             </w:r>
           </w:p>
@@ -846,7 +1063,7 @@
       </w:tr>
       <w:tr>
         <w:trPr>
-          <w:trHeight w:val="1340"/>
+          <w:trHeight w:val="1340" w:hRule="atLeast"/>
         </w:trPr>
         <w:tc>
           <w:tcPr>
@@ -862,6 +1079,9 @@
           <w:p>
             <w:pPr>
               <w:pStyle w:val="normal1"/>
+              <w:widowControl/>
+              <w:suppressAutoHyphens w:val="true"/>
+              <w:spacing w:before="0" w:after="160"/>
               <w:jc w:val="left"/>
               <w:rPr>
                 <w:b/>
@@ -872,10 +1092,13 @@
             </w:pPr>
             <w:r>
               <w:rPr>
-                <w:b/>
-                <w:bCs/>
+                <w:rFonts w:eastAsia="Calibri" w:cs="Calibri"/>
+                <w:b/>
+                <w:bCs/>
+                <w:kern w:val="0"/>
                 <w:sz w:val="24"/>
                 <w:szCs w:val="24"/>
+                <w:lang w:val="en-US" w:eastAsia="zh-CN" w:bidi="hi-IN"/>
               </w:rPr>
               <w:t>#2 Meerab Khan</w:t>
             </w:r>
@@ -894,36 +1117,100 @@
           <w:p>
             <w:pPr>
               <w:pStyle w:val="BodyText"/>
-              <w:spacing w:after="160"/>
-            </w:pPr>
-            <w:r>
+              <w:widowControl/>
+              <w:suppressAutoHyphens w:val="true"/>
+              <w:spacing w:before="0" w:after="160"/>
+              <w:rPr>
+                <w:rFonts w:ascii="Calibri" w:hAnsi="Calibri" w:eastAsia="Calibri" w:cs="Calibri"/>
+                <w:kern w:val="0"/>
+                <w:sz w:val="22"/>
+                <w:szCs w:val="22"/>
+                <w:lang w:val="en-US" w:eastAsia="zh-CN" w:bidi="hi-IN"/>
+              </w:rPr>
+            </w:pPr>
+            <w:r>
+              <w:rPr>
+                <w:rFonts w:eastAsia="Calibri" w:cs="Calibri"/>
+                <w:kern w:val="0"/>
+                <w:sz w:val="22"/>
+                <w:szCs w:val="22"/>
+                <w:lang w:val="en-US" w:eastAsia="zh-CN" w:bidi="hi-IN"/>
+              </w:rPr>
               <w:t>Helped with finding ways to implement the project (Python, email system, MQTT logic with 2 ESP32s)</w:t>
             </w:r>
           </w:p>
           <w:p>
             <w:pPr>
               <w:pStyle w:val="BodyText"/>
-              <w:spacing w:after="160"/>
-            </w:pPr>
-            <w:r>
+              <w:widowControl/>
+              <w:suppressAutoHyphens w:val="true"/>
+              <w:spacing w:before="0" w:after="160"/>
+              <w:rPr>
+                <w:rFonts w:ascii="Calibri" w:hAnsi="Calibri" w:eastAsia="Calibri" w:cs="Calibri"/>
+                <w:kern w:val="0"/>
+                <w:sz w:val="22"/>
+                <w:szCs w:val="22"/>
+                <w:lang w:val="en-US" w:eastAsia="zh-CN" w:bidi="hi-IN"/>
+              </w:rPr>
+            </w:pPr>
+            <w:r>
+              <w:rPr>
+                <w:rFonts w:eastAsia="Calibri" w:cs="Calibri"/>
+                <w:kern w:val="0"/>
+                <w:sz w:val="22"/>
+                <w:szCs w:val="22"/>
+                <w:lang w:val="en-US" w:eastAsia="zh-CN" w:bidi="hi-IN"/>
+              </w:rPr>
               <w:t>Implemented email system (sending alerts and receiving with fan activation)</w:t>
             </w:r>
           </w:p>
           <w:p>
             <w:pPr>
               <w:pStyle w:val="BodyText"/>
-              <w:spacing w:after="160"/>
-            </w:pPr>
-            <w:r>
+              <w:widowControl/>
+              <w:suppressAutoHyphens w:val="true"/>
+              <w:spacing w:before="0" w:after="160"/>
+              <w:rPr>
+                <w:rFonts w:ascii="Calibri" w:hAnsi="Calibri" w:eastAsia="Calibri" w:cs="Calibri"/>
+                <w:kern w:val="0"/>
+                <w:sz w:val="22"/>
+                <w:szCs w:val="22"/>
+                <w:lang w:val="en-US" w:eastAsia="zh-CN" w:bidi="hi-IN"/>
+              </w:rPr>
+            </w:pPr>
+            <w:r>
+              <w:rPr>
+                <w:rFonts w:eastAsia="Calibri" w:cs="Calibri"/>
+                <w:kern w:val="0"/>
+                <w:sz w:val="22"/>
+                <w:szCs w:val="22"/>
+                <w:lang w:val="en-US" w:eastAsia="zh-CN" w:bidi="hi-IN"/>
+              </w:rPr>
               <w:t>Implemented threshold values stored in database</w:t>
             </w:r>
           </w:p>
           <w:p>
             <w:pPr>
               <w:pStyle w:val="BodyText"/>
-              <w:spacing w:after="160"/>
-            </w:pPr>
-            <w:r>
+              <w:widowControl/>
+              <w:suppressAutoHyphens w:val="true"/>
+              <w:spacing w:before="0" w:after="160"/>
+              <w:rPr>
+                <w:rFonts w:ascii="Calibri" w:hAnsi="Calibri" w:eastAsia="Calibri" w:cs="Calibri"/>
+                <w:kern w:val="0"/>
+                <w:sz w:val="22"/>
+                <w:szCs w:val="22"/>
+                <w:lang w:val="en-US" w:eastAsia="zh-CN" w:bidi="hi-IN"/>
+              </w:rPr>
+            </w:pPr>
+            <w:r>
+              <w:rPr>
+                <w:rFonts w:eastAsia="Calibri" w:cs="Calibri"/>
+                <w:kern w:val="0"/>
+                <w:sz w:val="22"/>
+                <w:szCs w:val="22"/>
+                <w:lang w:val="en-US" w:eastAsia="zh-CN" w:bidi="hi-IN"/>
+              </w:rPr>
               <w:t>Assisted with testing hardware setup with the GUI.</w:t>
             </w:r>
           </w:p>
@@ -931,7 +1218,7 @@
       </w:tr>
       <w:tr>
         <w:trPr>
-          <w:trHeight w:val="1430"/>
+          <w:trHeight w:val="1430" w:hRule="atLeast"/>
         </w:trPr>
         <w:tc>
           <w:tcPr>
@@ -947,6 +1234,9 @@
           <w:p>
             <w:pPr>
               <w:pStyle w:val="normal1"/>
+              <w:widowControl/>
+              <w:suppressAutoHyphens w:val="true"/>
+              <w:spacing w:before="0" w:after="160"/>
               <w:jc w:val="left"/>
               <w:rPr>
                 <w:b/>
@@ -957,10 +1247,13 @@
             </w:pPr>
             <w:r>
               <w:rPr>
-                <w:b/>
-                <w:bCs/>
+                <w:rFonts w:eastAsia="Calibri" w:cs="Calibri"/>
+                <w:b/>
+                <w:bCs/>
+                <w:kern w:val="0"/>
                 <w:sz w:val="24"/>
                 <w:szCs w:val="24"/>
+                <w:lang w:val="en-US" w:eastAsia="zh-CN" w:bidi="hi-IN"/>
               </w:rPr>
               <w:t>#3 Cheng Yu Yang</w:t>
             </w:r>
@@ -979,65 +1272,184 @@
           <w:p>
             <w:pPr>
               <w:pStyle w:val="normal1"/>
-            </w:pPr>
-            <w:r>
+              <w:widowControl/>
+              <w:suppressAutoHyphens w:val="true"/>
+              <w:spacing w:before="0" w:after="160"/>
+              <w:rPr>
+                <w:rFonts w:ascii="Calibri" w:hAnsi="Calibri" w:eastAsia="Calibri" w:cs="Calibri"/>
+                <w:kern w:val="0"/>
+                <w:sz w:val="22"/>
+                <w:szCs w:val="22"/>
+                <w:lang w:val="en-US" w:eastAsia="zh-CN" w:bidi="hi-IN"/>
+              </w:rPr>
+            </w:pPr>
+            <w:r>
+              <w:rPr>
+                <w:rFonts w:eastAsia="Calibri" w:cs="Calibri"/>
+                <w:kern w:val="0"/>
+                <w:sz w:val="22"/>
+                <w:szCs w:val="22"/>
+                <w:lang w:val="en-US" w:eastAsia="zh-CN" w:bidi="hi-IN"/>
+              </w:rPr>
               <w:t>Created flask server application and HTML templates</w:t>
             </w:r>
           </w:p>
           <w:p>
             <w:pPr>
               <w:pStyle w:val="normal1"/>
-            </w:pPr>
-            <w:r>
+              <w:widowControl/>
+              <w:suppressAutoHyphens w:val="true"/>
+              <w:spacing w:before="0" w:after="160"/>
+              <w:rPr>
+                <w:rFonts w:ascii="Calibri" w:hAnsi="Calibri" w:eastAsia="Calibri" w:cs="Calibri"/>
+                <w:kern w:val="0"/>
+                <w:sz w:val="22"/>
+                <w:szCs w:val="22"/>
+                <w:lang w:val="en-US" w:eastAsia="zh-CN" w:bidi="hi-IN"/>
+              </w:rPr>
+            </w:pPr>
+            <w:r>
+              <w:rPr>
+                <w:rFonts w:eastAsia="Calibri" w:cs="Calibri"/>
+                <w:kern w:val="0"/>
+                <w:sz w:val="22"/>
+                <w:szCs w:val="22"/>
+                <w:lang w:val="en-US" w:eastAsia="zh-CN" w:bidi="hi-IN"/>
+              </w:rPr>
               <w:t>Styled pages using custom CSS</w:t>
             </w:r>
           </w:p>
           <w:p>
             <w:pPr>
               <w:pStyle w:val="normal1"/>
-            </w:pPr>
-            <w:r>
+              <w:widowControl/>
+              <w:suppressAutoHyphens w:val="true"/>
+              <w:spacing w:before="0" w:after="160"/>
+              <w:rPr>
+                <w:rFonts w:ascii="Calibri" w:hAnsi="Calibri" w:eastAsia="Calibri" w:cs="Calibri"/>
+                <w:kern w:val="0"/>
+                <w:sz w:val="22"/>
+                <w:szCs w:val="22"/>
+                <w:lang w:val="en-US" w:eastAsia="zh-CN" w:bidi="hi-IN"/>
+              </w:rPr>
+            </w:pPr>
+            <w:r>
+              <w:rPr>
+                <w:rFonts w:eastAsia="Calibri" w:cs="Calibri"/>
+                <w:kern w:val="0"/>
+                <w:sz w:val="22"/>
+                <w:szCs w:val="22"/>
+                <w:lang w:val="en-US" w:eastAsia="zh-CN" w:bidi="hi-IN"/>
+              </w:rPr>
               <w:t>Implemented app routes and HTTP request logic</w:t>
             </w:r>
           </w:p>
           <w:p>
             <w:pPr>
               <w:pStyle w:val="normal1"/>
-            </w:pPr>
-            <w:r>
+              <w:widowControl/>
+              <w:suppressAutoHyphens w:val="true"/>
+              <w:spacing w:before="0" w:after="160"/>
+              <w:rPr>
+                <w:rFonts w:ascii="Calibri" w:hAnsi="Calibri" w:eastAsia="Calibri" w:cs="Calibri"/>
+                <w:kern w:val="0"/>
+                <w:sz w:val="22"/>
+                <w:szCs w:val="22"/>
+                <w:lang w:val="en-US" w:eastAsia="zh-CN" w:bidi="hi-IN"/>
+              </w:rPr>
+            </w:pPr>
+            <w:r>
+              <w:rPr>
+                <w:rFonts w:eastAsia="Calibri" w:cs="Calibri"/>
+                <w:kern w:val="0"/>
+                <w:sz w:val="22"/>
+                <w:szCs w:val="22"/>
+                <w:lang w:val="en-US" w:eastAsia="zh-CN" w:bidi="hi-IN"/>
+              </w:rPr>
               <w:t>Helped implement database methods (insert)</w:t>
             </w:r>
           </w:p>
           <w:p>
             <w:pPr>
               <w:pStyle w:val="normal1"/>
-            </w:pPr>
-            <w:r>
+              <w:widowControl/>
+              <w:suppressAutoHyphens w:val="true"/>
+              <w:spacing w:before="0" w:after="160"/>
+              <w:rPr>
+                <w:rFonts w:ascii="Calibri" w:hAnsi="Calibri" w:eastAsia="Calibri" w:cs="Calibri"/>
+                <w:kern w:val="0"/>
+                <w:sz w:val="22"/>
+                <w:szCs w:val="22"/>
+                <w:lang w:val="en-US" w:eastAsia="zh-CN" w:bidi="hi-IN"/>
+              </w:rPr>
+            </w:pPr>
+            <w:r>
+              <w:rPr>
+                <w:rFonts w:eastAsia="Calibri" w:cs="Calibri"/>
+                <w:kern w:val="0"/>
+                <w:sz w:val="22"/>
+                <w:szCs w:val="22"/>
+                <w:lang w:val="en-US" w:eastAsia="zh-CN" w:bidi="hi-IN"/>
+              </w:rPr>
               <w:t>Designed value display for temperature and humidity</w:t>
             </w:r>
           </w:p>
           <w:p>
             <w:pPr>
               <w:pStyle w:val="normal1"/>
-            </w:pPr>
-            <w:r>
+              <w:widowControl/>
+              <w:suppressAutoHyphens w:val="true"/>
+              <w:spacing w:before="0" w:after="160"/>
+              <w:rPr>
+                <w:rFonts w:ascii="Calibri" w:hAnsi="Calibri" w:eastAsia="Calibri" w:cs="Calibri"/>
+                <w:kern w:val="0"/>
+                <w:sz w:val="22"/>
+                <w:szCs w:val="22"/>
+                <w:lang w:val="en-US" w:eastAsia="zh-CN" w:bidi="hi-IN"/>
+              </w:rPr>
+            </w:pPr>
+            <w:r>
+              <w:rPr>
+                <w:rFonts w:eastAsia="Calibri" w:cs="Calibri"/>
+                <w:kern w:val="0"/>
+                <w:sz w:val="22"/>
+                <w:szCs w:val="22"/>
+                <w:lang w:val="en-US" w:eastAsia="zh-CN" w:bidi="hi-IN"/>
+              </w:rPr>
               <w:t>Implemented fan toggle (ON/OFF)</w:t>
             </w:r>
           </w:p>
         </w:tc>
       </w:tr>
     </w:tbl>
-    <w:p/>
+    <w:p>
+      <w:pPr>
+        <w:pStyle w:val="Normal"/>
+        <w:rPr/>
+      </w:pPr>
+      <w:r>
+        <w:rPr/>
+      </w:r>
+    </w:p>
     <w:p>
       <w:pPr>
         <w:pStyle w:val="normal1"/>
+        <w:rPr/>
       </w:pPr>
+      <w:r>
+        <w:rPr/>
+      </w:r>
     </w:p>
     <w:p>
       <w:pPr>
-        <w:spacing w:after="0" w:line="240" w:lineRule="auto"/>
+        <w:pStyle w:val="Normal"/>
+        <w:spacing w:lineRule="auto" w:line="240" w:before="0" w:after="0"/>
         <w:jc w:val="left"/>
+        <w:rPr/>
       </w:pPr>
+      <w:r>
+        <w:rPr/>
+      </w:r>
       <w:r>
         <w:br w:type="page"/>
       </w:r>
@@ -1045,7 +1457,9 @@
     <w:p>
       <w:pPr>
         <w:pStyle w:val="normal1"/>
+        <w:spacing w:before="0" w:after="160"/>
         <w:jc w:val="right"/>
+        <w:rPr/>
       </w:pPr>
       <w:r>
         <w:rPr>
@@ -1054,7 +1468,6 @@
           <w:sz w:val="28"/>
           <w:szCs w:val="28"/>
         </w:rPr>
-        <w:lastRenderedPageBreak/>
         <w:t>Phase: 3</w:t>
       </w:r>
     </w:p>
@@ -1062,6 +1475,7 @@
       <w:tblPr>
         <w:tblStyle w:val="TableNormal0"/>
         <w:tblW w:w="9350" w:type="dxa"/>
+        <w:jc w:val="left"/>
         <w:tblInd w:w="0" w:type="dxa"/>
         <w:tblLayout w:type="fixed"/>
         <w:tblCellMar>
@@ -1070,15 +1484,15 @@
           <w:bottom w:w="0" w:type="dxa"/>
           <w:right w:w="108" w:type="dxa"/>
         </w:tblCellMar>
-        <w:tblLook w:val="0400" w:firstRow="0" w:lastRow="0" w:firstColumn="0" w:lastColumn="0" w:noHBand="0" w:noVBand="1"/>
+        <w:tblLook w:val="0400" w:noHBand="0" w:noVBand="1" w:firstColumn="0" w:lastRow="0" w:lastColumn="0" w:firstRow="0"/>
       </w:tblPr>
       <w:tblGrid>
         <w:gridCol w:w="3955"/>
-        <w:gridCol w:w="5395"/>
+        <w:gridCol w:w="5394"/>
       </w:tblGrid>
       <w:tr>
         <w:trPr>
-          <w:trHeight w:val="530"/>
+          <w:trHeight w:val="530" w:hRule="atLeast"/>
         </w:trPr>
         <w:tc>
           <w:tcPr>
@@ -1094,6 +1508,9 @@
           <w:p>
             <w:pPr>
               <w:pStyle w:val="normal1"/>
+              <w:widowControl/>
+              <w:suppressAutoHyphens w:val="true"/>
+              <w:spacing w:before="0" w:after="160"/>
               <w:jc w:val="center"/>
               <w:rPr>
                 <w:b/>
@@ -1104,10 +1521,13 @@
             </w:pPr>
             <w:r>
               <w:rPr>
-                <w:b/>
-                <w:bCs/>
+                <w:rFonts w:eastAsia="Calibri" w:cs="Calibri"/>
+                <w:b/>
+                <w:bCs/>
+                <w:kern w:val="0"/>
                 <w:sz w:val="32"/>
                 <w:szCs w:val="32"/>
+                <w:lang w:val="en-US" w:eastAsia="zh-CN" w:bidi="hi-IN"/>
               </w:rPr>
               <w:t>Student name</w:t>
             </w:r>
@@ -1127,6 +1547,9 @@
           <w:p>
             <w:pPr>
               <w:pStyle w:val="normal1"/>
+              <w:widowControl/>
+              <w:suppressAutoHyphens w:val="true"/>
+              <w:spacing w:before="0" w:after="160"/>
               <w:jc w:val="center"/>
               <w:rPr>
                 <w:b/>
@@ -1137,10 +1560,13 @@
             </w:pPr>
             <w:r>
               <w:rPr>
-                <w:b/>
-                <w:bCs/>
+                <w:rFonts w:eastAsia="Calibri" w:cs="Calibri"/>
+                <w:b/>
+                <w:bCs/>
+                <w:kern w:val="0"/>
                 <w:sz w:val="32"/>
                 <w:szCs w:val="32"/>
+                <w:lang w:val="en-US" w:eastAsia="zh-CN" w:bidi="hi-IN"/>
               </w:rPr>
               <w:t>Tasks and duties</w:t>
             </w:r>
@@ -1149,7 +1575,7 @@
       </w:tr>
       <w:tr>
         <w:trPr>
-          <w:trHeight w:val="1790"/>
+          <w:trHeight w:val="1790" w:hRule="atLeast"/>
         </w:trPr>
         <w:tc>
           <w:tcPr>
@@ -1165,6 +1591,9 @@
           <w:p>
             <w:pPr>
               <w:pStyle w:val="normal1"/>
+              <w:widowControl/>
+              <w:suppressAutoHyphens w:val="true"/>
+              <w:spacing w:before="0" w:after="160"/>
               <w:jc w:val="left"/>
               <w:rPr>
                 <w:b/>
@@ -1175,10 +1604,13 @@
             </w:pPr>
             <w:r>
               <w:rPr>
-                <w:b/>
-                <w:bCs/>
+                <w:rFonts w:eastAsia="Calibri" w:cs="Calibri"/>
+                <w:b/>
+                <w:bCs/>
+                <w:kern w:val="0"/>
                 <w:sz w:val="24"/>
                 <w:szCs w:val="24"/>
+                <w:lang w:val="en-US" w:eastAsia="zh-CN" w:bidi="hi-IN"/>
               </w:rPr>
               <w:t>#1 Jonathan Markovic</w:t>
             </w:r>
@@ -1197,68 +1629,175 @@
           <w:p>
             <w:pPr>
               <w:pStyle w:val="BodyText"/>
-              <w:spacing w:after="160"/>
-            </w:pPr>
-            <w:r>
+              <w:widowControl/>
+              <w:suppressAutoHyphens w:val="true"/>
+              <w:spacing w:before="0" w:after="160"/>
+              <w:rPr>
+                <w:rFonts w:ascii="Calibri" w:hAnsi="Calibri" w:eastAsia="Calibri" w:cs="Calibri"/>
+                <w:kern w:val="0"/>
+                <w:sz w:val="22"/>
+                <w:szCs w:val="22"/>
+                <w:lang w:val="en-US" w:eastAsia="zh-CN" w:bidi="hi-IN"/>
+              </w:rPr>
+            </w:pPr>
+            <w:r>
+              <w:rPr>
+                <w:rFonts w:eastAsia="Calibri" w:cs="Calibri"/>
+                <w:kern w:val="0"/>
+                <w:sz w:val="22"/>
+                <w:szCs w:val="22"/>
+                <w:lang w:val="en-US" w:eastAsia="zh-CN" w:bidi="hi-IN"/>
+              </w:rPr>
               <w:t>Worked on RFID scanner implementation</w:t>
             </w:r>
           </w:p>
           <w:p>
             <w:pPr>
               <w:pStyle w:val="BodyText"/>
-              <w:spacing w:after="160"/>
-            </w:pPr>
-            <w:r>
+              <w:widowControl/>
+              <w:suppressAutoHyphens w:val="true"/>
+              <w:spacing w:before="0" w:after="160"/>
+              <w:rPr>
+                <w:rFonts w:ascii="Calibri" w:hAnsi="Calibri" w:eastAsia="Calibri" w:cs="Calibri"/>
+                <w:kern w:val="0"/>
+                <w:sz w:val="22"/>
+                <w:szCs w:val="22"/>
+                <w:lang w:val="en-US" w:eastAsia="zh-CN" w:bidi="hi-IN"/>
+              </w:rPr>
+            </w:pPr>
+            <w:r>
+              <w:rPr>
+                <w:rFonts w:eastAsia="Calibri" w:cs="Calibri"/>
+                <w:kern w:val="0"/>
+                <w:sz w:val="22"/>
+                <w:szCs w:val="22"/>
+                <w:lang w:val="en-US" w:eastAsia="zh-CN" w:bidi="hi-IN"/>
+              </w:rPr>
               <w:t>Worked on Barcode scanner implementation</w:t>
             </w:r>
           </w:p>
           <w:p>
             <w:pPr>
               <w:pStyle w:val="BodyText"/>
-              <w:spacing w:after="160"/>
-            </w:pPr>
-            <w:r>
+              <w:widowControl/>
+              <w:suppressAutoHyphens w:val="true"/>
+              <w:spacing w:before="0" w:after="160"/>
+              <w:rPr>
+                <w:rFonts w:ascii="Calibri" w:hAnsi="Calibri" w:eastAsia="Calibri" w:cs="Calibri"/>
+                <w:kern w:val="0"/>
+                <w:sz w:val="22"/>
+                <w:szCs w:val="22"/>
+                <w:lang w:val="en-US" w:eastAsia="zh-CN" w:bidi="hi-IN"/>
+              </w:rPr>
+            </w:pPr>
+            <w:r>
+              <w:rPr>
+                <w:rFonts w:eastAsia="Calibri" w:cs="Calibri"/>
+                <w:kern w:val="0"/>
+                <w:sz w:val="22"/>
+                <w:szCs w:val="22"/>
+                <w:lang w:val="en-US" w:eastAsia="zh-CN" w:bidi="hi-IN"/>
+              </w:rPr>
               <w:t>Created Checkout page</w:t>
             </w:r>
           </w:p>
           <w:p>
             <w:pPr>
               <w:pStyle w:val="BodyText"/>
-              <w:spacing w:after="160"/>
-            </w:pPr>
-            <w:r>
+              <w:widowControl/>
+              <w:suppressAutoHyphens w:val="true"/>
+              <w:spacing w:before="0" w:after="160"/>
+              <w:rPr>
+                <w:rFonts w:ascii="Calibri" w:hAnsi="Calibri" w:eastAsia="Calibri" w:cs="Calibri"/>
+                <w:kern w:val="0"/>
+                <w:sz w:val="22"/>
+                <w:szCs w:val="22"/>
+                <w:lang w:val="en-US" w:eastAsia="zh-CN" w:bidi="hi-IN"/>
+              </w:rPr>
+            </w:pPr>
+            <w:r>
+              <w:rPr>
+                <w:rFonts w:eastAsia="Calibri" w:cs="Calibri"/>
+                <w:kern w:val="0"/>
+                <w:sz w:val="22"/>
+                <w:szCs w:val="22"/>
+                <w:lang w:val="en-US" w:eastAsia="zh-CN" w:bidi="hi-IN"/>
+              </w:rPr>
               <w:t>Worked on cart and receipt functions</w:t>
             </w:r>
           </w:p>
           <w:p>
             <w:pPr>
               <w:pStyle w:val="BodyText"/>
-              <w:spacing w:after="160"/>
-            </w:pPr>
-            <w:r>
+              <w:widowControl/>
+              <w:suppressAutoHyphens w:val="true"/>
+              <w:spacing w:before="0" w:after="160"/>
+              <w:rPr>
+                <w:rFonts w:ascii="Calibri" w:hAnsi="Calibri" w:eastAsia="Calibri" w:cs="Calibri"/>
+                <w:kern w:val="0"/>
+                <w:sz w:val="22"/>
+                <w:szCs w:val="22"/>
+                <w:lang w:val="en-US" w:eastAsia="zh-CN" w:bidi="hi-IN"/>
+              </w:rPr>
+            </w:pPr>
+            <w:r>
+              <w:rPr>
+                <w:rFonts w:eastAsia="Calibri" w:cs="Calibri"/>
+                <w:kern w:val="0"/>
+                <w:sz w:val="22"/>
+                <w:szCs w:val="22"/>
+                <w:lang w:val="en-US" w:eastAsia="zh-CN" w:bidi="hi-IN"/>
+              </w:rPr>
               <w:t>Worked on sending email receipts</w:t>
             </w:r>
           </w:p>
           <w:p>
             <w:pPr>
               <w:pStyle w:val="BodyText"/>
-              <w:spacing w:after="160"/>
-            </w:pPr>
-            <w:proofErr w:type="gramStart"/>
-            <w:r>
-              <w:t>Helped</w:t>
-            </w:r>
-            <w:proofErr w:type="gramEnd"/>
-            <w:r>
-              <w:t xml:space="preserve"> with Login functionality</w:t>
+              <w:widowControl/>
+              <w:suppressAutoHyphens w:val="true"/>
+              <w:spacing w:before="0" w:after="160"/>
+              <w:rPr>
+                <w:rFonts w:ascii="Calibri" w:hAnsi="Calibri" w:eastAsia="Calibri" w:cs="Calibri"/>
+                <w:kern w:val="0"/>
+                <w:sz w:val="22"/>
+                <w:szCs w:val="22"/>
+                <w:lang w:val="en-US" w:eastAsia="zh-CN" w:bidi="hi-IN"/>
+              </w:rPr>
+            </w:pPr>
+            <w:r>
+              <w:rPr>
+                <w:rFonts w:eastAsia="Calibri" w:cs="Calibri"/>
+                <w:kern w:val="0"/>
+                <w:sz w:val="22"/>
+                <w:szCs w:val="22"/>
+                <w:lang w:val="en-US" w:eastAsia="zh-CN" w:bidi="hi-IN"/>
+              </w:rPr>
+              <w:t>Helped with Login functionality</w:t>
             </w:r>
           </w:p>
           <w:p>
             <w:pPr>
               <w:pStyle w:val="BodyText"/>
-              <w:spacing w:after="160"/>
-            </w:pPr>
-            <w:r>
+              <w:widowControl/>
+              <w:suppressAutoHyphens w:val="true"/>
+              <w:spacing w:before="0" w:after="160"/>
+              <w:rPr>
+                <w:rFonts w:ascii="Calibri" w:hAnsi="Calibri" w:eastAsia="Calibri" w:cs="Calibri"/>
+                <w:kern w:val="0"/>
+                <w:sz w:val="22"/>
+                <w:szCs w:val="22"/>
+                <w:lang w:val="en-US" w:eastAsia="zh-CN" w:bidi="hi-IN"/>
+              </w:rPr>
+            </w:pPr>
+            <w:r>
+              <w:rPr>
+                <w:rFonts w:eastAsia="Calibri" w:cs="Calibri"/>
+                <w:kern w:val="0"/>
+                <w:sz w:val="22"/>
+                <w:szCs w:val="22"/>
+                <w:lang w:val="en-US" w:eastAsia="zh-CN" w:bidi="hi-IN"/>
+              </w:rPr>
               <w:t>Helped with bug fixes</w:t>
             </w:r>
           </w:p>
@@ -1266,7 +1805,7 @@
       </w:tr>
       <w:tr>
         <w:trPr>
-          <w:trHeight w:val="1340"/>
+          <w:trHeight w:val="1340" w:hRule="atLeast"/>
         </w:trPr>
         <w:tc>
           <w:tcPr>
@@ -1282,6 +1821,9 @@
           <w:p>
             <w:pPr>
               <w:pStyle w:val="normal1"/>
+              <w:widowControl/>
+              <w:suppressAutoHyphens w:val="true"/>
+              <w:spacing w:before="0" w:after="160"/>
               <w:jc w:val="left"/>
               <w:rPr>
                 <w:b/>
@@ -1292,10 +1834,13 @@
             </w:pPr>
             <w:r>
               <w:rPr>
-                <w:b/>
-                <w:bCs/>
+                <w:rFonts w:eastAsia="Calibri" w:cs="Calibri"/>
+                <w:b/>
+                <w:bCs/>
+                <w:kern w:val="0"/>
                 <w:sz w:val="24"/>
                 <w:szCs w:val="24"/>
+                <w:lang w:val="en-US" w:eastAsia="zh-CN" w:bidi="hi-IN"/>
               </w:rPr>
               <w:t>#2 Meerab Khan</w:t>
             </w:r>
@@ -1314,36 +1859,100 @@
           <w:p>
             <w:pPr>
               <w:pStyle w:val="BodyText"/>
-              <w:spacing w:after="160"/>
-            </w:pPr>
-            <w:r>
+              <w:widowControl/>
+              <w:suppressAutoHyphens w:val="true"/>
+              <w:spacing w:before="0" w:after="160"/>
+              <w:rPr>
+                <w:rFonts w:ascii="Calibri" w:hAnsi="Calibri" w:eastAsia="Calibri" w:cs="Calibri"/>
+                <w:kern w:val="0"/>
+                <w:sz w:val="22"/>
+                <w:szCs w:val="22"/>
+                <w:lang w:val="en-US" w:eastAsia="zh-CN" w:bidi="hi-IN"/>
+              </w:rPr>
+            </w:pPr>
+            <w:r>
+              <w:rPr>
+                <w:rFonts w:eastAsia="Calibri" w:cs="Calibri"/>
+                <w:kern w:val="0"/>
+                <w:sz w:val="22"/>
+                <w:szCs w:val="22"/>
+                <w:lang w:val="en-US" w:eastAsia="zh-CN" w:bidi="hi-IN"/>
+              </w:rPr>
               <w:t>Designed the database.</w:t>
             </w:r>
           </w:p>
           <w:p>
             <w:pPr>
               <w:pStyle w:val="BodyText"/>
-              <w:spacing w:after="160"/>
-            </w:pPr>
-            <w:r>
+              <w:widowControl/>
+              <w:suppressAutoHyphens w:val="true"/>
+              <w:spacing w:before="0" w:after="160"/>
+              <w:rPr>
+                <w:rFonts w:ascii="Calibri" w:hAnsi="Calibri" w:eastAsia="Calibri" w:cs="Calibri"/>
+                <w:kern w:val="0"/>
+                <w:sz w:val="22"/>
+                <w:szCs w:val="22"/>
+                <w:lang w:val="en-US" w:eastAsia="zh-CN" w:bidi="hi-IN"/>
+              </w:rPr>
+            </w:pPr>
+            <w:r>
+              <w:rPr>
+                <w:rFonts w:eastAsia="Calibri" w:cs="Calibri"/>
+                <w:kern w:val="0"/>
+                <w:sz w:val="22"/>
+                <w:szCs w:val="22"/>
+                <w:lang w:val="en-US" w:eastAsia="zh-CN" w:bidi="hi-IN"/>
+              </w:rPr>
               <w:t>Implemented Admin side UI with back-end CRUD operations on products</w:t>
             </w:r>
           </w:p>
           <w:p>
             <w:pPr>
               <w:pStyle w:val="BodyText"/>
-              <w:spacing w:after="160"/>
-            </w:pPr>
-            <w:r>
+              <w:widowControl/>
+              <w:suppressAutoHyphens w:val="true"/>
+              <w:spacing w:before="0" w:after="160"/>
+              <w:rPr>
+                <w:rFonts w:ascii="Calibri" w:hAnsi="Calibri" w:eastAsia="Calibri" w:cs="Calibri"/>
+                <w:kern w:val="0"/>
+                <w:sz w:val="22"/>
+                <w:szCs w:val="22"/>
+                <w:lang w:val="en-US" w:eastAsia="zh-CN" w:bidi="hi-IN"/>
+              </w:rPr>
+            </w:pPr>
+            <w:r>
+              <w:rPr>
+                <w:rFonts w:eastAsia="Calibri" w:cs="Calibri"/>
+                <w:kern w:val="0"/>
+                <w:sz w:val="22"/>
+                <w:szCs w:val="22"/>
+                <w:lang w:val="en-US" w:eastAsia="zh-CN" w:bidi="hi-IN"/>
+              </w:rPr>
               <w:t>Fixed client registration back-end and helped in bug fixes</w:t>
             </w:r>
           </w:p>
           <w:p>
             <w:pPr>
               <w:pStyle w:val="BodyText"/>
-              <w:spacing w:after="160"/>
-            </w:pPr>
-            <w:r>
+              <w:widowControl/>
+              <w:suppressAutoHyphens w:val="true"/>
+              <w:spacing w:before="0" w:after="160"/>
+              <w:rPr>
+                <w:rFonts w:ascii="Calibri" w:hAnsi="Calibri" w:eastAsia="Calibri" w:cs="Calibri"/>
+                <w:kern w:val="0"/>
+                <w:sz w:val="22"/>
+                <w:szCs w:val="22"/>
+                <w:lang w:val="en-US" w:eastAsia="zh-CN" w:bidi="hi-IN"/>
+              </w:rPr>
+            </w:pPr>
+            <w:r>
+              <w:rPr>
+                <w:rFonts w:eastAsia="Calibri" w:cs="Calibri"/>
+                <w:kern w:val="0"/>
+                <w:sz w:val="22"/>
+                <w:szCs w:val="22"/>
+                <w:lang w:val="en-US" w:eastAsia="zh-CN" w:bidi="hi-IN"/>
+              </w:rPr>
               <w:t>Assisted in testing hardware, UI and database all together</w:t>
             </w:r>
           </w:p>
@@ -1351,7 +1960,7 @@
       </w:tr>
       <w:tr>
         <w:trPr>
-          <w:trHeight w:val="1430"/>
+          <w:trHeight w:val="1430" w:hRule="atLeast"/>
         </w:trPr>
         <w:tc>
           <w:tcPr>
@@ -1367,6 +1976,9 @@
           <w:p>
             <w:pPr>
               <w:pStyle w:val="normal1"/>
+              <w:widowControl/>
+              <w:suppressAutoHyphens w:val="true"/>
+              <w:spacing w:before="0" w:after="160"/>
               <w:jc w:val="left"/>
               <w:rPr>
                 <w:b/>
@@ -1377,10 +1989,13 @@
             </w:pPr>
             <w:r>
               <w:rPr>
-                <w:b/>
-                <w:bCs/>
+                <w:rFonts w:eastAsia="Calibri" w:cs="Calibri"/>
+                <w:b/>
+                <w:bCs/>
+                <w:kern w:val="0"/>
                 <w:sz w:val="24"/>
                 <w:szCs w:val="24"/>
+                <w:lang w:val="en-US" w:eastAsia="zh-CN" w:bidi="hi-IN"/>
               </w:rPr>
               <w:t>#3 Cheng Yu Yang</w:t>
             </w:r>
@@ -1399,75 +2014,170 @@
           <w:p>
             <w:pPr>
               <w:pStyle w:val="normal1"/>
-            </w:pPr>
-            <w:r>
+              <w:widowControl/>
+              <w:suppressAutoHyphens w:val="true"/>
+              <w:spacing w:before="0" w:after="160"/>
+              <w:rPr>
+                <w:rFonts w:ascii="Calibri" w:hAnsi="Calibri" w:eastAsia="Calibri" w:cs="Calibri"/>
+                <w:kern w:val="0"/>
+                <w:sz w:val="22"/>
+                <w:szCs w:val="22"/>
+                <w:lang w:val="en-US" w:eastAsia="zh-CN" w:bidi="hi-IN"/>
+              </w:rPr>
+            </w:pPr>
+            <w:r>
+              <w:rPr>
+                <w:rFonts w:eastAsia="Calibri" w:cs="Calibri"/>
+                <w:kern w:val="0"/>
+                <w:sz w:val="22"/>
+                <w:szCs w:val="22"/>
+                <w:lang w:val="en-US" w:eastAsia="zh-CN" w:bidi="hi-IN"/>
+              </w:rPr>
               <w:t>Make the code compatible with Windows to make future iterations easier to implement</w:t>
             </w:r>
           </w:p>
           <w:p>
             <w:pPr>
               <w:pStyle w:val="normal1"/>
-            </w:pPr>
-            <w:r>
+              <w:widowControl/>
+              <w:suppressAutoHyphens w:val="true"/>
+              <w:spacing w:before="0" w:after="160"/>
+              <w:rPr>
+                <w:rFonts w:ascii="Calibri" w:hAnsi="Calibri" w:eastAsia="Calibri" w:cs="Calibri"/>
+                <w:kern w:val="0"/>
+                <w:sz w:val="22"/>
+                <w:szCs w:val="22"/>
+                <w:lang w:val="en-US" w:eastAsia="zh-CN" w:bidi="hi-IN"/>
+              </w:rPr>
+            </w:pPr>
+            <w:r>
+              <w:rPr>
+                <w:rFonts w:eastAsia="Calibri" w:cs="Calibri"/>
+                <w:kern w:val="0"/>
+                <w:sz w:val="22"/>
+                <w:szCs w:val="22"/>
+                <w:lang w:val="en-US" w:eastAsia="zh-CN" w:bidi="hi-IN"/>
+              </w:rPr>
               <w:t>Create Client Login and Register UI</w:t>
             </w:r>
           </w:p>
           <w:p>
             <w:pPr>
               <w:pStyle w:val="normal1"/>
-            </w:pPr>
-            <w:r>
+              <w:widowControl/>
+              <w:suppressAutoHyphens w:val="true"/>
+              <w:spacing w:before="0" w:after="160"/>
+              <w:rPr>
+                <w:rFonts w:ascii="Calibri" w:hAnsi="Calibri" w:eastAsia="Calibri" w:cs="Calibri"/>
+                <w:kern w:val="0"/>
+                <w:sz w:val="22"/>
+                <w:szCs w:val="22"/>
+                <w:lang w:val="en-US" w:eastAsia="zh-CN" w:bidi="hi-IN"/>
+              </w:rPr>
+            </w:pPr>
+            <w:r>
+              <w:rPr>
+                <w:rFonts w:eastAsia="Calibri" w:cs="Calibri"/>
+                <w:kern w:val="0"/>
+                <w:sz w:val="22"/>
+                <w:szCs w:val="22"/>
+                <w:lang w:val="en-US" w:eastAsia="zh-CN" w:bidi="hi-IN"/>
+              </w:rPr>
               <w:t>Optimize Flask HTML template structure using extends and Jinja2 blocks</w:t>
             </w:r>
           </w:p>
         </w:tc>
       </w:tr>
     </w:tbl>
-    <w:p/>
     <w:p>
       <w:pPr>
-        <w:pStyle w:val="normal1"/>
+        <w:pStyle w:val="Normal"/>
+        <w:rPr/>
       </w:pPr>
+      <w:r>
+        <w:rPr/>
+      </w:r>
     </w:p>
     <w:p>
       <w:pPr>
         <w:pStyle w:val="normal1"/>
+        <w:rPr/>
       </w:pPr>
+      <w:r>
+        <w:rPr/>
+      </w:r>
     </w:p>
     <w:p>
       <w:pPr>
         <w:pStyle w:val="normal1"/>
+        <w:rPr/>
       </w:pPr>
+      <w:r>
+        <w:rPr/>
+      </w:r>
     </w:p>
     <w:p>
       <w:pPr>
         <w:pStyle w:val="normal1"/>
+        <w:rPr/>
       </w:pPr>
+      <w:r>
+        <w:rPr/>
+      </w:r>
     </w:p>
     <w:p>
       <w:pPr>
         <w:pStyle w:val="normal1"/>
+        <w:rPr/>
       </w:pPr>
+      <w:r>
+        <w:rPr/>
+      </w:r>
     </w:p>
     <w:p>
       <w:pPr>
         <w:pStyle w:val="normal1"/>
+        <w:rPr/>
       </w:pPr>
+      <w:r>
+        <w:rPr/>
+      </w:r>
     </w:p>
     <w:p>
       <w:pPr>
         <w:pStyle w:val="normal1"/>
+        <w:rPr/>
       </w:pPr>
+      <w:r>
+        <w:rPr/>
+      </w:r>
     </w:p>
     <w:p>
       <w:pPr>
         <w:pStyle w:val="normal1"/>
+        <w:rPr/>
       </w:pPr>
+      <w:r>
+        <w:rPr/>
+      </w:r>
     </w:p>
     <w:p>
       <w:pPr>
         <w:pStyle w:val="normal1"/>
+        <w:rPr/>
       </w:pPr>
+      <w:r>
+        <w:rPr/>
+      </w:r>
+    </w:p>
+    <w:p>
+      <w:pPr>
+        <w:pStyle w:val="normal1"/>
+        <w:rPr/>
+      </w:pPr>
+      <w:r>
+        <w:rPr/>
+      </w:r>
       <w:r>
         <w:br w:type="page"/>
       </w:r>
@@ -1475,7 +2185,9 @@
     <w:p>
       <w:pPr>
         <w:pStyle w:val="normal1"/>
+        <w:spacing w:before="0" w:after="160"/>
         <w:jc w:val="right"/>
+        <w:rPr/>
       </w:pPr>
       <w:r>
         <w:rPr>
@@ -1484,7 +2196,6 @@
           <w:sz w:val="28"/>
           <w:szCs w:val="28"/>
         </w:rPr>
-        <w:lastRenderedPageBreak/>
         <w:t>Phase: 4</w:t>
       </w:r>
     </w:p>
@@ -1492,6 +2203,7 @@
       <w:tblPr>
         <w:tblStyle w:val="TableNormal0"/>
         <w:tblW w:w="9350" w:type="dxa"/>
+        <w:jc w:val="left"/>
         <w:tblInd w:w="0" w:type="dxa"/>
         <w:tblLayout w:type="fixed"/>
         <w:tblCellMar>
@@ -1500,15 +2212,15 @@
           <w:bottom w:w="0" w:type="dxa"/>
           <w:right w:w="108" w:type="dxa"/>
         </w:tblCellMar>
-        <w:tblLook w:val="0400" w:firstRow="0" w:lastRow="0" w:firstColumn="0" w:lastColumn="0" w:noHBand="0" w:noVBand="1"/>
+        <w:tblLook w:val="0400" w:noHBand="0" w:noVBand="1" w:firstColumn="0" w:lastRow="0" w:lastColumn="0" w:firstRow="0"/>
       </w:tblPr>
       <w:tblGrid>
         <w:gridCol w:w="3955"/>
-        <w:gridCol w:w="5395"/>
+        <w:gridCol w:w="5394"/>
       </w:tblGrid>
       <w:tr>
         <w:trPr>
-          <w:trHeight w:val="530"/>
+          <w:trHeight w:val="530" w:hRule="atLeast"/>
         </w:trPr>
         <w:tc>
           <w:tcPr>
@@ -1524,6 +2236,9 @@
           <w:p>
             <w:pPr>
               <w:pStyle w:val="normal1"/>
+              <w:widowControl/>
+              <w:suppressAutoHyphens w:val="true"/>
+              <w:spacing w:before="0" w:after="160"/>
               <w:jc w:val="center"/>
               <w:rPr>
                 <w:b/>
@@ -1534,10 +2249,13 @@
             </w:pPr>
             <w:r>
               <w:rPr>
-                <w:b/>
-                <w:bCs/>
+                <w:rFonts w:eastAsia="Calibri" w:cs="Calibri"/>
+                <w:b/>
+                <w:bCs/>
+                <w:kern w:val="0"/>
                 <w:sz w:val="32"/>
                 <w:szCs w:val="32"/>
+                <w:lang w:val="en-US" w:eastAsia="zh-CN" w:bidi="hi-IN"/>
               </w:rPr>
               <w:t>Student name</w:t>
             </w:r>
@@ -1557,6 +2275,9 @@
           <w:p>
             <w:pPr>
               <w:pStyle w:val="normal1"/>
+              <w:widowControl/>
+              <w:suppressAutoHyphens w:val="true"/>
+              <w:spacing w:before="0" w:after="160"/>
               <w:jc w:val="center"/>
               <w:rPr>
                 <w:b/>
@@ -1567,10 +2288,13 @@
             </w:pPr>
             <w:r>
               <w:rPr>
-                <w:b/>
-                <w:bCs/>
+                <w:rFonts w:eastAsia="Calibri" w:cs="Calibri"/>
+                <w:b/>
+                <w:bCs/>
+                <w:kern w:val="0"/>
                 <w:sz w:val="32"/>
                 <w:szCs w:val="32"/>
+                <w:lang w:val="en-US" w:eastAsia="zh-CN" w:bidi="hi-IN"/>
               </w:rPr>
               <w:t>Tasks and duties</w:t>
             </w:r>
@@ -1579,7 +2303,7 @@
       </w:tr>
       <w:tr>
         <w:trPr>
-          <w:trHeight w:val="1790"/>
+          <w:trHeight w:val="1790" w:hRule="atLeast"/>
         </w:trPr>
         <w:tc>
           <w:tcPr>
@@ -1595,6 +2319,9 @@
           <w:p>
             <w:pPr>
               <w:pStyle w:val="normal1"/>
+              <w:widowControl/>
+              <w:suppressAutoHyphens w:val="true"/>
+              <w:spacing w:before="0" w:after="160"/>
               <w:jc w:val="left"/>
               <w:rPr>
                 <w:b/>
@@ -1605,10 +2332,13 @@
             </w:pPr>
             <w:r>
               <w:rPr>
-                <w:b/>
-                <w:bCs/>
+                <w:rFonts w:eastAsia="Calibri" w:cs="Calibri"/>
+                <w:b/>
+                <w:bCs/>
+                <w:kern w:val="0"/>
                 <w:sz w:val="24"/>
                 <w:szCs w:val="24"/>
+                <w:lang w:val="en-US" w:eastAsia="zh-CN" w:bidi="hi-IN"/>
               </w:rPr>
               <w:t>#1 Jonathan Markovic</w:t>
             </w:r>
@@ -1627,53 +2357,125 @@
           <w:p>
             <w:pPr>
               <w:pStyle w:val="BodyText"/>
-              <w:spacing w:after="160"/>
-            </w:pPr>
-            <w:r>
+              <w:widowControl/>
+              <w:suppressAutoHyphens w:val="true"/>
+              <w:spacing w:before="0" w:after="160"/>
+              <w:rPr>
+                <w:rFonts w:ascii="Calibri" w:hAnsi="Calibri" w:eastAsia="Calibri" w:cs="Calibri"/>
+                <w:kern w:val="0"/>
+                <w:sz w:val="22"/>
+                <w:szCs w:val="22"/>
+                <w:lang w:val="en-US" w:eastAsia="zh-CN" w:bidi="hi-IN"/>
+              </w:rPr>
+            </w:pPr>
+            <w:r>
+              <w:rPr>
+                <w:rFonts w:eastAsia="Calibri" w:cs="Calibri"/>
+                <w:kern w:val="0"/>
+                <w:sz w:val="22"/>
+                <w:szCs w:val="22"/>
+                <w:lang w:val="en-US" w:eastAsia="zh-CN" w:bidi="hi-IN"/>
+              </w:rPr>
               <w:t>Worked on implementation of previous phases.</w:t>
             </w:r>
           </w:p>
           <w:p>
             <w:pPr>
               <w:pStyle w:val="BodyText"/>
-              <w:spacing w:after="160"/>
-            </w:pPr>
-            <w:r>
+              <w:widowControl/>
+              <w:suppressAutoHyphens w:val="true"/>
+              <w:spacing w:before="0" w:after="160"/>
+              <w:rPr>
+                <w:rFonts w:ascii="Calibri" w:hAnsi="Calibri" w:eastAsia="Calibri" w:cs="Calibri"/>
+                <w:kern w:val="0"/>
+                <w:sz w:val="22"/>
+                <w:szCs w:val="22"/>
+                <w:lang w:val="en-US" w:eastAsia="zh-CN" w:bidi="hi-IN"/>
+              </w:rPr>
+            </w:pPr>
+            <w:r>
+              <w:rPr>
+                <w:rFonts w:eastAsia="Calibri" w:cs="Calibri"/>
+                <w:kern w:val="0"/>
+                <w:sz w:val="22"/>
+                <w:szCs w:val="22"/>
+                <w:lang w:val="en-US" w:eastAsia="zh-CN" w:bidi="hi-IN"/>
+              </w:rPr>
               <w:t>Added temperature gauges to fridges</w:t>
             </w:r>
           </w:p>
           <w:p>
             <w:pPr>
               <w:pStyle w:val="BodyText"/>
-              <w:spacing w:after="160"/>
-            </w:pPr>
-            <w:r>
+              <w:widowControl/>
+              <w:suppressAutoHyphens w:val="true"/>
+              <w:spacing w:before="0" w:after="160"/>
+              <w:rPr>
+                <w:rFonts w:ascii="Calibri" w:hAnsi="Calibri" w:eastAsia="Calibri" w:cs="Calibri"/>
+                <w:kern w:val="0"/>
+                <w:sz w:val="22"/>
+                <w:szCs w:val="22"/>
+                <w:lang w:val="en-US" w:eastAsia="zh-CN" w:bidi="hi-IN"/>
+              </w:rPr>
+            </w:pPr>
+            <w:r>
+              <w:rPr>
+                <w:rFonts w:eastAsia="Calibri" w:cs="Calibri"/>
+                <w:kern w:val="0"/>
+                <w:sz w:val="22"/>
+                <w:szCs w:val="22"/>
+                <w:lang w:val="en-US" w:eastAsia="zh-CN" w:bidi="hi-IN"/>
+              </w:rPr>
               <w:t>Fixed issue with motor code not working</w:t>
             </w:r>
           </w:p>
           <w:p>
             <w:pPr>
               <w:pStyle w:val="BodyText"/>
-              <w:spacing w:after="160"/>
-            </w:pPr>
-            <w:r>
-              <w:t xml:space="preserve">Added functionality for customers to search through purchase history for either </w:t>
-            </w:r>
-            <w:proofErr w:type="gramStart"/>
-            <w:r>
-              <w:t>a period of time</w:t>
-            </w:r>
-            <w:proofErr w:type="gramEnd"/>
-            <w:r>
-              <w:t xml:space="preserve"> and money spent or for a specific item with dates &amp; times of purchases</w:t>
+              <w:widowControl/>
+              <w:suppressAutoHyphens w:val="true"/>
+              <w:spacing w:before="0" w:after="160"/>
+              <w:rPr>
+                <w:rFonts w:ascii="Calibri" w:hAnsi="Calibri" w:eastAsia="Calibri" w:cs="Calibri"/>
+                <w:kern w:val="0"/>
+                <w:sz w:val="22"/>
+                <w:szCs w:val="22"/>
+                <w:lang w:val="en-US" w:eastAsia="zh-CN" w:bidi="hi-IN"/>
+              </w:rPr>
+            </w:pPr>
+            <w:r>
+              <w:rPr>
+                <w:rFonts w:eastAsia="Calibri" w:cs="Calibri"/>
+                <w:kern w:val="0"/>
+                <w:sz w:val="22"/>
+                <w:szCs w:val="22"/>
+                <w:lang w:val="en-US" w:eastAsia="zh-CN" w:bidi="hi-IN"/>
+              </w:rPr>
+              <w:t>Added functionality for customers to search through purchase history for either a period of time and money spent or for a specific item with dates &amp; times of purchases</w:t>
             </w:r>
           </w:p>
           <w:p>
             <w:pPr>
               <w:pStyle w:val="BodyText"/>
-              <w:spacing w:after="160"/>
-            </w:pPr>
-            <w:r>
+              <w:widowControl/>
+              <w:suppressAutoHyphens w:val="true"/>
+              <w:spacing w:before="0" w:after="160"/>
+              <w:rPr>
+                <w:rFonts w:ascii="Calibri" w:hAnsi="Calibri" w:eastAsia="Calibri" w:cs="Calibri"/>
+                <w:kern w:val="0"/>
+                <w:sz w:val="22"/>
+                <w:szCs w:val="22"/>
+                <w:lang w:val="en-US" w:eastAsia="zh-CN" w:bidi="hi-IN"/>
+              </w:rPr>
+            </w:pPr>
+            <w:r>
+              <w:rPr>
+                <w:rFonts w:eastAsia="Calibri" w:cs="Calibri"/>
+                <w:kern w:val="0"/>
+                <w:sz w:val="22"/>
+                <w:szCs w:val="22"/>
+                <w:lang w:val="en-US" w:eastAsia="zh-CN" w:bidi="hi-IN"/>
+              </w:rPr>
               <w:t>Implemented functionality for BLE sensor and integrated it into the fridges.html page</w:t>
             </w:r>
           </w:p>
@@ -1681,7 +2483,7 @@
       </w:tr>
       <w:tr>
         <w:trPr>
-          <w:trHeight w:val="1340"/>
+          <w:trHeight w:val="1340" w:hRule="atLeast"/>
         </w:trPr>
         <w:tc>
           <w:tcPr>
@@ -1697,6 +2499,9 @@
           <w:p>
             <w:pPr>
               <w:pStyle w:val="normal1"/>
+              <w:widowControl/>
+              <w:suppressAutoHyphens w:val="true"/>
+              <w:spacing w:before="0" w:after="160"/>
               <w:jc w:val="left"/>
               <w:rPr>
                 <w:b/>
@@ -1707,10 +2512,13 @@
             </w:pPr>
             <w:r>
               <w:rPr>
-                <w:b/>
-                <w:bCs/>
+                <w:rFonts w:eastAsia="Calibri" w:cs="Calibri"/>
+                <w:b/>
+                <w:bCs/>
+                <w:kern w:val="0"/>
                 <w:sz w:val="24"/>
                 <w:szCs w:val="24"/>
+                <w:lang w:val="en-US" w:eastAsia="zh-CN" w:bidi="hi-IN"/>
               </w:rPr>
               <w:t>#2 Meerab Khan</w:t>
             </w:r>
@@ -1729,32 +2537,133 @@
           <w:p>
             <w:pPr>
               <w:pStyle w:val="BodyText"/>
-              <w:spacing w:after="160"/>
-            </w:pPr>
-            <w:r>
-              <w:t xml:space="preserve">Worked on Database improvements </w:t>
+              <w:widowControl/>
+              <w:suppressAutoHyphens w:val="true"/>
+              <w:spacing w:before="0" w:after="160"/>
+              <w:rPr>
+                <w:rFonts w:ascii="Calibri" w:hAnsi="Calibri" w:eastAsia="Calibri" w:cs="Calibri"/>
+                <w:kern w:val="0"/>
+                <w:sz w:val="22"/>
+                <w:szCs w:val="22"/>
+                <w:lang w:val="en-US" w:eastAsia="zh-CN" w:bidi="hi-IN"/>
+              </w:rPr>
+            </w:pPr>
+            <w:r>
+              <w:rPr>
+                <w:rFonts w:eastAsia="Calibri" w:cs="Calibri"/>
+                <w:kern w:val="0"/>
+                <w:sz w:val="22"/>
+                <w:szCs w:val="22"/>
+                <w:lang w:val="en-US" w:eastAsia="zh-CN" w:bidi="hi-IN"/>
+              </w:rPr>
+              <w:t>Worked on Database improvements</w:t>
             </w:r>
           </w:p>
           <w:p>
             <w:pPr>
               <w:pStyle w:val="BodyText"/>
-              <w:spacing w:after="160"/>
-            </w:pPr>
-            <w:r>
+              <w:widowControl/>
+              <w:suppressAutoHyphens w:val="true"/>
+              <w:spacing w:before="0" w:after="160"/>
+              <w:rPr>
+                <w:rFonts w:ascii="Calibri" w:hAnsi="Calibri" w:eastAsia="Calibri" w:cs="Calibri"/>
+                <w:kern w:val="0"/>
+                <w:sz w:val="22"/>
+                <w:szCs w:val="22"/>
+                <w:lang w:val="en-US" w:eastAsia="zh-CN" w:bidi="hi-IN"/>
+              </w:rPr>
+            </w:pPr>
+            <w:r>
+              <w:rPr>
+                <w:rFonts w:eastAsia="Calibri" w:cs="Calibri"/>
+                <w:kern w:val="0"/>
+                <w:sz w:val="22"/>
+                <w:szCs w:val="22"/>
+                <w:lang w:val="en-US" w:eastAsia="zh-CN" w:bidi="hi-IN"/>
+              </w:rPr>
               <w:t>Added database implementation for inventory management</w:t>
             </w:r>
           </w:p>
           <w:p>
             <w:pPr>
               <w:pStyle w:val="BodyText"/>
-              <w:spacing w:after="160"/>
-            </w:pPr>
+              <w:widowControl/>
+              <w:suppressAutoHyphens w:val="true"/>
+              <w:spacing w:before="0" w:after="160"/>
+              <w:rPr>
+                <w:rFonts w:ascii="Calibri" w:hAnsi="Calibri" w:eastAsia="Calibri" w:cs="Calibri"/>
+                <w:kern w:val="0"/>
+                <w:sz w:val="22"/>
+                <w:szCs w:val="22"/>
+                <w:lang w:val="en-US" w:eastAsia="zh-CN" w:bidi="hi-IN"/>
+              </w:rPr>
+            </w:pPr>
+            <w:r>
+              <w:rPr>
+                <w:rFonts w:eastAsia="Calibri" w:cs="Calibri"/>
+                <w:kern w:val="0"/>
+                <w:sz w:val="22"/>
+                <w:szCs w:val="22"/>
+                <w:lang w:val="en-US" w:eastAsia="zh-CN" w:bidi="hi-IN"/>
+              </w:rPr>
+              <w:t>Checkout and Cart debugging with email</w:t>
+            </w:r>
+          </w:p>
+          <w:p>
+            <w:pPr>
+              <w:pStyle w:val="BodyText"/>
+              <w:widowControl/>
+              <w:suppressAutoHyphens w:val="true"/>
+              <w:spacing w:before="0" w:after="160"/>
+              <w:rPr>
+                <w:rFonts w:ascii="Calibri" w:hAnsi="Calibri" w:eastAsia="Calibri" w:cs="Calibri"/>
+                <w:kern w:val="0"/>
+                <w:sz w:val="22"/>
+                <w:szCs w:val="22"/>
+                <w:lang w:val="en-US" w:eastAsia="zh-CN" w:bidi="hi-IN"/>
+              </w:rPr>
+            </w:pPr>
+            <w:r>
+              <w:rPr>
+                <w:rFonts w:eastAsia="Calibri" w:cs="Calibri"/>
+                <w:kern w:val="0"/>
+                <w:sz w:val="22"/>
+                <w:szCs w:val="22"/>
+                <w:lang w:val="en-US" w:eastAsia="zh-CN" w:bidi="hi-IN"/>
+              </w:rPr>
+              <w:t>Added more constraints on CRUD with RFID debugging</w:t>
+            </w:r>
+          </w:p>
+          <w:p>
+            <w:pPr>
+              <w:pStyle w:val="BodyText"/>
+              <w:widowControl/>
+              <w:suppressAutoHyphens w:val="true"/>
+              <w:spacing w:before="0" w:after="160"/>
+              <w:rPr>
+                <w:rFonts w:ascii="Calibri" w:hAnsi="Calibri" w:eastAsia="Calibri" w:cs="Calibri"/>
+                <w:kern w:val="0"/>
+                <w:sz w:val="22"/>
+                <w:szCs w:val="22"/>
+                <w:lang w:val="en-US" w:eastAsia="zh-CN" w:bidi="hi-IN"/>
+              </w:rPr>
+            </w:pPr>
+            <w:r>
+              <w:rPr>
+                <w:rFonts w:eastAsia="Calibri" w:cs="Calibri"/>
+                <w:kern w:val="0"/>
+                <w:sz w:val="22"/>
+                <w:szCs w:val="22"/>
+                <w:lang w:val="en-US" w:eastAsia="zh-CN" w:bidi="hi-IN"/>
+              </w:rPr>
+              <w:t>Assisted in testing hardware, UI and database all together</w:t>
+            </w:r>
           </w:p>
         </w:tc>
       </w:tr>
       <w:tr>
         <w:trPr>
-          <w:trHeight w:val="1430"/>
+          <w:trHeight w:val="1430" w:hRule="atLeast"/>
         </w:trPr>
         <w:tc>
           <w:tcPr>
@@ -1770,6 +2679,9 @@
           <w:p>
             <w:pPr>
               <w:pStyle w:val="normal1"/>
+              <w:widowControl/>
+              <w:suppressAutoHyphens w:val="true"/>
+              <w:spacing w:before="0" w:after="160"/>
               <w:jc w:val="left"/>
               <w:rPr>
                 <w:b/>
@@ -1780,10 +2692,13 @@
             </w:pPr>
             <w:r>
               <w:rPr>
-                <w:b/>
-                <w:bCs/>
+                <w:rFonts w:eastAsia="Calibri" w:cs="Calibri"/>
+                <w:b/>
+                <w:bCs/>
+                <w:kern w:val="0"/>
                 <w:sz w:val="24"/>
                 <w:szCs w:val="24"/>
+                <w:lang w:val="en-US" w:eastAsia="zh-CN" w:bidi="hi-IN"/>
               </w:rPr>
               <w:t>#3 Cheng Yu Yang</w:t>
             </w:r>
@@ -1802,49 +2717,114 @@
           <w:p>
             <w:pPr>
               <w:pStyle w:val="normal1"/>
-            </w:pPr>
-            <w:r>
+              <w:widowControl/>
+              <w:suppressAutoHyphens w:val="true"/>
+              <w:spacing w:before="0" w:after="160"/>
+              <w:rPr>
+                <w:rFonts w:ascii="Calibri" w:hAnsi="Calibri" w:eastAsia="Calibri" w:cs="Calibri"/>
+                <w:kern w:val="0"/>
+                <w:sz w:val="22"/>
+                <w:szCs w:val="22"/>
+                <w:lang w:val="en-US" w:eastAsia="zh-CN" w:bidi="hi-IN"/>
+              </w:rPr>
+            </w:pPr>
+            <w:r>
+              <w:rPr>
+                <w:rFonts w:eastAsia="Calibri" w:cs="Calibri"/>
+                <w:kern w:val="0"/>
+                <w:sz w:val="22"/>
+                <w:szCs w:val="22"/>
+                <w:lang w:val="en-US" w:eastAsia="zh-CN" w:bidi="hi-IN"/>
+              </w:rPr>
               <w:t>Worked on client receipt history</w:t>
             </w:r>
           </w:p>
           <w:p>
             <w:pPr>
               <w:pStyle w:val="normal1"/>
-            </w:pPr>
-            <w:r>
+              <w:widowControl/>
+              <w:suppressAutoHyphens w:val="true"/>
+              <w:spacing w:before="0" w:after="160"/>
+              <w:rPr>
+                <w:rFonts w:ascii="Calibri" w:hAnsi="Calibri" w:eastAsia="Calibri" w:cs="Calibri"/>
+                <w:kern w:val="0"/>
+                <w:sz w:val="22"/>
+                <w:szCs w:val="22"/>
+                <w:lang w:val="en-US" w:eastAsia="zh-CN" w:bidi="hi-IN"/>
+              </w:rPr>
+            </w:pPr>
+            <w:r>
+              <w:rPr>
+                <w:rFonts w:eastAsia="Calibri" w:cs="Calibri"/>
+                <w:kern w:val="0"/>
+                <w:sz w:val="22"/>
+                <w:szCs w:val="22"/>
+                <w:lang w:val="en-US" w:eastAsia="zh-CN" w:bidi="hi-IN"/>
+              </w:rPr>
               <w:t>Worked on client receipt history downloads</w:t>
             </w:r>
           </w:p>
           <w:p>
             <w:pPr>
               <w:pStyle w:val="normal1"/>
-            </w:pPr>
-            <w:r>
+              <w:widowControl/>
+              <w:suppressAutoHyphens w:val="true"/>
+              <w:spacing w:before="0" w:after="160"/>
+              <w:rPr>
+                <w:rFonts w:ascii="Calibri" w:hAnsi="Calibri" w:eastAsia="Calibri" w:cs="Calibri"/>
+                <w:kern w:val="0"/>
+                <w:sz w:val="22"/>
+                <w:szCs w:val="22"/>
+                <w:lang w:val="en-US" w:eastAsia="zh-CN" w:bidi="hi-IN"/>
+              </w:rPr>
+            </w:pPr>
+            <w:r>
+              <w:rPr>
+                <w:rFonts w:eastAsia="Calibri" w:cs="Calibri"/>
+                <w:kern w:val="0"/>
+                <w:sz w:val="22"/>
+                <w:szCs w:val="22"/>
+                <w:lang w:val="en-US" w:eastAsia="zh-CN" w:bidi="hi-IN"/>
+              </w:rPr>
               <w:t>Worked on Admin report functionality</w:t>
             </w:r>
           </w:p>
         </w:tc>
       </w:tr>
     </w:tbl>
-    <w:p/>
+    <w:p>
+      <w:pPr>
+        <w:pStyle w:val="Normal"/>
+        <w:widowControl/>
+        <w:suppressAutoHyphens w:val="true"/>
+        <w:bidi w:val="0"/>
+        <w:spacing w:lineRule="auto" w:line="259" w:before="0" w:after="160"/>
+        <w:jc w:val="both"/>
+        <w:rPr/>
+      </w:pPr>
+      <w:r>
+        <w:rPr/>
+      </w:r>
+    </w:p>
     <w:sectPr>
+      <w:type w:val="nextPage"/>
       <w:pgSz w:w="12240" w:h="15840"/>
-      <w:pgMar w:top="1440" w:right="1440" w:bottom="1440" w:left="1440" w:header="0" w:footer="0" w:gutter="0"/>
-      <w:pgNumType w:start="1"/>
-      <w:cols w:space="720"/>
-      <w:formProt w:val="0"/>
-      <w:docGrid w:linePitch="100" w:charSpace="12288"/>
+      <w:pgMar w:left="1440" w:right="1440" w:gutter="0" w:header="0" w:top="1440" w:footer="0" w:bottom="1440"/>
+      <w:pgNumType w:start="1" w:fmt="decimal"/>
+      <w:formProt w:val="false"/>
+      <w:textDirection w:val="lrTb"/>
+      <w:docGrid w:type="default" w:linePitch="100" w:charSpace="16384"/>
     </w:sectPr>
   </w:body>
 </w:document>
 </file>
 
 <file path=word/styles.xml><?xml version="1.0" encoding="utf-8"?>
-<w:styles xmlns:mc="http://schemas.openxmlformats.org/markup-compatibility/2006" xmlns:r="http://schemas.openxmlformats.org/officeDocument/2006/relationships" xmlns:w="http://schemas.openxmlformats.org/wordprocessingml/2006/main" xmlns:w14="http://schemas.microsoft.com/office/word/2010/wordml" xmlns:w15="http://schemas.microsoft.com/office/word/2012/wordml" xmlns:w16cex="http://schemas.microsoft.com/office/word/2018/wordml/cex" xmlns:w16cid="http://schemas.microsoft.com/office/word/2016/wordml/cid" xmlns:w16="http://schemas.microsoft.com/office/word/2018/wordml" xmlns:w16du="http://schemas.microsoft.com/office/word/2023/wordml/word16du" xmlns:w16sdtdh="http://schemas.microsoft.com/office/word/2020/wordml/sdtdatahash" xmlns:w16sdtfl="http://schemas.microsoft.com/office/word/2024/wordml/sdtformatlock" xmlns:w16se="http://schemas.microsoft.com/office/word/2015/wordml/symex" mc:Ignorable="w14 w15 w16se w16cid w16 w16cex w16sdtdh w16sdtfl w16du">
+<w:styles xmlns:w="http://schemas.openxmlformats.org/wordprocessingml/2006/main" xmlns:w14="http://schemas.microsoft.com/office/word/2010/wordml" xmlns:mc="http://schemas.openxmlformats.org/markup-compatibility/2006" mc:Ignorable="w14">
   <w:docDefaults>
     <w:rPrDefault>
       <w:rPr>
-        <w:rFonts w:ascii="Calibri" w:eastAsia="Calibri" w:hAnsi="Calibri" w:cs="Calibri"/>
+        <w:rFonts w:ascii="Calibri" w:hAnsi="Calibri" w:eastAsia="Calibri" w:cs="Calibri"/>
         <w:sz w:val="22"/>
         <w:szCs w:val="22"/>
         <w:lang w:val="en-US" w:eastAsia="zh-CN" w:bidi="hi-IN"/>
@@ -1852,21 +2832,21 @@
     </w:rPrDefault>
     <w:pPrDefault>
       <w:pPr>
-        <w:suppressAutoHyphens/>
+        <w:suppressAutoHyphens w:val="true"/>
       </w:pPr>
     </w:pPrDefault>
   </w:docDefaults>
   <w:latentStyles w:defLockedState="0" w:defUIPriority="99" w:defSemiHidden="0" w:defUnhideWhenUsed="0" w:defQFormat="0" w:count="376">
     <w:lsdException w:name="Normal" w:uiPriority="0" w:qFormat="1"/>
     <w:lsdException w:name="heading 1" w:uiPriority="9" w:qFormat="1"/>
-    <w:lsdException w:name="heading 2" w:semiHidden="1" w:uiPriority="9" w:unhideWhenUsed="1" w:qFormat="1"/>
-    <w:lsdException w:name="heading 3" w:semiHidden="1" w:uiPriority="9" w:unhideWhenUsed="1" w:qFormat="1"/>
-    <w:lsdException w:name="heading 4" w:semiHidden="1" w:uiPriority="9" w:unhideWhenUsed="1" w:qFormat="1"/>
-    <w:lsdException w:name="heading 5" w:semiHidden="1" w:uiPriority="9" w:unhideWhenUsed="1" w:qFormat="1"/>
-    <w:lsdException w:name="heading 6" w:semiHidden="1" w:uiPriority="9" w:unhideWhenUsed="1" w:qFormat="1"/>
-    <w:lsdException w:name="heading 7" w:semiHidden="1" w:uiPriority="9" w:unhideWhenUsed="1" w:qFormat="1"/>
-    <w:lsdException w:name="heading 8" w:semiHidden="1" w:uiPriority="9" w:unhideWhenUsed="1" w:qFormat="1"/>
-    <w:lsdException w:name="heading 9" w:semiHidden="1" w:uiPriority="9" w:unhideWhenUsed="1" w:qFormat="1"/>
+    <w:lsdException w:name="heading 2" w:uiPriority="9" w:semiHidden="1" w:unhideWhenUsed="1" w:qFormat="1"/>
+    <w:lsdException w:name="heading 3" w:uiPriority="9" w:semiHidden="1" w:unhideWhenUsed="1" w:qFormat="1"/>
+    <w:lsdException w:name="heading 4" w:uiPriority="9" w:semiHidden="1" w:unhideWhenUsed="1" w:qFormat="1"/>
+    <w:lsdException w:name="heading 5" w:uiPriority="9" w:semiHidden="1" w:unhideWhenUsed="1" w:qFormat="1"/>
+    <w:lsdException w:name="heading 6" w:uiPriority="9" w:semiHidden="1" w:unhideWhenUsed="1" w:qFormat="1"/>
+    <w:lsdException w:name="heading 7" w:uiPriority="9" w:semiHidden="1" w:unhideWhenUsed="1" w:qFormat="1"/>
+    <w:lsdException w:name="heading 8" w:uiPriority="9" w:semiHidden="1" w:unhideWhenUsed="1" w:qFormat="1"/>
+    <w:lsdException w:name="heading 9" w:uiPriority="9" w:semiHidden="1" w:unhideWhenUsed="1" w:qFormat="1"/>
     <w:lsdException w:name="index 1" w:semiHidden="1" w:unhideWhenUsed="1"/>
     <w:lsdException w:name="index 2" w:semiHidden="1" w:unhideWhenUsed="1"/>
     <w:lsdException w:name="index 3" w:semiHidden="1" w:unhideWhenUsed="1"/>
@@ -1876,22 +2856,22 @@
     <w:lsdException w:name="index 7" w:semiHidden="1" w:unhideWhenUsed="1"/>
     <w:lsdException w:name="index 8" w:semiHidden="1" w:unhideWhenUsed="1"/>
     <w:lsdException w:name="index 9" w:semiHidden="1" w:unhideWhenUsed="1"/>
-    <w:lsdException w:name="toc 1" w:semiHidden="1" w:uiPriority="39" w:unhideWhenUsed="1"/>
-    <w:lsdException w:name="toc 2" w:semiHidden="1" w:uiPriority="39" w:unhideWhenUsed="1"/>
-    <w:lsdException w:name="toc 3" w:semiHidden="1" w:uiPriority="39" w:unhideWhenUsed="1"/>
-    <w:lsdException w:name="toc 4" w:semiHidden="1" w:uiPriority="39" w:unhideWhenUsed="1"/>
-    <w:lsdException w:name="toc 5" w:semiHidden="1" w:uiPriority="39" w:unhideWhenUsed="1"/>
-    <w:lsdException w:name="toc 6" w:semiHidden="1" w:uiPriority="39" w:unhideWhenUsed="1"/>
-    <w:lsdException w:name="toc 7" w:semiHidden="1" w:uiPriority="39" w:unhideWhenUsed="1"/>
-    <w:lsdException w:name="toc 8" w:semiHidden="1" w:uiPriority="39" w:unhideWhenUsed="1"/>
-    <w:lsdException w:name="toc 9" w:semiHidden="1" w:uiPriority="39" w:unhideWhenUsed="1"/>
+    <w:lsdException w:name="toc 1" w:uiPriority="39" w:semiHidden="1" w:unhideWhenUsed="1"/>
+    <w:lsdException w:name="toc 2" w:uiPriority="39" w:semiHidden="1" w:unhideWhenUsed="1"/>
+    <w:lsdException w:name="toc 3" w:uiPriority="39" w:semiHidden="1" w:unhideWhenUsed="1"/>
+    <w:lsdException w:name="toc 4" w:uiPriority="39" w:semiHidden="1" w:unhideWhenUsed="1"/>
+    <w:lsdException w:name="toc 5" w:uiPriority="39" w:semiHidden="1" w:unhideWhenUsed="1"/>
+    <w:lsdException w:name="toc 6" w:uiPriority="39" w:semiHidden="1" w:unhideWhenUsed="1"/>
+    <w:lsdException w:name="toc 7" w:uiPriority="39" w:semiHidden="1" w:unhideWhenUsed="1"/>
+    <w:lsdException w:name="toc 8" w:uiPriority="39" w:semiHidden="1" w:unhideWhenUsed="1"/>
+    <w:lsdException w:name="toc 9" w:uiPriority="39" w:semiHidden="1" w:unhideWhenUsed="1"/>
     <w:lsdException w:name="Normal Indent" w:semiHidden="1" w:unhideWhenUsed="1"/>
     <w:lsdException w:name="footnote text" w:semiHidden="1" w:unhideWhenUsed="1"/>
     <w:lsdException w:name="annotation text" w:semiHidden="1" w:unhideWhenUsed="1"/>
     <w:lsdException w:name="header" w:semiHidden="1" w:unhideWhenUsed="1"/>
     <w:lsdException w:name="footer" w:semiHidden="1" w:unhideWhenUsed="1"/>
     <w:lsdException w:name="index heading" w:semiHidden="1" w:unhideWhenUsed="1"/>
-    <w:lsdException w:name="caption" w:semiHidden="1" w:uiPriority="35" w:unhideWhenUsed="1" w:qFormat="1"/>
+    <w:lsdException w:name="caption" w:uiPriority="35" w:semiHidden="1" w:unhideWhenUsed="1" w:qFormat="1"/>
     <w:lsdException w:name="table of figures" w:semiHidden="1" w:unhideWhenUsed="1"/>
     <w:lsdException w:name="envelope address" w:semiHidden="1" w:unhideWhenUsed="1"/>
     <w:lsdException w:name="envelope return" w:semiHidden="1" w:unhideWhenUsed="1"/>
@@ -1922,7 +2902,7 @@
     <w:lsdException w:name="Title" w:uiPriority="10" w:qFormat="1"/>
     <w:lsdException w:name="Closing" w:semiHidden="1" w:unhideWhenUsed="1"/>
     <w:lsdException w:name="Signature" w:semiHidden="1" w:unhideWhenUsed="1"/>
-    <w:lsdException w:name="Default Paragraph Font" w:semiHidden="1" w:uiPriority="1" w:unhideWhenUsed="1"/>
+    <w:lsdException w:name="Default Paragraph Font" w:uiPriority="1" w:semiHidden="1" w:unhideWhenUsed="1"/>
     <w:lsdException w:name="Body Text" w:semiHidden="1" w:unhideWhenUsed="1"/>
     <w:lsdException w:name="Body Text Indent" w:semiHidden="1" w:unhideWhenUsed="1"/>
     <w:lsdException w:name="List Continue" w:semiHidden="1" w:unhideWhenUsed="1"/>
@@ -2122,8 +3102,8 @@
     <w:lsdException w:name="Subtle Reference" w:uiPriority="31" w:qFormat="1"/>
     <w:lsdException w:name="Intense Reference" w:uiPriority="32" w:qFormat="1"/>
     <w:lsdException w:name="Book Title" w:uiPriority="33" w:qFormat="1"/>
-    <w:lsdException w:name="Bibliography" w:semiHidden="1" w:uiPriority="37" w:unhideWhenUsed="1"/>
-    <w:lsdException w:name="TOC Heading" w:semiHidden="1" w:uiPriority="39" w:unhideWhenUsed="1" w:qFormat="1"/>
+    <w:lsdException w:name="Bibliography" w:uiPriority="37" w:semiHidden="1" w:unhideWhenUsed="1"/>
+    <w:lsdException w:name="TOC Heading" w:uiPriority="39" w:semiHidden="1" w:unhideWhenUsed="1" w:qFormat="1"/>
     <w:lsdException w:name="Plain Table 1" w:uiPriority="41"/>
     <w:lsdException w:name="Plain Table 2" w:uiPriority="42"/>
     <w:lsdException w:name="Plain Table 3" w:uiPriority="43"/>
@@ -2234,14 +3214,25 @@
     <w:lsdException w:name="Unresolved Mention" w:semiHidden="1" w:unhideWhenUsed="1"/>
     <w:lsdException w:name="Smart Link" w:semiHidden="1" w:unhideWhenUsed="1"/>
   </w:latentStyles>
-  <w:style w:type="paragraph" w:default="1" w:styleId="Normal">
+  <w:style w:type="paragraph" w:styleId="Normal" w:default="1">
     <w:name w:val="Normal"/>
     <w:qFormat/>
     <w:rsid w:val="00600128"/>
     <w:pPr>
-      <w:spacing w:after="160" w:line="259" w:lineRule="auto"/>
+      <w:widowControl/>
+      <w:suppressAutoHyphens w:val="true"/>
+      <w:bidi w:val="0"/>
+      <w:spacing w:lineRule="auto" w:line="259" w:before="0" w:after="160"/>
       <w:jc w:val="both"/>
     </w:pPr>
+    <w:rPr>
+      <w:rFonts w:ascii="Calibri" w:hAnsi="Calibri" w:eastAsia="Calibri" w:cs="Calibri"/>
+      <w:color w:val="auto"/>
+      <w:kern w:val="0"/>
+      <w:sz w:val="22"/>
+      <w:szCs w:val="22"/>
+      <w:lang w:val="en-US" w:eastAsia="zh-CN" w:bidi="hi-IN"/>
+    </w:rPr>
   </w:style>
   <w:style w:type="paragraph" w:styleId="Heading1">
     <w:name w:val="heading 1"/>
@@ -2250,9 +3241,9 @@
     <w:uiPriority w:val="9"/>
     <w:qFormat/>
     <w:pPr>
-      <w:keepNext/>
+      <w:keepNext w:val="true"/>
       <w:keepLines/>
-      <w:spacing w:before="480" w:after="120" w:line="240" w:lineRule="auto"/>
+      <w:spacing w:lineRule="auto" w:line="240" w:before="480" w:after="120"/>
       <w:outlineLvl w:val="0"/>
     </w:pPr>
     <w:rPr>
@@ -2271,9 +3262,9 @@
     <w:unhideWhenUsed/>
     <w:qFormat/>
     <w:pPr>
-      <w:keepNext/>
+      <w:keepNext w:val="true"/>
       <w:keepLines/>
-      <w:spacing w:before="360" w:after="80" w:line="240" w:lineRule="auto"/>
+      <w:spacing w:lineRule="auto" w:line="240" w:before="360" w:after="80"/>
       <w:outlineLvl w:val="1"/>
     </w:pPr>
     <w:rPr>
@@ -2292,9 +3283,9 @@
     <w:unhideWhenUsed/>
     <w:qFormat/>
     <w:pPr>
-      <w:keepNext/>
+      <w:keepNext w:val="true"/>
       <w:keepLines/>
-      <w:spacing w:before="280" w:after="80" w:line="240" w:lineRule="auto"/>
+      <w:spacing w:lineRule="auto" w:line="240" w:before="280" w:after="80"/>
       <w:outlineLvl w:val="2"/>
     </w:pPr>
     <w:rPr>
@@ -2313,9 +3304,9 @@
     <w:unhideWhenUsed/>
     <w:qFormat/>
     <w:pPr>
-      <w:keepNext/>
+      <w:keepNext w:val="true"/>
       <w:keepLines/>
-      <w:spacing w:before="240" w:after="40" w:line="240" w:lineRule="auto"/>
+      <w:spacing w:lineRule="auto" w:line="240" w:before="240" w:after="40"/>
       <w:outlineLvl w:val="3"/>
     </w:pPr>
     <w:rPr>
@@ -2334,9 +3325,9 @@
     <w:unhideWhenUsed/>
     <w:qFormat/>
     <w:pPr>
-      <w:keepNext/>
+      <w:keepNext w:val="true"/>
       <w:keepLines/>
-      <w:spacing w:before="220" w:after="40" w:line="240" w:lineRule="auto"/>
+      <w:spacing w:lineRule="auto" w:line="240" w:before="220" w:after="40"/>
       <w:outlineLvl w:val="4"/>
     </w:pPr>
     <w:rPr>
@@ -2353,9 +3344,9 @@
     <w:unhideWhenUsed/>
     <w:qFormat/>
     <w:pPr>
-      <w:keepNext/>
+      <w:keepNext w:val="true"/>
       <w:keepLines/>
-      <w:spacing w:before="200" w:after="40" w:line="240" w:lineRule="auto"/>
+      <w:spacing w:lineRule="auto" w:line="240" w:before="200" w:after="40"/>
       <w:outlineLvl w:val="5"/>
     </w:pPr>
     <w:rPr>
@@ -2365,58 +3356,39 @@
       <w:szCs w:val="20"/>
     </w:rPr>
   </w:style>
-  <w:style w:type="character" w:default="1" w:styleId="DefaultParagraphFont">
+  <w:style w:type="character" w:styleId="DefaultParagraphFont" w:default="1">
     <w:name w:val="Default Paragraph Font"/>
     <w:uiPriority w:val="1"/>
     <w:semiHidden/>
     <w:unhideWhenUsed/>
+    <w:qFormat/>
+    <w:rPr/>
   </w:style>
-  <w:style w:type="table" w:default="1" w:styleId="TableNormal">
-    <w:name w:val="Normal Table"/>
-    <w:uiPriority w:val="99"/>
-    <w:semiHidden/>
-    <w:unhideWhenUsed/>
-    <w:tblPr>
-      <w:tblInd w:w="0" w:type="dxa"/>
-      <w:tblCellMar>
-        <w:top w:w="0" w:type="dxa"/>
-        <w:left w:w="108" w:type="dxa"/>
-        <w:bottom w:w="0" w:type="dxa"/>
-        <w:right w:w="108" w:type="dxa"/>
-      </w:tblCellMar>
-    </w:tblPr>
-  </w:style>
-  <w:style w:type="numbering" w:default="1" w:styleId="NoList">
-    <w:name w:val="No List"/>
-    <w:uiPriority w:val="99"/>
-    <w:semiHidden/>
-    <w:unhideWhenUsed/>
-  </w:style>
-  <w:style w:type="character" w:customStyle="1" w:styleId="Bulletsuser">
-    <w:name w:val="Bullets (user)"/>
+  <w:style w:type="character" w:styleId="Bullets" w:customStyle="1">
+    <w:name w:val="Bullets"/>
     <w:qFormat/>
     <w:rPr>
-      <w:rFonts w:ascii="OpenSymbol" w:eastAsia="OpenSymbol" w:hAnsi="OpenSymbol" w:cs="OpenSymbol"/>
+      <w:rFonts w:ascii="OpenSymbol" w:hAnsi="OpenSymbol" w:eastAsia="OpenSymbol" w:cs="OpenSymbol"/>
     </w:rPr>
   </w:style>
-  <w:style w:type="character" w:customStyle="1" w:styleId="BodyTextChar">
+  <w:style w:type="character" w:styleId="BodyTextChar" w:customStyle="1">
     <w:name w:val="Body Text Char"/>
     <w:basedOn w:val="DefaultParagraphFont"/>
-    <w:link w:val="BodyText"/>
     <w:qFormat/>
     <w:rsid w:val="00600128"/>
+    <w:rPr/>
   </w:style>
-  <w:style w:type="paragraph" w:customStyle="1" w:styleId="Heading">
+  <w:style w:type="paragraph" w:styleId="Heading" w:customStyle="1">
     <w:name w:val="Heading"/>
     <w:basedOn w:val="Normal"/>
     <w:next w:val="BodyText"/>
     <w:qFormat/>
     <w:pPr>
-      <w:keepNext/>
+      <w:keepNext w:val="true"/>
       <w:spacing w:before="240" w:after="120"/>
     </w:pPr>
     <w:rPr>
-      <w:rFonts w:ascii="Liberation Sans" w:eastAsia="Noto Sans" w:hAnsi="Liberation Sans" w:cs="FreeSans"/>
+      <w:rFonts w:ascii="Liberation Sans" w:hAnsi="Liberation Sans" w:eastAsia="Noto Sans" w:cs="FreeSans"/>
       <w:sz w:val="28"/>
       <w:szCs w:val="28"/>
     </w:rPr>
@@ -2426,12 +3398,14 @@
     <w:basedOn w:val="Normal"/>
     <w:link w:val="BodyTextChar"/>
     <w:pPr>
-      <w:spacing w:after="140" w:line="276" w:lineRule="auto"/>
+      <w:spacing w:lineRule="auto" w:line="276" w:before="0" w:after="140"/>
     </w:pPr>
+    <w:rPr/>
   </w:style>
   <w:style w:type="paragraph" w:styleId="List">
     <w:name w:val="List"/>
     <w:basedOn w:val="BodyText"/>
+    <w:pPr/>
     <w:rPr>
       <w:rFonts w:cs="FreeSans"/>
     </w:rPr>
@@ -2452,7 +3426,7 @@
       <w:szCs w:val="24"/>
     </w:rPr>
   </w:style>
-  <w:style w:type="paragraph" w:customStyle="1" w:styleId="Index">
+  <w:style w:type="paragraph" w:styleId="Index" w:customStyle="1">
     <w:name w:val="Index"/>
     <w:basedOn w:val="Normal"/>
     <w:qFormat/>
@@ -2463,13 +3437,24 @@
       <w:rFonts w:cs="FreeSans"/>
     </w:rPr>
   </w:style>
-  <w:style w:type="paragraph" w:customStyle="1" w:styleId="normal1">
+  <w:style w:type="paragraph" w:styleId="normal1" w:customStyle="1">
     <w:name w:val="normal1"/>
     <w:qFormat/>
     <w:pPr>
-      <w:spacing w:after="160" w:line="259" w:lineRule="auto"/>
+      <w:widowControl/>
+      <w:suppressAutoHyphens w:val="true"/>
+      <w:bidi w:val="0"/>
+      <w:spacing w:lineRule="auto" w:line="259" w:before="0" w:after="160"/>
       <w:jc w:val="both"/>
     </w:pPr>
+    <w:rPr>
+      <w:rFonts w:ascii="Calibri" w:hAnsi="Calibri" w:eastAsia="Calibri" w:cs="Calibri"/>
+      <w:color w:val="auto"/>
+      <w:kern w:val="0"/>
+      <w:sz w:val="22"/>
+      <w:szCs w:val="22"/>
+      <w:lang w:val="en-US" w:eastAsia="zh-CN" w:bidi="hi-IN"/>
+    </w:rPr>
   </w:style>
   <w:style w:type="paragraph" w:styleId="Title">
     <w:name w:val="Title"/>
@@ -2478,9 +3463,9 @@
     <w:uiPriority w:val="10"/>
     <w:qFormat/>
     <w:pPr>
-      <w:keepNext/>
+      <w:keepNext w:val="true"/>
       <w:keepLines/>
-      <w:spacing w:before="480" w:after="120" w:line="240" w:lineRule="auto"/>
+      <w:spacing w:lineRule="auto" w:line="240" w:before="480" w:after="120"/>
     </w:pPr>
     <w:rPr>
       <w:b/>
@@ -2496,12 +3481,12 @@
     <w:uiPriority w:val="11"/>
     <w:qFormat/>
     <w:pPr>
-      <w:keepNext/>
+      <w:keepNext w:val="true"/>
       <w:keepLines/>
-      <w:spacing w:before="360" w:after="80" w:line="240" w:lineRule="auto"/>
+      <w:spacing w:lineRule="auto" w:line="240" w:before="360" w:after="80"/>
     </w:pPr>
     <w:rPr>
-      <w:rFonts w:ascii="Georgia" w:eastAsia="Georgia" w:hAnsi="Georgia" w:cs="Georgia"/>
+      <w:rFonts w:ascii="Georgia" w:hAnsi="Georgia" w:eastAsia="Georgia" w:cs="Georgia"/>
       <w:i/>
       <w:iCs/>
       <w:color w:val="666666"/>
@@ -2509,16 +3494,17 @@
       <w:szCs w:val="48"/>
     </w:rPr>
   </w:style>
-  <w:style w:type="paragraph" w:customStyle="1" w:styleId="TableContents">
+  <w:style w:type="paragraph" w:styleId="TableContents" w:customStyle="1">
     <w:name w:val="Table Contents"/>
     <w:basedOn w:val="Normal"/>
     <w:qFormat/>
     <w:pPr>
-      <w:widowControl w:val="0"/>
+      <w:widowControl w:val="false"/>
       <w:suppressLineNumbers/>
     </w:pPr>
+    <w:rPr/>
   </w:style>
-  <w:style w:type="paragraph" w:customStyle="1" w:styleId="TableHeading">
+  <w:style w:type="paragraph" w:styleId="TableHeading" w:customStyle="1">
     <w:name w:val="Table Heading"/>
     <w:basedOn w:val="TableContents"/>
     <w:qFormat/>
@@ -2529,6 +3515,27 @@
       <w:b/>
       <w:bCs/>
     </w:rPr>
+  </w:style>
+  <w:style w:type="numbering" w:styleId="NoList" w:default="1">
+    <w:name w:val="No List"/>
+    <w:uiPriority w:val="99"/>
+    <w:semiHidden/>
+    <w:unhideWhenUsed/>
+    <w:qFormat/>
+  </w:style>
+  <w:style w:type="table" w:default="1" w:styleId="TableNormal">
+    <w:name w:val="Normal Table"/>
+    <w:uiPriority w:val="99"/>
+    <w:semiHidden/>
+    <w:unhideWhenUsed/>
+    <w:tblPr>
+      <w:tblCellMar>
+        <w:top w:w="0" w:type="dxa"/>
+        <w:left w:w="108" w:type="dxa"/>
+        <w:bottom w:w="0" w:type="dxa"/>
+        <w:right w:w="108" w:type="dxa"/>
+      </w:tblCellMar>
+    </w:tblPr>
   </w:style>
   <w:style w:type="table" w:customStyle="1" w:styleId="TableNormal0">
     <w:name w:val="TableNormal"/>
@@ -2545,41 +3552,41 @@
 </file>
 
 <file path=word/theme/theme1.xml><?xml version="1.0" encoding="utf-8"?>
-<a:theme xmlns:a="http://schemas.openxmlformats.org/drawingml/2006/main" name="Office Theme">
+<a:theme xmlns:a="http://schemas.openxmlformats.org/drawingml/2006/main" xmlns:r="http://schemas.openxmlformats.org/officeDocument/2006/relationships" name="Office Theme">
   <a:themeElements>
     <a:clrScheme name="Office">
       <a:dk1>
         <a:srgbClr val="000000"/>
       </a:dk1>
       <a:lt1>
-        <a:srgbClr val="FFFFFF"/>
+        <a:srgbClr val="ffffff"/>
       </a:lt1>
       <a:dk2>
-        <a:srgbClr val="1F497D"/>
+        <a:srgbClr val="1f497d"/>
       </a:dk2>
       <a:lt2>
-        <a:srgbClr val="EEECE1"/>
+        <a:srgbClr val="eeece1"/>
       </a:lt2>
       <a:accent1>
-        <a:srgbClr val="4F81BD"/>
+        <a:srgbClr val="4f81bd"/>
       </a:accent1>
       <a:accent2>
-        <a:srgbClr val="C0504D"/>
+        <a:srgbClr val="c0504d"/>
       </a:accent2>
       <a:accent3>
-        <a:srgbClr val="9BBB59"/>
+        <a:srgbClr val="9bbb59"/>
       </a:accent3>
       <a:accent4>
-        <a:srgbClr val="8064A2"/>
+        <a:srgbClr val="8064a2"/>
       </a:accent4>
       <a:accent5>
-        <a:srgbClr val="4BACC6"/>
+        <a:srgbClr val="4bacc6"/>
       </a:accent5>
       <a:accent6>
-        <a:srgbClr val="F79646"/>
+        <a:srgbClr val="f79646"/>
       </a:accent6>
       <a:hlink>
-        <a:srgbClr val="0000FF"/>
+        <a:srgbClr val="0000ff"/>
       </a:hlink>
       <a:folHlink>
         <a:srgbClr val="800080"/>
@@ -2587,12 +3594,12 @@
     </a:clrScheme>
     <a:fontScheme name="Office">
       <a:majorFont>
-        <a:latin typeface="Calibri"/>
+        <a:latin typeface="Calibri" pitchFamily="0" charset="1"/>
         <a:ea typeface=""/>
         <a:cs typeface=""/>
       </a:majorFont>
       <a:minorFont>
-        <a:latin typeface="Cambria"/>
+        <a:latin typeface="Cambria" pitchFamily="0" charset="1"/>
         <a:ea typeface=""/>
         <a:cs typeface=""/>
       </a:minorFont>
@@ -2621,7 +3628,7 @@
             </a:gs>
           </a:gsLst>
           <a:lin ang="16200000" scaled="1"/>
-          <a:tileRect/>
+          <a:tileRect l="0" t="0" r="0" b="0"/>
         </a:gradFill>
         <a:gradFill>
           <a:gsLst>
@@ -2639,7 +3646,7 @@
             </a:gs>
           </a:gsLst>
           <a:lin ang="16200000" scaled="0"/>
-          <a:tileRect/>
+          <a:tileRect l="0" t="0" r="0" b="0"/>
         </a:gradFill>
       </a:fillStyleLst>
       <a:lnStyleLst>
@@ -2690,7 +3697,7 @@
           <a:path path="circle">
             <a:fillToRect l="50000" t="-80000" r="50000" b="180000"/>
           </a:path>
-          <a:tileRect/>
+          <a:tileRect l="0" t="0" r="0" b="0"/>
         </a:gradFill>
         <a:gradFill>
           <a:gsLst>
@@ -2708,12 +3715,10 @@
           <a:path path="circle">
             <a:fillToRect l="50000" t="50000" r="50000" b="50000"/>
           </a:path>
-          <a:tileRect/>
+          <a:tileRect l="0" t="0" r="0" b="0"/>
         </a:gradFill>
       </a:bgFillStyleLst>
     </a:fmtScheme>
   </a:themeElements>
-  <a:objectDefaults/>
-  <a:extraClrSchemeLst/>
 </a:theme>
 </file>
</xml_diff>

<commit_message>
Added to tasks/changed admin sales report
</commit_message>
<xml_diff>
--- a/Team-Tasks/TasksReport.docx
+++ b/Team-Tasks/TasksReport.docx
@@ -2787,6 +2787,56 @@
                 <w:lang w:val="en-US" w:eastAsia="zh-CN" w:bidi="hi-IN"/>
               </w:rPr>
               <w:t>Worked on Admin report functionality</w:t>
+            </w:r>
+          </w:p>
+          <w:p>
+            <w:pPr>
+              <w:pStyle w:val="normal1"/>
+              <w:widowControl/>
+              <w:suppressAutoHyphens w:val="true"/>
+              <w:spacing w:before="0" w:after="160"/>
+              <w:rPr>
+                <w:rFonts w:ascii="Calibri" w:hAnsi="Calibri" w:eastAsia="Calibri" w:cs="Calibri"/>
+                <w:kern w:val="0"/>
+                <w:sz w:val="22"/>
+                <w:szCs w:val="22"/>
+                <w:lang w:val="en-US" w:eastAsia="zh-CN" w:bidi="hi-IN"/>
+              </w:rPr>
+            </w:pPr>
+            <w:r>
+              <w:rPr>
+                <w:rFonts w:eastAsia="Calibri" w:cs="Calibri"/>
+                <w:kern w:val="0"/>
+                <w:sz w:val="22"/>
+                <w:szCs w:val="22"/>
+                <w:lang w:val="en-US" w:eastAsia="zh-CN" w:bidi="hi-IN"/>
+              </w:rPr>
+              <w:t>Worked on Admin report downloads</w:t>
+            </w:r>
+          </w:p>
+          <w:p>
+            <w:pPr>
+              <w:pStyle w:val="normal1"/>
+              <w:widowControl/>
+              <w:suppressAutoHyphens w:val="true"/>
+              <w:spacing w:before="0" w:after="160"/>
+              <w:rPr>
+                <w:rFonts w:ascii="Calibri" w:hAnsi="Calibri" w:eastAsia="Calibri" w:cs="Calibri"/>
+                <w:kern w:val="0"/>
+                <w:sz w:val="22"/>
+                <w:szCs w:val="22"/>
+                <w:lang w:val="en-US" w:eastAsia="zh-CN" w:bidi="hi-IN"/>
+              </w:rPr>
+            </w:pPr>
+            <w:r>
+              <w:rPr>
+                <w:rFonts w:eastAsia="Calibri" w:cs="Calibri"/>
+                <w:kern w:val="0"/>
+                <w:sz w:val="22"/>
+                <w:szCs w:val="22"/>
+                <w:lang w:val="en-US" w:eastAsia="zh-CN" w:bidi="hi-IN"/>
+              </w:rPr>
+              <w:t>Database methods for admin reports</w:t>
             </w:r>
           </w:p>
         </w:tc>
@@ -3364,8 +3414,8 @@
     <w:qFormat/>
     <w:rPr/>
   </w:style>
-  <w:style w:type="character" w:styleId="Bullets" w:customStyle="1">
-    <w:name w:val="Bullets"/>
+  <w:style w:type="character" w:styleId="Bulletsuser" w:customStyle="1">
+    <w:name w:val="Bullets (user)"/>
     <w:qFormat/>
     <w:rPr>
       <w:rFonts w:ascii="OpenSymbol" w:hAnsi="OpenSymbol" w:eastAsia="OpenSymbol" w:cs="OpenSymbol"/>

</xml_diff>

<commit_message>
Updates, and Bug fixes
Added inventory Email alerts when stock is below threshold
</commit_message>
<xml_diff>
--- a/Team-Tasks/TasksReport.docx
+++ b/Team-Tasks/TasksReport.docx
@@ -2479,6 +2479,31 @@
               <w:t>Implemented functionality for BLE sensor and integrated it into the fridges.html page</w:t>
             </w:r>
           </w:p>
+          <w:p>
+            <w:pPr>
+              <w:pStyle w:val="BodyText"/>
+              <w:widowControl/>
+              <w:suppressAutoHyphens w:val="true"/>
+              <w:spacing w:before="0" w:after="160"/>
+              <w:rPr>
+                <w:rFonts w:ascii="Calibri" w:hAnsi="Calibri" w:eastAsia="Calibri" w:cs="Calibri"/>
+                <w:kern w:val="0"/>
+                <w:sz w:val="22"/>
+                <w:szCs w:val="22"/>
+                <w:lang w:val="en-US" w:eastAsia="zh-CN" w:bidi="hi-IN"/>
+              </w:rPr>
+            </w:pPr>
+            <w:r>
+              <w:rPr>
+                <w:rFonts w:eastAsia="Calibri" w:cs="Calibri"/>
+                <w:kern w:val="0"/>
+                <w:sz w:val="22"/>
+                <w:szCs w:val="22"/>
+                <w:lang w:val="en-US" w:eastAsia="zh-CN" w:bidi="hi-IN"/>
+              </w:rPr>
+              <w:t>Bug Fixing</w:t>
+            </w:r>
+          </w:p>
         </w:tc>
       </w:tr>
       <w:tr>
@@ -2659,6 +2684,31 @@
               <w:t>Assisted in testing hardware, UI and database all together</w:t>
             </w:r>
           </w:p>
+          <w:p>
+            <w:pPr>
+              <w:pStyle w:val="BodyText"/>
+              <w:widowControl/>
+              <w:suppressAutoHyphens w:val="true"/>
+              <w:spacing w:before="0" w:after="160"/>
+              <w:rPr>
+                <w:rFonts w:ascii="Calibri" w:hAnsi="Calibri" w:eastAsia="Calibri" w:cs="Calibri"/>
+                <w:kern w:val="0"/>
+                <w:sz w:val="22"/>
+                <w:szCs w:val="22"/>
+                <w:lang w:val="en-US" w:eastAsia="zh-CN" w:bidi="hi-IN"/>
+              </w:rPr>
+            </w:pPr>
+            <w:r>
+              <w:rPr>
+                <w:rFonts w:eastAsia="Calibri" w:cs="Calibri"/>
+                <w:kern w:val="0"/>
+                <w:sz w:val="22"/>
+                <w:szCs w:val="22"/>
+                <w:lang w:val="en-US" w:eastAsia="zh-CN" w:bidi="hi-IN"/>
+              </w:rPr>
+              <w:t>Bug Fixing</w:t>
+            </w:r>
+          </w:p>
         </w:tc>
       </w:tr>
       <w:tr>
@@ -2837,6 +2887,31 @@
                 <w:lang w:val="en-US" w:eastAsia="zh-CN" w:bidi="hi-IN"/>
               </w:rPr>
               <w:t>Database methods for admin reports</w:t>
+            </w:r>
+          </w:p>
+          <w:p>
+            <w:pPr>
+              <w:pStyle w:val="normal1"/>
+              <w:widowControl/>
+              <w:suppressAutoHyphens w:val="true"/>
+              <w:spacing w:before="0" w:after="160"/>
+              <w:rPr>
+                <w:rFonts w:ascii="Calibri" w:hAnsi="Calibri" w:eastAsia="Calibri" w:cs="Calibri"/>
+                <w:kern w:val="0"/>
+                <w:sz w:val="22"/>
+                <w:szCs w:val="22"/>
+                <w:lang w:val="en-US" w:eastAsia="zh-CN" w:bidi="hi-IN"/>
+              </w:rPr>
+            </w:pPr>
+            <w:r>
+              <w:rPr>
+                <w:rFonts w:eastAsia="Calibri" w:cs="Calibri"/>
+                <w:kern w:val="0"/>
+                <w:sz w:val="22"/>
+                <w:szCs w:val="22"/>
+                <w:lang w:val="en-US" w:eastAsia="zh-CN" w:bidi="hi-IN"/>
+              </w:rPr>
+              <w:t>Bug Fixing</w:t>
             </w:r>
           </w:p>
         </w:tc>
@@ -3414,8 +3489,8 @@
     <w:qFormat/>
     <w:rPr/>
   </w:style>
-  <w:style w:type="character" w:styleId="Bulletsuser" w:customStyle="1">
-    <w:name w:val="Bullets (user)"/>
+  <w:style w:type="character" w:styleId="Bullets" w:customStyle="1">
+    <w:name w:val="Bullets"/>
     <w:qFormat/>
     <w:rPr>
       <w:rFonts w:ascii="OpenSymbol" w:hAnsi="OpenSymbol" w:eastAsia="OpenSymbol" w:cs="OpenSymbol"/>

</xml_diff>